<commit_message>
AT+CONFIG_HASH: datasheet sections and guide examples
Adds the command to the m1421 (3.3) and 1090 (4.4) datasheets. The PDF exports
are not regenerated.
</commit_message>
<xml_diff>
--- a/word/datasheet_adsbee_1090.docx
+++ b/word/datasheet_adsbee_1090.docx
@@ -2453,13 +2453,103 @@
               <w:lang w:eastAsia="zh-CN"/>
             </w:rPr>
           </w:pPr>
+          <w:hyperlink w:anchor="_Toc242110619" w:history="1">
+            <w:r>
+              <w:rPr>
+                <w:rStyle w:val="Hyperlink"/>
+                <w:noProof/>
+              </w:rPr>
+              <w:t>4.4</w:t>
+            </w:r>
+            <w:r>
+              <w:rPr>
+                <w:rFonts w:eastAsiaTheme="minorEastAsia"/>
+                <w:noProof/>
+                <w:sz w:val="24"/>
+                <w:szCs w:val="24"/>
+                <w:lang w:eastAsia="zh-CN"/>
+              </w:rPr>
+              <w:tab/>
+            </w:r>
+            <w:r>
+              <w:rPr>
+                <w:rStyle w:val="Hyperlink"/>
+                <w:noProof/>
+              </w:rPr>
+              <w:t>AT+CONFIG_HASH</w:t>
+            </w:r>
+            <w:r>
+              <w:rPr>
+                <w:noProof/>
+                <w:webHidden/>
+              </w:rPr>
+              <w:tab/>
+            </w:r>
+            <w:r>
+              <w:rPr>
+                <w:noProof/>
+                <w:webHidden/>
+              </w:rPr>
+              <w:fldChar w:fldCharType="begin"/>
+            </w:r>
+            <w:r>
+              <w:rPr>
+                <w:noProof/>
+                <w:webHidden/>
+              </w:rPr>
+              <w:instrText xml:space="preserve"> PAGEREF _Toc242110619 \h </w:instrText>
+            </w:r>
+            <w:r>
+              <w:rPr>
+                <w:noProof/>
+                <w:webHidden/>
+              </w:rPr>
+            </w:r>
+            <w:r>
+              <w:rPr>
+                <w:noProof/>
+                <w:webHidden/>
+              </w:rPr>
+              <w:fldChar w:fldCharType="separate"/>
+            </w:r>
+            <w:r>
+              <w:rPr>
+                <w:noProof/>
+                <w:webHidden/>
+              </w:rPr>
+              <w:t>12</w:t>
+            </w:r>
+            <w:r>
+              <w:rPr>
+                <w:noProof/>
+                <w:webHidden/>
+              </w:rPr>
+              <w:fldChar w:fldCharType="end"/>
+            </w:r>
+          </w:hyperlink>
+        </w:p>
+        <w:p>
+          <w:pPr>
+            <w:pStyle w:val="TOC2"/>
+            <w:tabs>
+              <w:tab w:val="left" w:pos="960"/>
+              <w:tab w:val="right" w:leader="dot" w:pos="10790"/>
+            </w:tabs>
+            <w:rPr>
+              <w:rFonts w:eastAsiaTheme="minorEastAsia"/>
+              <w:noProof/>
+              <w:sz w:val="24"/>
+              <w:szCs w:val="24"/>
+              <w:lang w:eastAsia="zh-CN"/>
+            </w:rPr>
+          </w:pPr>
           <w:hyperlink w:anchor="_Toc242110529" w:history="1">
             <w:r>
               <w:rPr>
                 <w:rStyle w:val="Hyperlink"/>
                 <w:noProof/>
               </w:rPr>
-              <w:t>4.4</w:t>
+              <w:t>4.5</w:t>
             </w:r>
             <w:r>
               <w:rPr>
@@ -2549,7 +2639,7 @@
                 <w:rStyle w:val="Hyperlink"/>
                 <w:noProof/>
               </w:rPr>
-              <w:t>4.5</w:t>
+              <w:t>4.6</w:t>
             </w:r>
             <w:r>
               <w:rPr>
@@ -2639,7 +2729,7 @@
                 <w:rStyle w:val="Hyperlink"/>
                 <w:noProof/>
               </w:rPr>
-              <w:t>4.5.1</w:t>
+              <w:t>4.6.1</w:t>
             </w:r>
             <w:r>
               <w:rPr>
@@ -2729,7 +2819,7 @@
                 <w:rStyle w:val="Hyperlink"/>
                 <w:noProof/>
               </w:rPr>
-              <w:t>4.5.2</w:t>
+              <w:t>4.6.2</w:t>
             </w:r>
             <w:r>
               <w:rPr>
@@ -2819,7 +2909,7 @@
                 <w:rStyle w:val="Hyperlink"/>
                 <w:noProof/>
               </w:rPr>
-              <w:t>4.6</w:t>
+              <w:t>4.7</w:t>
             </w:r>
             <w:r>
               <w:rPr>
@@ -2909,7 +2999,7 @@
                 <w:rStyle w:val="Hyperlink"/>
                 <w:noProof/>
               </w:rPr>
-              <w:t>4.7</w:t>
+              <w:t>4.8</w:t>
             </w:r>
             <w:r>
               <w:rPr>
@@ -2999,7 +3089,7 @@
                 <w:rStyle w:val="Hyperlink"/>
                 <w:noProof/>
               </w:rPr>
-              <w:t>4.7.1</w:t>
+              <w:t>4.8.1</w:t>
             </w:r>
             <w:r>
               <w:rPr>
@@ -3089,7 +3179,7 @@
                 <w:rStyle w:val="Hyperlink"/>
                 <w:noProof/>
               </w:rPr>
-              <w:t>4.7.2</w:t>
+              <w:t>4.8.2</w:t>
             </w:r>
             <w:r>
               <w:rPr>
@@ -3179,7 +3269,7 @@
                 <w:rStyle w:val="Hyperlink"/>
                 <w:noProof/>
               </w:rPr>
-              <w:t>4.8</w:t>
+              <w:t>4.9</w:t>
             </w:r>
             <w:r>
               <w:rPr>
@@ -3269,7 +3359,7 @@
                 <w:rStyle w:val="Hyperlink"/>
                 <w:noProof/>
               </w:rPr>
-              <w:t>4.8.1</w:t>
+              <w:t>4.9.1</w:t>
             </w:r>
             <w:r>
               <w:rPr>
@@ -3359,7 +3449,7 @@
                 <w:rStyle w:val="Hyperlink"/>
                 <w:noProof/>
               </w:rPr>
-              <w:t>4.8.2</w:t>
+              <w:t>4.9.2</w:t>
             </w:r>
             <w:r>
               <w:rPr>
@@ -3449,7 +3539,7 @@
                 <w:rStyle w:val="Hyperlink"/>
                 <w:noProof/>
               </w:rPr>
-              <w:t>4.8.3</w:t>
+              <w:t>4.9.3</w:t>
             </w:r>
             <w:r>
               <w:rPr>
@@ -3539,7 +3629,7 @@
                 <w:rStyle w:val="Hyperlink"/>
                 <w:noProof/>
               </w:rPr>
-              <w:t>4.9</w:t>
+              <w:t>4.10</w:t>
             </w:r>
             <w:r>
               <w:rPr>
@@ -3629,7 +3719,7 @@
                 <w:rStyle w:val="Hyperlink"/>
                 <w:noProof/>
               </w:rPr>
-              <w:t>4.9.1</w:t>
+              <w:t>4.10.1</w:t>
             </w:r>
             <w:r>
               <w:rPr>
@@ -3719,7 +3809,7 @@
                 <w:rStyle w:val="Hyperlink"/>
                 <w:noProof/>
               </w:rPr>
-              <w:t>4.9.2</w:t>
+              <w:t>4.10.2</w:t>
             </w:r>
             <w:r>
               <w:rPr>
@@ -3809,7 +3899,7 @@
                 <w:rStyle w:val="Hyperlink"/>
                 <w:noProof/>
               </w:rPr>
-              <w:t>4.10</w:t>
+              <w:t>4.11</w:t>
             </w:r>
             <w:r>
               <w:rPr>
@@ -3899,7 +3989,7 @@
                 <w:rStyle w:val="Hyperlink"/>
                 <w:noProof/>
               </w:rPr>
-              <w:t>4.10.1</w:t>
+              <w:t>4.11.1</w:t>
             </w:r>
             <w:r>
               <w:rPr>
@@ -3989,7 +4079,7 @@
                 <w:rStyle w:val="Hyperlink"/>
                 <w:noProof/>
               </w:rPr>
-              <w:t>4.10.2</w:t>
+              <w:t>4.11.2</w:t>
             </w:r>
             <w:r>
               <w:rPr>
@@ -4079,7 +4169,7 @@
                 <w:rStyle w:val="Hyperlink"/>
                 <w:noProof/>
               </w:rPr>
-              <w:t>4.11</w:t>
+              <w:t>4.12</w:t>
             </w:r>
             <w:r>
               <w:rPr>
@@ -4169,7 +4259,7 @@
                 <w:rStyle w:val="Hyperlink"/>
                 <w:noProof/>
               </w:rPr>
-              <w:t>4.11.1</w:t>
+              <w:t>4.12.1</w:t>
             </w:r>
             <w:r>
               <w:rPr>
@@ -4259,7 +4349,7 @@
                 <w:rStyle w:val="Hyperlink"/>
                 <w:noProof/>
               </w:rPr>
-              <w:t>4.11.2</w:t>
+              <w:t>4.12.2</w:t>
             </w:r>
             <w:r>
               <w:rPr>
@@ -4349,7 +4439,7 @@
                 <w:rStyle w:val="Hyperlink"/>
                 <w:noProof/>
               </w:rPr>
-              <w:t>4.12</w:t>
+              <w:t>4.13</w:t>
             </w:r>
             <w:r>
               <w:rPr>
@@ -4439,7 +4529,7 @@
                 <w:rStyle w:val="Hyperlink"/>
                 <w:noProof/>
               </w:rPr>
-              <w:t>4.13</w:t>
+              <w:t>4.14</w:t>
             </w:r>
             <w:r>
               <w:rPr>
@@ -4529,7 +4619,7 @@
                 <w:rStyle w:val="Hyperlink"/>
                 <w:noProof/>
               </w:rPr>
-              <w:t>4.13.1</w:t>
+              <w:t>4.14.1</w:t>
             </w:r>
             <w:r>
               <w:rPr>
@@ -4619,7 +4709,7 @@
                 <w:rStyle w:val="Hyperlink"/>
                 <w:noProof/>
               </w:rPr>
-              <w:t>4.13.2</w:t>
+              <w:t>4.14.2</w:t>
             </w:r>
             <w:r>
               <w:rPr>
@@ -4709,7 +4799,7 @@
                 <w:rStyle w:val="Hyperlink"/>
                 <w:noProof/>
               </w:rPr>
-              <w:t>4.14</w:t>
+              <w:t>4.15</w:t>
             </w:r>
             <w:r>
               <w:rPr>
@@ -4799,7 +4889,7 @@
                 <w:rStyle w:val="Hyperlink"/>
                 <w:noProof/>
               </w:rPr>
-              <w:t>4.15</w:t>
+              <w:t>4.16</w:t>
             </w:r>
             <w:r>
               <w:rPr>
@@ -4889,7 +4979,7 @@
                 <w:rStyle w:val="Hyperlink"/>
                 <w:noProof/>
               </w:rPr>
-              <w:t>4.15.1</w:t>
+              <w:t>4.16.1</w:t>
             </w:r>
             <w:r>
               <w:rPr>
@@ -4979,7 +5069,7 @@
                 <w:rStyle w:val="Hyperlink"/>
                 <w:noProof/>
               </w:rPr>
-              <w:t>4.15.2</w:t>
+              <w:t>4.16.2</w:t>
             </w:r>
             <w:r>
               <w:rPr>
@@ -5069,7 +5159,7 @@
                 <w:rStyle w:val="Hyperlink"/>
                 <w:noProof/>
               </w:rPr>
-              <w:t>4.16</w:t>
+              <w:t>4.17</w:t>
             </w:r>
             <w:r>
               <w:rPr>
@@ -5159,7 +5249,7 @@
                 <w:rStyle w:val="Hyperlink"/>
                 <w:noProof/>
               </w:rPr>
-              <w:t>4.16.1</w:t>
+              <w:t>4.17.1</w:t>
             </w:r>
             <w:r>
               <w:rPr>
@@ -5249,7 +5339,7 @@
                 <w:rStyle w:val="Hyperlink"/>
                 <w:noProof/>
               </w:rPr>
-              <w:t>4.16.2</w:t>
+              <w:t>4.17.2</w:t>
             </w:r>
             <w:r>
               <w:rPr>
@@ -5339,7 +5429,7 @@
                 <w:rStyle w:val="Hyperlink"/>
                 <w:noProof/>
               </w:rPr>
-              <w:t>4.17</w:t>
+              <w:t>4.18</w:t>
             </w:r>
             <w:r>
               <w:rPr>
@@ -5429,7 +5519,7 @@
                 <w:rStyle w:val="Hyperlink"/>
                 <w:noProof/>
               </w:rPr>
-              <w:t>4.18</w:t>
+              <w:t>4.19</w:t>
             </w:r>
             <w:r>
               <w:rPr>
@@ -5519,7 +5609,7 @@
                 <w:rStyle w:val="Hyperlink"/>
                 <w:noProof/>
               </w:rPr>
-              <w:t>4.18.1</w:t>
+              <w:t>4.19.1</w:t>
             </w:r>
             <w:r>
               <w:rPr>
@@ -5609,7 +5699,7 @@
                 <w:rStyle w:val="Hyperlink"/>
                 <w:noProof/>
               </w:rPr>
-              <w:t>4.18.2</w:t>
+              <w:t>4.19.2</w:t>
             </w:r>
             <w:r>
               <w:rPr>
@@ -5699,7 +5789,7 @@
                 <w:rStyle w:val="Hyperlink"/>
                 <w:noProof/>
               </w:rPr>
-              <w:t>4.19</w:t>
+              <w:t>4.20</w:t>
             </w:r>
             <w:r>
               <w:rPr>
@@ -5789,7 +5879,7 @@
                 <w:rStyle w:val="Hyperlink"/>
                 <w:noProof/>
               </w:rPr>
-              <w:t>4.20</w:t>
+              <w:t>4.21</w:t>
             </w:r>
             <w:r>
               <w:rPr>
@@ -5879,7 +5969,7 @@
                 <w:rStyle w:val="Hyperlink"/>
                 <w:noProof/>
               </w:rPr>
-              <w:t>4.20.1</w:t>
+              <w:t>4.21.1</w:t>
             </w:r>
             <w:r>
               <w:rPr>
@@ -5969,7 +6059,7 @@
                 <w:rStyle w:val="Hyperlink"/>
                 <w:noProof/>
               </w:rPr>
-              <w:t>4.20.2</w:t>
+              <w:t>4.21.2</w:t>
             </w:r>
             <w:r>
               <w:rPr>
@@ -6059,7 +6149,7 @@
                 <w:rStyle w:val="Hyperlink"/>
                 <w:noProof/>
               </w:rPr>
-              <w:t>4.21</w:t>
+              <w:t>4.22</w:t>
             </w:r>
             <w:r>
               <w:rPr>
@@ -6149,7 +6239,7 @@
                 <w:rStyle w:val="Hyperlink"/>
                 <w:noProof/>
               </w:rPr>
-              <w:t>4.21.1</w:t>
+              <w:t>4.22.1</w:t>
             </w:r>
             <w:r>
               <w:rPr>
@@ -6239,7 +6329,7 @@
                 <w:rStyle w:val="Hyperlink"/>
                 <w:noProof/>
               </w:rPr>
-              <w:t>4.21.2</w:t>
+              <w:t>4.22.2</w:t>
             </w:r>
             <w:r>
               <w:rPr>
@@ -6329,7 +6419,7 @@
                 <w:rStyle w:val="Hyperlink"/>
                 <w:noProof/>
               </w:rPr>
-              <w:t>4.22</w:t>
+              <w:t>4.23</w:t>
             </w:r>
             <w:r>
               <w:rPr>
@@ -6419,7 +6509,7 @@
                 <w:rStyle w:val="Hyperlink"/>
                 <w:noProof/>
               </w:rPr>
-              <w:t>4.22.1</w:t>
+              <w:t>4.23.1</w:t>
             </w:r>
             <w:r>
               <w:rPr>
@@ -6509,7 +6599,7 @@
                 <w:rStyle w:val="Hyperlink"/>
                 <w:noProof/>
               </w:rPr>
-              <w:t>4.22.2</w:t>
+              <w:t>4.23.2</w:t>
             </w:r>
             <w:r>
               <w:rPr>
@@ -6599,7 +6689,7 @@
                 <w:rStyle w:val="Hyperlink"/>
                 <w:noProof/>
               </w:rPr>
-              <w:t>4.22.3</w:t>
+              <w:t>4.23.3</w:t>
             </w:r>
             <w:r>
               <w:rPr>
@@ -6689,7 +6779,7 @@
                 <w:rStyle w:val="Hyperlink"/>
                 <w:noProof/>
               </w:rPr>
-              <w:t>4.22.4</w:t>
+              <w:t>4.23.4</w:t>
             </w:r>
             <w:r>
               <w:rPr>
@@ -6779,7 +6869,7 @@
                 <w:rStyle w:val="Hyperlink"/>
                 <w:noProof/>
               </w:rPr>
-              <w:t>4.22.5</w:t>
+              <w:t>4.23.5</w:t>
             </w:r>
             <w:r>
               <w:rPr>
@@ -6869,7 +6959,7 @@
                 <w:rStyle w:val="Hyperlink"/>
                 <w:noProof/>
               </w:rPr>
-              <w:t>4.23</w:t>
+              <w:t>4.24</w:t>
             </w:r>
             <w:r>
               <w:rPr>
@@ -6961,7 +7051,7 @@
                 <w:bCs/>
                 <w:noProof/>
               </w:rPr>
-              <w:t>4.23.1</w:t>
+              <w:t>4.24.1</w:t>
             </w:r>
             <w:r>
               <w:rPr>
@@ -7053,7 +7143,7 @@
                 <w:rStyle w:val="Hyperlink"/>
                 <w:noProof/>
               </w:rPr>
-              <w:t>4.23.2</w:t>
+              <w:t>4.24.2</w:t>
             </w:r>
             <w:r>
               <w:rPr>
@@ -7143,7 +7233,7 @@
                 <w:rStyle w:val="Hyperlink"/>
                 <w:noProof/>
               </w:rPr>
-              <w:t>4.24</w:t>
+              <w:t>4.25</w:t>
             </w:r>
             <w:r>
               <w:rPr>
@@ -7233,7 +7323,7 @@
                 <w:rStyle w:val="Hyperlink"/>
                 <w:noProof/>
               </w:rPr>
-              <w:t>4.25</w:t>
+              <w:t>4.26</w:t>
             </w:r>
             <w:r>
               <w:rPr>
@@ -7323,7 +7413,7 @@
                 <w:rStyle w:val="Hyperlink"/>
                 <w:noProof/>
               </w:rPr>
-              <w:t>4.26</w:t>
+              <w:t>4.27</w:t>
             </w:r>
             <w:r>
               <w:rPr>
@@ -7413,7 +7503,7 @@
                 <w:rStyle w:val="Hyperlink"/>
                 <w:noProof/>
               </w:rPr>
-              <w:t>4.26.1</w:t>
+              <w:t>4.27.1</w:t>
             </w:r>
             <w:r>
               <w:rPr>
@@ -7503,7 +7593,7 @@
                 <w:rStyle w:val="Hyperlink"/>
                 <w:noProof/>
               </w:rPr>
-              <w:t>4.26.2</w:t>
+              <w:t>4.27.2</w:t>
             </w:r>
             <w:r>
               <w:rPr>
@@ -7593,7 +7683,7 @@
                 <w:rStyle w:val="Hyperlink"/>
                 <w:noProof/>
               </w:rPr>
-              <w:t>4.27</w:t>
+              <w:t>4.28</w:t>
             </w:r>
             <w:r>
               <w:rPr>
@@ -7683,7 +7773,7 @@
                 <w:rStyle w:val="Hyperlink"/>
                 <w:noProof/>
               </w:rPr>
-              <w:t>4.28</w:t>
+              <w:t>4.29</w:t>
             </w:r>
             <w:r>
               <w:rPr>
@@ -7773,7 +7863,7 @@
                 <w:rStyle w:val="Hyperlink"/>
                 <w:noProof/>
               </w:rPr>
-              <w:t>4.28.1</w:t>
+              <w:t>4.29.1</w:t>
             </w:r>
             <w:r>
               <w:rPr>
@@ -7863,7 +7953,7 @@
                 <w:rStyle w:val="Hyperlink"/>
                 <w:noProof/>
               </w:rPr>
-              <w:t>4.28.2</w:t>
+              <w:t>4.29.2</w:t>
             </w:r>
             <w:r>
               <w:rPr>
@@ -7953,7 +8043,7 @@
                 <w:rStyle w:val="Hyperlink"/>
                 <w:noProof/>
               </w:rPr>
-              <w:t>4.28.3</w:t>
+              <w:t>4.29.3</w:t>
             </w:r>
             <w:r>
               <w:rPr>
@@ -8043,7 +8133,7 @@
                 <w:rStyle w:val="Hyperlink"/>
                 <w:noProof/>
               </w:rPr>
-              <w:t>4.29</w:t>
+              <w:t>4.30</w:t>
             </w:r>
             <w:r>
               <w:rPr>
@@ -8133,7 +8223,7 @@
                 <w:rStyle w:val="Hyperlink"/>
                 <w:noProof/>
               </w:rPr>
-              <w:t>4.29.1</w:t>
+              <w:t>4.30.1</w:t>
             </w:r>
             <w:r>
               <w:rPr>
@@ -8223,7 +8313,7 @@
                 <w:rStyle w:val="Hyperlink"/>
                 <w:noProof/>
               </w:rPr>
-              <w:t>4.29.2</w:t>
+              <w:t>4.30.2</w:t>
             </w:r>
             <w:r>
               <w:rPr>
@@ -8313,7 +8403,7 @@
                 <w:rStyle w:val="Hyperlink"/>
                 <w:noProof/>
               </w:rPr>
-              <w:t>4.30</w:t>
+              <w:t>4.31</w:t>
             </w:r>
             <w:r>
               <w:rPr>
@@ -8403,7 +8493,7 @@
                 <w:rStyle w:val="Hyperlink"/>
                 <w:noProof/>
               </w:rPr>
-              <w:t>4.30.1</w:t>
+              <w:t>4.31.1</w:t>
             </w:r>
             <w:r>
               <w:rPr>
@@ -8493,7 +8583,7 @@
                 <w:rStyle w:val="Hyperlink"/>
                 <w:noProof/>
               </w:rPr>
-              <w:t>4.30.2</w:t>
+              <w:t>4.31.2</w:t>
             </w:r>
             <w:r>
               <w:rPr>
@@ -12952,6 +13042,394 @@
           <w:numId w:val="4"/>
         </w:numPr>
       </w:pPr>
+      <w:bookmarkStart w:id="132" w:name="_Toc242110619"/>
+      <w:r>
+        <w:t>AT+CONFIG_HASH</w:t>
+      </w:r>
+      <w:bookmarkEnd w:id="132"/>
+    </w:p>
+    <w:p>
+      <w:r>
+        <w:t>Prints hashes of the settings, the CC1312 CCFG (customer configuration) and the firmware images, so a receiver can be compared with a reference receiver in one line. Two receivers with the same firmware and the same settings print the same values. An example query and reply is shown below.</w:t>
+      </w:r>
+    </w:p>
+    <w:tbl>
+      <w:tblPr>
+        <w:tblStyle w:val="TableGrid"/>
+        <w:tblW w:w="0" w:type="auto"/>
+        <w:tblLook w:val="04A0" w:firstRow="1" w:lastRow="0" w:firstColumn="1" w:lastColumn="0" w:noHBand="0" w:noVBand="1"/>
+      </w:tblPr>
+      <w:tblGrid>
+        <w:gridCol w:w="11016"/>
+      </w:tblGrid>
+      <w:tr>
+        <w:tc>
+          <w:tcPr>
+            <w:tcW w:w="11016" w:type="dxa"/>
+          </w:tcPr>
+          <w:p>
+            <w:pPr>
+              <w:rPr>
+                <w:rFonts w:ascii="Courier New" w:hAnsi="Courier New" w:cs="Courier New"/>
+              </w:rPr>
+            </w:pPr>
+            <w:r>
+              <w:rPr>
+                <w:rFonts w:ascii="Courier New" w:hAnsi="Courier New" w:cs="Courier New"/>
+              </w:rPr>
+              <w:t>&gt; AT+CONFIG_HASH?</w:t>
+            </w:r>
+          </w:p>
+          <w:p>
+            <w:pPr>
+              <w:rPr>
+                <w:rFonts w:ascii="Courier New" w:hAnsi="Courier New" w:cs="Courier New"/>
+              </w:rPr>
+            </w:pPr>
+            <w:r>
+              <w:rPr>
+                <w:rFonts w:ascii="Courier New" w:hAnsi="Courier New" w:cs="Courier New"/>
+              </w:rPr>
+              <w:t>CONFIG_HASH=0x3D7A91C4</w:t>
+            </w:r>
+          </w:p>
+          <w:p>
+            <w:pPr>
+              <w:rPr>
+                <w:rFonts w:ascii="Courier New" w:hAnsi="Courier New" w:cs="Courier New"/>
+              </w:rPr>
+            </w:pPr>
+            <w:r>
+              <w:rPr>
+                <w:rFonts w:ascii="Courier New" w:hAnsi="Courier New" w:cs="Courier New"/>
+              </w:rPr>
+              <w:t>SETTINGS_FLEET=0x9140FC1E (settings version 18, 1340 Bytes)</w:t>
+            </w:r>
+          </w:p>
+          <w:p>
+            <w:pPr>
+              <w:rPr>
+                <w:rFonts w:ascii="Courier New" w:hAnsi="Courier New" w:cs="Courier New"/>
+              </w:rPr>
+            </w:pPr>
+            <w:r>
+              <w:rPr>
+                <w:rFonts w:ascii="Courier New" w:hAnsi="Courier New" w:cs="Courier New"/>
+              </w:rPr>
+              <w:t>SETTINGS_FULL=0x2F6B0D55</w:t>
+            </w:r>
+          </w:p>
+          <w:p>
+            <w:pPr>
+              <w:rPr>
+                <w:rFonts w:ascii="Courier New" w:hAnsi="Courier New" w:cs="Courier New"/>
+              </w:rPr>
+            </w:pPr>
+            <w:r>
+              <w:rPr>
+                <w:rFonts w:ascii="Courier New" w:hAnsi="Courier New" w:cs="Courier New"/>
+              </w:rPr>
+              <w:t>CCFG_CC1312=0x4BB06FBD</w:t>
+            </w:r>
+          </w:p>
+          <w:p>
+            <w:pPr>
+              <w:rPr>
+                <w:rFonts w:ascii="Courier New" w:hAnsi="Courier New" w:cs="Courier New"/>
+              </w:rPr>
+            </w:pPr>
+            <w:r>
+              <w:rPr>
+                <w:rFonts w:ascii="Courier New" w:hAnsi="Courier New" w:cs="Courier New"/>
+              </w:rPr>
+              <w:t>FIRMWARE=0x4D476C34</w:t>
+            </w:r>
+          </w:p>
+          <w:p>
+            <w:pPr>
+              <w:rPr>
+                <w:rFonts w:ascii="Courier New" w:hAnsi="Courier New" w:cs="Courier New"/>
+              </w:rPr>
+            </w:pPr>
+            <w:r>
+              <w:rPr>
+                <w:rFonts w:ascii="Courier New" w:hAnsi="Courier New" w:cs="Courier New"/>
+              </w:rPr>
+              <w:t>FIRMWARE_RP2040=0x7DC53693 (UF2 image, partition 0, 2950400 Bytes)</w:t>
+            </w:r>
+          </w:p>
+          <w:p>
+            <w:pPr>
+              <w:rPr>
+                <w:rFonts w:ascii="Courier New" w:hAnsi="Courier New" w:cs="Courier New"/>
+              </w:rPr>
+            </w:pPr>
+            <w:r>
+              <w:rPr>
+                <w:rFonts w:ascii="Courier New" w:hAnsi="Courier New" w:cs="Courier New"/>
+              </w:rPr>
+              <w:t>FIRMWARE_ESP32=0xC90EA4DB</w:t>
+            </w:r>
+          </w:p>
+          <w:p>
+            <w:pPr>
+              <w:rPr>
+                <w:rFonts w:ascii="Courier New" w:hAnsi="Courier New" w:cs="Courier New"/>
+              </w:rPr>
+            </w:pPr>
+            <w:r>
+              <w:rPr>
+                <w:rFonts w:ascii="Courier New" w:hAnsi="Courier New" w:cs="Courier New"/>
+              </w:rPr>
+              <w:t>FIRMWARE_CC1312=0x6F59BCF1</w:t>
+            </w:r>
+          </w:p>
+        </w:tc>
+      </w:tr>
+    </w:tbl>
+    <w:p/>
+    <w:tbl>
+      <w:tblPr>
+        <w:tblStyle w:val="TableGrid"/>
+        <w:tblW w:w="0" w:type="auto"/>
+        <w:tblLook w:val="04A0" w:firstRow="1" w:lastRow="0" w:firstColumn="1" w:lastColumn="0" w:noHBand="0" w:noVBand="1"/>
+      </w:tblPr>
+      <w:tblGrid>
+        <w:gridCol w:w="2200"/>
+        <w:gridCol w:w="8816"/>
+      </w:tblGrid>
+      <w:tr>
+        <w:tc>
+          <w:tcPr>
+            <w:tcW w:w="2200" w:type="dxa"/>
+          </w:tcPr>
+          <w:p>
+            <w:pPr>
+              <w:rPr>
+                <w:b/>
+                <w:bCs/>
+              </w:rPr>
+            </w:pPr>
+            <w:r>
+              <w:rPr>
+                <w:b/>
+                <w:bCs/>
+              </w:rPr>
+              <w:t>Line</w:t>
+            </w:r>
+          </w:p>
+        </w:tc>
+        <w:tc>
+          <w:tcPr>
+            <w:tcW w:w="8816" w:type="dxa"/>
+          </w:tcPr>
+          <w:p>
+            <w:pPr>
+              <w:rPr>
+                <w:b/>
+                <w:bCs/>
+              </w:rPr>
+            </w:pPr>
+            <w:r>
+              <w:rPr>
+                <w:b/>
+                <w:bCs/>
+              </w:rPr>
+              <w:t>Description</w:t>
+            </w:r>
+          </w:p>
+        </w:tc>
+      </w:tr>
+      <w:tr>
+        <w:tc>
+          <w:tcPr>
+            <w:tcW w:w="2200" w:type="dxa"/>
+          </w:tcPr>
+          <w:p>
+            <w:r>
+              <w:t>CONFIG_HASH</w:t>
+            </w:r>
+          </w:p>
+        </w:tc>
+        <w:tc>
+          <w:tcPr>
+            <w:tcW w:w="8816" w:type="dxa"/>
+          </w:tcPr>
+          <w:p>
+            <w:r>
+              <w:t>Hash of SETTINGS_FLEET, CCFG_CC1312 and FIRMWARE. Compare this first.</w:t>
+            </w:r>
+          </w:p>
+        </w:tc>
+      </w:tr>
+      <w:tr>
+        <w:tc>
+          <w:tcPr>
+            <w:tcW w:w="2200" w:type="dxa"/>
+          </w:tcPr>
+          <w:p>
+            <w:r>
+              <w:t>SETTINGS_FLEET</w:t>
+            </w:r>
+          </w:p>
+        </w:tc>
+        <w:tc>
+          <w:tcPr>
+            <w:tcW w:w="8816" w:type="dxa"/>
+          </w:tcPr>
+          <w:p>
+            <w:r>
+              <w:t>All settings except the hostname, WiFi access point SSID and channel, feed receiver IDs, Remote ID UAS ID and receiver position values.</w:t>
+            </w:r>
+          </w:p>
+        </w:tc>
+      </w:tr>
+      <w:tr>
+        <w:tc>
+          <w:tcPr>
+            <w:tcW w:w="2200" w:type="dxa"/>
+          </w:tcPr>
+          <w:p>
+            <w:r>
+              <w:t>SETTINGS_FULL</w:t>
+            </w:r>
+          </w:p>
+        </w:tc>
+        <w:tc>
+          <w:tcPr>
+            <w:tcW w:w="8816" w:type="dxa"/>
+          </w:tcPr>
+          <w:p>
+            <w:r>
+              <w:t>All settings.</w:t>
+            </w:r>
+          </w:p>
+        </w:tc>
+      </w:tr>
+      <w:tr>
+        <w:tc>
+          <w:tcPr>
+            <w:tcW w:w="2200" w:type="dxa"/>
+          </w:tcPr>
+          <w:p>
+            <w:r>
+              <w:t>CCFG_CC1312</w:t>
+            </w:r>
+          </w:p>
+        </w:tc>
+        <w:tc>
+          <w:tcPr>
+            <w:tcW w:w="8816" w:type="dxa"/>
+          </w:tcPr>
+          <w:p>
+            <w:r>
+              <w:t>The CCFG of the CC1312, read from its flash at boot.</w:t>
+            </w:r>
+          </w:p>
+        </w:tc>
+      </w:tr>
+      <w:tr>
+        <w:tc>
+          <w:tcPr>
+            <w:tcW w:w="2200" w:type="dxa"/>
+          </w:tcPr>
+          <w:p>
+            <w:r>
+              <w:t>FIRMWARE</w:t>
+            </w:r>
+          </w:p>
+        </w:tc>
+        <w:tc>
+          <w:tcPr>
+            <w:tcW w:w="8816" w:type="dxa"/>
+          </w:tcPr>
+          <w:p>
+            <w:r>
+              <w:t>Hash of the three FIRMWARE_&lt;processor&gt; lines.</w:t>
+            </w:r>
+          </w:p>
+        </w:tc>
+      </w:tr>
+      <w:tr>
+        <w:tc>
+          <w:tcPr>
+            <w:tcW w:w="2200" w:type="dxa"/>
+          </w:tcPr>
+          <w:p>
+            <w:r>
+              <w:t>FIRMWARE_RP2040</w:t>
+            </w:r>
+          </w:p>
+        </w:tc>
+        <w:tc>
+          <w:tcPr>
+            <w:tcW w:w="8816" w:type="dxa"/>
+          </w:tcPr>
+          <w:p>
+            <w:r>
+              <w:t>The application image in the running flash partition. The .uf2 image and the .ota images for partition 0 and partition 1 each have their own value.</w:t>
+            </w:r>
+          </w:p>
+        </w:tc>
+      </w:tr>
+      <w:tr>
+        <w:tc>
+          <w:tcPr>
+            <w:tcW w:w="2200" w:type="dxa"/>
+          </w:tcPr>
+          <w:p>
+            <w:r>
+              <w:t>FIRMWARE_ESP32</w:t>
+            </w:r>
+          </w:p>
+        </w:tc>
+        <w:tc>
+          <w:tcPr>
+            <w:tcW w:w="8816" w:type="dxa"/>
+          </w:tcPr>
+          <w:p>
+            <w:r>
+              <w:t>The first 4 bytes of the SHA-256 that the ESP32 build stores in its application image.</w:t>
+            </w:r>
+          </w:p>
+        </w:tc>
+      </w:tr>
+      <w:tr>
+        <w:tc>
+          <w:tcPr>
+            <w:tcW w:w="2200" w:type="dxa"/>
+          </w:tcPr>
+          <w:p>
+            <w:r>
+              <w:t>FIRMWARE_CC1312</w:t>
+            </w:r>
+          </w:p>
+        </w:tc>
+        <w:tc>
+          <w:tcPr>
+            <w:tcW w:w="8816" w:type="dxa"/>
+          </w:tcPr>
+          <w:p>
+            <w:r>
+              <w:t>The application image in the CC1312’s flash.</w:t>
+            </w:r>
+          </w:p>
+        </w:tc>
+      </w:tr>
+    </w:tbl>
+    <w:p>
+      <w:r>
+        <w:t>A line reads UNKNOWN when a processor is off or did not answer. Releases list the firmware and CCFG values in adsbee_1090-&lt;version&gt;.hashes.txt.</w:t>
+      </w:r>
+    </w:p>
+    <w:p>
+      <w:pPr>
+        <w:pStyle w:val="Heading2"/>
+        <w:numPr>
+          <w:ilvl w:val="1"/>
+          <w:numId w:val="4"/>
+        </w:numPr>
+      </w:pPr>
       <w:bookmarkStart w:id="22" w:name="_Toc242110529"/>
       <w:r>
         <w:t>AT+DEVICE_INFO</w:t>
@@ -13344,7 +13822,7 @@
         <w:fldChar w:fldCharType="separate"/>
       </w:r>
       <w:r>
-        <w:t xml:space="preserve">4.5.1  </w:t>
+        <w:t xml:space="preserve">4.6.1  </w:t>
       </w:r>
       <w:r>
         <w:fldChar w:fldCharType="end"/>
@@ -16406,7 +16884,7 @@
         <w:fldChar w:fldCharType="separate"/>
       </w:r>
       <w:r>
-        <w:t xml:space="preserve">4.18.1  </w:t>
+        <w:t xml:space="preserve">4.19.1  </w:t>
       </w:r>
       <w:r>
         <w:fldChar w:fldCharType="end"/>

</xml_diff>

<commit_message>
Datasheets: revision 20261013 for AT+CONFIG_HASH; revision rule in AGENTS.md
</commit_message>
<xml_diff>
--- a/word/datasheet_adsbee_1090.docx
+++ b/word/datasheet_adsbee_1090.docx
@@ -10979,6 +10979,35 @@
       </w:pPr>
       <w:r>
         <w:t>AT+FEED_ENABLE</w:t>
+      </w:r>
+    </w:p>
+    <w:p>
+      <w:r>
+        <w:t>20261013</w:t>
+      </w:r>
+    </w:p>
+    <w:p>
+      <w:pPr>
+        <w:pStyle w:val="ListParagraph"/>
+        <w:numPr>
+          <w:ilvl w:val="0"/>
+          <w:numId w:val="10"/>
+        </w:numPr>
+      </w:pPr>
+      <w:r>
+        <w:t>Added new AT command:</w:t>
+      </w:r>
+    </w:p>
+    <w:p>
+      <w:pPr>
+        <w:pStyle w:val="ListParagraph"/>
+        <w:numPr>
+          <w:ilvl w:val="1"/>
+          <w:numId w:val="10"/>
+        </w:numPr>
+      </w:pPr>
+      <w:r>
+        <w:t>AT+CONFIG_HASH</w:t>
       </w:r>
     </w:p>
     <w:p>
@@ -44036,7 +44065,7 @@
       <w:rPr>
         <w:color w:val="FFFFFF" w:themeColor="background1"/>
       </w:rPr>
-      <w:t>0924</w:t>
+      <w:t>1013</w:t>
     </w:r>
     <w:r>
       <w:rPr>

</xml_diff>

<commit_message>
Datasheets: table of contents page numbers match the export
</commit_message>
<xml_diff>
--- a/word/datasheet_adsbee_1090.docx
+++ b/word/datasheet_adsbee_1090.docx
@@ -2697,7 +2697,7 @@
                 <w:noProof/>
                 <w:webHidden/>
               </w:rPr>
-              <w:t>12</w:t>
+              <w:t>13</w:t>
             </w:r>
             <w:r>
               <w:rPr>
@@ -2787,7 +2787,7 @@
                 <w:noProof/>
                 <w:webHidden/>
               </w:rPr>
-              <w:t>12</w:t>
+              <w:t>13</w:t>
             </w:r>
             <w:r>
               <w:rPr>
@@ -2877,7 +2877,7 @@
                 <w:noProof/>
                 <w:webHidden/>
               </w:rPr>
-              <w:t>12</w:t>
+              <w:t>13</w:t>
             </w:r>
             <w:r>
               <w:rPr>
@@ -2967,7 +2967,7 @@
                 <w:noProof/>
                 <w:webHidden/>
               </w:rPr>
-              <w:t>12</w:t>
+              <w:t>13</w:t>
             </w:r>
             <w:r>
               <w:rPr>
@@ -3237,7 +3237,7 @@
                 <w:noProof/>
                 <w:webHidden/>
               </w:rPr>
-              <w:t>13</w:t>
+              <w:t>14</w:t>
             </w:r>
             <w:r>
               <w:rPr>
@@ -3327,7 +3327,7 @@
                 <w:noProof/>
                 <w:webHidden/>
               </w:rPr>
-              <w:t>13</w:t>
+              <w:t>14</w:t>
             </w:r>
             <w:r>
               <w:rPr>
@@ -3417,7 +3417,7 @@
                 <w:noProof/>
                 <w:webHidden/>
               </w:rPr>
-              <w:t>13</w:t>
+              <w:t>14</w:t>
             </w:r>
             <w:r>
               <w:rPr>
@@ -3507,7 +3507,7 @@
                 <w:noProof/>
                 <w:webHidden/>
               </w:rPr>
-              <w:t>14</w:t>
+              <w:t>15</w:t>
             </w:r>
             <w:r>
               <w:rPr>
@@ -3597,7 +3597,7 @@
                 <w:noProof/>
                 <w:webHidden/>
               </w:rPr>
-              <w:t>14</w:t>
+              <w:t>15</w:t>
             </w:r>
             <w:r>
               <w:rPr>
@@ -3687,7 +3687,7 @@
                 <w:noProof/>
                 <w:webHidden/>
               </w:rPr>
-              <w:t>14</w:t>
+              <w:t>15</w:t>
             </w:r>
             <w:r>
               <w:rPr>
@@ -3777,7 +3777,7 @@
                 <w:noProof/>
                 <w:webHidden/>
               </w:rPr>
-              <w:t>14</w:t>
+              <w:t>15</w:t>
             </w:r>
             <w:r>
               <w:rPr>
@@ -3867,7 +3867,7 @@
                 <w:noProof/>
                 <w:webHidden/>
               </w:rPr>
-              <w:t>14</w:t>
+              <w:t>15</w:t>
             </w:r>
             <w:r>
               <w:rPr>
@@ -3957,7 +3957,7 @@
                 <w:noProof/>
                 <w:webHidden/>
               </w:rPr>
-              <w:t>15</w:t>
+              <w:t>16</w:t>
             </w:r>
             <w:r>
               <w:rPr>
@@ -4047,7 +4047,7 @@
                 <w:noProof/>
                 <w:webHidden/>
               </w:rPr>
-              <w:t>15</w:t>
+              <w:t>16</w:t>
             </w:r>
             <w:r>
               <w:rPr>
@@ -4137,7 +4137,7 @@
                 <w:noProof/>
                 <w:webHidden/>
               </w:rPr>
-              <w:t>15</w:t>
+              <w:t>16</w:t>
             </w:r>
             <w:r>
               <w:rPr>
@@ -4227,7 +4227,7 @@
                 <w:noProof/>
                 <w:webHidden/>
               </w:rPr>
-              <w:t>15</w:t>
+              <w:t>16</w:t>
             </w:r>
             <w:r>
               <w:rPr>
@@ -4317,7 +4317,7 @@
                 <w:noProof/>
                 <w:webHidden/>
               </w:rPr>
-              <w:t>15</w:t>
+              <w:t>16</w:t>
             </w:r>
             <w:r>
               <w:rPr>
@@ -4407,7 +4407,7 @@
                 <w:noProof/>
                 <w:webHidden/>
               </w:rPr>
-              <w:t>15</w:t>
+              <w:t>16</w:t>
             </w:r>
             <w:r>
               <w:rPr>
@@ -4497,7 +4497,7 @@
                 <w:noProof/>
                 <w:webHidden/>
               </w:rPr>
-              <w:t>16</w:t>
+              <w:t>17</w:t>
             </w:r>
             <w:r>
               <w:rPr>
@@ -4587,7 +4587,7 @@
                 <w:noProof/>
                 <w:webHidden/>
               </w:rPr>
-              <w:t>16</w:t>
+              <w:t>17</w:t>
             </w:r>
             <w:r>
               <w:rPr>
@@ -4677,7 +4677,7 @@
                 <w:noProof/>
                 <w:webHidden/>
               </w:rPr>
-              <w:t>16</w:t>
+              <w:t>17</w:t>
             </w:r>
             <w:r>
               <w:rPr>
@@ -4767,7 +4767,7 @@
                 <w:noProof/>
                 <w:webHidden/>
               </w:rPr>
-              <w:t>16</w:t>
+              <w:t>17</w:t>
             </w:r>
             <w:r>
               <w:rPr>
@@ -4857,7 +4857,7 @@
                 <w:noProof/>
                 <w:webHidden/>
               </w:rPr>
-              <w:t>17</w:t>
+              <w:t>18</w:t>
             </w:r>
             <w:r>
               <w:rPr>
@@ -4947,7 +4947,7 @@
                 <w:noProof/>
                 <w:webHidden/>
               </w:rPr>
-              <w:t>18</w:t>
+              <w:t>19</w:t>
             </w:r>
             <w:r>
               <w:rPr>
@@ -5037,7 +5037,7 @@
                 <w:noProof/>
                 <w:webHidden/>
               </w:rPr>
-              <w:t>18</w:t>
+              <w:t>19</w:t>
             </w:r>
             <w:r>
               <w:rPr>
@@ -5127,7 +5127,7 @@
                 <w:noProof/>
                 <w:webHidden/>
               </w:rPr>
-              <w:t>18</w:t>
+              <w:t>19</w:t>
             </w:r>
             <w:r>
               <w:rPr>
@@ -5217,7 +5217,7 @@
                 <w:noProof/>
                 <w:webHidden/>
               </w:rPr>
-              <w:t>19</w:t>
+              <w:t>20</w:t>
             </w:r>
             <w:r>
               <w:rPr>
@@ -5307,7 +5307,7 @@
                 <w:noProof/>
                 <w:webHidden/>
               </w:rPr>
-              <w:t>19</w:t>
+              <w:t>20</w:t>
             </w:r>
             <w:r>
               <w:rPr>
@@ -5397,7 +5397,7 @@
                 <w:noProof/>
                 <w:webHidden/>
               </w:rPr>
-              <w:t>19</w:t>
+              <w:t>20</w:t>
             </w:r>
             <w:r>
               <w:rPr>
@@ -5487,7 +5487,7 @@
                 <w:noProof/>
                 <w:webHidden/>
               </w:rPr>
-              <w:t>19</w:t>
+              <w:t>20</w:t>
             </w:r>
             <w:r>
               <w:rPr>
@@ -5577,7 +5577,7 @@
                 <w:noProof/>
                 <w:webHidden/>
               </w:rPr>
-              <w:t>20</w:t>
+              <w:t>21</w:t>
             </w:r>
             <w:r>
               <w:rPr>
@@ -5667,7 +5667,7 @@
                 <w:noProof/>
                 <w:webHidden/>
               </w:rPr>
-              <w:t>20</w:t>
+              <w:t>21</w:t>
             </w:r>
             <w:r>
               <w:rPr>
@@ -5757,7 +5757,7 @@
                 <w:noProof/>
                 <w:webHidden/>
               </w:rPr>
-              <w:t>20</w:t>
+              <w:t>21</w:t>
             </w:r>
             <w:r>
               <w:rPr>
@@ -5847,7 +5847,7 @@
                 <w:noProof/>
                 <w:webHidden/>
               </w:rPr>
-              <w:t>20</w:t>
+              <w:t>21</w:t>
             </w:r>
             <w:r>
               <w:rPr>
@@ -5937,7 +5937,7 @@
                 <w:noProof/>
                 <w:webHidden/>
               </w:rPr>
-              <w:t>21</w:t>
+              <w:t>22</w:t>
             </w:r>
             <w:r>
               <w:rPr>
@@ -6027,7 +6027,7 @@
                 <w:noProof/>
                 <w:webHidden/>
               </w:rPr>
-              <w:t>21</w:t>
+              <w:t>22</w:t>
             </w:r>
             <w:r>
               <w:rPr>
@@ -6117,7 +6117,7 @@
                 <w:noProof/>
                 <w:webHidden/>
               </w:rPr>
-              <w:t>21</w:t>
+              <w:t>22</w:t>
             </w:r>
             <w:r>
               <w:rPr>
@@ -6207,7 +6207,7 @@
                 <w:noProof/>
                 <w:webHidden/>
               </w:rPr>
-              <w:t>22</w:t>
+              <w:t>23</w:t>
             </w:r>
             <w:r>
               <w:rPr>
@@ -6297,7 +6297,7 @@
                 <w:noProof/>
                 <w:webHidden/>
               </w:rPr>
-              <w:t>22</w:t>
+              <w:t>23</w:t>
             </w:r>
             <w:r>
               <w:rPr>
@@ -6387,7 +6387,7 @@
                 <w:noProof/>
                 <w:webHidden/>
               </w:rPr>
-              <w:t>23</w:t>
+              <w:t>24</w:t>
             </w:r>
             <w:r>
               <w:rPr>
@@ -6477,7 +6477,7 @@
                 <w:noProof/>
                 <w:webHidden/>
               </w:rPr>
-              <w:t>24</w:t>
+              <w:t>25</w:t>
             </w:r>
             <w:r>
               <w:rPr>
@@ -6567,7 +6567,7 @@
                 <w:noProof/>
                 <w:webHidden/>
               </w:rPr>
-              <w:t>24</w:t>
+              <w:t>25</w:t>
             </w:r>
             <w:r>
               <w:rPr>
@@ -6657,7 +6657,7 @@
                 <w:noProof/>
                 <w:webHidden/>
               </w:rPr>
-              <w:t>25</w:t>
+              <w:t>26</w:t>
             </w:r>
             <w:r>
               <w:rPr>
@@ -6747,7 +6747,7 @@
                 <w:noProof/>
                 <w:webHidden/>
               </w:rPr>
-              <w:t>25</w:t>
+              <w:t>26</w:t>
             </w:r>
             <w:r>
               <w:rPr>
@@ -6837,7 +6837,7 @@
                 <w:noProof/>
                 <w:webHidden/>
               </w:rPr>
-              <w:t>25</w:t>
+              <w:t>26</w:t>
             </w:r>
             <w:r>
               <w:rPr>
@@ -6927,7 +6927,7 @@
                 <w:noProof/>
                 <w:webHidden/>
               </w:rPr>
-              <w:t>25</w:t>
+              <w:t>26</w:t>
             </w:r>
             <w:r>
               <w:rPr>
@@ -7017,7 +7017,7 @@
                 <w:noProof/>
                 <w:webHidden/>
               </w:rPr>
-              <w:t>26</w:t>
+              <w:t>27</w:t>
             </w:r>
             <w:r>
               <w:rPr>
@@ -7111,7 +7111,7 @@
                 <w:noProof/>
                 <w:webHidden/>
               </w:rPr>
-              <w:t>26</w:t>
+              <w:t>27</w:t>
             </w:r>
             <w:r>
               <w:rPr>
@@ -7201,7 +7201,7 @@
                 <w:noProof/>
                 <w:webHidden/>
               </w:rPr>
-              <w:t>26</w:t>
+              <w:t>27</w:t>
             </w:r>
             <w:r>
               <w:rPr>
@@ -7291,7 +7291,7 @@
                 <w:noProof/>
                 <w:webHidden/>
               </w:rPr>
-              <w:t>26</w:t>
+              <w:t>27</w:t>
             </w:r>
             <w:r>
               <w:rPr>
@@ -7381,7 +7381,7 @@
                 <w:noProof/>
                 <w:webHidden/>
               </w:rPr>
-              <w:t>27</w:t>
+              <w:t>28</w:t>
             </w:r>
             <w:r>
               <w:rPr>
@@ -7471,7 +7471,7 @@
                 <w:noProof/>
                 <w:webHidden/>
               </w:rPr>
-              <w:t>27</w:t>
+              <w:t>28</w:t>
             </w:r>
             <w:r>
               <w:rPr>
@@ -7561,7 +7561,7 @@
                 <w:noProof/>
                 <w:webHidden/>
               </w:rPr>
-              <w:t>27</w:t>
+              <w:t>28</w:t>
             </w:r>
             <w:r>
               <w:rPr>
@@ -7651,7 +7651,7 @@
                 <w:noProof/>
                 <w:webHidden/>
               </w:rPr>
-              <w:t>27</w:t>
+              <w:t>28</w:t>
             </w:r>
             <w:r>
               <w:rPr>
@@ -7741,7 +7741,7 @@
                 <w:noProof/>
                 <w:webHidden/>
               </w:rPr>
-              <w:t>28</w:t>
+              <w:t>29</w:t>
             </w:r>
             <w:r>
               <w:rPr>
@@ -7831,7 +7831,7 @@
                 <w:noProof/>
                 <w:webHidden/>
               </w:rPr>
-              <w:t>28</w:t>
+              <w:t>29</w:t>
             </w:r>
             <w:r>
               <w:rPr>
@@ -7921,7 +7921,7 @@
                 <w:noProof/>
                 <w:webHidden/>
               </w:rPr>
-              <w:t>28</w:t>
+              <w:t>29</w:t>
             </w:r>
             <w:r>
               <w:rPr>
@@ -8011,7 +8011,7 @@
                 <w:noProof/>
                 <w:webHidden/>
               </w:rPr>
-              <w:t>28</w:t>
+              <w:t>29</w:t>
             </w:r>
             <w:r>
               <w:rPr>
@@ -8101,7 +8101,7 @@
                 <w:noProof/>
                 <w:webHidden/>
               </w:rPr>
-              <w:t>28</w:t>
+              <w:t>29</w:t>
             </w:r>
             <w:r>
               <w:rPr>
@@ -8191,7 +8191,7 @@
                 <w:noProof/>
                 <w:webHidden/>
               </w:rPr>
-              <w:t>29</w:t>
+              <w:t>30</w:t>
             </w:r>
             <w:r>
               <w:rPr>
@@ -8281,7 +8281,7 @@
                 <w:noProof/>
                 <w:webHidden/>
               </w:rPr>
-              <w:t>29</w:t>
+              <w:t>30</w:t>
             </w:r>
             <w:r>
               <w:rPr>
@@ -8371,7 +8371,7 @@
                 <w:noProof/>
                 <w:webHidden/>
               </w:rPr>
-              <w:t>29</w:t>
+              <w:t>30</w:t>
             </w:r>
             <w:r>
               <w:rPr>
@@ -8461,7 +8461,7 @@
                 <w:noProof/>
                 <w:webHidden/>
               </w:rPr>
-              <w:t>30</w:t>
+              <w:t>31</w:t>
             </w:r>
             <w:r>
               <w:rPr>
@@ -8551,7 +8551,7 @@
                 <w:noProof/>
                 <w:webHidden/>
               </w:rPr>
-              <w:t>30</w:t>
+              <w:t>31</w:t>
             </w:r>
             <w:r>
               <w:rPr>
@@ -8641,7 +8641,7 @@
                 <w:noProof/>
                 <w:webHidden/>
               </w:rPr>
-              <w:t>30</w:t>
+              <w:t>31</w:t>
             </w:r>
             <w:r>
               <w:rPr>
@@ -8730,7 +8730,7 @@
                 <w:noProof/>
                 <w:webHidden/>
               </w:rPr>
-              <w:t>31</w:t>
+              <w:t>32</w:t>
             </w:r>
             <w:r>
               <w:rPr>
@@ -8820,7 +8820,7 @@
                 <w:noProof/>
                 <w:webHidden/>
               </w:rPr>
-              <w:t>32</w:t>
+              <w:t>33</w:t>
             </w:r>
             <w:r>
               <w:rPr>
@@ -8910,7 +8910,7 @@
                 <w:noProof/>
                 <w:webHidden/>
               </w:rPr>
-              <w:t>32</w:t>
+              <w:t>33</w:t>
             </w:r>
             <w:r>
               <w:rPr>
@@ -9000,7 +9000,7 @@
                 <w:noProof/>
                 <w:webHidden/>
               </w:rPr>
-              <w:t>33</w:t>
+              <w:t>34</w:t>
             </w:r>
             <w:r>
               <w:rPr>
@@ -9090,7 +9090,7 @@
                 <w:noProof/>
                 <w:webHidden/>
               </w:rPr>
-              <w:t>40</w:t>
+              <w:t>41</w:t>
             </w:r>
             <w:r>
               <w:rPr>
@@ -9180,7 +9180,7 @@
                 <w:noProof/>
                 <w:webHidden/>
               </w:rPr>
-              <w:t>44</w:t>
+              <w:t>45</w:t>
             </w:r>
             <w:r>
               <w:rPr>
@@ -9270,7 +9270,7 @@
                 <w:noProof/>
                 <w:webHidden/>
               </w:rPr>
-              <w:t>45</w:t>
+              <w:t>46</w:t>
             </w:r>
             <w:r>
               <w:rPr>
@@ -9360,7 +9360,7 @@
                 <w:noProof/>
                 <w:webHidden/>
               </w:rPr>
-              <w:t>46</w:t>
+              <w:t>47</w:t>
             </w:r>
             <w:r>
               <w:rPr>
@@ -9483,7 +9483,7 @@
                 <w:noProof/>
                 <w:webHidden/>
               </w:rPr>
-              <w:t>46</w:t>
+              <w:t>47</w:t>
             </w:r>
             <w:r>
               <w:rPr>
@@ -9573,7 +9573,7 @@
                 <w:noProof/>
                 <w:webHidden/>
               </w:rPr>
-              <w:t>46</w:t>
+              <w:t>47</w:t>
             </w:r>
             <w:r>
               <w:rPr>
@@ -9663,7 +9663,7 @@
                 <w:noProof/>
                 <w:webHidden/>
               </w:rPr>
-              <w:t>47</w:t>
+              <w:t>48</w:t>
             </w:r>
             <w:r>
               <w:rPr>
@@ -9753,7 +9753,7 @@
                 <w:noProof/>
                 <w:webHidden/>
               </w:rPr>
-              <w:t>47</w:t>
+              <w:t>48</w:t>
             </w:r>
             <w:r>
               <w:rPr>
@@ -9843,7 +9843,7 @@
                 <w:noProof/>
                 <w:webHidden/>
               </w:rPr>
-              <w:t>48</w:t>
+              <w:t>49</w:t>
             </w:r>
             <w:r>
               <w:rPr>
@@ -9933,7 +9933,7 @@
                 <w:noProof/>
                 <w:webHidden/>
               </w:rPr>
-              <w:t>48</w:t>
+              <w:t>49</w:t>
             </w:r>
             <w:r>
               <w:rPr>
@@ -10023,7 +10023,7 @@
                 <w:noProof/>
                 <w:webHidden/>
               </w:rPr>
-              <w:t>48</w:t>
+              <w:t>49</w:t>
             </w:r>
             <w:r>
               <w:rPr>
@@ -10113,7 +10113,7 @@
                 <w:noProof/>
                 <w:webHidden/>
               </w:rPr>
-              <w:t>49</w:t>
+              <w:t>50</w:t>
             </w:r>
             <w:r>
               <w:rPr>
@@ -10203,7 +10203,7 @@
                 <w:noProof/>
                 <w:webHidden/>
               </w:rPr>
-              <w:t>49</w:t>
+              <w:t>50</w:t>
             </w:r>
             <w:r>
               <w:rPr>
@@ -10293,7 +10293,7 @@
                 <w:noProof/>
                 <w:webHidden/>
               </w:rPr>
-              <w:t>49</w:t>
+              <w:t>50</w:t>
             </w:r>
             <w:r>
               <w:rPr>
@@ -10383,7 +10383,7 @@
                 <w:noProof/>
                 <w:webHidden/>
               </w:rPr>
-              <w:t>50</w:t>
+              <w:t>51</w:t>
             </w:r>
             <w:r>
               <w:rPr>
@@ -10473,7 +10473,7 @@
                 <w:noProof/>
                 <w:webHidden/>
               </w:rPr>
-              <w:t>51</w:t>
+              <w:t>52</w:t>
             </w:r>
             <w:r>
               <w:rPr>
@@ -10563,7 +10563,7 @@
                 <w:noProof/>
                 <w:webHidden/>
               </w:rPr>
-              <w:t>51</w:t>
+              <w:t>52</w:t>
             </w:r>
             <w:r>
               <w:rPr>
@@ -10653,7 +10653,7 @@
                 <w:noProof/>
                 <w:webHidden/>
               </w:rPr>
-              <w:t>52</w:t>
+              <w:t>53</w:t>
             </w:r>
             <w:r>
               <w:rPr>

</xml_diff>

<commit_message>
Datasheets: AT+CONFIG_HASH joins the unreleased revision; stable tags only in AGENTS.md
</commit_message>
<xml_diff>
--- a/word/datasheet_adsbee_1090.docx
+++ b/word/datasheet_adsbee_1090.docx
@@ -10954,7 +10954,7 @@
     </w:p>
     <w:p>
       <w:r>
-        <w:t>20260924</w:t>
+        <w:t>20261013</w:t>
       </w:r>
     </w:p>
     <w:p>
@@ -10966,7 +10966,7 @@
         </w:numPr>
       </w:pPr>
       <w:r>
-        <w:t>Added new AT command:</w:t>
+        <w:t>Added new AT commands:</w:t>
       </w:r>
     </w:p>
     <w:p>
@@ -10979,23 +10979,6 @@
       </w:pPr>
       <w:r>
         <w:t>AT+FEED_ENABLE</w:t>
-      </w:r>
-    </w:p>
-    <w:p>
-      <w:r>
-        <w:t>20261013</w:t>
-      </w:r>
-    </w:p>
-    <w:p>
-      <w:pPr>
-        <w:pStyle w:val="ListParagraph"/>
-        <w:numPr>
-          <w:ilvl w:val="0"/>
-          <w:numId w:val="10"/>
-        </w:numPr>
-      </w:pPr>
-      <w:r>
-        <w:t>Added new AT command:</w:t>
       </w:r>
     </w:p>
     <w:p>

</xml_diff>

<commit_message>
Datasheets: one 20261013 revision for everything since the stable release
</commit_message>
<xml_diff>
--- a/word/datasheet_adsbee_1090.docx
+++ b/word/datasheet_adsbee_1090.docx
@@ -10848,7 +10848,7 @@
     </w:p>
     <w:p>
       <w:r>
-        <w:t>20260801</w:t>
+        <w:t>20261013</w:t>
       </w:r>
     </w:p>
     <w:p>
@@ -10888,8 +10888,51 @@
       </w:r>
     </w:p>
     <w:p>
-      <w:r>
-        <w:t>20260824</w:t>
+      <w:pPr>
+        <w:pStyle w:val="ListParagraph"/>
+        <w:numPr>
+          <w:ilvl w:val="1"/>
+          <w:numId w:val="10"/>
+        </w:numPr>
+      </w:pPr>
+      <w:r>
+        <w:t>AT+LED_BLINK</w:t>
+      </w:r>
+    </w:p>
+    <w:p>
+      <w:pPr>
+        <w:pStyle w:val="ListParagraph"/>
+        <w:numPr>
+          <w:ilvl w:val="1"/>
+          <w:numId w:val="10"/>
+        </w:numPr>
+      </w:pPr>
+      <w:r>
+        <w:t>AT+LED_ENABLE</w:t>
+      </w:r>
+    </w:p>
+    <w:p>
+      <w:pPr>
+        <w:pStyle w:val="ListParagraph"/>
+        <w:numPr>
+          <w:ilvl w:val="1"/>
+          <w:numId w:val="10"/>
+        </w:numPr>
+      </w:pPr>
+      <w:r>
+        <w:t>AT+FEED_ENABLE</w:t>
+      </w:r>
+    </w:p>
+    <w:p>
+      <w:pPr>
+        <w:pStyle w:val="ListParagraph"/>
+        <w:numPr>
+          <w:ilvl w:val="1"/>
+          <w:numId w:val="10"/>
+        </w:numPr>
+      </w:pPr>
+      <w:r>
+        <w:t>AT+CONFIG_HASH</w:t>
       </w:r>
     </w:p>
     <w:p>
@@ -10901,31 +10944,7 @@
         </w:numPr>
       </w:pPr>
       <w:r>
-        <w:t>Added new AT commands:</w:t>
-      </w:r>
-    </w:p>
-    <w:p>
-      <w:pPr>
-        <w:pStyle w:val="ListParagraph"/>
-        <w:numPr>
-          <w:ilvl w:val="1"/>
-          <w:numId w:val="10"/>
-        </w:numPr>
-      </w:pPr>
-      <w:r>
-        <w:t>AT+LED_BLINK</w:t>
-      </w:r>
-    </w:p>
-    <w:p>
-      <w:pPr>
-        <w:pStyle w:val="ListParagraph"/>
-        <w:numPr>
-          <w:ilvl w:val="1"/>
-          <w:numId w:val="10"/>
-        </w:numPr>
-      </w:pPr>
-      <w:r>
-        <w:t>AT+LED_ENABLE</w:t>
+        <w:t>Added the Status Indicators section describing the 1090, SUBG, and NETWORK LEDs.</w:t>
       </w:r>
     </w:p>
     <w:p>
@@ -10937,60 +10956,7 @@
         </w:numPr>
       </w:pPr>
       <w:r>
-        <w:t>Added the Status Indicators section describing the 1090, SUBG, and NETWORK LEDs.</w:t>
-      </w:r>
-    </w:p>
-    <w:p>
-      <w:pPr>
-        <w:pStyle w:val="ListParagraph"/>
-        <w:numPr>
-          <w:ilvl w:val="0"/>
-          <w:numId w:val="10"/>
-        </w:numPr>
-      </w:pPr>
-      <w:r>
         <w:t>Corrected the AT Commands introduction: command replies are not prefixed with “+”.</w:t>
-      </w:r>
-    </w:p>
-    <w:p>
-      <w:r>
-        <w:t>20261013</w:t>
-      </w:r>
-    </w:p>
-    <w:p>
-      <w:pPr>
-        <w:pStyle w:val="ListParagraph"/>
-        <w:numPr>
-          <w:ilvl w:val="0"/>
-          <w:numId w:val="10"/>
-        </w:numPr>
-      </w:pPr>
-      <w:r>
-        <w:t>Added new AT commands:</w:t>
-      </w:r>
-    </w:p>
-    <w:p>
-      <w:pPr>
-        <w:pStyle w:val="ListParagraph"/>
-        <w:numPr>
-          <w:ilvl w:val="1"/>
-          <w:numId w:val="10"/>
-        </w:numPr>
-      </w:pPr>
-      <w:r>
-        <w:t>AT+FEED_ENABLE</w:t>
-      </w:r>
-    </w:p>
-    <w:p>
-      <w:pPr>
-        <w:pStyle w:val="ListParagraph"/>
-        <w:numPr>
-          <w:ilvl w:val="1"/>
-          <w:numId w:val="10"/>
-        </w:numPr>
-      </w:pPr>
-      <w:r>
-        <w:t>AT+CONFIG_HASH</w:t>
       </w:r>
     </w:p>
     <w:p>

</xml_diff>

<commit_message>
Add safety notice to README and datasheets
New Safety Notice section in all five datasheets with revision entries, footer dates and TOC lines.
</commit_message>
<xml_diff>
--- a/word/datasheet_adsbee_1090.docx
+++ b/word/datasheet_adsbee_1090.docx
@@ -10665,6 +10665,95 @@
           </w:hyperlink>
         </w:p>
         <w:p>
+          <w:pPr>
+            <w:pStyle w:val="TOC1"/>
+            <w:tabs>
+              <w:tab w:val="left" w:pos="440"/>
+            </w:tabs>
+            <w:rPr>
+              <w:rFonts w:eastAsiaTheme="minorEastAsia"/>
+              <w:noProof/>
+              <w:sz w:val="24"/>
+              <w:szCs w:val="24"/>
+              <w:lang w:eastAsia="zh-CN"/>
+            </w:rPr>
+          </w:pPr>
+          <w:hyperlink w:anchor="_Toc242110620" w:history="1">
+            <w:r>
+              <w:rPr>
+                <w:rStyle w:val="Hyperlink"/>
+                <w:noProof/>
+              </w:rPr>
+              <w:t>6</w:t>
+            </w:r>
+            <w:r>
+              <w:rPr>
+                <w:rFonts w:eastAsiaTheme="minorEastAsia"/>
+                <w:noProof/>
+                <w:sz w:val="24"/>
+                <w:szCs w:val="24"/>
+                <w:lang w:eastAsia="zh-CN"/>
+              </w:rPr>
+              <w:tab/>
+            </w:r>
+            <w:r>
+              <w:rPr>
+                <w:rStyle w:val="Hyperlink"/>
+                <w:noProof/>
+              </w:rPr>
+              <w:t>Safety Notice</w:t>
+            </w:r>
+            <w:r>
+              <w:rPr>
+                <w:noProof/>
+                <w:webHidden/>
+              </w:rPr>
+              <w:tab/>
+            </w:r>
+            <w:r>
+              <w:rPr>
+                <w:noProof/>
+                <w:webHidden/>
+              </w:rPr>
+              <w:fldChar w:fldCharType="begin"/>
+            </w:r>
+            <w:r>
+              <w:rPr>
+                <w:noProof/>
+                <w:webHidden/>
+              </w:rPr>
+              <w:instrText xml:space="preserve"> PAGEREF _Toc242110620 \h </w:instrText>
+            </w:r>
+            <w:r>
+              <w:rPr>
+                <w:noProof/>
+                <w:webHidden/>
+              </w:rPr>
+            </w:r>
+            <w:r>
+              <w:rPr>
+                <w:noProof/>
+                <w:webHidden/>
+              </w:rPr>
+              <w:fldChar w:fldCharType="separate"/>
+            </w:r>
+            <w:r>
+              <w:rPr>
+                <w:noProof/>
+                <w:webHidden/>
+              </w:rPr>
+              <w:t>54</w:t>
+            </w:r>
+            <w:r>
+              <w:rPr>
+                <w:noProof/>
+                <w:webHidden/>
+              </w:rPr>
+              <w:fldChar w:fldCharType="end"/>
+            </w:r>
+          </w:hyperlink>
+        </w:p>
+        <w:p>
           <w:r>
             <w:rPr>
               <w:b/>
@@ -10848,7 +10937,7 @@
     </w:p>
     <w:p>
       <w:r>
-        <w:t>20261013</w:t>
+        <w:t>20261014</w:t>
       </w:r>
     </w:p>
     <w:p>
@@ -10957,6 +11046,18 @@
       </w:pPr>
       <w:r>
         <w:t>Corrected the AT Commands introduction: command replies are not prefixed with “+”.</w:t>
+      </w:r>
+    </w:p>
+    <w:p>
+      <w:pPr>
+        <w:pStyle w:val="ListParagraph"/>
+        <w:numPr>
+          <w:ilvl w:val="0"/>
+          <w:numId w:val="10"/>
+        </w:numPr>
+      </w:pPr>
+      <w:r>
+        <w:t>Added a Safety Notice section.</w:t>
       </w:r>
     </w:p>
     <w:p>
@@ -43786,6 +43887,25 @@
       </w:tr>
     </w:tbl>
     <w:p/>
+    <w:p>
+      <w:pPr>
+        <w:pStyle w:val="Heading1"/>
+        <w:numPr>
+          <w:ilvl w:val="0"/>
+          <w:numId w:val="4"/>
+        </w:numPr>
+      </w:pPr>
+      <w:bookmarkStart w:id="133" w:name="_Toc242110620"/>
+      <w:r>
+        <w:t>Safety Notice</w:t>
+      </w:r>
+      <w:bookmarkEnd w:id="133"/>
+    </w:p>
+    <w:p>
+      <w:r>
+        <w:t>We work hard to make ADSBee products performant and reliable, but not all aircraft broadcast their location, messages can be lost or corrupted, and hardware or software can fail. ADSBee cannot guarantee detection or accurate reporting of all traffic. Users are responsible for evaluating its suitability for their application and for the safe operation of any system it is integrated into. See our terms of sale (pantsforbirds.com/terms-of-sale) and license (github.com/CoolNamesAllTaken/adsbee) for full terms.</w:t>
+      </w:r>
+    </w:p>
     <w:sectPr>
       <w:pgSz w:w="12240" w:h="15840"/>
       <w:pgMar w:top="720" w:right="720" w:bottom="720" w:left="720" w:header="288" w:footer="288" w:gutter="0"/>
@@ -44008,13 +44128,13 @@
       <w:rPr>
         <w:color w:val="FFFFFF" w:themeColor="background1"/>
       </w:rPr>
-      <w:t>2026</w:t>
+      <w:t>20261014</w:t>
     </w:r>
     <w:r>
       <w:rPr>
         <w:color w:val="FFFFFF" w:themeColor="background1"/>
       </w:rPr>
-      <w:t>1013</w:t>
+      <w:t/>
     </w:r>
     <w:r>
       <w:rPr>

</xml_diff>

<commit_message>
Datasheets: move Safety Notice after revision history, unnumbered
</commit_message>
<xml_diff>
--- a/word/datasheet_adsbee_1090.docx
+++ b/word/datasheet_adsbee_1090.docx
@@ -1164,6 +1164,96 @@
         <w:p>
           <w:pPr>
             <w:pStyle w:val="TOC1"/>
+            <w:rPr>
+              <w:rFonts w:eastAsiaTheme="minorEastAsia" w:hint="eastAsia"/>
+              <w:noProof/>
+              <w:sz w:val="24"/>
+              <w:szCs w:val="24"/>
+              <w:lang w:eastAsia="zh-CN"/>
+            </w:rPr>
+          </w:pPr>
+          <w:hyperlink w:anchor="_Toc242110620" w:history="1">
+            <w:r>
+              <w:rPr>
+                <w:rStyle w:val="Hyperlink"/>
+                <w:noProof/>
+              </w:rPr>
+              <w:t>Safety Notice</w:t>
+            </w:r>
+            <w:r>
+              <w:rPr>
+                <w:rFonts w:hint="eastAsia"/>
+                <w:noProof/>
+                <w:webHidden/>
+              </w:rPr>
+              <w:tab/>
+            </w:r>
+            <w:r>
+              <w:rPr>
+                <w:rFonts w:hint="eastAsia"/>
+                <w:noProof/>
+                <w:webHidden/>
+              </w:rPr>
+              <w:fldChar w:fldCharType="begin"/>
+            </w:r>
+            <w:r>
+              <w:rPr>
+                <w:rFonts w:hint="eastAsia"/>
+                <w:noProof/>
+                <w:webHidden/>
+              </w:rPr>
+              <w:instrText xml:space="preserve"> </w:instrText>
+            </w:r>
+            <w:r>
+              <w:rPr>
+                <w:noProof/>
+                <w:webHidden/>
+              </w:rPr>
+              <w:instrText>PAGEREF _Toc242110620 \h</w:instrText>
+            </w:r>
+            <w:r>
+              <w:rPr>
+                <w:rFonts w:hint="eastAsia"/>
+                <w:noProof/>
+                <w:webHidden/>
+              </w:rPr>
+              <w:instrText xml:space="preserve"> </w:instrText>
+            </w:r>
+            <w:r>
+              <w:rPr>
+                <w:rFonts w:hint="eastAsia"/>
+                <w:noProof/>
+                <w:webHidden/>
+              </w:rPr>
+            </w:r>
+            <w:r>
+              <w:rPr>
+                <w:rFonts w:hint="eastAsia"/>
+                <w:noProof/>
+                <w:webHidden/>
+              </w:rPr>
+              <w:fldChar w:fldCharType="separate"/>
+            </w:r>
+            <w:r>
+              <w:rPr>
+                <w:noProof/>
+                <w:webHidden/>
+              </w:rPr>
+              <w:t>6</w:t>
+            </w:r>
+            <w:r>
+              <w:rPr>
+                <w:rFonts w:hint="eastAsia"/>
+                <w:noProof/>
+                <w:webHidden/>
+              </w:rPr>
+              <w:fldChar w:fldCharType="end"/>
+            </w:r>
+          </w:hyperlink>
+        </w:p>
+        <w:p>
+          <w:pPr>
+            <w:pStyle w:val="TOC1"/>
             <w:tabs>
               <w:tab w:val="left" w:pos="440"/>
             </w:tabs>
@@ -10665,95 +10755,6 @@
           </w:hyperlink>
         </w:p>
         <w:p>
-          <w:pPr>
-            <w:pStyle w:val="TOC1"/>
-            <w:tabs>
-              <w:tab w:val="left" w:pos="440"/>
-            </w:tabs>
-            <w:rPr>
-              <w:rFonts w:eastAsiaTheme="minorEastAsia"/>
-              <w:noProof/>
-              <w:sz w:val="24"/>
-              <w:szCs w:val="24"/>
-              <w:lang w:eastAsia="zh-CN"/>
-            </w:rPr>
-          </w:pPr>
-          <w:hyperlink w:anchor="_Toc242110620" w:history="1">
-            <w:r>
-              <w:rPr>
-                <w:rStyle w:val="Hyperlink"/>
-                <w:noProof/>
-              </w:rPr>
-              <w:t>6</w:t>
-            </w:r>
-            <w:r>
-              <w:rPr>
-                <w:rFonts w:eastAsiaTheme="minorEastAsia"/>
-                <w:noProof/>
-                <w:sz w:val="24"/>
-                <w:szCs w:val="24"/>
-                <w:lang w:eastAsia="zh-CN"/>
-              </w:rPr>
-              <w:tab/>
-            </w:r>
-            <w:r>
-              <w:rPr>
-                <w:rStyle w:val="Hyperlink"/>
-                <w:noProof/>
-              </w:rPr>
-              <w:t>Safety Notice</w:t>
-            </w:r>
-            <w:r>
-              <w:rPr>
-                <w:noProof/>
-                <w:webHidden/>
-              </w:rPr>
-              <w:tab/>
-            </w:r>
-            <w:r>
-              <w:rPr>
-                <w:noProof/>
-                <w:webHidden/>
-              </w:rPr>
-              <w:fldChar w:fldCharType="begin"/>
-            </w:r>
-            <w:r>
-              <w:rPr>
-                <w:noProof/>
-                <w:webHidden/>
-              </w:rPr>
-              <w:instrText xml:space="preserve"> PAGEREF _Toc242110620 \h </w:instrText>
-            </w:r>
-            <w:r>
-              <w:rPr>
-                <w:noProof/>
-                <w:webHidden/>
-              </w:rPr>
-            </w:r>
-            <w:r>
-              <w:rPr>
-                <w:noProof/>
-                <w:webHidden/>
-              </w:rPr>
-              <w:fldChar w:fldCharType="separate"/>
-            </w:r>
-            <w:r>
-              <w:rPr>
-                <w:noProof/>
-                <w:webHidden/>
-              </w:rPr>
-              <w:t>54</w:t>
-            </w:r>
-            <w:r>
-              <w:rPr>
-                <w:noProof/>
-                <w:webHidden/>
-              </w:rPr>
-              <w:fldChar w:fldCharType="end"/>
-            </w:r>
-          </w:hyperlink>
-        </w:p>
-        <w:p>
           <w:r>
             <w:rPr>
               <w:b/>
@@ -11058,6 +11059,21 @@
       </w:pPr>
       <w:r>
         <w:t>Added a Safety Notice section.</w:t>
+      </w:r>
+    </w:p>
+    <w:p>
+      <w:pPr>
+        <w:pStyle w:val="Heading1"/>
+      </w:pPr>
+      <w:bookmarkStart w:id="133" w:name="_Toc242110620"/>
+      <w:r>
+        <w:t>Safety Notice</w:t>
+      </w:r>
+      <w:bookmarkEnd w:id="133"/>
+    </w:p>
+    <w:p>
+      <w:r>
+        <w:t>We work hard to make ADSBee products performant and reliable, but not all aircraft broadcast their location, messages can be lost or corrupted, and hardware or software can fail. ADSBee cannot guarantee detection or accurate reporting of all traffic. Users are responsible for evaluating its suitability for their application and for the safe operation of any system it is integrated into. See our terms of sale (pantsforbirds.com/terms-of-sale) and license (github.com/CoolNamesAllTaken/adsbee) for full terms.</w:t>
       </w:r>
     </w:p>
     <w:p>
@@ -43887,25 +43903,6 @@
       </w:tr>
     </w:tbl>
     <w:p/>
-    <w:p>
-      <w:pPr>
-        <w:pStyle w:val="Heading1"/>
-        <w:numPr>
-          <w:ilvl w:val="0"/>
-          <w:numId w:val="4"/>
-        </w:numPr>
-      </w:pPr>
-      <w:bookmarkStart w:id="133" w:name="_Toc242110620"/>
-      <w:r>
-        <w:t>Safety Notice</w:t>
-      </w:r>
-      <w:bookmarkEnd w:id="133"/>
-    </w:p>
-    <w:p>
-      <w:r>
-        <w:t>We work hard to make ADSBee products performant and reliable, but not all aircraft broadcast their location, messages can be lost or corrupted, and hardware or software can fail. ADSBee cannot guarantee detection or accurate reporting of all traffic. Users are responsible for evaluating its suitability for their application and for the safe operation of any system it is integrated into. See our terms of sale (pantsforbirds.com/terms-of-sale) and license (github.com/CoolNamesAllTaken/adsbee) for full terms.</w:t>
-      </w:r>
-    </w:p>
     <w:sectPr>
       <w:pgSz w:w="12240" w:h="15840"/>
       <w:pgMar w:top="720" w:right="720" w:bottom="720" w:left="720" w:header="288" w:footer="288" w:gutter="0"/>

</xml_diff>

<commit_message>
Datasheets: leave the Safety Notice out of the revision history
The owner exempted this notice from the revision history: each revision list and footer
Document Version is back to what main has. The notice and its TOC line are unchanged.
</commit_message>
<xml_diff>
--- a/word/datasheet_adsbee_1090.docx
+++ b/word/datasheet_adsbee_1090.docx
@@ -10938,7 +10938,7 @@
     </w:p>
     <w:p>
       <w:r>
-        <w:t>20261014</w:t>
+        <w:t>20261013</w:t>
       </w:r>
     </w:p>
     <w:p>
@@ -11047,18 +11047,6 @@
       </w:pPr>
       <w:r>
         <w:t>Corrected the AT Commands introduction: command replies are not prefixed with “+”.</w:t>
-      </w:r>
-    </w:p>
-    <w:p>
-      <w:pPr>
-        <w:pStyle w:val="ListParagraph"/>
-        <w:numPr>
-          <w:ilvl w:val="0"/>
-          <w:numId w:val="10"/>
-        </w:numPr>
-      </w:pPr>
-      <w:r>
-        <w:t>Added a Safety Notice section.</w:t>
       </w:r>
     </w:p>
     <w:p>
@@ -44125,13 +44113,13 @@
       <w:rPr>
         <w:color w:val="FFFFFF" w:themeColor="background1"/>
       </w:rPr>
-      <w:t>20261014</w:t>
+      <w:t>2026</w:t>
     </w:r>
     <w:r>
       <w:rPr>
         <w:color w:val="FFFFFF" w:themeColor="background1"/>
       </w:rPr>
-      <w:t/>
+      <w:t>1013</w:t>
     </w:r>
     <w:r>
       <w:rPr>

</xml_diff>

<commit_message>
Datasheets: AT+MAX_DISTANCE, r_dst and r_dir in aircraft JSON
</commit_message>
<xml_diff>
--- a/word/datasheet_adsbee_1090.docx
+++ b/word/datasheet_adsbee_1090.docx
@@ -5513,7 +5513,7 @@
               <w:lang w:eastAsia="zh-CN"/>
             </w:rPr>
           </w:pPr>
-          <w:hyperlink w:anchor="_Toc242110561" w:history="1">
+          <w:hyperlink w:anchor="_Toc242110901" w:history="1">
             <w:r>
               <w:rPr>
                 <w:rStyle w:val="Hyperlink"/>
@@ -5536,6 +5536,276 @@
                 <w:rStyle w:val="Hyperlink"/>
                 <w:noProof/>
               </w:rPr>
+              <w:t>AT+MAX_DISTANCE</w:t>
+            </w:r>
+            <w:r>
+              <w:rPr>
+                <w:noProof/>
+                <w:webHidden/>
+              </w:rPr>
+              <w:tab/>
+            </w:r>
+            <w:r>
+              <w:rPr>
+                <w:noProof/>
+                <w:webHidden/>
+              </w:rPr>
+              <w:fldChar w:fldCharType="begin"/>
+            </w:r>
+            <w:r>
+              <w:rPr>
+                <w:noProof/>
+                <w:webHidden/>
+              </w:rPr>
+              <w:instrText xml:space="preserve"> PAGEREF _Toc242110901 \h </w:instrText>
+            </w:r>
+            <w:r>
+              <w:rPr>
+                <w:noProof/>
+                <w:webHidden/>
+              </w:rPr>
+            </w:r>
+            <w:r>
+              <w:rPr>
+                <w:noProof/>
+                <w:webHidden/>
+              </w:rPr>
+              <w:fldChar w:fldCharType="separate"/>
+            </w:r>
+            <w:r>
+              <w:rPr>
+                <w:noProof/>
+                <w:webHidden/>
+              </w:rPr>
+              <w:t>20</w:t>
+            </w:r>
+            <w:r>
+              <w:rPr>
+                <w:noProof/>
+                <w:webHidden/>
+              </w:rPr>
+              <w:fldChar w:fldCharType="end"/>
+            </w:r>
+          </w:hyperlink>
+        </w:p>
+        <w:p>
+          <w:pPr>
+            <w:pStyle w:val="TOC3"/>
+            <w:tabs>
+              <w:tab w:val="left" w:pos="1440"/>
+              <w:tab w:val="right" w:leader="dot" w:pos="10790"/>
+            </w:tabs>
+            <w:rPr>
+              <w:rFonts w:eastAsiaTheme="minorEastAsia"/>
+              <w:noProof/>
+              <w:sz w:val="24"/>
+              <w:szCs w:val="24"/>
+              <w:lang w:eastAsia="zh-CN"/>
+            </w:rPr>
+          </w:pPr>
+          <w:hyperlink w:anchor="_Toc242110902" w:history="1">
+            <w:r>
+              <w:rPr>
+                <w:rStyle w:val="Hyperlink"/>
+                <w:noProof/>
+              </w:rPr>
+              <w:t>4.18.1</w:t>
+            </w:r>
+            <w:r>
+              <w:rPr>
+                <w:rFonts w:eastAsiaTheme="minorEastAsia"/>
+                <w:noProof/>
+                <w:sz w:val="24"/>
+                <w:szCs w:val="24"/>
+                <w:lang w:eastAsia="zh-CN"/>
+              </w:rPr>
+              <w:tab/>
+            </w:r>
+            <w:r>
+              <w:rPr>
+                <w:rStyle w:val="Hyperlink"/>
+                <w:noProof/>
+              </w:rPr>
+              <w:t>Set the Maximum Distance</w:t>
+            </w:r>
+            <w:r>
+              <w:rPr>
+                <w:noProof/>
+                <w:webHidden/>
+              </w:rPr>
+              <w:tab/>
+            </w:r>
+            <w:r>
+              <w:rPr>
+                <w:noProof/>
+                <w:webHidden/>
+              </w:rPr>
+              <w:fldChar w:fldCharType="begin"/>
+            </w:r>
+            <w:r>
+              <w:rPr>
+                <w:noProof/>
+                <w:webHidden/>
+              </w:rPr>
+              <w:instrText xml:space="preserve"> PAGEREF _Toc242110902 \h </w:instrText>
+            </w:r>
+            <w:r>
+              <w:rPr>
+                <w:noProof/>
+                <w:webHidden/>
+              </w:rPr>
+            </w:r>
+            <w:r>
+              <w:rPr>
+                <w:noProof/>
+                <w:webHidden/>
+              </w:rPr>
+              <w:fldChar w:fldCharType="separate"/>
+            </w:r>
+            <w:r>
+              <w:rPr>
+                <w:noProof/>
+                <w:webHidden/>
+              </w:rPr>
+              <w:t>20</w:t>
+            </w:r>
+            <w:r>
+              <w:rPr>
+                <w:noProof/>
+                <w:webHidden/>
+              </w:rPr>
+              <w:fldChar w:fldCharType="end"/>
+            </w:r>
+          </w:hyperlink>
+        </w:p>
+        <w:p>
+          <w:pPr>
+            <w:pStyle w:val="TOC3"/>
+            <w:tabs>
+              <w:tab w:val="left" w:pos="1440"/>
+              <w:tab w:val="right" w:leader="dot" w:pos="10790"/>
+            </w:tabs>
+            <w:rPr>
+              <w:rFonts w:eastAsiaTheme="minorEastAsia"/>
+              <w:noProof/>
+              <w:sz w:val="24"/>
+              <w:szCs w:val="24"/>
+              <w:lang w:eastAsia="zh-CN"/>
+            </w:rPr>
+          </w:pPr>
+          <w:hyperlink w:anchor="_Toc242110903" w:history="1">
+            <w:r>
+              <w:rPr>
+                <w:rStyle w:val="Hyperlink"/>
+                <w:noProof/>
+              </w:rPr>
+              <w:t>4.18.2</w:t>
+            </w:r>
+            <w:r>
+              <w:rPr>
+                <w:rFonts w:eastAsiaTheme="minorEastAsia"/>
+                <w:noProof/>
+                <w:sz w:val="24"/>
+                <w:szCs w:val="24"/>
+                <w:lang w:eastAsia="zh-CN"/>
+              </w:rPr>
+              <w:tab/>
+            </w:r>
+            <w:r>
+              <w:rPr>
+                <w:rStyle w:val="Hyperlink"/>
+                <w:noProof/>
+              </w:rPr>
+              <w:t>Query the Maximum Distance</w:t>
+            </w:r>
+            <w:r>
+              <w:rPr>
+                <w:noProof/>
+                <w:webHidden/>
+              </w:rPr>
+              <w:tab/>
+            </w:r>
+            <w:r>
+              <w:rPr>
+                <w:noProof/>
+                <w:webHidden/>
+              </w:rPr>
+              <w:fldChar w:fldCharType="begin"/>
+            </w:r>
+            <w:r>
+              <w:rPr>
+                <w:noProof/>
+                <w:webHidden/>
+              </w:rPr>
+              <w:instrText xml:space="preserve"> PAGEREF _Toc242110903 \h </w:instrText>
+            </w:r>
+            <w:r>
+              <w:rPr>
+                <w:noProof/>
+                <w:webHidden/>
+              </w:rPr>
+            </w:r>
+            <w:r>
+              <w:rPr>
+                <w:noProof/>
+                <w:webHidden/>
+              </w:rPr>
+              <w:fldChar w:fldCharType="separate"/>
+            </w:r>
+            <w:r>
+              <w:rPr>
+                <w:noProof/>
+                <w:webHidden/>
+              </w:rPr>
+              <w:t>21</w:t>
+            </w:r>
+            <w:r>
+              <w:rPr>
+                <w:noProof/>
+                <w:webHidden/>
+              </w:rPr>
+              <w:fldChar w:fldCharType="end"/>
+            </w:r>
+          </w:hyperlink>
+        </w:p>
+        <w:p>
+          <w:pPr>
+            <w:pStyle w:val="TOC2"/>
+            <w:tabs>
+              <w:tab w:val="left" w:pos="960"/>
+              <w:tab w:val="right" w:leader="dot" w:pos="10790"/>
+            </w:tabs>
+            <w:rPr>
+              <w:rFonts w:eastAsiaTheme="minorEastAsia"/>
+              <w:noProof/>
+              <w:sz w:val="24"/>
+              <w:szCs w:val="24"/>
+              <w:lang w:eastAsia="zh-CN"/>
+            </w:rPr>
+          </w:pPr>
+          <w:hyperlink w:anchor="_Toc242110561" w:history="1">
+            <w:r>
+              <w:rPr>
+                <w:rStyle w:val="Hyperlink"/>
+                <w:noProof/>
+              </w:rPr>
+              <w:t>4.19</w:t>
+            </w:r>
+            <w:r>
+              <w:rPr>
+                <w:rFonts w:eastAsiaTheme="minorEastAsia"/>
+                <w:noProof/>
+                <w:sz w:val="24"/>
+                <w:szCs w:val="24"/>
+                <w:lang w:eastAsia="zh-CN"/>
+              </w:rPr>
+              <w:tab/>
+            </w:r>
+            <w:r>
+              <w:rPr>
+                <w:rStyle w:val="Hyperlink"/>
+                <w:noProof/>
+              </w:rPr>
               <w:t>AT+LOG_LEVEL</w:t>
             </w:r>
             <w:r>
@@ -5577,7 +5847,7 @@
                 <w:noProof/>
                 <w:webHidden/>
               </w:rPr>
-              <w:t>20</w:t>
+              <w:t>21</w:t>
             </w:r>
             <w:r>
               <w:rPr>
@@ -5609,7 +5879,7 @@
                 <w:rStyle w:val="Hyperlink"/>
                 <w:noProof/>
               </w:rPr>
-              <w:t>4.19</w:t>
+              <w:t>4.20</w:t>
             </w:r>
             <w:r>
               <w:rPr>
@@ -5699,7 +5969,7 @@
                 <w:rStyle w:val="Hyperlink"/>
                 <w:noProof/>
               </w:rPr>
-              <w:t>4.19.1</w:t>
+              <w:t>4.20.1</w:t>
             </w:r>
             <w:r>
               <w:rPr>
@@ -5789,7 +6059,7 @@
                 <w:rStyle w:val="Hyperlink"/>
                 <w:noProof/>
               </w:rPr>
-              <w:t>4.19.2</w:t>
+              <w:t>4.20.2</w:t>
             </w:r>
             <w:r>
               <w:rPr>
@@ -5847,7 +6117,7 @@
                 <w:noProof/>
                 <w:webHidden/>
               </w:rPr>
-              <w:t>21</w:t>
+              <w:t>22</w:t>
             </w:r>
             <w:r>
               <w:rPr>
@@ -5879,7 +6149,7 @@
                 <w:rStyle w:val="Hyperlink"/>
                 <w:noProof/>
               </w:rPr>
-              <w:t>4.20</w:t>
+              <w:t>4.21</w:t>
             </w:r>
             <w:r>
               <w:rPr>
@@ -5937,7 +6207,7 @@
                 <w:noProof/>
                 <w:webHidden/>
               </w:rPr>
-              <w:t>21</w:t>
+              <w:t>22</w:t>
             </w:r>
             <w:r>
               <w:rPr>
@@ -5969,7 +6239,7 @@
                 <w:rStyle w:val="Hyperlink"/>
                 <w:noProof/>
               </w:rPr>
-              <w:t>4.21</w:t>
+              <w:t>4.22</w:t>
             </w:r>
             <w:r>
               <w:rPr>
@@ -6027,7 +6297,7 @@
                 <w:noProof/>
                 <w:webHidden/>
               </w:rPr>
-              <w:t>22</w:t>
+              <w:t>23</w:t>
             </w:r>
             <w:r>
               <w:rPr>
@@ -6059,7 +6329,7 @@
                 <w:rStyle w:val="Hyperlink"/>
                 <w:noProof/>
               </w:rPr>
-              <w:t>4.21.1</w:t>
+              <w:t>4.22.1</w:t>
             </w:r>
             <w:r>
               <w:rPr>
@@ -6117,7 +6387,7 @@
                 <w:noProof/>
                 <w:webHidden/>
               </w:rPr>
-              <w:t>22</w:t>
+              <w:t>23</w:t>
             </w:r>
             <w:r>
               <w:rPr>
@@ -6149,7 +6419,7 @@
                 <w:rStyle w:val="Hyperlink"/>
                 <w:noProof/>
               </w:rPr>
-              <w:t>4.21.2</w:t>
+              <w:t>4.22.2</w:t>
             </w:r>
             <w:r>
               <w:rPr>
@@ -6207,7 +6477,7 @@
                 <w:noProof/>
                 <w:webHidden/>
               </w:rPr>
-              <w:t>22</w:t>
+              <w:t>23</w:t>
             </w:r>
             <w:r>
               <w:rPr>
@@ -6239,7 +6509,7 @@
                 <w:rStyle w:val="Hyperlink"/>
                 <w:noProof/>
               </w:rPr>
-              <w:t>4.22</w:t>
+              <w:t>4.23</w:t>
             </w:r>
             <w:r>
               <w:rPr>
@@ -6297,7 +6567,7 @@
                 <w:noProof/>
                 <w:webHidden/>
               </w:rPr>
-              <w:t>23</w:t>
+              <w:t>24</w:t>
             </w:r>
             <w:r>
               <w:rPr>
@@ -6329,7 +6599,7 @@
                 <w:rStyle w:val="Hyperlink"/>
                 <w:noProof/>
               </w:rPr>
-              <w:t>4.22.1</w:t>
+              <w:t>4.23.1</w:t>
             </w:r>
             <w:r>
               <w:rPr>
@@ -6387,7 +6657,7 @@
                 <w:noProof/>
                 <w:webHidden/>
               </w:rPr>
-              <w:t>23</w:t>
+              <w:t>24</w:t>
             </w:r>
             <w:r>
               <w:rPr>
@@ -6419,7 +6689,7 @@
                 <w:rStyle w:val="Hyperlink"/>
                 <w:noProof/>
               </w:rPr>
-              <w:t>4.22.2</w:t>
+              <w:t>4.23.2</w:t>
             </w:r>
             <w:r>
               <w:rPr>
@@ -6477,7 +6747,7 @@
                 <w:noProof/>
                 <w:webHidden/>
               </w:rPr>
-              <w:t>24</w:t>
+              <w:t>25</w:t>
             </w:r>
             <w:r>
               <w:rPr>
@@ -6509,7 +6779,7 @@
                 <w:rStyle w:val="Hyperlink"/>
                 <w:noProof/>
               </w:rPr>
-              <w:t>4.23</w:t>
+              <w:t>4.24</w:t>
             </w:r>
             <w:r>
               <w:rPr>
@@ -6567,7 +6837,7 @@
                 <w:noProof/>
                 <w:webHidden/>
               </w:rPr>
-              <w:t>25</w:t>
+              <w:t>26</w:t>
             </w:r>
             <w:r>
               <w:rPr>
@@ -6599,7 +6869,7 @@
                 <w:rStyle w:val="Hyperlink"/>
                 <w:noProof/>
               </w:rPr>
-              <w:t>4.23.1</w:t>
+              <w:t>4.24.1</w:t>
             </w:r>
             <w:r>
               <w:rPr>
@@ -6657,7 +6927,7 @@
                 <w:noProof/>
                 <w:webHidden/>
               </w:rPr>
-              <w:t>25</w:t>
+              <w:t>26</w:t>
             </w:r>
             <w:r>
               <w:rPr>
@@ -6689,7 +6959,7 @@
                 <w:rStyle w:val="Hyperlink"/>
                 <w:noProof/>
               </w:rPr>
-              <w:t>4.23.2</w:t>
+              <w:t>4.24.2</w:t>
             </w:r>
             <w:r>
               <w:rPr>
@@ -6747,7 +7017,7 @@
                 <w:noProof/>
                 <w:webHidden/>
               </w:rPr>
-              <w:t>26</w:t>
+              <w:t>27</w:t>
             </w:r>
             <w:r>
               <w:rPr>
@@ -6779,7 +7049,7 @@
                 <w:rStyle w:val="Hyperlink"/>
                 <w:noProof/>
               </w:rPr>
-              <w:t>4.23.3</w:t>
+              <w:t>4.24.3</w:t>
             </w:r>
             <w:r>
               <w:rPr>
@@ -6837,7 +7107,7 @@
                 <w:noProof/>
                 <w:webHidden/>
               </w:rPr>
-              <w:t>26</w:t>
+              <w:t>27</w:t>
             </w:r>
             <w:r>
               <w:rPr>
@@ -6869,7 +7139,7 @@
                 <w:rStyle w:val="Hyperlink"/>
                 <w:noProof/>
               </w:rPr>
-              <w:t>4.23.4</w:t>
+              <w:t>4.24.4</w:t>
             </w:r>
             <w:r>
               <w:rPr>
@@ -6927,7 +7197,7 @@
                 <w:noProof/>
                 <w:webHidden/>
               </w:rPr>
-              <w:t>26</w:t>
+              <w:t>27</w:t>
             </w:r>
             <w:r>
               <w:rPr>
@@ -6959,7 +7229,7 @@
                 <w:rStyle w:val="Hyperlink"/>
                 <w:noProof/>
               </w:rPr>
-              <w:t>4.23.5</w:t>
+              <w:t>4.24.5</w:t>
             </w:r>
             <w:r>
               <w:rPr>
@@ -7017,7 +7287,7 @@
                 <w:noProof/>
                 <w:webHidden/>
               </w:rPr>
-              <w:t>26</w:t>
+              <w:t>27</w:t>
             </w:r>
             <w:r>
               <w:rPr>
@@ -7049,7 +7319,7 @@
                 <w:rStyle w:val="Hyperlink"/>
                 <w:noProof/>
               </w:rPr>
-              <w:t>4.24</w:t>
+              <w:t>4.25</w:t>
             </w:r>
             <w:r>
               <w:rPr>
@@ -7107,7 +7377,7 @@
                 <w:noProof/>
                 <w:webHidden/>
               </w:rPr>
-              <w:t>27</w:t>
+              <w:t>28</w:t>
             </w:r>
             <w:r>
               <w:rPr>
@@ -7141,7 +7411,7 @@
                 <w:bCs/>
                 <w:noProof/>
               </w:rPr>
-              <w:t>4.24.1</w:t>
+              <w:t>4.25.1</w:t>
             </w:r>
             <w:r>
               <w:rPr>
@@ -7201,7 +7471,7 @@
                 <w:noProof/>
                 <w:webHidden/>
               </w:rPr>
-              <w:t>27</w:t>
+              <w:t>28</w:t>
             </w:r>
             <w:r>
               <w:rPr>
@@ -7233,7 +7503,7 @@
                 <w:rStyle w:val="Hyperlink"/>
                 <w:noProof/>
               </w:rPr>
-              <w:t>4.24.2</w:t>
+              <w:t>4.25.2</w:t>
             </w:r>
             <w:r>
               <w:rPr>
@@ -7291,7 +7561,7 @@
                 <w:noProof/>
                 <w:webHidden/>
               </w:rPr>
-              <w:t>27</w:t>
+              <w:t>28</w:t>
             </w:r>
             <w:r>
               <w:rPr>
@@ -7323,7 +7593,7 @@
                 <w:rStyle w:val="Hyperlink"/>
                 <w:noProof/>
               </w:rPr>
-              <w:t>4.25</w:t>
+              <w:t>4.26</w:t>
             </w:r>
             <w:r>
               <w:rPr>
@@ -7381,7 +7651,7 @@
                 <w:noProof/>
                 <w:webHidden/>
               </w:rPr>
-              <w:t>27</w:t>
+              <w:t>28</w:t>
             </w:r>
             <w:r>
               <w:rPr>
@@ -7413,7 +7683,7 @@
                 <w:rStyle w:val="Hyperlink"/>
                 <w:noProof/>
               </w:rPr>
-              <w:t>4.26</w:t>
+              <w:t>4.27</w:t>
             </w:r>
             <w:r>
               <w:rPr>
@@ -7471,7 +7741,7 @@
                 <w:noProof/>
                 <w:webHidden/>
               </w:rPr>
-              <w:t>28</w:t>
+              <w:t>29</w:t>
             </w:r>
             <w:r>
               <w:rPr>
@@ -7503,7 +7773,7 @@
                 <w:rStyle w:val="Hyperlink"/>
                 <w:noProof/>
               </w:rPr>
-              <w:t>4.27</w:t>
+              <w:t>4.28</w:t>
             </w:r>
             <w:r>
               <w:rPr>
@@ -7561,7 +7831,7 @@
                 <w:noProof/>
                 <w:webHidden/>
               </w:rPr>
-              <w:t>28</w:t>
+              <w:t>29</w:t>
             </w:r>
             <w:r>
               <w:rPr>
@@ -7593,7 +7863,7 @@
                 <w:rStyle w:val="Hyperlink"/>
                 <w:noProof/>
               </w:rPr>
-              <w:t>4.27.1</w:t>
+              <w:t>4.28.1</w:t>
             </w:r>
             <w:r>
               <w:rPr>
@@ -7651,7 +7921,7 @@
                 <w:noProof/>
                 <w:webHidden/>
               </w:rPr>
-              <w:t>28</w:t>
+              <w:t>29</w:t>
             </w:r>
             <w:r>
               <w:rPr>
@@ -7683,7 +7953,7 @@
                 <w:rStyle w:val="Hyperlink"/>
                 <w:noProof/>
               </w:rPr>
-              <w:t>4.27.2</w:t>
+              <w:t>4.28.2</w:t>
             </w:r>
             <w:r>
               <w:rPr>
@@ -7741,7 +8011,7 @@
                 <w:noProof/>
                 <w:webHidden/>
               </w:rPr>
-              <w:t>28</w:t>
+              <w:t>29</w:t>
             </w:r>
             <w:r>
               <w:rPr>
@@ -7773,7 +8043,7 @@
                 <w:rStyle w:val="Hyperlink"/>
                 <w:noProof/>
               </w:rPr>
-              <w:t>4.28</w:t>
+              <w:t>4.29</w:t>
             </w:r>
             <w:r>
               <w:rPr>
@@ -7831,7 +8101,7 @@
                 <w:noProof/>
                 <w:webHidden/>
               </w:rPr>
-              <w:t>29</w:t>
+              <w:t>30</w:t>
             </w:r>
             <w:r>
               <w:rPr>
@@ -7863,7 +8133,7 @@
                 <w:rStyle w:val="Hyperlink"/>
                 <w:noProof/>
               </w:rPr>
-              <w:t>4.29</w:t>
+              <w:t>4.30</w:t>
             </w:r>
             <w:r>
               <w:rPr>
@@ -7921,7 +8191,7 @@
                 <w:noProof/>
                 <w:webHidden/>
               </w:rPr>
-              <w:t>29</w:t>
+              <w:t>30</w:t>
             </w:r>
             <w:r>
               <w:rPr>
@@ -7953,7 +8223,7 @@
                 <w:rStyle w:val="Hyperlink"/>
                 <w:noProof/>
               </w:rPr>
-              <w:t>4.29.1</w:t>
+              <w:t>4.30.1</w:t>
             </w:r>
             <w:r>
               <w:rPr>
@@ -8011,7 +8281,7 @@
                 <w:noProof/>
                 <w:webHidden/>
               </w:rPr>
-              <w:t>29</w:t>
+              <w:t>30</w:t>
             </w:r>
             <w:r>
               <w:rPr>
@@ -8043,7 +8313,7 @@
                 <w:rStyle w:val="Hyperlink"/>
                 <w:noProof/>
               </w:rPr>
-              <w:t>4.29.2</w:t>
+              <w:t>4.30.2</w:t>
             </w:r>
             <w:r>
               <w:rPr>
@@ -8101,7 +8371,7 @@
                 <w:noProof/>
                 <w:webHidden/>
               </w:rPr>
-              <w:t>29</w:t>
+              <w:t>30</w:t>
             </w:r>
             <w:r>
               <w:rPr>
@@ -8133,7 +8403,7 @@
                 <w:rStyle w:val="Hyperlink"/>
                 <w:noProof/>
               </w:rPr>
-              <w:t>4.29.3</w:t>
+              <w:t>4.30.3</w:t>
             </w:r>
             <w:r>
               <w:rPr>
@@ -8191,7 +8461,7 @@
                 <w:noProof/>
                 <w:webHidden/>
               </w:rPr>
-              <w:t>29</w:t>
+              <w:t>30</w:t>
             </w:r>
             <w:r>
               <w:rPr>
@@ -8223,7 +8493,7 @@
                 <w:rStyle w:val="Hyperlink"/>
                 <w:noProof/>
               </w:rPr>
-              <w:t>4.30</w:t>
+              <w:t>4.31</w:t>
             </w:r>
             <w:r>
               <w:rPr>
@@ -8281,7 +8551,7 @@
                 <w:noProof/>
                 <w:webHidden/>
               </w:rPr>
-              <w:t>30</w:t>
+              <w:t>31</w:t>
             </w:r>
             <w:r>
               <w:rPr>
@@ -8313,7 +8583,7 @@
                 <w:rStyle w:val="Hyperlink"/>
                 <w:noProof/>
               </w:rPr>
-              <w:t>4.30.1</w:t>
+              <w:t>4.31.1</w:t>
             </w:r>
             <w:r>
               <w:rPr>
@@ -8371,7 +8641,7 @@
                 <w:noProof/>
                 <w:webHidden/>
               </w:rPr>
-              <w:t>30</w:t>
+              <w:t>31</w:t>
             </w:r>
             <w:r>
               <w:rPr>
@@ -8403,7 +8673,7 @@
                 <w:rStyle w:val="Hyperlink"/>
                 <w:noProof/>
               </w:rPr>
-              <w:t>4.30.2</w:t>
+              <w:t>4.31.2</w:t>
             </w:r>
             <w:r>
               <w:rPr>
@@ -8461,7 +8731,7 @@
                 <w:noProof/>
                 <w:webHidden/>
               </w:rPr>
-              <w:t>30</w:t>
+              <w:t>31</w:t>
             </w:r>
             <w:r>
               <w:rPr>
@@ -8493,7 +8763,7 @@
                 <w:rStyle w:val="Hyperlink"/>
                 <w:noProof/>
               </w:rPr>
-              <w:t>4.31</w:t>
+              <w:t>4.32</w:t>
             </w:r>
             <w:r>
               <w:rPr>
@@ -8551,7 +8821,7 @@
                 <w:noProof/>
                 <w:webHidden/>
               </w:rPr>
-              <w:t>31</w:t>
+              <w:t>32</w:t>
             </w:r>
             <w:r>
               <w:rPr>
@@ -8583,7 +8853,7 @@
                 <w:rStyle w:val="Hyperlink"/>
                 <w:noProof/>
               </w:rPr>
-              <w:t>4.31.1</w:t>
+              <w:t>4.32.1</w:t>
             </w:r>
             <w:r>
               <w:rPr>
@@ -8641,7 +8911,7 @@
                 <w:noProof/>
                 <w:webHidden/>
               </w:rPr>
-              <w:t>31</w:t>
+              <w:t>32</w:t>
             </w:r>
             <w:r>
               <w:rPr>
@@ -8673,7 +8943,7 @@
                 <w:rStyle w:val="Hyperlink"/>
                 <w:noProof/>
               </w:rPr>
-              <w:t>4.31.2</w:t>
+              <w:t>4.32.2</w:t>
             </w:r>
             <w:r>
               <w:rPr>
@@ -8731,7 +9001,7 @@
                 <w:noProof/>
                 <w:webHidden/>
               </w:rPr>
-              <w:t>31</w:t>
+              <w:t>32</w:t>
             </w:r>
             <w:r>
               <w:rPr>
@@ -8820,7 +9090,7 @@
                 <w:noProof/>
                 <w:webHidden/>
               </w:rPr>
-              <w:t>32</w:t>
+              <w:t>33</w:t>
             </w:r>
             <w:r>
               <w:rPr>
@@ -8910,7 +9180,7 @@
                 <w:noProof/>
                 <w:webHidden/>
               </w:rPr>
-              <w:t>33</w:t>
+              <w:t>34</w:t>
             </w:r>
             <w:r>
               <w:rPr>
@@ -9000,7 +9270,7 @@
                 <w:noProof/>
                 <w:webHidden/>
               </w:rPr>
-              <w:t>33</w:t>
+              <w:t>34</w:t>
             </w:r>
             <w:r>
               <w:rPr>
@@ -9090,7 +9360,7 @@
                 <w:noProof/>
                 <w:webHidden/>
               </w:rPr>
-              <w:t>34</w:t>
+              <w:t>35</w:t>
             </w:r>
             <w:r>
               <w:rPr>
@@ -9180,7 +9450,7 @@
                 <w:noProof/>
                 <w:webHidden/>
               </w:rPr>
-              <w:t>41</w:t>
+              <w:t>42</w:t>
             </w:r>
             <w:r>
               <w:rPr>
@@ -9270,7 +9540,7 @@
                 <w:noProof/>
                 <w:webHidden/>
               </w:rPr>
-              <w:t>45</w:t>
+              <w:t>46</w:t>
             </w:r>
             <w:r>
               <w:rPr>
@@ -9360,7 +9630,7 @@
                 <w:noProof/>
                 <w:webHidden/>
               </w:rPr>
-              <w:t>46</w:t>
+              <w:t>47</w:t>
             </w:r>
             <w:r>
               <w:rPr>
@@ -9450,7 +9720,7 @@
                 <w:noProof/>
                 <w:webHidden/>
               </w:rPr>
-              <w:t>47</w:t>
+              <w:t>48</w:t>
             </w:r>
             <w:r>
               <w:rPr>
@@ -9573,7 +9843,7 @@
                 <w:noProof/>
                 <w:webHidden/>
               </w:rPr>
-              <w:t>47</w:t>
+              <w:t>48</w:t>
             </w:r>
             <w:r>
               <w:rPr>
@@ -9663,7 +9933,7 @@
                 <w:noProof/>
                 <w:webHidden/>
               </w:rPr>
-              <w:t>47</w:t>
+              <w:t>48</w:t>
             </w:r>
             <w:r>
               <w:rPr>
@@ -9753,7 +10023,7 @@
                 <w:noProof/>
                 <w:webHidden/>
               </w:rPr>
-              <w:t>48</w:t>
+              <w:t>49</w:t>
             </w:r>
             <w:r>
               <w:rPr>
@@ -9843,7 +10113,7 @@
                 <w:noProof/>
                 <w:webHidden/>
               </w:rPr>
-              <w:t>48</w:t>
+              <w:t>49</w:t>
             </w:r>
             <w:r>
               <w:rPr>
@@ -9933,7 +10203,7 @@
                 <w:noProof/>
                 <w:webHidden/>
               </w:rPr>
-              <w:t>49</w:t>
+              <w:t>50</w:t>
             </w:r>
             <w:r>
               <w:rPr>
@@ -10023,7 +10293,7 @@
                 <w:noProof/>
                 <w:webHidden/>
               </w:rPr>
-              <w:t>49</w:t>
+              <w:t>50</w:t>
             </w:r>
             <w:r>
               <w:rPr>
@@ -10113,7 +10383,7 @@
                 <w:noProof/>
                 <w:webHidden/>
               </w:rPr>
-              <w:t>49</w:t>
+              <w:t>50</w:t>
             </w:r>
             <w:r>
               <w:rPr>
@@ -10203,7 +10473,7 @@
                 <w:noProof/>
                 <w:webHidden/>
               </w:rPr>
-              <w:t>50</w:t>
+              <w:t>51</w:t>
             </w:r>
             <w:r>
               <w:rPr>
@@ -10293,7 +10563,7 @@
                 <w:noProof/>
                 <w:webHidden/>
               </w:rPr>
-              <w:t>50</w:t>
+              <w:t>51</w:t>
             </w:r>
             <w:r>
               <w:rPr>
@@ -10383,7 +10653,7 @@
                 <w:noProof/>
                 <w:webHidden/>
               </w:rPr>
-              <w:t>50</w:t>
+              <w:t>51</w:t>
             </w:r>
             <w:r>
               <w:rPr>
@@ -10473,7 +10743,7 @@
                 <w:noProof/>
                 <w:webHidden/>
               </w:rPr>
-              <w:t>51</w:t>
+              <w:t>52</w:t>
             </w:r>
             <w:r>
               <w:rPr>
@@ -10563,7 +10833,7 @@
                 <w:noProof/>
                 <w:webHidden/>
               </w:rPr>
-              <w:t>52</w:t>
+              <w:t>53</w:t>
             </w:r>
             <w:r>
               <w:rPr>
@@ -10653,7 +10923,7 @@
                 <w:noProof/>
                 <w:webHidden/>
               </w:rPr>
-              <w:t>52</w:t>
+              <w:t>53</w:t>
             </w:r>
             <w:r>
               <w:rPr>
@@ -10743,7 +11013,7 @@
                 <w:noProof/>
                 <w:webHidden/>
               </w:rPr>
-              <w:t>53</w:t>
+              <w:t>54</w:t>
             </w:r>
             <w:r>
               <w:rPr>
@@ -10938,7 +11208,7 @@
     </w:p>
     <w:p>
       <w:r>
-        <w:t>20261013</w:t>
+        <w:t>20261015</w:t>
       </w:r>
     </w:p>
     <w:p>
@@ -11029,12 +11299,12 @@
       <w:pPr>
         <w:pStyle w:val="ListParagraph"/>
         <w:numPr>
-          <w:ilvl w:val="0"/>
+          <w:ilvl w:val="1"/>
           <w:numId w:val="10"/>
         </w:numPr>
       </w:pPr>
       <w:r>
-        <w:t>Added the Status Indicators section describing the 1090, SUBG, and NETWORK LEDs.</w:t>
+        <w:t>AT+MAX_DISTANCE</w:t>
       </w:r>
     </w:p>
     <w:p>
@@ -11046,7 +11316,31 @@
         </w:numPr>
       </w:pPr>
       <w:r>
+        <w:t>Added the Status Indicators section describing the 1090, SUBG, and NETWORK LEDs.</w:t>
+      </w:r>
+    </w:p>
+    <w:p>
+      <w:pPr>
+        <w:pStyle w:val="ListParagraph"/>
+        <w:numPr>
+          <w:ilvl w:val="0"/>
+          <w:numId w:val="10"/>
+        </w:numPr>
+      </w:pPr>
+      <w:r>
         <w:t>Corrected the AT Commands introduction: command replies are not prefixed with “+”.</w:t>
+      </w:r>
+    </w:p>
+    <w:p>
+      <w:pPr>
+        <w:pStyle w:val="ListParagraph"/>
+        <w:numPr>
+          <w:ilvl w:val="0"/>
+          <w:numId w:val="10"/>
+        </w:numPr>
+      </w:pPr>
+      <w:r>
+        <w:t>Added r_dst and r_dir (distance and bearing from the receiver) to the Aircraft JSON WebSocket fields.</w:t>
       </w:r>
     </w:p>
     <w:p>
@@ -13186,7 +13480,7 @@
               <w:rPr>
                 <w:rFonts w:ascii="Courier New" w:hAnsi="Courier New" w:cs="Courier New"/>
               </w:rPr>
-              <w:t>SETTINGS_FLEET=0x9140FC1E (settings version 18, 1340 Bytes)</w:t>
+              <w:t>SETTINGS_FLEET=0x9140FC1E (settings version 19, 1344 Bytes)</w:t>
             </w:r>
           </w:p>
           <w:p>
@@ -16489,6 +16783,199 @@
           <w:numId w:val="4"/>
         </w:numPr>
       </w:pPr>
+      <w:bookmarkStart w:id="301" w:name="_Toc242110901"/>
+      <w:r>
+        <w:t>AT+MAX_DISTANCE</w:t>
+      </w:r>
+      <w:bookmarkEnd w:id="301"/>
+    </w:p>
+    <w:p>
+      <w:r>
+        <w:t>Leaves aircraft that are farther than a set distance from the receiver position out of every report and output: serial reporting protocols, network feeds and the web interface. The RP2040 drops their packets before they reach any output, so Raw and Beast outputs leave them out too. Aircraft at an unknown distance (no position decoded yet, or no receiver position; see AT+RX_POSITION) are always kept. Changes take effect immediately and persist across reboots after AT+SETTINGS=SAVE.</w:t>
+      </w:r>
+    </w:p>
+    <w:p>
+      <w:pPr>
+        <w:pStyle w:val="Heading3"/>
+        <w:numPr>
+          <w:ilvl w:val="2"/>
+          <w:numId w:val="4"/>
+        </w:numPr>
+      </w:pPr>
+      <w:bookmarkStart w:id="302" w:name="_Toc242110902"/>
+      <w:r>
+        <w:t>Set the Maximum Distance</w:t>
+      </w:r>
+      <w:bookmarkEnd w:id="302"/>
+    </w:p>
+    <w:p>
+      <w:pPr>
+        <w:pStyle w:val="code"/>
+      </w:pPr>
+      <w:r>
+        <w:t>AT+MAX_DISTANCE=&lt;max_distance_m&gt;</w:t>
+      </w:r>
+    </w:p>
+    <w:p>
+      <w:pPr>
+        <w:pStyle w:val="code"/>
+      </w:pPr>
+      <w:r>
+        <w:t>OK</w:t>
+      </w:r>
+    </w:p>
+    <w:p/>
+    <w:tbl>
+      <w:tblPr>
+        <w:tblStyle w:val="TableGrid"/>
+        <w:tblW w:w="0" w:type="auto"/>
+        <w:tblLook w:val="04A0" w:firstRow="1" w:lastRow="0" w:firstColumn="1" w:lastColumn="0" w:noHBand="0" w:noVBand="1"/>
+      </w:tblPr>
+      <w:tblGrid>
+        <w:gridCol w:w="1716"/>
+        <w:gridCol w:w="2966"/>
+        <w:gridCol w:w="6334"/>
+      </w:tblGrid>
+      <w:tr>
+        <w:tc>
+          <w:tcPr>
+            <w:tcW w:w="1818" w:type="dxa"/>
+          </w:tcPr>
+          <w:p>
+            <w:pPr>
+              <w:rPr>
+                <w:b/>
+                <w:bCs/>
+              </w:rPr>
+            </w:pPr>
+            <w:r>
+              <w:rPr>
+                <w:b/>
+                <w:bCs/>
+              </w:rPr>
+              <w:t>Parameter</w:t>
+            </w:r>
+          </w:p>
+        </w:tc>
+        <w:tc>
+          <w:tcPr>
+            <w:tcW w:w="3690" w:type="dxa"/>
+          </w:tcPr>
+          <w:p>
+            <w:pPr>
+              <w:rPr>
+                <w:b/>
+                <w:bCs/>
+              </w:rPr>
+            </w:pPr>
+            <w:r>
+              <w:rPr>
+                <w:b/>
+                <w:bCs/>
+              </w:rPr>
+              <w:t>Description</w:t>
+            </w:r>
+          </w:p>
+        </w:tc>
+        <w:tc>
+          <w:tcPr>
+            <w:tcW w:w="5508" w:type="dxa"/>
+          </w:tcPr>
+          <w:p>
+            <w:pPr>
+              <w:rPr>
+                <w:b/>
+                <w:bCs/>
+              </w:rPr>
+            </w:pPr>
+            <w:r>
+              <w:rPr>
+                <w:b/>
+                <w:bCs/>
+              </w:rPr>
+              <w:t>Acceptable Values</w:t>
+            </w:r>
+          </w:p>
+        </w:tc>
+      </w:tr>
+      <w:tr>
+        <w:tc>
+          <w:tcPr>
+            <w:tcW w:w="1818" w:type="dxa"/>
+          </w:tcPr>
+          <w:p>
+            <w:r>
+              <w:t>max_distance_m</w:t>
+            </w:r>
+          </w:p>
+        </w:tc>
+        <w:tc>
+          <w:tcPr>
+            <w:tcW w:w="3690" w:type="dxa"/>
+          </w:tcPr>
+          <w:p>
+            <w:r>
+              <w:t>Aircraft known to be farther than this many meters from the receiver position are left out of reports and outputs. 0 turns the filter off.</w:t>
+            </w:r>
+          </w:p>
+        </w:tc>
+        <w:tc>
+          <w:tcPr>
+            <w:tcW w:w="5508" w:type="dxa"/>
+          </w:tcPr>
+          <w:p>
+            <w:r>
+              <w:t>0-4294967295</w:t>
+            </w:r>
+          </w:p>
+          <w:p/>
+          <w:p>
+            <w:r>
+              <w:t>Default: 0 (filter off)</w:t>
+            </w:r>
+          </w:p>
+        </w:tc>
+      </w:tr>
+    </w:tbl>
+    <w:p>
+      <w:pPr>
+        <w:pStyle w:val="Heading3"/>
+        <w:numPr>
+          <w:ilvl w:val="2"/>
+          <w:numId w:val="4"/>
+        </w:numPr>
+      </w:pPr>
+      <w:bookmarkStart w:id="303" w:name="_Toc242110903"/>
+      <w:r>
+        <w:t>Query the Maximum Distance</w:t>
+      </w:r>
+      <w:bookmarkEnd w:id="303"/>
+    </w:p>
+    <w:p>
+      <w:pPr>
+        <w:pStyle w:val="code"/>
+      </w:pPr>
+      <w:r>
+        <w:t>AT+MAX_DISTANCE?</w:t>
+      </w:r>
+    </w:p>
+    <w:p>
+      <w:pPr>
+        <w:pStyle w:val="code"/>
+      </w:pPr>
+      <w:r>
+        <w:t>MAX_DISTANCE=0</w:t>
+      </w:r>
+    </w:p>
+    <w:p/>
+    <w:p>
+      <w:pPr>
+        <w:pStyle w:val="Heading2"/>
+        <w:numPr>
+          <w:ilvl w:val="1"/>
+          <w:numId w:val="4"/>
+        </w:numPr>
+      </w:pPr>
       <w:bookmarkStart w:id="62" w:name="_Toc242110561"/>
       <w:r>
         <w:t>AT+LOG_LEVEL</w:t>
@@ -18680,6 +19167,14 @@
       </w:pPr>
       <w:r>
         <w:t>AT+WIFI_STA=0,,</w:t>
+      </w:r>
+    </w:p>
+    <w:p>
+      <w:pPr>
+        <w:pStyle w:val="code"/>
+      </w:pPr>
+      <w:r>
+        <w:t>AT+MAX_DISTANCE=0</w:t>
       </w:r>
     </w:p>
     <w:p>
@@ -41169,6 +41664,252 @@
           <w:p>
             <w:r>
               <w:t>WGS-84 longitude, 5 decimal places (~1.1 m resolution).</w:t>
+            </w:r>
+          </w:p>
+        </w:tc>
+      </w:tr>
+      <w:tr>
+        <w:tc>
+          <w:tcPr>
+            <w:tcW w:w="1458" w:type="dxa"/>
+            <w:tcBorders>
+              <w:top w:val="single" w:sz="6" w:space="0" w:color="000000"/>
+              <w:left w:val="single" w:sz="6" w:space="0" w:color="000000"/>
+              <w:bottom w:val="single" w:sz="6" w:space="0" w:color="000000"/>
+              <w:right w:val="single" w:sz="6" w:space="0" w:color="000000"/>
+            </w:tcBorders>
+          </w:tcPr>
+          <w:p>
+            <w:r>
+              <w:t>r_dst</w:t>
+            </w:r>
+          </w:p>
+        </w:tc>
+        <w:tc>
+          <w:tcPr>
+            <w:tcW w:w="990" w:type="dxa"/>
+            <w:tcBorders>
+              <w:top w:val="single" w:sz="6" w:space="0" w:color="000000"/>
+              <w:left w:val="single" w:sz="6" w:space="0" w:color="000000"/>
+              <w:bottom w:val="single" w:sz="6" w:space="0" w:color="000000"/>
+              <w:right w:val="single" w:sz="6" w:space="0" w:color="000000"/>
+            </w:tcBorders>
+          </w:tcPr>
+          <w:p>
+            <w:r>
+              <w:t>number</w:t>
+            </w:r>
+          </w:p>
+        </w:tc>
+        <w:tc>
+          <w:tcPr>
+            <w:tcW w:w="1440" w:type="dxa"/>
+            <w:tcBorders>
+              <w:top w:val="single" w:sz="6" w:space="0" w:color="000000"/>
+              <w:left w:val="single" w:sz="6" w:space="0" w:color="000000"/>
+              <w:bottom w:val="single" w:sz="6" w:space="0" w:color="000000"/>
+              <w:right w:val="single" w:sz="6" w:space="0" w:color="000000"/>
+            </w:tcBorders>
+          </w:tcPr>
+          <w:p>
+            <w:r>
+              <w:t>If distance known</w:t>
+            </w:r>
+          </w:p>
+        </w:tc>
+        <w:tc>
+          <w:tcPr>
+            <w:tcW w:w="990" w:type="dxa"/>
+            <w:tcBorders>
+              <w:top w:val="single" w:sz="6" w:space="0" w:color="000000"/>
+              <w:left w:val="single" w:sz="6" w:space="0" w:color="000000"/>
+              <w:bottom w:val="single" w:sz="6" w:space="0" w:color="000000"/>
+              <w:right w:val="single" w:sz="6" w:space="0" w:color="000000"/>
+            </w:tcBorders>
+          </w:tcPr>
+          <w:p>
+            <w:pPr>
+              <w:jc w:val="center"/>
+            </w:pPr>
+            <w:r>
+              <w:t>✓</w:t>
+            </w:r>
+          </w:p>
+        </w:tc>
+        <w:tc>
+          <w:tcPr>
+            <w:tcW w:w="630" w:type="dxa"/>
+            <w:tcBorders>
+              <w:top w:val="single" w:sz="6" w:space="0" w:color="000000"/>
+              <w:left w:val="single" w:sz="6" w:space="0" w:color="000000"/>
+              <w:bottom w:val="single" w:sz="6" w:space="0" w:color="000000"/>
+              <w:right w:val="single" w:sz="6" w:space="0" w:color="000000"/>
+            </w:tcBorders>
+          </w:tcPr>
+          <w:p>
+            <w:pPr>
+              <w:jc w:val="center"/>
+            </w:pPr>
+            <w:r>
+              <w:t>✓</w:t>
+            </w:r>
+          </w:p>
+        </w:tc>
+        <w:tc>
+          <w:tcPr>
+            <w:tcW w:w="990" w:type="dxa"/>
+            <w:tcBorders>
+              <w:top w:val="single" w:sz="6" w:space="0" w:color="000000"/>
+              <w:left w:val="single" w:sz="6" w:space="0" w:color="000000"/>
+              <w:bottom w:val="single" w:sz="6" w:space="0" w:color="000000"/>
+              <w:right w:val="single" w:sz="6" w:space="0" w:color="000000"/>
+            </w:tcBorders>
+          </w:tcPr>
+          <w:p>
+            <w:pPr>
+              <w:jc w:val="center"/>
+            </w:pPr>
+            <w:r>
+              <w:t>NM</w:t>
+            </w:r>
+          </w:p>
+        </w:tc>
+        <w:tc>
+          <w:tcPr>
+            <w:tcW w:w="4446" w:type="dxa"/>
+            <w:tcBorders>
+              <w:top w:val="single" w:sz="6" w:space="0" w:color="000000"/>
+              <w:left w:val="single" w:sz="6" w:space="0" w:color="000000"/>
+              <w:bottom w:val="single" w:sz="6" w:space="0" w:color="000000"/>
+              <w:right w:val="single" w:sz="6" w:space="0" w:color="000000"/>
+            </w:tcBorders>
+          </w:tcPr>
+          <w:p>
+            <w:r>
+              <w:t>Distance from the receiver position (see AT+RX_POSITION), 3 decimal places. Within 0.015% + 1 m of the WGS-84 geodesic distance up to 600 km.</w:t>
+            </w:r>
+          </w:p>
+        </w:tc>
+      </w:tr>
+      <w:tr>
+        <w:tc>
+          <w:tcPr>
+            <w:tcW w:w="1458" w:type="dxa"/>
+            <w:tcBorders>
+              <w:top w:val="single" w:sz="6" w:space="0" w:color="000000"/>
+              <w:left w:val="single" w:sz="6" w:space="0" w:color="000000"/>
+              <w:bottom w:val="single" w:sz="6" w:space="0" w:color="000000"/>
+              <w:right w:val="single" w:sz="6" w:space="0" w:color="000000"/>
+            </w:tcBorders>
+          </w:tcPr>
+          <w:p>
+            <w:r>
+              <w:t>r_dir</w:t>
+            </w:r>
+          </w:p>
+        </w:tc>
+        <w:tc>
+          <w:tcPr>
+            <w:tcW w:w="990" w:type="dxa"/>
+            <w:tcBorders>
+              <w:top w:val="single" w:sz="6" w:space="0" w:color="000000"/>
+              <w:left w:val="single" w:sz="6" w:space="0" w:color="000000"/>
+              <w:bottom w:val="single" w:sz="6" w:space="0" w:color="000000"/>
+              <w:right w:val="single" w:sz="6" w:space="0" w:color="000000"/>
+            </w:tcBorders>
+          </w:tcPr>
+          <w:p>
+            <w:r>
+              <w:t>number</w:t>
+            </w:r>
+          </w:p>
+        </w:tc>
+        <w:tc>
+          <w:tcPr>
+            <w:tcW w:w="1440" w:type="dxa"/>
+            <w:tcBorders>
+              <w:top w:val="single" w:sz="6" w:space="0" w:color="000000"/>
+              <w:left w:val="single" w:sz="6" w:space="0" w:color="000000"/>
+              <w:bottom w:val="single" w:sz="6" w:space="0" w:color="000000"/>
+              <w:right w:val="single" w:sz="6" w:space="0" w:color="000000"/>
+            </w:tcBorders>
+          </w:tcPr>
+          <w:p>
+            <w:r>
+              <w:t>If distance known</w:t>
+            </w:r>
+          </w:p>
+        </w:tc>
+        <w:tc>
+          <w:tcPr>
+            <w:tcW w:w="990" w:type="dxa"/>
+            <w:tcBorders>
+              <w:top w:val="single" w:sz="6" w:space="0" w:color="000000"/>
+              <w:left w:val="single" w:sz="6" w:space="0" w:color="000000"/>
+              <w:bottom w:val="single" w:sz="6" w:space="0" w:color="000000"/>
+              <w:right w:val="single" w:sz="6" w:space="0" w:color="000000"/>
+            </w:tcBorders>
+          </w:tcPr>
+          <w:p>
+            <w:pPr>
+              <w:jc w:val="center"/>
+            </w:pPr>
+            <w:r>
+              <w:t>✓</w:t>
+            </w:r>
+          </w:p>
+        </w:tc>
+        <w:tc>
+          <w:tcPr>
+            <w:tcW w:w="630" w:type="dxa"/>
+            <w:tcBorders>
+              <w:top w:val="single" w:sz="6" w:space="0" w:color="000000"/>
+              <w:left w:val="single" w:sz="6" w:space="0" w:color="000000"/>
+              <w:bottom w:val="single" w:sz="6" w:space="0" w:color="000000"/>
+              <w:right w:val="single" w:sz="6" w:space="0" w:color="000000"/>
+            </w:tcBorders>
+          </w:tcPr>
+          <w:p>
+            <w:pPr>
+              <w:jc w:val="center"/>
+            </w:pPr>
+            <w:r>
+              <w:t>✓</w:t>
+            </w:r>
+          </w:p>
+        </w:tc>
+        <w:tc>
+          <w:tcPr>
+            <w:tcW w:w="990" w:type="dxa"/>
+            <w:tcBorders>
+              <w:top w:val="single" w:sz="6" w:space="0" w:color="000000"/>
+              <w:left w:val="single" w:sz="6" w:space="0" w:color="000000"/>
+              <w:bottom w:val="single" w:sz="6" w:space="0" w:color="000000"/>
+              <w:right w:val="single" w:sz="6" w:space="0" w:color="000000"/>
+            </w:tcBorders>
+          </w:tcPr>
+          <w:p>
+            <w:pPr>
+              <w:jc w:val="center"/>
+            </w:pPr>
+            <w:r>
+              <w:t>degrees</w:t>
+            </w:r>
+          </w:p>
+        </w:tc>
+        <w:tc>
+          <w:tcPr>
+            <w:tcW w:w="4446" w:type="dxa"/>
+            <w:tcBorders>
+              <w:top w:val="single" w:sz="6" w:space="0" w:color="000000"/>
+              <w:left w:val="single" w:sz="6" w:space="0" w:color="000000"/>
+              <w:bottom w:val="single" w:sz="6" w:space="0" w:color="000000"/>
+              <w:right w:val="single" w:sz="6" w:space="0" w:color="000000"/>
+            </w:tcBorders>
+          </w:tcPr>
+          <w:p>
+            <w:r>
+              <w:t>Bearing from the receiver position, clockwise from true north, 1 decimal place. Within 0.2 degrees of the WGS-84 geodesic bearing.</w:t>
             </w:r>
           </w:p>
         </w:tc>
@@ -44119,7 +44860,7 @@
       <w:rPr>
         <w:color w:val="FFFFFF" w:themeColor="background1"/>
       </w:rPr>
-      <w:t>1013</w:t>
+      <w:t>1015</w:t>
     </w:r>
     <w:r>
       <w:rPr>

</xml_diff>

<commit_message>
Datasheets: 1090U and m1421 sensitivity -90dBm to 0dBm
m1421 datasheet and docs page: one Sensitivity row (Mode S and UAT -90dBm to 0dBm) replaces Minimum RF Input Power Level and Dynamic Range. 1090 datasheet: Sensitivity lists the 1090U figures and keeps -85dBm for other models. Revisions renamed to 20261016 with an entry each; footers match.
</commit_message>
<xml_diff>
--- a/word/datasheet_adsbee_1090.docx
+++ b/word/datasheet_adsbee_1090.docx
@@ -460,10 +460,7 @@
           </w:tcPr>
           <w:p>
             <w:r>
-              <w:t>Minimum</w:t>
-            </w:r>
-            <w:r>
-              <w:t xml:space="preserve"> RF Input Power Level</w:t>
+              <w:t>Sensitivity</w:t>
             </w:r>
           </w:p>
         </w:tc>
@@ -473,13 +470,17 @@
           </w:tcPr>
           <w:p>
             <w:r>
-              <w:t>-</w:t>
-            </w:r>
-            <w:r>
-              <w:t>85</w:t>
-            </w:r>
-            <w:r>
-              <w:t>dBm</w:t>
+              <w:t>1090U Mode S: -90dBm to 0dBm</w:t>
+            </w:r>
+          </w:p>
+          <w:p>
+            <w:r>
+              <w:t>1090U UAT: -90dBm to 0dBm</w:t>
+            </w:r>
+          </w:p>
+          <w:p>
+            <w:r>
+              <w:t>Other models: -85dBm</w:t>
             </w:r>
           </w:p>
         </w:tc>
@@ -10938,7 +10939,7 @@
     </w:p>
     <w:p>
       <w:r>
-        <w:t>20261013</w:t>
+        <w:t>20261016</w:t>
       </w:r>
     </w:p>
     <w:p>
@@ -11047,6 +11048,18 @@
       </w:pPr>
       <w:r>
         <w:t>Corrected the AT Commands introduction: command replies are not prefixed with “+”.</w:t>
+      </w:r>
+    </w:p>
+    <w:p>
+      <w:pPr>
+        <w:pStyle w:val="ListParagraph"/>
+        <w:numPr>
+          <w:ilvl w:val="0"/>
+          <w:numId w:val="10"/>
+        </w:numPr>
+      </w:pPr>
+      <w:r>
+        <w:t>Sensitivity is -90dBm to 0dBm on the 1090U for Mode S and UAT.</w:t>
       </w:r>
     </w:p>
     <w:p>
@@ -44119,7 +44132,7 @@
       <w:rPr>
         <w:color w:val="FFFFFF" w:themeColor="background1"/>
       </w:rPr>
-      <w:t>1013</w:t>
+      <w:t>1016</w:t>
     </w:r>
     <w:r>
       <w:rPr>

</xml_diff>

<commit_message>
Distance filter on aircraft reports only, as AT+FILTER_DISTANCE_NM=<0|1>,<nm>
Raw packets are never filtered again: the RP2040 and CC1314 forward every packet to Raw, Beast, MLAT, the
feeds and the ESP32. The filter gates the aircraft reports only: the shared report UID snapshot (CSBee,
MAVLink, GDL90, aircraft JSON on every output), the ESP32's GDL90 and the web UI's aircraft list and map.

AT+MAX_DISTANCE=<m> becomes AT+FILTER_DISTANCE_NM=<enabled>,<distance_nm> (0.1 to 10000.0 nm in 0.1 nm
steps, default 0,100.0). Settings store filter_distance_enabled and filter_distance_deci_nm: 1090 v19 keeps
1344 bytes (the bool sits in auto_update_enabled's tail padding), 1421 v6 grows to 67 bytes. Migrations from
v18 / v5 set the default, Sanitize() repairs out-of-range values. Web UI, consoles, docs and datasheets updated.
</commit_message>
<xml_diff>
--- a/word/datasheet_adsbee_1090.docx
+++ b/word/datasheet_adsbee_1090.docx
@@ -3983,13 +3983,283 @@
               <w:lang w:eastAsia="zh-CN"/>
             </w:rPr>
           </w:pPr>
+          <w:hyperlink w:anchor="_Toc242110901" w:history="1">
+            <w:r>
+              <w:rPr>
+                <w:rStyle w:val="Hyperlink"/>
+                <w:noProof/>
+              </w:rPr>
+              <w:t>4.11</w:t>
+            </w:r>
+            <w:r>
+              <w:rPr>
+                <w:rFonts w:eastAsiaTheme="minorEastAsia"/>
+                <w:noProof/>
+                <w:sz w:val="24"/>
+                <w:szCs w:val="24"/>
+                <w:lang w:eastAsia="zh-CN"/>
+              </w:rPr>
+              <w:tab/>
+            </w:r>
+            <w:r>
+              <w:rPr>
+                <w:rStyle w:val="Hyperlink"/>
+                <w:noProof/>
+              </w:rPr>
+              <w:t>AT+FILTER_DISTANCE_NM</w:t>
+            </w:r>
+            <w:r>
+              <w:rPr>
+                <w:noProof/>
+                <w:webHidden/>
+              </w:rPr>
+              <w:tab/>
+            </w:r>
+            <w:r>
+              <w:rPr>
+                <w:noProof/>
+                <w:webHidden/>
+              </w:rPr>
+              <w:fldChar w:fldCharType="begin"/>
+            </w:r>
+            <w:r>
+              <w:rPr>
+                <w:noProof/>
+                <w:webHidden/>
+              </w:rPr>
+              <w:instrText xml:space="preserve"> PAGEREF _Toc242110901 \h </w:instrText>
+            </w:r>
+            <w:r>
+              <w:rPr>
+                <w:noProof/>
+                <w:webHidden/>
+              </w:rPr>
+            </w:r>
+            <w:r>
+              <w:rPr>
+                <w:noProof/>
+                <w:webHidden/>
+              </w:rPr>
+              <w:fldChar w:fldCharType="separate"/>
+            </w:r>
+            <w:r>
+              <w:rPr>
+                <w:noProof/>
+                <w:webHidden/>
+              </w:rPr>
+              <w:t>20</w:t>
+            </w:r>
+            <w:r>
+              <w:rPr>
+                <w:noProof/>
+                <w:webHidden/>
+              </w:rPr>
+              <w:fldChar w:fldCharType="end"/>
+            </w:r>
+          </w:hyperlink>
+        </w:p>
+        <w:p>
+          <w:pPr>
+            <w:pStyle w:val="TOC3"/>
+            <w:tabs>
+              <w:tab w:val="left" w:pos="1440"/>
+              <w:tab w:val="right" w:leader="dot" w:pos="10790"/>
+            </w:tabs>
+            <w:rPr>
+              <w:rFonts w:eastAsiaTheme="minorEastAsia"/>
+              <w:noProof/>
+              <w:sz w:val="24"/>
+              <w:szCs w:val="24"/>
+              <w:lang w:eastAsia="zh-CN"/>
+            </w:rPr>
+          </w:pPr>
+          <w:hyperlink w:anchor="_Toc242110902" w:history="1">
+            <w:r>
+              <w:rPr>
+                <w:rStyle w:val="Hyperlink"/>
+                <w:noProof/>
+              </w:rPr>
+              <w:t>4.11.1</w:t>
+            </w:r>
+            <w:r>
+              <w:rPr>
+                <w:rFonts w:eastAsiaTheme="minorEastAsia"/>
+                <w:noProof/>
+                <w:sz w:val="24"/>
+                <w:szCs w:val="24"/>
+                <w:lang w:eastAsia="zh-CN"/>
+              </w:rPr>
+              <w:tab/>
+            </w:r>
+            <w:r>
+              <w:rPr>
+                <w:rStyle w:val="Hyperlink"/>
+                <w:noProof/>
+              </w:rPr>
+              <w:t>Set the Distance Filter</w:t>
+            </w:r>
+            <w:r>
+              <w:rPr>
+                <w:noProof/>
+                <w:webHidden/>
+              </w:rPr>
+              <w:tab/>
+            </w:r>
+            <w:r>
+              <w:rPr>
+                <w:noProof/>
+                <w:webHidden/>
+              </w:rPr>
+              <w:fldChar w:fldCharType="begin"/>
+            </w:r>
+            <w:r>
+              <w:rPr>
+                <w:noProof/>
+                <w:webHidden/>
+              </w:rPr>
+              <w:instrText xml:space="preserve"> PAGEREF _Toc242110902 \h </w:instrText>
+            </w:r>
+            <w:r>
+              <w:rPr>
+                <w:noProof/>
+                <w:webHidden/>
+              </w:rPr>
+            </w:r>
+            <w:r>
+              <w:rPr>
+                <w:noProof/>
+                <w:webHidden/>
+              </w:rPr>
+              <w:fldChar w:fldCharType="separate"/>
+            </w:r>
+            <w:r>
+              <w:rPr>
+                <w:noProof/>
+                <w:webHidden/>
+              </w:rPr>
+              <w:t>20</w:t>
+            </w:r>
+            <w:r>
+              <w:rPr>
+                <w:noProof/>
+                <w:webHidden/>
+              </w:rPr>
+              <w:fldChar w:fldCharType="end"/>
+            </w:r>
+          </w:hyperlink>
+        </w:p>
+        <w:p>
+          <w:pPr>
+            <w:pStyle w:val="TOC3"/>
+            <w:tabs>
+              <w:tab w:val="left" w:pos="1440"/>
+              <w:tab w:val="right" w:leader="dot" w:pos="10790"/>
+            </w:tabs>
+            <w:rPr>
+              <w:rFonts w:eastAsiaTheme="minorEastAsia"/>
+              <w:noProof/>
+              <w:sz w:val="24"/>
+              <w:szCs w:val="24"/>
+              <w:lang w:eastAsia="zh-CN"/>
+            </w:rPr>
+          </w:pPr>
+          <w:hyperlink w:anchor="_Toc242110903" w:history="1">
+            <w:r>
+              <w:rPr>
+                <w:rStyle w:val="Hyperlink"/>
+                <w:noProof/>
+              </w:rPr>
+              <w:t>4.11.2</w:t>
+            </w:r>
+            <w:r>
+              <w:rPr>
+                <w:rFonts w:eastAsiaTheme="minorEastAsia"/>
+                <w:noProof/>
+                <w:sz w:val="24"/>
+                <w:szCs w:val="24"/>
+                <w:lang w:eastAsia="zh-CN"/>
+              </w:rPr>
+              <w:tab/>
+            </w:r>
+            <w:r>
+              <w:rPr>
+                <w:rStyle w:val="Hyperlink"/>
+                <w:noProof/>
+              </w:rPr>
+              <w:t>Query the Distance Filter</w:t>
+            </w:r>
+            <w:r>
+              <w:rPr>
+                <w:noProof/>
+                <w:webHidden/>
+              </w:rPr>
+              <w:tab/>
+            </w:r>
+            <w:r>
+              <w:rPr>
+                <w:noProof/>
+                <w:webHidden/>
+              </w:rPr>
+              <w:fldChar w:fldCharType="begin"/>
+            </w:r>
+            <w:r>
+              <w:rPr>
+                <w:noProof/>
+                <w:webHidden/>
+              </w:rPr>
+              <w:instrText xml:space="preserve"> PAGEREF _Toc242110903 \h </w:instrText>
+            </w:r>
+            <w:r>
+              <w:rPr>
+                <w:noProof/>
+                <w:webHidden/>
+              </w:rPr>
+            </w:r>
+            <w:r>
+              <w:rPr>
+                <w:noProof/>
+                <w:webHidden/>
+              </w:rPr>
+              <w:fldChar w:fldCharType="separate"/>
+            </w:r>
+            <w:r>
+              <w:rPr>
+                <w:noProof/>
+                <w:webHidden/>
+              </w:rPr>
+              <w:t>21</w:t>
+            </w:r>
+            <w:r>
+              <w:rPr>
+                <w:noProof/>
+                <w:webHidden/>
+              </w:rPr>
+              <w:fldChar w:fldCharType="end"/>
+            </w:r>
+          </w:hyperlink>
+        </w:p>
+        <w:p>
+          <w:pPr>
+            <w:pStyle w:val="TOC2"/>
+            <w:tabs>
+              <w:tab w:val="left" w:pos="960"/>
+              <w:tab w:val="right" w:leader="dot" w:pos="10790"/>
+            </w:tabs>
+            <w:rPr>
+              <w:rFonts w:eastAsiaTheme="minorEastAsia"/>
+              <w:noProof/>
+              <w:sz w:val="24"/>
+              <w:szCs w:val="24"/>
+              <w:lang w:eastAsia="zh-CN"/>
+            </w:rPr>
+          </w:pPr>
           <w:hyperlink w:anchor="_Toc242110544" w:history="1">
             <w:r>
               <w:rPr>
                 <w:rStyle w:val="Hyperlink"/>
                 <w:noProof/>
               </w:rPr>
-              <w:t>4.11</w:t>
+              <w:t>4.12</w:t>
             </w:r>
             <w:r>
               <w:rPr>
@@ -4079,7 +4349,7 @@
                 <w:rStyle w:val="Hyperlink"/>
                 <w:noProof/>
               </w:rPr>
-              <w:t>4.11.1</w:t>
+              <w:t>4.12.1</w:t>
             </w:r>
             <w:r>
               <w:rPr>
@@ -4169,7 +4439,7 @@
                 <w:rStyle w:val="Hyperlink"/>
                 <w:noProof/>
               </w:rPr>
-              <w:t>4.11.2</w:t>
+              <w:t>4.12.2</w:t>
             </w:r>
             <w:r>
               <w:rPr>
@@ -4259,7 +4529,7 @@
                 <w:rStyle w:val="Hyperlink"/>
                 <w:noProof/>
               </w:rPr>
-              <w:t>4.12</w:t>
+              <w:t>4.13</w:t>
             </w:r>
             <w:r>
               <w:rPr>
@@ -4349,7 +4619,7 @@
                 <w:rStyle w:val="Hyperlink"/>
                 <w:noProof/>
               </w:rPr>
-              <w:t>4.12.1</w:t>
+              <w:t>4.13.1</w:t>
             </w:r>
             <w:r>
               <w:rPr>
@@ -4439,7 +4709,7 @@
                 <w:rStyle w:val="Hyperlink"/>
                 <w:noProof/>
               </w:rPr>
-              <w:t>4.12.2</w:t>
+              <w:t>4.13.2</w:t>
             </w:r>
             <w:r>
               <w:rPr>
@@ -4529,7 +4799,7 @@
                 <w:rStyle w:val="Hyperlink"/>
                 <w:noProof/>
               </w:rPr>
-              <w:t>4.13</w:t>
+              <w:t>4.14</w:t>
             </w:r>
             <w:r>
               <w:rPr>
@@ -4619,7 +4889,7 @@
                 <w:rStyle w:val="Hyperlink"/>
                 <w:noProof/>
               </w:rPr>
-              <w:t>4.14</w:t>
+              <w:t>4.15</w:t>
             </w:r>
             <w:r>
               <w:rPr>
@@ -4709,7 +4979,7 @@
                 <w:rStyle w:val="Hyperlink"/>
                 <w:noProof/>
               </w:rPr>
-              <w:t>4.14.1</w:t>
+              <w:t>4.15.1</w:t>
             </w:r>
             <w:r>
               <w:rPr>
@@ -4799,7 +5069,7 @@
                 <w:rStyle w:val="Hyperlink"/>
                 <w:noProof/>
               </w:rPr>
-              <w:t>4.14.2</w:t>
+              <w:t>4.15.2</w:t>
             </w:r>
             <w:r>
               <w:rPr>
@@ -4889,7 +5159,7 @@
                 <w:rStyle w:val="Hyperlink"/>
                 <w:noProof/>
               </w:rPr>
-              <w:t>4.15</w:t>
+              <w:t>4.16</w:t>
             </w:r>
             <w:r>
               <w:rPr>
@@ -4979,7 +5249,7 @@
                 <w:rStyle w:val="Hyperlink"/>
                 <w:noProof/>
               </w:rPr>
-              <w:t>4.16</w:t>
+              <w:t>4.17</w:t>
             </w:r>
             <w:r>
               <w:rPr>
@@ -5069,7 +5339,7 @@
                 <w:rStyle w:val="Hyperlink"/>
                 <w:noProof/>
               </w:rPr>
-              <w:t>4.16.1</w:t>
+              <w:t>4.17.1</w:t>
             </w:r>
             <w:r>
               <w:rPr>
@@ -5159,7 +5429,7 @@
                 <w:rStyle w:val="Hyperlink"/>
                 <w:noProof/>
               </w:rPr>
-              <w:t>4.16.2</w:t>
+              <w:t>4.17.2</w:t>
             </w:r>
             <w:r>
               <w:rPr>
@@ -5249,7 +5519,7 @@
                 <w:rStyle w:val="Hyperlink"/>
                 <w:noProof/>
               </w:rPr>
-              <w:t>4.17</w:t>
+              <w:t>4.18</w:t>
             </w:r>
             <w:r>
               <w:rPr>
@@ -5339,7 +5609,7 @@
                 <w:rStyle w:val="Hyperlink"/>
                 <w:noProof/>
               </w:rPr>
-              <w:t>4.17.1</w:t>
+              <w:t>4.18.1</w:t>
             </w:r>
             <w:r>
               <w:rPr>
@@ -5429,7 +5699,7 @@
                 <w:rStyle w:val="Hyperlink"/>
                 <w:noProof/>
               </w:rPr>
-              <w:t>4.17.2</w:t>
+              <w:t>4.18.2</w:t>
             </w:r>
             <w:r>
               <w:rPr>
@@ -5488,276 +5758,6 @@
                 <w:webHidden/>
               </w:rPr>
               <w:t>20</w:t>
-            </w:r>
-            <w:r>
-              <w:rPr>
-                <w:noProof/>
-                <w:webHidden/>
-              </w:rPr>
-              <w:fldChar w:fldCharType="end"/>
-            </w:r>
-          </w:hyperlink>
-        </w:p>
-        <w:p>
-          <w:pPr>
-            <w:pStyle w:val="TOC2"/>
-            <w:tabs>
-              <w:tab w:val="left" w:pos="960"/>
-              <w:tab w:val="right" w:leader="dot" w:pos="10790"/>
-            </w:tabs>
-            <w:rPr>
-              <w:rFonts w:eastAsiaTheme="minorEastAsia"/>
-              <w:noProof/>
-              <w:sz w:val="24"/>
-              <w:szCs w:val="24"/>
-              <w:lang w:eastAsia="zh-CN"/>
-            </w:rPr>
-          </w:pPr>
-          <w:hyperlink w:anchor="_Toc242110901" w:history="1">
-            <w:r>
-              <w:rPr>
-                <w:rStyle w:val="Hyperlink"/>
-                <w:noProof/>
-              </w:rPr>
-              <w:t>4.18</w:t>
-            </w:r>
-            <w:r>
-              <w:rPr>
-                <w:rFonts w:eastAsiaTheme="minorEastAsia"/>
-                <w:noProof/>
-                <w:sz w:val="24"/>
-                <w:szCs w:val="24"/>
-                <w:lang w:eastAsia="zh-CN"/>
-              </w:rPr>
-              <w:tab/>
-            </w:r>
-            <w:r>
-              <w:rPr>
-                <w:rStyle w:val="Hyperlink"/>
-                <w:noProof/>
-              </w:rPr>
-              <w:t>AT+MAX_DISTANCE</w:t>
-            </w:r>
-            <w:r>
-              <w:rPr>
-                <w:noProof/>
-                <w:webHidden/>
-              </w:rPr>
-              <w:tab/>
-            </w:r>
-            <w:r>
-              <w:rPr>
-                <w:noProof/>
-                <w:webHidden/>
-              </w:rPr>
-              <w:fldChar w:fldCharType="begin"/>
-            </w:r>
-            <w:r>
-              <w:rPr>
-                <w:noProof/>
-                <w:webHidden/>
-              </w:rPr>
-              <w:instrText xml:space="preserve"> PAGEREF _Toc242110901 \h </w:instrText>
-            </w:r>
-            <w:r>
-              <w:rPr>
-                <w:noProof/>
-                <w:webHidden/>
-              </w:rPr>
-            </w:r>
-            <w:r>
-              <w:rPr>
-                <w:noProof/>
-                <w:webHidden/>
-              </w:rPr>
-              <w:fldChar w:fldCharType="separate"/>
-            </w:r>
-            <w:r>
-              <w:rPr>
-                <w:noProof/>
-                <w:webHidden/>
-              </w:rPr>
-              <w:t>20</w:t>
-            </w:r>
-            <w:r>
-              <w:rPr>
-                <w:noProof/>
-                <w:webHidden/>
-              </w:rPr>
-              <w:fldChar w:fldCharType="end"/>
-            </w:r>
-          </w:hyperlink>
-        </w:p>
-        <w:p>
-          <w:pPr>
-            <w:pStyle w:val="TOC3"/>
-            <w:tabs>
-              <w:tab w:val="left" w:pos="1440"/>
-              <w:tab w:val="right" w:leader="dot" w:pos="10790"/>
-            </w:tabs>
-            <w:rPr>
-              <w:rFonts w:eastAsiaTheme="minorEastAsia"/>
-              <w:noProof/>
-              <w:sz w:val="24"/>
-              <w:szCs w:val="24"/>
-              <w:lang w:eastAsia="zh-CN"/>
-            </w:rPr>
-          </w:pPr>
-          <w:hyperlink w:anchor="_Toc242110902" w:history="1">
-            <w:r>
-              <w:rPr>
-                <w:rStyle w:val="Hyperlink"/>
-                <w:noProof/>
-              </w:rPr>
-              <w:t>4.18.1</w:t>
-            </w:r>
-            <w:r>
-              <w:rPr>
-                <w:rFonts w:eastAsiaTheme="minorEastAsia"/>
-                <w:noProof/>
-                <w:sz w:val="24"/>
-                <w:szCs w:val="24"/>
-                <w:lang w:eastAsia="zh-CN"/>
-              </w:rPr>
-              <w:tab/>
-            </w:r>
-            <w:r>
-              <w:rPr>
-                <w:rStyle w:val="Hyperlink"/>
-                <w:noProof/>
-              </w:rPr>
-              <w:t>Set the Maximum Distance</w:t>
-            </w:r>
-            <w:r>
-              <w:rPr>
-                <w:noProof/>
-                <w:webHidden/>
-              </w:rPr>
-              <w:tab/>
-            </w:r>
-            <w:r>
-              <w:rPr>
-                <w:noProof/>
-                <w:webHidden/>
-              </w:rPr>
-              <w:fldChar w:fldCharType="begin"/>
-            </w:r>
-            <w:r>
-              <w:rPr>
-                <w:noProof/>
-                <w:webHidden/>
-              </w:rPr>
-              <w:instrText xml:space="preserve"> PAGEREF _Toc242110902 \h </w:instrText>
-            </w:r>
-            <w:r>
-              <w:rPr>
-                <w:noProof/>
-                <w:webHidden/>
-              </w:rPr>
-            </w:r>
-            <w:r>
-              <w:rPr>
-                <w:noProof/>
-                <w:webHidden/>
-              </w:rPr>
-              <w:fldChar w:fldCharType="separate"/>
-            </w:r>
-            <w:r>
-              <w:rPr>
-                <w:noProof/>
-                <w:webHidden/>
-              </w:rPr>
-              <w:t>20</w:t>
-            </w:r>
-            <w:r>
-              <w:rPr>
-                <w:noProof/>
-                <w:webHidden/>
-              </w:rPr>
-              <w:fldChar w:fldCharType="end"/>
-            </w:r>
-          </w:hyperlink>
-        </w:p>
-        <w:p>
-          <w:pPr>
-            <w:pStyle w:val="TOC3"/>
-            <w:tabs>
-              <w:tab w:val="left" w:pos="1440"/>
-              <w:tab w:val="right" w:leader="dot" w:pos="10790"/>
-            </w:tabs>
-            <w:rPr>
-              <w:rFonts w:eastAsiaTheme="minorEastAsia"/>
-              <w:noProof/>
-              <w:sz w:val="24"/>
-              <w:szCs w:val="24"/>
-              <w:lang w:eastAsia="zh-CN"/>
-            </w:rPr>
-          </w:pPr>
-          <w:hyperlink w:anchor="_Toc242110903" w:history="1">
-            <w:r>
-              <w:rPr>
-                <w:rStyle w:val="Hyperlink"/>
-                <w:noProof/>
-              </w:rPr>
-              <w:t>4.18.2</w:t>
-            </w:r>
-            <w:r>
-              <w:rPr>
-                <w:rFonts w:eastAsiaTheme="minorEastAsia"/>
-                <w:noProof/>
-                <w:sz w:val="24"/>
-                <w:szCs w:val="24"/>
-                <w:lang w:eastAsia="zh-CN"/>
-              </w:rPr>
-              <w:tab/>
-            </w:r>
-            <w:r>
-              <w:rPr>
-                <w:rStyle w:val="Hyperlink"/>
-                <w:noProof/>
-              </w:rPr>
-              <w:t>Query the Maximum Distance</w:t>
-            </w:r>
-            <w:r>
-              <w:rPr>
-                <w:noProof/>
-                <w:webHidden/>
-              </w:rPr>
-              <w:tab/>
-            </w:r>
-            <w:r>
-              <w:rPr>
-                <w:noProof/>
-                <w:webHidden/>
-              </w:rPr>
-              <w:fldChar w:fldCharType="begin"/>
-            </w:r>
-            <w:r>
-              <w:rPr>
-                <w:noProof/>
-                <w:webHidden/>
-              </w:rPr>
-              <w:instrText xml:space="preserve"> PAGEREF _Toc242110903 \h </w:instrText>
-            </w:r>
-            <w:r>
-              <w:rPr>
-                <w:noProof/>
-                <w:webHidden/>
-              </w:rPr>
-            </w:r>
-            <w:r>
-              <w:rPr>
-                <w:noProof/>
-                <w:webHidden/>
-              </w:rPr>
-              <w:fldChar w:fldCharType="separate"/>
-            </w:r>
-            <w:r>
-              <w:rPr>
-                <w:noProof/>
-                <w:webHidden/>
-              </w:rPr>
-              <w:t>21</w:t>
             </w:r>
             <w:r>
               <w:rPr>
@@ -11208,7 +11208,7 @@
     </w:p>
     <w:p>
       <w:r>
-        <w:t>20261015</w:t>
+        <w:t>20261016</w:t>
       </w:r>
     </w:p>
     <w:p>
@@ -11304,7 +11304,7 @@
         </w:numPr>
       </w:pPr>
       <w:r>
-        <w:t>AT+MAX_DISTANCE</w:t>
+        <w:t>AT+FILTER_DISTANCE_NM</w:t>
       </w:r>
     </w:p>
     <w:p>
@@ -15094,6 +15094,253 @@
           <w:numId w:val="4"/>
         </w:numPr>
       </w:pPr>
+      <w:bookmarkStart w:id="301" w:name="_Toc242110901"/>
+      <w:r>
+        <w:t>AT+FILTER_DISTANCE_NM</w:t>
+      </w:r>
+      <w:bookmarkEnd w:id="301"/>
+    </w:p>
+    <w:p>
+      <w:r>
+        <w:t>Leaves aircraft that are farther than a set distance from the receiver position out of aircraft reports: the web interface's aircraft list and map, the Aircraft JSON WebSocket, and the aircraft reporting protocols (CSBee, MAVLink, GDL90, Aircraft JSON) on serial outputs and network feeds. Raw packets are never filtered: Raw, Beast and MLAT outputs, the network feeds that carry them and the ESP32's packet stream still carry every packet, including those from far aircraft. Aircraft at an unknown distance (no position decoded yet, or no receiver position; see AT+RX_POSITION) are always kept. The filter is off by default. Changes take effect immediately and persist across reboots after AT+SETTINGS=SAVE.</w:t>
+      </w:r>
+    </w:p>
+    <w:p>
+      <w:pPr>
+        <w:pStyle w:val="Heading3"/>
+        <w:numPr>
+          <w:ilvl w:val="2"/>
+          <w:numId w:val="4"/>
+        </w:numPr>
+      </w:pPr>
+      <w:bookmarkStart w:id="302" w:name="_Toc242110902"/>
+      <w:r>
+        <w:t>Set the Distance Filter</w:t>
+      </w:r>
+      <w:bookmarkEnd w:id="302"/>
+    </w:p>
+    <w:p>
+      <w:pPr>
+        <w:pStyle w:val="code"/>
+      </w:pPr>
+      <w:r>
+        <w:t>AT+FILTER_DISTANCE_NM=&lt;enabled&gt;,&lt;distance_nm&gt;</w:t>
+      </w:r>
+    </w:p>
+    <w:p>
+      <w:pPr>
+        <w:pStyle w:val="code"/>
+      </w:pPr>
+      <w:r>
+        <w:t>OK</w:t>
+      </w:r>
+    </w:p>
+    <w:p>
+      <w:pPr>
+        <w:pStyle w:val="code"/>
+      </w:pPr>
+      <w:r>
+        <w:t>AT+FILTER_DISTANCE_NM=1,50</w:t>
+      </w:r>
+    </w:p>
+    <w:p>
+      <w:pPr>
+        <w:pStyle w:val="code"/>
+      </w:pPr>
+      <w:r>
+        <w:t>OK</w:t>
+      </w:r>
+    </w:p>
+    <w:p/>
+    <w:tbl>
+      <w:tblPr>
+        <w:tblStyle w:val="TableGrid"/>
+        <w:tblW w:w="0" w:type="auto"/>
+        <w:tblLook w:val="04A0" w:firstRow="1" w:lastRow="0" w:firstColumn="1" w:lastColumn="0" w:noHBand="0" w:noVBand="1"/>
+      </w:tblPr>
+      <w:tblGrid>
+        <w:gridCol w:w="1716"/>
+        <w:gridCol w:w="2966"/>
+        <w:gridCol w:w="6334"/>
+      </w:tblGrid>
+      <w:tr>
+        <w:tc>
+          <w:tcPr>
+            <w:tcW w:w="1818" w:type="dxa"/>
+          </w:tcPr>
+          <w:p>
+            <w:pPr>
+              <w:rPr>
+                <w:b/>
+                <w:bCs/>
+              </w:rPr>
+            </w:pPr>
+            <w:r>
+              <w:rPr>
+                <w:b/>
+                <w:bCs/>
+              </w:rPr>
+              <w:t>Parameter</w:t>
+            </w:r>
+          </w:p>
+        </w:tc>
+        <w:tc>
+          <w:tcPr>
+            <w:tcW w:w="3690" w:type="dxa"/>
+          </w:tcPr>
+          <w:p>
+            <w:pPr>
+              <w:rPr>
+                <w:b/>
+                <w:bCs/>
+              </w:rPr>
+            </w:pPr>
+            <w:r>
+              <w:rPr>
+                <w:b/>
+                <w:bCs/>
+              </w:rPr>
+              <w:t>Description</w:t>
+            </w:r>
+          </w:p>
+        </w:tc>
+        <w:tc>
+          <w:tcPr>
+            <w:tcW w:w="5508" w:type="dxa"/>
+          </w:tcPr>
+          <w:p>
+            <w:pPr>
+              <w:rPr>
+                <w:b/>
+                <w:bCs/>
+              </w:rPr>
+            </w:pPr>
+            <w:r>
+              <w:rPr>
+                <w:b/>
+                <w:bCs/>
+              </w:rPr>
+              <w:t>Acceptable Values</w:t>
+            </w:r>
+          </w:p>
+        </w:tc>
+      </w:tr>
+      <w:tr>
+        <w:tc>
+          <w:tcPr>
+            <w:tcW w:w="1818" w:type="dxa"/>
+          </w:tcPr>
+          <w:p>
+            <w:r>
+              <w:t>enabled</w:t>
+            </w:r>
+          </w:p>
+        </w:tc>
+        <w:tc>
+          <w:tcPr>
+            <w:tcW w:w="3690" w:type="dxa"/>
+          </w:tcPr>
+          <w:p>
+            <w:r>
+              <w:t>1 turns the filter on, 0 turns it off. Empty keeps the current value.</w:t>
+            </w:r>
+          </w:p>
+        </w:tc>
+        <w:tc>
+          <w:tcPr>
+            <w:tcW w:w="5508" w:type="dxa"/>
+          </w:tcPr>
+          <w:p>
+            <w:r>
+              <w:t>0, 1</w:t>
+            </w:r>
+          </w:p>
+          <w:p/>
+          <w:p>
+            <w:r>
+              <w:t>Default: 0 (filter off)</w:t>
+            </w:r>
+          </w:p>
+        </w:tc>
+      </w:tr>
+      <w:tr>
+        <w:tc>
+          <w:tcPr>
+            <w:tcW w:w="1818" w:type="dxa"/>
+          </w:tcPr>
+          <w:p>
+            <w:r>
+              <w:t>distance_nm</w:t>
+            </w:r>
+          </w:p>
+        </w:tc>
+        <w:tc>
+          <w:tcPr>
+            <w:tcW w:w="3690" w:type="dxa"/>
+          </w:tcPr>
+          <w:p>
+            <w:r>
+              <w:t>Aircraft known to be farther than this many nautical miles from the receiver position are left out of aircraft reports. Decimal, 0.1 nm resolution (finer values are rounded). Empty keeps the current value.</w:t>
+            </w:r>
+          </w:p>
+        </w:tc>
+        <w:tc>
+          <w:tcPr>
+            <w:tcW w:w="5508" w:type="dxa"/>
+          </w:tcPr>
+          <w:p>
+            <w:r>
+              <w:t>0.1-10000.0</w:t>
+            </w:r>
+          </w:p>
+          <w:p/>
+          <w:p>
+            <w:r>
+              <w:t>Default: 100.0</w:t>
+            </w:r>
+          </w:p>
+        </w:tc>
+      </w:tr>
+    </w:tbl>
+    <w:p>
+      <w:pPr>
+        <w:pStyle w:val="Heading3"/>
+        <w:numPr>
+          <w:ilvl w:val="2"/>
+          <w:numId w:val="4"/>
+        </w:numPr>
+      </w:pPr>
+      <w:bookmarkStart w:id="303" w:name="_Toc242110903"/>
+      <w:r>
+        <w:t>Query the Distance Filter</w:t>
+      </w:r>
+      <w:bookmarkEnd w:id="303"/>
+    </w:p>
+    <w:p>
+      <w:pPr>
+        <w:pStyle w:val="code"/>
+      </w:pPr>
+      <w:r>
+        <w:t>AT+FILTER_DISTANCE_NM?</w:t>
+      </w:r>
+    </w:p>
+    <w:p>
+      <w:pPr>
+        <w:pStyle w:val="code"/>
+      </w:pPr>
+      <w:r>
+        <w:t>FILTER_DISTANCE_NM=0,100.0</w:t>
+      </w:r>
+    </w:p>
+    <w:p/>
+    <w:p>
+      <w:pPr>
+        <w:pStyle w:val="Heading2"/>
+        <w:numPr>
+          <w:ilvl w:val="1"/>
+          <w:numId w:val="4"/>
+        </w:numPr>
+      </w:pPr>
       <w:bookmarkStart w:id="41" w:name="_Toc242110544"/>
       <w:r>
         <w:t>AT+GNSS</w:t>
@@ -16783,199 +17030,6 @@
           <w:numId w:val="4"/>
         </w:numPr>
       </w:pPr>
-      <w:bookmarkStart w:id="301" w:name="_Toc242110901"/>
-      <w:r>
-        <w:t>AT+MAX_DISTANCE</w:t>
-      </w:r>
-      <w:bookmarkEnd w:id="301"/>
-    </w:p>
-    <w:p>
-      <w:r>
-        <w:t>Leaves aircraft that are farther than a set distance from the receiver position out of every report and output: serial reporting protocols, network feeds and the web interface. The RP2040 drops their packets before they reach any output, so Raw and Beast outputs leave them out too. Aircraft at an unknown distance (no position decoded yet, or no receiver position; see AT+RX_POSITION) are always kept. Changes take effect immediately and persist across reboots after AT+SETTINGS=SAVE.</w:t>
-      </w:r>
-    </w:p>
-    <w:p>
-      <w:pPr>
-        <w:pStyle w:val="Heading3"/>
-        <w:numPr>
-          <w:ilvl w:val="2"/>
-          <w:numId w:val="4"/>
-        </w:numPr>
-      </w:pPr>
-      <w:bookmarkStart w:id="302" w:name="_Toc242110902"/>
-      <w:r>
-        <w:t>Set the Maximum Distance</w:t>
-      </w:r>
-      <w:bookmarkEnd w:id="302"/>
-    </w:p>
-    <w:p>
-      <w:pPr>
-        <w:pStyle w:val="code"/>
-      </w:pPr>
-      <w:r>
-        <w:t>AT+MAX_DISTANCE=&lt;max_distance_m&gt;</w:t>
-      </w:r>
-    </w:p>
-    <w:p>
-      <w:pPr>
-        <w:pStyle w:val="code"/>
-      </w:pPr>
-      <w:r>
-        <w:t>OK</w:t>
-      </w:r>
-    </w:p>
-    <w:p/>
-    <w:tbl>
-      <w:tblPr>
-        <w:tblStyle w:val="TableGrid"/>
-        <w:tblW w:w="0" w:type="auto"/>
-        <w:tblLook w:val="04A0" w:firstRow="1" w:lastRow="0" w:firstColumn="1" w:lastColumn="0" w:noHBand="0" w:noVBand="1"/>
-      </w:tblPr>
-      <w:tblGrid>
-        <w:gridCol w:w="1716"/>
-        <w:gridCol w:w="2966"/>
-        <w:gridCol w:w="6334"/>
-      </w:tblGrid>
-      <w:tr>
-        <w:tc>
-          <w:tcPr>
-            <w:tcW w:w="1818" w:type="dxa"/>
-          </w:tcPr>
-          <w:p>
-            <w:pPr>
-              <w:rPr>
-                <w:b/>
-                <w:bCs/>
-              </w:rPr>
-            </w:pPr>
-            <w:r>
-              <w:rPr>
-                <w:b/>
-                <w:bCs/>
-              </w:rPr>
-              <w:t>Parameter</w:t>
-            </w:r>
-          </w:p>
-        </w:tc>
-        <w:tc>
-          <w:tcPr>
-            <w:tcW w:w="3690" w:type="dxa"/>
-          </w:tcPr>
-          <w:p>
-            <w:pPr>
-              <w:rPr>
-                <w:b/>
-                <w:bCs/>
-              </w:rPr>
-            </w:pPr>
-            <w:r>
-              <w:rPr>
-                <w:b/>
-                <w:bCs/>
-              </w:rPr>
-              <w:t>Description</w:t>
-            </w:r>
-          </w:p>
-        </w:tc>
-        <w:tc>
-          <w:tcPr>
-            <w:tcW w:w="5508" w:type="dxa"/>
-          </w:tcPr>
-          <w:p>
-            <w:pPr>
-              <w:rPr>
-                <w:b/>
-                <w:bCs/>
-              </w:rPr>
-            </w:pPr>
-            <w:r>
-              <w:rPr>
-                <w:b/>
-                <w:bCs/>
-              </w:rPr>
-              <w:t>Acceptable Values</w:t>
-            </w:r>
-          </w:p>
-        </w:tc>
-      </w:tr>
-      <w:tr>
-        <w:tc>
-          <w:tcPr>
-            <w:tcW w:w="1818" w:type="dxa"/>
-          </w:tcPr>
-          <w:p>
-            <w:r>
-              <w:t>max_distance_m</w:t>
-            </w:r>
-          </w:p>
-        </w:tc>
-        <w:tc>
-          <w:tcPr>
-            <w:tcW w:w="3690" w:type="dxa"/>
-          </w:tcPr>
-          <w:p>
-            <w:r>
-              <w:t>Aircraft known to be farther than this many meters from the receiver position are left out of reports and outputs. 0 turns the filter off.</w:t>
-            </w:r>
-          </w:p>
-        </w:tc>
-        <w:tc>
-          <w:tcPr>
-            <w:tcW w:w="5508" w:type="dxa"/>
-          </w:tcPr>
-          <w:p>
-            <w:r>
-              <w:t>0-4294967295</w:t>
-            </w:r>
-          </w:p>
-          <w:p/>
-          <w:p>
-            <w:r>
-              <w:t>Default: 0 (filter off)</w:t>
-            </w:r>
-          </w:p>
-        </w:tc>
-      </w:tr>
-    </w:tbl>
-    <w:p>
-      <w:pPr>
-        <w:pStyle w:val="Heading3"/>
-        <w:numPr>
-          <w:ilvl w:val="2"/>
-          <w:numId w:val="4"/>
-        </w:numPr>
-      </w:pPr>
-      <w:bookmarkStart w:id="303" w:name="_Toc242110903"/>
-      <w:r>
-        <w:t>Query the Maximum Distance</w:t>
-      </w:r>
-      <w:bookmarkEnd w:id="303"/>
-    </w:p>
-    <w:p>
-      <w:pPr>
-        <w:pStyle w:val="code"/>
-      </w:pPr>
-      <w:r>
-        <w:t>AT+MAX_DISTANCE?</w:t>
-      </w:r>
-    </w:p>
-    <w:p>
-      <w:pPr>
-        <w:pStyle w:val="code"/>
-      </w:pPr>
-      <w:r>
-        <w:t>MAX_DISTANCE=0</w:t>
-      </w:r>
-    </w:p>
-    <w:p/>
-    <w:p>
-      <w:pPr>
-        <w:pStyle w:val="Heading2"/>
-        <w:numPr>
-          <w:ilvl w:val="1"/>
-          <w:numId w:val="4"/>
-        </w:numPr>
-      </w:pPr>
       <w:bookmarkStart w:id="62" w:name="_Toc242110561"/>
       <w:r>
         <w:t>AT+LOG_LEVEL</w:t>
@@ -19174,7 +19228,7 @@
         <w:pStyle w:val="code"/>
       </w:pPr>
       <w:r>
-        <w:t>AT+MAX_DISTANCE=0</w:t>
+        <w:t>AT+FILTER_DISTANCE_NM=0,100.0</w:t>
       </w:r>
     </w:p>
     <w:p>
@@ -44854,13 +44908,13 @@
       <w:rPr>
         <w:color w:val="FFFFFF" w:themeColor="background1"/>
       </w:rPr>
-      <w:t>2026</w:t>
+      <w:t>20261016</w:t>
     </w:r>
     <w:r>
       <w:rPr>
         <w:color w:val="FFFFFF" w:themeColor="background1"/>
       </w:rPr>
-      <w:t>1015</w:t>
+      <w:t/>
     </w:r>
     <w:r>
       <w:rPr>

</xml_diff>

<commit_message>
Datasheets: TOC page numbers after the AT+FILTER_DISTANCE_NM section moved
</commit_message>
<xml_diff>
--- a/word/datasheet_adsbee_1090.docx
+++ b/word/datasheet_adsbee_1090.docx
@@ -4047,7 +4047,7 @@
                 <w:noProof/>
                 <w:webHidden/>
               </w:rPr>
-              <w:t>20</w:t>
+              <w:t>16</w:t>
             </w:r>
             <w:r>
               <w:rPr>
@@ -4137,7 +4137,7 @@
                 <w:noProof/>
                 <w:webHidden/>
               </w:rPr>
-              <w:t>20</w:t>
+              <w:t>16</w:t>
             </w:r>
             <w:r>
               <w:rPr>
@@ -4227,7 +4227,7 @@
                 <w:noProof/>
                 <w:webHidden/>
               </w:rPr>
-              <w:t>21</w:t>
+              <w:t>16</w:t>
             </w:r>
             <w:r>
               <w:rPr>
@@ -4497,7 +4497,7 @@
                 <w:noProof/>
                 <w:webHidden/>
               </w:rPr>
-              <w:t>16</w:t>
+              <w:t>17</w:t>
             </w:r>
             <w:r>
               <w:rPr>
@@ -4587,7 +4587,7 @@
                 <w:noProof/>
                 <w:webHidden/>
               </w:rPr>
-              <w:t>16</w:t>
+              <w:t>17</w:t>
             </w:r>
             <w:r>
               <w:rPr>
@@ -4677,7 +4677,7 @@
                 <w:noProof/>
                 <w:webHidden/>
               </w:rPr>
-              <w:t>16</w:t>
+              <w:t>17</w:t>
             </w:r>
             <w:r>
               <w:rPr>
@@ -4767,7 +4767,7 @@
                 <w:noProof/>
                 <w:webHidden/>
               </w:rPr>
-              <w:t>16</w:t>
+              <w:t>17</w:t>
             </w:r>
             <w:r>
               <w:rPr>
@@ -4857,7 +4857,7 @@
                 <w:noProof/>
                 <w:webHidden/>
               </w:rPr>
-              <w:t>17</w:t>
+              <w:t>18</w:t>
             </w:r>
             <w:r>
               <w:rPr>
@@ -4947,7 +4947,7 @@
                 <w:noProof/>
                 <w:webHidden/>
               </w:rPr>
-              <w:t>17</w:t>
+              <w:t>18</w:t>
             </w:r>
             <w:r>
               <w:rPr>
@@ -5037,7 +5037,7 @@
                 <w:noProof/>
                 <w:webHidden/>
               </w:rPr>
-              <w:t>17</w:t>
+              <w:t>18</w:t>
             </w:r>
             <w:r>
               <w:rPr>
@@ -5127,7 +5127,7 @@
                 <w:noProof/>
                 <w:webHidden/>
               </w:rPr>
-              <w:t>17</w:t>
+              <w:t>18</w:t>
             </w:r>
             <w:r>
               <w:rPr>
@@ -5217,7 +5217,7 @@
                 <w:noProof/>
                 <w:webHidden/>
               </w:rPr>
-              <w:t>18</w:t>
+              <w:t>19</w:t>
             </w:r>
             <w:r>
               <w:rPr>
@@ -5307,7 +5307,7 @@
                 <w:noProof/>
                 <w:webHidden/>
               </w:rPr>
-              <w:t>19</w:t>
+              <w:t>20</w:t>
             </w:r>
             <w:r>
               <w:rPr>
@@ -5397,7 +5397,7 @@
                 <w:noProof/>
                 <w:webHidden/>
               </w:rPr>
-              <w:t>19</w:t>
+              <w:t>20</w:t>
             </w:r>
             <w:r>
               <w:rPr>
@@ -5487,7 +5487,7 @@
                 <w:noProof/>
                 <w:webHidden/>
               </w:rPr>
-              <w:t>19</w:t>
+              <w:t>20</w:t>
             </w:r>
             <w:r>
               <w:rPr>
@@ -5577,7 +5577,7 @@
                 <w:noProof/>
                 <w:webHidden/>
               </w:rPr>
-              <w:t>20</w:t>
+              <w:t>21</w:t>
             </w:r>
             <w:r>
               <w:rPr>
@@ -5667,7 +5667,7 @@
                 <w:noProof/>
                 <w:webHidden/>
               </w:rPr>
-              <w:t>20</w:t>
+              <w:t>21</w:t>
             </w:r>
             <w:r>
               <w:rPr>
@@ -5757,7 +5757,7 @@
                 <w:noProof/>
                 <w:webHidden/>
               </w:rPr>
-              <w:t>20</w:t>
+              <w:t>21</w:t>
             </w:r>
             <w:r>
               <w:rPr>
@@ -5937,7 +5937,7 @@
                 <w:noProof/>
                 <w:webHidden/>
               </w:rPr>
-              <w:t>21</w:t>
+              <w:t>22</w:t>
             </w:r>
             <w:r>
               <w:rPr>
@@ -6027,7 +6027,7 @@
                 <w:noProof/>
                 <w:webHidden/>
               </w:rPr>
-              <w:t>21</w:t>
+              <w:t>22</w:t>
             </w:r>
             <w:r>
               <w:rPr>

</xml_diff>

<commit_message>
Datasheets: Mode S -90dBm to 0dBm on all 1090 models, m1090 about -70dBm without an LNA
1090: Sensitivity is Mode S -90dBm to 0dBm, UAT (1090U) -90dBm to 0dBm, and the m1090 figure (about -70dBm
without an LNA, -90dBm to 0dBm with an external one) replaces the -85dBm line; the 20261016 revision line says so.
GS3M PoE: Sensitivity, Mode S -90dBm to 0dBm. m1090 Eval Board: Sensitivity, Mode S about -70dBm without an LNA
and -90dBm to 0dBm with the external LNA, the same as the 1090U. Both get a 20261016 revision and footer, since
their last revisions shipped in adsbee_1090-0.9.0.
</commit_message>
<xml_diff>
--- a/word/datasheet_adsbee_1090.docx
+++ b/word/datasheet_adsbee_1090.docx
@@ -470,17 +470,17 @@
           </w:tcPr>
           <w:p>
             <w:r>
-              <w:t>1090U Mode S: -90dBm to 0dBm</w:t>
-            </w:r>
-          </w:p>
-          <w:p>
-            <w:r>
-              <w:t>1090U UAT: -90dBm to 0dBm</w:t>
-            </w:r>
-          </w:p>
-          <w:p>
-            <w:r>
-              <w:t>Other models: -85dBm</w:t>
+              <w:t>Mode S: -90dBm to 0dBm</w:t>
+            </w:r>
+          </w:p>
+          <w:p>
+            <w:r>
+              <w:t>UAT (1090U): -90dBm to 0dBm</w:t>
+            </w:r>
+          </w:p>
+          <w:p>
+            <w:r>
+              <w:t>m1090 Mode S: about -70dBm (no LNA), -90dBm to 0dBm with an external LNA</w:t>
             </w:r>
           </w:p>
         </w:tc>
@@ -11059,7 +11059,7 @@
         </w:numPr>
       </w:pPr>
       <w:r>
-        <w:t>Sensitivity is -90dBm to 0dBm on the 1090U for Mode S and UAT.</w:t>
+        <w:t>Sensitivity is -90dBm to 0dBm for Mode S on all models and for UAT on the 1090U. The m1090 has no first-stage LNA: about -70dBm, or -90dBm to 0dBm with an external LNA.</w:t>
       </w:r>
     </w:p>
     <w:p>

</xml_diff>

<commit_message>
Datasheets: AT+FILTER_ALTITUDE_FT section, TOC entries and revision 20261016 entry (1090, m1421)
</commit_message>
<xml_diff>
--- a/word/datasheet_adsbee_1090.docx
+++ b/word/datasheet_adsbee_1090.docx
@@ -3984,13 +3984,283 @@
               <w:lang w:eastAsia="zh-CN"/>
             </w:rPr>
           </w:pPr>
+          <w:hyperlink w:anchor="_Toc242110911" w:history="1">
+            <w:r>
+              <w:rPr>
+                <w:rStyle w:val="Hyperlink"/>
+                <w:noProof/>
+              </w:rPr>
+              <w:t>4.11</w:t>
+            </w:r>
+            <w:r>
+              <w:rPr>
+                <w:rFonts w:eastAsiaTheme="minorEastAsia"/>
+                <w:noProof/>
+                <w:sz w:val="24"/>
+                <w:szCs w:val="24"/>
+                <w:lang w:eastAsia="zh-CN"/>
+              </w:rPr>
+              <w:tab/>
+            </w:r>
+            <w:r>
+              <w:rPr>
+                <w:rStyle w:val="Hyperlink"/>
+                <w:noProof/>
+              </w:rPr>
+              <w:t>AT+FILTER_ALTITUDE_FT</w:t>
+            </w:r>
+            <w:r>
+              <w:rPr>
+                <w:noProof/>
+                <w:webHidden/>
+              </w:rPr>
+              <w:tab/>
+            </w:r>
+            <w:r>
+              <w:rPr>
+                <w:noProof/>
+                <w:webHidden/>
+              </w:rPr>
+              <w:fldChar w:fldCharType="begin"/>
+            </w:r>
+            <w:r>
+              <w:rPr>
+                <w:noProof/>
+                <w:webHidden/>
+              </w:rPr>
+              <w:instrText xml:space="preserve"> PAGEREF _Toc242110911 \h </w:instrText>
+            </w:r>
+            <w:r>
+              <w:rPr>
+                <w:noProof/>
+                <w:webHidden/>
+              </w:rPr>
+            </w:r>
+            <w:r>
+              <w:rPr>
+                <w:noProof/>
+                <w:webHidden/>
+              </w:rPr>
+              <w:fldChar w:fldCharType="separate"/>
+            </w:r>
+            <w:r>
+              <w:rPr>
+                <w:noProof/>
+                <w:webHidden/>
+              </w:rPr>
+              <w:t>16</w:t>
+            </w:r>
+            <w:r>
+              <w:rPr>
+                <w:noProof/>
+                <w:webHidden/>
+              </w:rPr>
+              <w:fldChar w:fldCharType="end"/>
+            </w:r>
+          </w:hyperlink>
+        </w:p>
+        <w:p>
+          <w:pPr>
+            <w:pStyle w:val="TOC3"/>
+            <w:tabs>
+              <w:tab w:val="left" w:pos="1440"/>
+              <w:tab w:val="right" w:leader="dot" w:pos="10790"/>
+            </w:tabs>
+            <w:rPr>
+              <w:rFonts w:eastAsiaTheme="minorEastAsia"/>
+              <w:noProof/>
+              <w:sz w:val="24"/>
+              <w:szCs w:val="24"/>
+              <w:lang w:eastAsia="zh-CN"/>
+            </w:rPr>
+          </w:pPr>
+          <w:hyperlink w:anchor="_Toc242110912" w:history="1">
+            <w:r>
+              <w:rPr>
+                <w:rStyle w:val="Hyperlink"/>
+                <w:noProof/>
+              </w:rPr>
+              <w:t>4.11.1</w:t>
+            </w:r>
+            <w:r>
+              <w:rPr>
+                <w:rFonts w:eastAsiaTheme="minorEastAsia"/>
+                <w:noProof/>
+                <w:sz w:val="24"/>
+                <w:szCs w:val="24"/>
+                <w:lang w:eastAsia="zh-CN"/>
+              </w:rPr>
+              <w:tab/>
+            </w:r>
+            <w:r>
+              <w:rPr>
+                <w:rStyle w:val="Hyperlink"/>
+                <w:noProof/>
+              </w:rPr>
+              <w:t>Set the Altitude Filter</w:t>
+            </w:r>
+            <w:r>
+              <w:rPr>
+                <w:noProof/>
+                <w:webHidden/>
+              </w:rPr>
+              <w:tab/>
+            </w:r>
+            <w:r>
+              <w:rPr>
+                <w:noProof/>
+                <w:webHidden/>
+              </w:rPr>
+              <w:fldChar w:fldCharType="begin"/>
+            </w:r>
+            <w:r>
+              <w:rPr>
+                <w:noProof/>
+                <w:webHidden/>
+              </w:rPr>
+              <w:instrText xml:space="preserve"> PAGEREF _Toc242110912 \h </w:instrText>
+            </w:r>
+            <w:r>
+              <w:rPr>
+                <w:noProof/>
+                <w:webHidden/>
+              </w:rPr>
+            </w:r>
+            <w:r>
+              <w:rPr>
+                <w:noProof/>
+                <w:webHidden/>
+              </w:rPr>
+              <w:fldChar w:fldCharType="separate"/>
+            </w:r>
+            <w:r>
+              <w:rPr>
+                <w:noProof/>
+                <w:webHidden/>
+              </w:rPr>
+              <w:t>16</w:t>
+            </w:r>
+            <w:r>
+              <w:rPr>
+                <w:noProof/>
+                <w:webHidden/>
+              </w:rPr>
+              <w:fldChar w:fldCharType="end"/>
+            </w:r>
+          </w:hyperlink>
+        </w:p>
+        <w:p>
+          <w:pPr>
+            <w:pStyle w:val="TOC3"/>
+            <w:tabs>
+              <w:tab w:val="left" w:pos="1440"/>
+              <w:tab w:val="right" w:leader="dot" w:pos="10790"/>
+            </w:tabs>
+            <w:rPr>
+              <w:rFonts w:eastAsiaTheme="minorEastAsia"/>
+              <w:noProof/>
+              <w:sz w:val="24"/>
+              <w:szCs w:val="24"/>
+              <w:lang w:eastAsia="zh-CN"/>
+            </w:rPr>
+          </w:pPr>
+          <w:hyperlink w:anchor="_Toc242110913" w:history="1">
+            <w:r>
+              <w:rPr>
+                <w:rStyle w:val="Hyperlink"/>
+                <w:noProof/>
+              </w:rPr>
+              <w:t>4.11.2</w:t>
+            </w:r>
+            <w:r>
+              <w:rPr>
+                <w:rFonts w:eastAsiaTheme="minorEastAsia"/>
+                <w:noProof/>
+                <w:sz w:val="24"/>
+                <w:szCs w:val="24"/>
+                <w:lang w:eastAsia="zh-CN"/>
+              </w:rPr>
+              <w:tab/>
+            </w:r>
+            <w:r>
+              <w:rPr>
+                <w:rStyle w:val="Hyperlink"/>
+                <w:noProof/>
+              </w:rPr>
+              <w:t>Query the Altitude Filter</w:t>
+            </w:r>
+            <w:r>
+              <w:rPr>
+                <w:noProof/>
+                <w:webHidden/>
+              </w:rPr>
+              <w:tab/>
+            </w:r>
+            <w:r>
+              <w:rPr>
+                <w:noProof/>
+                <w:webHidden/>
+              </w:rPr>
+              <w:fldChar w:fldCharType="begin"/>
+            </w:r>
+            <w:r>
+              <w:rPr>
+                <w:noProof/>
+                <w:webHidden/>
+              </w:rPr>
+              <w:instrText xml:space="preserve"> PAGEREF _Toc242110913 \h </w:instrText>
+            </w:r>
+            <w:r>
+              <w:rPr>
+                <w:noProof/>
+                <w:webHidden/>
+              </w:rPr>
+            </w:r>
+            <w:r>
+              <w:rPr>
+                <w:noProof/>
+                <w:webHidden/>
+              </w:rPr>
+              <w:fldChar w:fldCharType="separate"/>
+            </w:r>
+            <w:r>
+              <w:rPr>
+                <w:noProof/>
+                <w:webHidden/>
+              </w:rPr>
+              <w:t>16</w:t>
+            </w:r>
+            <w:r>
+              <w:rPr>
+                <w:noProof/>
+                <w:webHidden/>
+              </w:rPr>
+              <w:fldChar w:fldCharType="end"/>
+            </w:r>
+          </w:hyperlink>
+        </w:p>
+        <w:p>
+          <w:pPr>
+            <w:pStyle w:val="TOC2"/>
+            <w:tabs>
+              <w:tab w:val="left" w:pos="960"/>
+              <w:tab w:val="right" w:leader="dot" w:pos="10790"/>
+            </w:tabs>
+            <w:rPr>
+              <w:rFonts w:eastAsiaTheme="minorEastAsia"/>
+              <w:noProof/>
+              <w:sz w:val="24"/>
+              <w:szCs w:val="24"/>
+              <w:lang w:eastAsia="zh-CN"/>
+            </w:rPr>
+          </w:pPr>
           <w:hyperlink w:anchor="_Toc242110901" w:history="1">
             <w:r>
               <w:rPr>
                 <w:rStyle w:val="Hyperlink"/>
                 <w:noProof/>
               </w:rPr>
-              <w:t>4.11</w:t>
+              <w:t>4.12</w:t>
             </w:r>
             <w:r>
               <w:rPr>
@@ -4080,7 +4350,7 @@
                 <w:rStyle w:val="Hyperlink"/>
                 <w:noProof/>
               </w:rPr>
-              <w:t>4.11.1</w:t>
+              <w:t>4.12.1</w:t>
             </w:r>
             <w:r>
               <w:rPr>
@@ -4170,7 +4440,7 @@
                 <w:rStyle w:val="Hyperlink"/>
                 <w:noProof/>
               </w:rPr>
-              <w:t>4.11.2</w:t>
+              <w:t>4.12.2</w:t>
             </w:r>
             <w:r>
               <w:rPr>
@@ -4260,7 +4530,7 @@
                 <w:rStyle w:val="Hyperlink"/>
                 <w:noProof/>
               </w:rPr>
-              <w:t>4.12</w:t>
+              <w:t>4.13</w:t>
             </w:r>
             <w:r>
               <w:rPr>
@@ -4350,7 +4620,7 @@
                 <w:rStyle w:val="Hyperlink"/>
                 <w:noProof/>
               </w:rPr>
-              <w:t>4.12.1</w:t>
+              <w:t>4.13.1</w:t>
             </w:r>
             <w:r>
               <w:rPr>
@@ -4440,7 +4710,7 @@
                 <w:rStyle w:val="Hyperlink"/>
                 <w:noProof/>
               </w:rPr>
-              <w:t>4.12.2</w:t>
+              <w:t>4.13.2</w:t>
             </w:r>
             <w:r>
               <w:rPr>
@@ -4530,7 +4800,7 @@
                 <w:rStyle w:val="Hyperlink"/>
                 <w:noProof/>
               </w:rPr>
-              <w:t>4.13</w:t>
+              <w:t>4.14</w:t>
             </w:r>
             <w:r>
               <w:rPr>
@@ -4620,7 +4890,7 @@
                 <w:rStyle w:val="Hyperlink"/>
                 <w:noProof/>
               </w:rPr>
-              <w:t>4.13.1</w:t>
+              <w:t>4.14.1</w:t>
             </w:r>
             <w:r>
               <w:rPr>
@@ -4710,7 +4980,7 @@
                 <w:rStyle w:val="Hyperlink"/>
                 <w:noProof/>
               </w:rPr>
-              <w:t>4.13.2</w:t>
+              <w:t>4.14.2</w:t>
             </w:r>
             <w:r>
               <w:rPr>
@@ -4800,7 +5070,7 @@
                 <w:rStyle w:val="Hyperlink"/>
                 <w:noProof/>
               </w:rPr>
-              <w:t>4.14</w:t>
+              <w:t>4.15</w:t>
             </w:r>
             <w:r>
               <w:rPr>
@@ -4890,7 +5160,7 @@
                 <w:rStyle w:val="Hyperlink"/>
                 <w:noProof/>
               </w:rPr>
-              <w:t>4.15</w:t>
+              <w:t>4.16</w:t>
             </w:r>
             <w:r>
               <w:rPr>
@@ -4980,7 +5250,7 @@
                 <w:rStyle w:val="Hyperlink"/>
                 <w:noProof/>
               </w:rPr>
-              <w:t>4.15.1</w:t>
+              <w:t>4.16.1</w:t>
             </w:r>
             <w:r>
               <w:rPr>
@@ -5070,7 +5340,7 @@
                 <w:rStyle w:val="Hyperlink"/>
                 <w:noProof/>
               </w:rPr>
-              <w:t>4.15.2</w:t>
+              <w:t>4.16.2</w:t>
             </w:r>
             <w:r>
               <w:rPr>
@@ -5160,7 +5430,7 @@
                 <w:rStyle w:val="Hyperlink"/>
                 <w:noProof/>
               </w:rPr>
-              <w:t>4.16</w:t>
+              <w:t>4.17</w:t>
             </w:r>
             <w:r>
               <w:rPr>
@@ -5250,7 +5520,7 @@
                 <w:rStyle w:val="Hyperlink"/>
                 <w:noProof/>
               </w:rPr>
-              <w:t>4.17</w:t>
+              <w:t>4.18</w:t>
             </w:r>
             <w:r>
               <w:rPr>
@@ -5340,7 +5610,7 @@
                 <w:rStyle w:val="Hyperlink"/>
                 <w:noProof/>
               </w:rPr>
-              <w:t>4.17.1</w:t>
+              <w:t>4.18.1</w:t>
             </w:r>
             <w:r>
               <w:rPr>
@@ -5430,7 +5700,7 @@
                 <w:rStyle w:val="Hyperlink"/>
                 <w:noProof/>
               </w:rPr>
-              <w:t>4.17.2</w:t>
+              <w:t>4.18.2</w:t>
             </w:r>
             <w:r>
               <w:rPr>
@@ -5520,7 +5790,7 @@
                 <w:rStyle w:val="Hyperlink"/>
                 <w:noProof/>
               </w:rPr>
-              <w:t>4.18</w:t>
+              <w:t>4.19</w:t>
             </w:r>
             <w:r>
               <w:rPr>
@@ -5610,7 +5880,7 @@
                 <w:rStyle w:val="Hyperlink"/>
                 <w:noProof/>
               </w:rPr>
-              <w:t>4.18.1</w:t>
+              <w:t>4.19.1</w:t>
             </w:r>
             <w:r>
               <w:rPr>
@@ -5700,7 +5970,7 @@
                 <w:rStyle w:val="Hyperlink"/>
                 <w:noProof/>
               </w:rPr>
-              <w:t>4.18.2</w:t>
+              <w:t>4.19.2</w:t>
             </w:r>
             <w:r>
               <w:rPr>
@@ -5790,7 +6060,7 @@
                 <w:rStyle w:val="Hyperlink"/>
                 <w:noProof/>
               </w:rPr>
-              <w:t>4.19</w:t>
+              <w:t>4.20</w:t>
             </w:r>
             <w:r>
               <w:rPr>
@@ -5880,7 +6150,7 @@
                 <w:rStyle w:val="Hyperlink"/>
                 <w:noProof/>
               </w:rPr>
-              <w:t>4.20</w:t>
+              <w:t>4.21</w:t>
             </w:r>
             <w:r>
               <w:rPr>
@@ -5970,7 +6240,7 @@
                 <w:rStyle w:val="Hyperlink"/>
                 <w:noProof/>
               </w:rPr>
-              <w:t>4.20.1</w:t>
+              <w:t>4.21.1</w:t>
             </w:r>
             <w:r>
               <w:rPr>
@@ -6060,7 +6330,7 @@
                 <w:rStyle w:val="Hyperlink"/>
                 <w:noProof/>
               </w:rPr>
-              <w:t>4.20.2</w:t>
+              <w:t>4.21.2</w:t>
             </w:r>
             <w:r>
               <w:rPr>
@@ -6150,7 +6420,7 @@
                 <w:rStyle w:val="Hyperlink"/>
                 <w:noProof/>
               </w:rPr>
-              <w:t>4.21</w:t>
+              <w:t>4.22</w:t>
             </w:r>
             <w:r>
               <w:rPr>
@@ -6240,7 +6510,7 @@
                 <w:rStyle w:val="Hyperlink"/>
                 <w:noProof/>
               </w:rPr>
-              <w:t>4.22</w:t>
+              <w:t>4.23</w:t>
             </w:r>
             <w:r>
               <w:rPr>
@@ -6330,7 +6600,7 @@
                 <w:rStyle w:val="Hyperlink"/>
                 <w:noProof/>
               </w:rPr>
-              <w:t>4.22.1</w:t>
+              <w:t>4.23.1</w:t>
             </w:r>
             <w:r>
               <w:rPr>
@@ -6420,7 +6690,7 @@
                 <w:rStyle w:val="Hyperlink"/>
                 <w:noProof/>
               </w:rPr>
-              <w:t>4.22.2</w:t>
+              <w:t>4.23.2</w:t>
             </w:r>
             <w:r>
               <w:rPr>
@@ -6510,7 +6780,7 @@
                 <w:rStyle w:val="Hyperlink"/>
                 <w:noProof/>
               </w:rPr>
-              <w:t>4.23</w:t>
+              <w:t>4.24</w:t>
             </w:r>
             <w:r>
               <w:rPr>
@@ -6600,7 +6870,7 @@
                 <w:rStyle w:val="Hyperlink"/>
                 <w:noProof/>
               </w:rPr>
-              <w:t>4.23.1</w:t>
+              <w:t>4.24.1</w:t>
             </w:r>
             <w:r>
               <w:rPr>
@@ -6690,7 +6960,7 @@
                 <w:rStyle w:val="Hyperlink"/>
                 <w:noProof/>
               </w:rPr>
-              <w:t>4.23.2</w:t>
+              <w:t>4.24.2</w:t>
             </w:r>
             <w:r>
               <w:rPr>
@@ -6780,7 +7050,7 @@
                 <w:rStyle w:val="Hyperlink"/>
                 <w:noProof/>
               </w:rPr>
-              <w:t>4.24</w:t>
+              <w:t>4.25</w:t>
             </w:r>
             <w:r>
               <w:rPr>
@@ -6870,7 +7140,7 @@
                 <w:rStyle w:val="Hyperlink"/>
                 <w:noProof/>
               </w:rPr>
-              <w:t>4.24.1</w:t>
+              <w:t>4.25.1</w:t>
             </w:r>
             <w:r>
               <w:rPr>
@@ -6960,7 +7230,7 @@
                 <w:rStyle w:val="Hyperlink"/>
                 <w:noProof/>
               </w:rPr>
-              <w:t>4.24.2</w:t>
+              <w:t>4.25.2</w:t>
             </w:r>
             <w:r>
               <w:rPr>
@@ -7050,7 +7320,7 @@
                 <w:rStyle w:val="Hyperlink"/>
                 <w:noProof/>
               </w:rPr>
-              <w:t>4.24.3</w:t>
+              <w:t>4.25.3</w:t>
             </w:r>
             <w:r>
               <w:rPr>
@@ -7140,7 +7410,7 @@
                 <w:rStyle w:val="Hyperlink"/>
                 <w:noProof/>
               </w:rPr>
-              <w:t>4.24.4</w:t>
+              <w:t>4.25.4</w:t>
             </w:r>
             <w:r>
               <w:rPr>
@@ -7230,7 +7500,7 @@
                 <w:rStyle w:val="Hyperlink"/>
                 <w:noProof/>
               </w:rPr>
-              <w:t>4.24.5</w:t>
+              <w:t>4.25.5</w:t>
             </w:r>
             <w:r>
               <w:rPr>
@@ -7320,7 +7590,7 @@
                 <w:rStyle w:val="Hyperlink"/>
                 <w:noProof/>
               </w:rPr>
-              <w:t>4.25</w:t>
+              <w:t>4.26</w:t>
             </w:r>
             <w:r>
               <w:rPr>
@@ -7412,7 +7682,7 @@
                 <w:bCs/>
                 <w:noProof/>
               </w:rPr>
-              <w:t>4.25.1</w:t>
+              <w:t>4.26.1</w:t>
             </w:r>
             <w:r>
               <w:rPr>
@@ -7504,7 +7774,7 @@
                 <w:rStyle w:val="Hyperlink"/>
                 <w:noProof/>
               </w:rPr>
-              <w:t>4.25.2</w:t>
+              <w:t>4.26.2</w:t>
             </w:r>
             <w:r>
               <w:rPr>
@@ -7594,7 +7864,7 @@
                 <w:rStyle w:val="Hyperlink"/>
                 <w:noProof/>
               </w:rPr>
-              <w:t>4.26</w:t>
+              <w:t>4.27</w:t>
             </w:r>
             <w:r>
               <w:rPr>
@@ -7684,7 +7954,7 @@
                 <w:rStyle w:val="Hyperlink"/>
                 <w:noProof/>
               </w:rPr>
-              <w:t>4.27</w:t>
+              <w:t>4.28</w:t>
             </w:r>
             <w:r>
               <w:rPr>
@@ -7774,7 +8044,7 @@
                 <w:rStyle w:val="Hyperlink"/>
                 <w:noProof/>
               </w:rPr>
-              <w:t>4.28</w:t>
+              <w:t>4.29</w:t>
             </w:r>
             <w:r>
               <w:rPr>
@@ -7864,7 +8134,7 @@
                 <w:rStyle w:val="Hyperlink"/>
                 <w:noProof/>
               </w:rPr>
-              <w:t>4.28.1</w:t>
+              <w:t>4.29.1</w:t>
             </w:r>
             <w:r>
               <w:rPr>
@@ -7954,7 +8224,7 @@
                 <w:rStyle w:val="Hyperlink"/>
                 <w:noProof/>
               </w:rPr>
-              <w:t>4.28.2</w:t>
+              <w:t>4.29.2</w:t>
             </w:r>
             <w:r>
               <w:rPr>
@@ -8044,7 +8314,7 @@
                 <w:rStyle w:val="Hyperlink"/>
                 <w:noProof/>
               </w:rPr>
-              <w:t>4.29</w:t>
+              <w:t>4.30</w:t>
             </w:r>
             <w:r>
               <w:rPr>
@@ -8134,7 +8404,7 @@
                 <w:rStyle w:val="Hyperlink"/>
                 <w:noProof/>
               </w:rPr>
-              <w:t>4.30</w:t>
+              <w:t>4.31</w:t>
             </w:r>
             <w:r>
               <w:rPr>
@@ -8224,7 +8494,7 @@
                 <w:rStyle w:val="Hyperlink"/>
                 <w:noProof/>
               </w:rPr>
-              <w:t>4.30.1</w:t>
+              <w:t>4.31.1</w:t>
             </w:r>
             <w:r>
               <w:rPr>
@@ -8314,7 +8584,7 @@
                 <w:rStyle w:val="Hyperlink"/>
                 <w:noProof/>
               </w:rPr>
-              <w:t>4.30.2</w:t>
+              <w:t>4.31.2</w:t>
             </w:r>
             <w:r>
               <w:rPr>
@@ -8404,7 +8674,7 @@
                 <w:rStyle w:val="Hyperlink"/>
                 <w:noProof/>
               </w:rPr>
-              <w:t>4.30.3</w:t>
+              <w:t>4.31.3</w:t>
             </w:r>
             <w:r>
               <w:rPr>
@@ -8494,7 +8764,7 @@
                 <w:rStyle w:val="Hyperlink"/>
                 <w:noProof/>
               </w:rPr>
-              <w:t>4.31</w:t>
+              <w:t>4.32</w:t>
             </w:r>
             <w:r>
               <w:rPr>
@@ -8584,7 +8854,7 @@
                 <w:rStyle w:val="Hyperlink"/>
                 <w:noProof/>
               </w:rPr>
-              <w:t>4.31.1</w:t>
+              <w:t>4.32.1</w:t>
             </w:r>
             <w:r>
               <w:rPr>
@@ -8674,7 +8944,7 @@
                 <w:rStyle w:val="Hyperlink"/>
                 <w:noProof/>
               </w:rPr>
-              <w:t>4.31.2</w:t>
+              <w:t>4.32.2</w:t>
             </w:r>
             <w:r>
               <w:rPr>
@@ -8764,7 +9034,7 @@
                 <w:rStyle w:val="Hyperlink"/>
                 <w:noProof/>
               </w:rPr>
-              <w:t>4.32</w:t>
+              <w:t>4.33</w:t>
             </w:r>
             <w:r>
               <w:rPr>
@@ -8854,7 +9124,7 @@
                 <w:rStyle w:val="Hyperlink"/>
                 <w:noProof/>
               </w:rPr>
-              <w:t>4.32.1</w:t>
+              <w:t>4.33.1</w:t>
             </w:r>
             <w:r>
               <w:rPr>
@@ -8944,7 +9214,7 @@
                 <w:rStyle w:val="Hyperlink"/>
                 <w:noProof/>
               </w:rPr>
-              <w:t>4.32.2</w:t>
+              <w:t>4.33.2</w:t>
             </w:r>
             <w:r>
               <w:rPr>
@@ -11312,6 +11582,18 @@
       <w:pPr>
         <w:pStyle w:val="ListParagraph"/>
         <w:numPr>
+          <w:ilvl w:val="1"/>
+          <w:numId w:val="10"/>
+        </w:numPr>
+      </w:pPr>
+      <w:r>
+        <w:t>AT+FILTER_ALTITUDE_FT</w:t>
+      </w:r>
+    </w:p>
+    <w:p>
+      <w:pPr>
+        <w:pStyle w:val="ListParagraph"/>
+        <w:numPr>
           <w:ilvl w:val="0"/>
           <w:numId w:val="10"/>
         </w:numPr>
@@ -15107,15 +15389,15 @@
           <w:numId w:val="4"/>
         </w:numPr>
       </w:pPr>
-      <w:bookmarkStart w:id="301" w:name="_Toc242110901"/>
-      <w:r>
-        <w:t>AT+FILTER_DISTANCE_NM</w:t>
-      </w:r>
-      <w:bookmarkEnd w:id="301"/>
-    </w:p>
-    <w:p>
-      <w:r>
-        <w:t>Leaves aircraft that are farther than a set distance from the receiver position out of aircraft reports: the web interface's aircraft list and map, the Aircraft JSON WebSocket, and the aircraft reporting protocols (CSBee, MAVLink, GDL90, Aircraft JSON) on serial outputs and network feeds. Raw packets are never filtered: Raw, Beast and MLAT outputs, the network feeds that carry them and the ESP32's packet stream still carry every packet, including those from far aircraft. Aircraft at an unknown distance (no position decoded yet, or no receiver position; see AT+RX_POSITION) are always kept. The filter is off by default. Changes take effect immediately and persist across reboots after AT+SETTINGS=SAVE.</w:t>
+      <w:bookmarkStart w:id="304" w:name="_Toc242110911"/>
+      <w:r>
+        <w:t>AT+FILTER_ALTITUDE_FT</w:t>
+      </w:r>
+      <w:bookmarkEnd w:id="304"/>
+    </w:p>
+    <w:p>
+      <w:r>
+        <w:t>Leaves aircraft outside a set altitude band out of aircraft reports: the web interface's aircraft list and map, the Aircraft JSON WebSocket, and the aircraft reporting protocols (CSBee, MAVLink, GDL90, Aircraft JSON) on serial outputs and network feeds. Raw packets are never filtered: Raw, Beast and MLAT outputs, the network feeds that carry them and the ESP32's packet stream still carry every packet. The aircraft's altitude is its barometric altitude, or its GNSS altitude when no barometric altitude is known. Aircraft with no known altitude are always kept. Mode 4 compares against the receiver altitude from AT+RX_POSITION (the GNSS altitude for a GNSS fix, otherwise the barometric altitude unless it is 0) and filters nothing while no receiver position is available. With AT+FILTER_DISTANCE_NM also on, an aircraft is reported only if it passes both filters. The filter is off by default. Changes take effect immediately and persist across reboots after AT+SETTINGS=SAVE.</w:t>
       </w:r>
     </w:p>
     <w:p>
@@ -15126,18 +15408,18 @@
           <w:numId w:val="4"/>
         </w:numPr>
       </w:pPr>
-      <w:bookmarkStart w:id="302" w:name="_Toc242110902"/>
-      <w:r>
-        <w:t>Set the Distance Filter</w:t>
-      </w:r>
-      <w:bookmarkEnd w:id="302"/>
+      <w:bookmarkStart w:id="305" w:name="_Toc242110912"/>
+      <w:r>
+        <w:t>Set the Altitude Filter</w:t>
+      </w:r>
+      <w:bookmarkEnd w:id="305"/>
     </w:p>
     <w:p>
       <w:pPr>
         <w:pStyle w:val="code"/>
       </w:pPr>
       <w:r>
-        <w:t>AT+FILTER_DISTANCE_NM=&lt;enabled&gt;,&lt;distance_nm&gt;</w:t>
+        <w:t>AT+FILTER_ALTITUDE_FT=&lt;mode&gt;,&lt;a_ft&gt;,&lt;b_ft&gt;</w:t>
       </w:r>
     </w:p>
     <w:p>
@@ -15153,7 +15435,7 @@
         <w:pStyle w:val="code"/>
       </w:pPr>
       <w:r>
-        <w:t>AT+FILTER_DISTANCE_NM=1,50</w:t>
+        <w:t>AT+FILTER_ALTITUDE_FT=3,1000,18000</w:t>
       </w:r>
     </w:p>
     <w:p>
@@ -15245,6 +15527,291 @@
           </w:tcPr>
           <w:p>
             <w:r>
+              <w:t>mode</w:t>
+            </w:r>
+          </w:p>
+        </w:tc>
+        <w:tc>
+          <w:tcPr>
+            <w:tcW w:w="3690" w:type="dxa"/>
+          </w:tcPr>
+          <w:p>
+            <w:r>
+              <w:t>0: off. 1: keep aircraft at or above a_ft. 2: keep aircraft at or below a_ft. 3: keep aircraft from a_ft to b_ft. 4: keep aircraft within a_ft above or below the receiver. Bounds are inclusive. Empty keeps the current value.</w:t>
+            </w:r>
+          </w:p>
+        </w:tc>
+        <w:tc>
+          <w:tcPr>
+            <w:tcW w:w="5508" w:type="dxa"/>
+          </w:tcPr>
+          <w:p>
+            <w:r>
+              <w:t>0-4</w:t>
+            </w:r>
+          </w:p>
+          <w:p/>
+          <w:p>
+            <w:r>
+              <w:t>Default: 0 (filter off)</w:t>
+            </w:r>
+          </w:p>
+        </w:tc>
+      </w:tr>
+      <w:tr>
+        <w:tc>
+          <w:tcPr>
+            <w:tcW w:w="1818" w:type="dxa"/>
+          </w:tcPr>
+          <w:p>
+            <w:r>
+              <w:t>a_ft</w:t>
+            </w:r>
+          </w:p>
+        </w:tc>
+        <w:tc>
+          <w:tcPr>
+            <w:tcW w:w="3690" w:type="dxa"/>
+          </w:tcPr>
+          <w:p>
+            <w:r>
+              <w:t>Altitude in feet for modes 1-3, or the band half-width in feet for mode 4 (must be greater than 0). Empty keeps the current value.</w:t>
+            </w:r>
+          </w:p>
+        </w:tc>
+        <w:tc>
+          <w:tcPr>
+            <w:tcW w:w="5508" w:type="dxa"/>
+          </w:tcPr>
+          <w:p>
+            <w:r>
+              <w:t>-2000-100000</w:t>
+            </w:r>
+          </w:p>
+          <w:p/>
+          <w:p>
+            <w:r>
+              <w:t>Default: 0</w:t>
+            </w:r>
+          </w:p>
+        </w:tc>
+      </w:tr>
+      <w:tr>
+        <w:tc>
+          <w:tcPr>
+            <w:tcW w:w="1818" w:type="dxa"/>
+          </w:tcPr>
+          <w:p>
+            <w:r>
+              <w:t>b_ft</w:t>
+            </w:r>
+          </w:p>
+        </w:tc>
+        <w:tc>
+          <w:tcPr>
+            <w:tcW w:w="3690" w:type="dxa"/>
+          </w:tcPr>
+          <w:p>
+            <w:r>
+              <w:t>Upper altitude in feet for mode 3 (at least a_ft); kept but unused in the other modes. Empty keeps the current value.</w:t>
+            </w:r>
+          </w:p>
+        </w:tc>
+        <w:tc>
+          <w:tcPr>
+            <w:tcW w:w="5508" w:type="dxa"/>
+          </w:tcPr>
+          <w:p>
+            <w:r>
+              <w:t>-2000-100000</w:t>
+            </w:r>
+          </w:p>
+          <w:p/>
+          <w:p>
+            <w:r>
+              <w:t>Default: 10000</w:t>
+            </w:r>
+          </w:p>
+        </w:tc>
+      </w:tr>
+    </w:tbl>
+    <w:p>
+      <w:pPr>
+        <w:pStyle w:val="Heading3"/>
+        <w:numPr>
+          <w:ilvl w:val="2"/>
+          <w:numId w:val="4"/>
+        </w:numPr>
+      </w:pPr>
+      <w:bookmarkStart w:id="306" w:name="_Toc242110913"/>
+      <w:r>
+        <w:t>Query the Altitude Filter</w:t>
+      </w:r>
+      <w:bookmarkEnd w:id="306"/>
+    </w:p>
+    <w:p>
+      <w:pPr>
+        <w:pStyle w:val="code"/>
+      </w:pPr>
+      <w:r>
+        <w:t>AT+FILTER_ALTITUDE_FT?</w:t>
+      </w:r>
+    </w:p>
+    <w:p>
+      <w:pPr>
+        <w:pStyle w:val="code"/>
+      </w:pPr>
+      <w:r>
+        <w:t>FILTER_ALTITUDE_FT=0,0,10000</w:t>
+      </w:r>
+    </w:p>
+    <w:p/>
+    <w:p>
+      <w:pPr>
+        <w:pStyle w:val="Heading2"/>
+        <w:numPr>
+          <w:ilvl w:val="1"/>
+          <w:numId w:val="4"/>
+        </w:numPr>
+      </w:pPr>
+      <w:bookmarkStart w:id="301" w:name="_Toc242110901"/>
+      <w:r>
+        <w:t>AT+FILTER_DISTANCE_NM</w:t>
+      </w:r>
+      <w:bookmarkEnd w:id="301"/>
+    </w:p>
+    <w:p>
+      <w:r>
+        <w:t>Leaves aircraft that are farther than a set distance from the receiver position out of aircraft reports: the web interface's aircraft list and map, the Aircraft JSON WebSocket, and the aircraft reporting protocols (CSBee, MAVLink, GDL90, Aircraft JSON) on serial outputs and network feeds. Raw packets are never filtered: Raw, Beast and MLAT outputs, the network feeds that carry them and the ESP32's packet stream still carry every packet, including those from far aircraft. Aircraft at an unknown distance (no position decoded yet, or no receiver position; see AT+RX_POSITION) are always kept. The filter is off by default. Changes take effect immediately and persist across reboots after AT+SETTINGS=SAVE.</w:t>
+      </w:r>
+    </w:p>
+    <w:p>
+      <w:pPr>
+        <w:pStyle w:val="Heading3"/>
+        <w:numPr>
+          <w:ilvl w:val="2"/>
+          <w:numId w:val="4"/>
+        </w:numPr>
+      </w:pPr>
+      <w:bookmarkStart w:id="302" w:name="_Toc242110902"/>
+      <w:r>
+        <w:t>Set the Distance Filter</w:t>
+      </w:r>
+      <w:bookmarkEnd w:id="302"/>
+    </w:p>
+    <w:p>
+      <w:pPr>
+        <w:pStyle w:val="code"/>
+      </w:pPr>
+      <w:r>
+        <w:t>AT+FILTER_DISTANCE_NM=&lt;enabled&gt;,&lt;distance_nm&gt;</w:t>
+      </w:r>
+    </w:p>
+    <w:p>
+      <w:pPr>
+        <w:pStyle w:val="code"/>
+      </w:pPr>
+      <w:r>
+        <w:t>OK</w:t>
+      </w:r>
+    </w:p>
+    <w:p>
+      <w:pPr>
+        <w:pStyle w:val="code"/>
+      </w:pPr>
+      <w:r>
+        <w:t>AT+FILTER_DISTANCE_NM=1,50</w:t>
+      </w:r>
+    </w:p>
+    <w:p>
+      <w:pPr>
+        <w:pStyle w:val="code"/>
+      </w:pPr>
+      <w:r>
+        <w:t>OK</w:t>
+      </w:r>
+    </w:p>
+    <w:p/>
+    <w:tbl>
+      <w:tblPr>
+        <w:tblStyle w:val="TableGrid"/>
+        <w:tblW w:w="0" w:type="auto"/>
+        <w:tblLook w:val="04A0" w:firstRow="1" w:lastRow="0" w:firstColumn="1" w:lastColumn="0" w:noHBand="0" w:noVBand="1"/>
+      </w:tblPr>
+      <w:tblGrid>
+        <w:gridCol w:w="1716"/>
+        <w:gridCol w:w="2966"/>
+        <w:gridCol w:w="6334"/>
+      </w:tblGrid>
+      <w:tr>
+        <w:tc>
+          <w:tcPr>
+            <w:tcW w:w="1818" w:type="dxa"/>
+          </w:tcPr>
+          <w:p>
+            <w:pPr>
+              <w:rPr>
+                <w:b/>
+                <w:bCs/>
+              </w:rPr>
+            </w:pPr>
+            <w:r>
+              <w:rPr>
+                <w:b/>
+                <w:bCs/>
+              </w:rPr>
+              <w:t>Parameter</w:t>
+            </w:r>
+          </w:p>
+        </w:tc>
+        <w:tc>
+          <w:tcPr>
+            <w:tcW w:w="3690" w:type="dxa"/>
+          </w:tcPr>
+          <w:p>
+            <w:pPr>
+              <w:rPr>
+                <w:b/>
+                <w:bCs/>
+              </w:rPr>
+            </w:pPr>
+            <w:r>
+              <w:rPr>
+                <w:b/>
+                <w:bCs/>
+              </w:rPr>
+              <w:t>Description</w:t>
+            </w:r>
+          </w:p>
+        </w:tc>
+        <w:tc>
+          <w:tcPr>
+            <w:tcW w:w="5508" w:type="dxa"/>
+          </w:tcPr>
+          <w:p>
+            <w:pPr>
+              <w:rPr>
+                <w:b/>
+                <w:bCs/>
+              </w:rPr>
+            </w:pPr>
+            <w:r>
+              <w:rPr>
+                <w:b/>
+                <w:bCs/>
+              </w:rPr>
+              <w:t>Acceptable Values</w:t>
+            </w:r>
+          </w:p>
+        </w:tc>
+      </w:tr>
+      <w:tr>
+        <w:tc>
+          <w:tcPr>
+            <w:tcW w:w="1818" w:type="dxa"/>
+          </w:tcPr>
+          <w:p>
+            <w:r>
               <w:t>enabled</w:t>
             </w:r>
           </w:p>
@@ -17521,7 +18088,7 @@
         <w:fldChar w:fldCharType="separate"/>
       </w:r>
       <w:r>
-        <w:t xml:space="preserve">4.19.1  </w:t>
+        <w:t xml:space="preserve">4.21.1  </w:t>
       </w:r>
       <w:r>
         <w:fldChar w:fldCharType="end"/>

</xml_diff>

<commit_message>
Datasheets: AT+FILTER_ALTITUDE_FT modes as names (1090, m1421)
</commit_message>
<xml_diff>
--- a/word/datasheet_adsbee_1090.docx
+++ b/word/datasheet_adsbee_1090.docx
@@ -15397,7 +15397,7 @@
     </w:p>
     <w:p>
       <w:r>
-        <w:t>Leaves aircraft outside a set altitude band out of aircraft reports: the web interface's aircraft list and map, the Aircraft JSON WebSocket, and the aircraft reporting protocols (CSBee, MAVLink, GDL90, Aircraft JSON) on serial outputs and network feeds. Raw packets are never filtered: Raw, Beast and MLAT outputs, the network feeds that carry them and the ESP32's packet stream still carry every packet. The aircraft's altitude is its barometric altitude, or its GNSS altitude when no barometric altitude is known. Aircraft with no known altitude are always kept. Mode 4 compares against the receiver altitude from AT+RX_POSITION (the GNSS altitude for a GNSS fix, otherwise the barometric altitude unless it is 0) and filters nothing while no receiver position is available. With AT+FILTER_DISTANCE_NM also on, an aircraft is reported only if it passes both filters. The filter is off by default. Changes take effect immediately and persist across reboots after AT+SETTINGS=SAVE.</w:t>
+        <w:t>Leaves aircraft outside a set altitude band out of aircraft reports: the web interface's aircraft list and map, the Aircraft JSON WebSocket, and the aircraft reporting protocols (CSBee, MAVLink, GDL90, Aircraft JSON) on serial outputs and network feeds. Raw packets are never filtered: Raw, Beast and MLAT outputs, the network feeds that carry them and the ESP32's packet stream still carry every packet. The aircraft's altitude is its barometric altitude, or its GNSS altitude when no barometric altitude is known. Aircraft with no known altitude are always kept. NEAR_RX compares against the receiver altitude from AT+RX_POSITION (the GNSS altitude for a GNSS fix, otherwise the barometric altitude unless it is 0) and filters nothing while no receiver position is available. With AT+FILTER_DISTANCE_NM also on, an aircraft is reported only if it passes both filters. The filter is off by default. Changes take effect immediately and persist across reboots after AT+SETTINGS=SAVE.</w:t>
       </w:r>
     </w:p>
     <w:p>
@@ -15435,7 +15435,7 @@
         <w:pStyle w:val="code"/>
       </w:pPr>
       <w:r>
-        <w:t>AT+FILTER_ALTITUDE_FT=3,1000,18000</w:t>
+        <w:t>AT+FILTER_ALTITUDE_FT=BETWEEN,1000,18000</w:t>
       </w:r>
     </w:p>
     <w:p>
@@ -15537,7 +15537,7 @@
           </w:tcPr>
           <w:p>
             <w:r>
-              <w:t>0: off. 1: keep aircraft at or above a_ft. 2: keep aircraft at or below a_ft. 3: keep aircraft from a_ft to b_ft. 4: keep aircraft within a_ft above or below the receiver. Bounds are inclusive. Empty keeps the current value.</w:t>
+              <w:t>OFF: no filter. ABOVE: keep aircraft at or above a_ft. BELOW: keep aircraft at or below a_ft. BETWEEN: keep aircraft from a_ft to b_ft. NEAR_RX: keep aircraft within a_ft above or below the receiver. Bounds are inclusive. Not case sensitive. Empty keeps the current value.</w:t>
             </w:r>
           </w:p>
         </w:tc>
@@ -15547,13 +15547,13 @@
           </w:tcPr>
           <w:p>
             <w:r>
-              <w:t>0-4</w:t>
+              <w:t>OFF, ABOVE, BELOW, BETWEEN, NEAR_RX</w:t>
             </w:r>
           </w:p>
           <w:p/>
           <w:p>
             <w:r>
-              <w:t>Default: 0 (filter off)</w:t>
+              <w:t>Default: OFF</w:t>
             </w:r>
           </w:p>
         </w:tc>
@@ -15575,7 +15575,7 @@
           </w:tcPr>
           <w:p>
             <w:r>
-              <w:t>Altitude in feet for modes 1-3, or the band half-width in feet for mode 4 (must be greater than 0). Empty keeps the current value.</w:t>
+              <w:t>Altitude in feet for ABOVE, BELOW and BETWEEN, or the band half-width in feet for NEAR_RX (must be greater than 0). Empty keeps the current value.</w:t>
             </w:r>
           </w:p>
         </w:tc>
@@ -15613,7 +15613,7 @@
           </w:tcPr>
           <w:p>
             <w:r>
-              <w:t>Upper altitude in feet for mode 3 (at least a_ft); kept but unused in the other modes. Empty keeps the current value.</w:t>
+              <w:t>Upper altitude in feet for BETWEEN (at least a_ft); kept but unused in the other modes. Empty keeps the current value.</w:t>
             </w:r>
           </w:p>
         </w:tc>
@@ -15662,7 +15662,7 @@
         <w:pStyle w:val="code"/>
       </w:pPr>
       <w:r>
-        <w:t>FILTER_ALTITUDE_FT=0,0,10000</w:t>
+        <w:t>FILTER_ALTITUDE_FT=OFF,0,10000</w:t>
       </w:r>
     </w:p>
     <w:p/>

</xml_diff>

<commit_message>
Datasheets: ASTERIX protocol, AT+ASTERIX_SAC_SIC and AT+NTP_SERVER (#330)
ADSBee 1090: AT+ASTERIX_SAC_SIC and AT+NTP_SERVER sections, an ASTERIX section (data blocks, time source), and ASTERIX
in the AT+PROTOCOL_OUT and AT+FEED values and the reporting protocol list. ADSBee m1421: AT+ASTERIX_SAC_SIC and the
ASTERIX section; it has no time source, so it always sends NOGO. Revision 20261017 in both. Also fixes main's 1090
cross-reference to the AT+PROTOCOL_OUT table (4.19.1, now 4.20.1) and its 12-digit footer version.
</commit_message>
<xml_diff>
--- a/word/datasheet_adsbee_1090.docx
+++ b/word/datasheet_adsbee_1090.docx
@@ -1914,7 +1914,7 @@
               <w:lang w:eastAsia="zh-CN"/>
             </w:rPr>
           </w:pPr>
-          <w:hyperlink w:anchor="_Toc242110522" w:history="1">
+          <w:hyperlink w:anchor="_Toc242110904" w:history="1">
             <w:r>
               <w:rPr>
                 <w:rStyle w:val="Hyperlink"/>
@@ -1937,6 +1937,276 @@
                 <w:rStyle w:val="Hyperlink"/>
                 <w:noProof/>
               </w:rPr>
+              <w:t>AT+ASTERIX_SAC_SIC</w:t>
+            </w:r>
+            <w:r>
+              <w:rPr>
+                <w:noProof/>
+                <w:webHidden/>
+              </w:rPr>
+              <w:tab/>
+            </w:r>
+            <w:r>
+              <w:rPr>
+                <w:noProof/>
+                <w:webHidden/>
+              </w:rPr>
+              <w:fldChar w:fldCharType="begin"/>
+            </w:r>
+            <w:r>
+              <w:rPr>
+                <w:noProof/>
+                <w:webHidden/>
+              </w:rPr>
+              <w:instrText xml:space="preserve"> PAGEREF _Toc242110904 \h </w:instrText>
+            </w:r>
+            <w:r>
+              <w:rPr>
+                <w:noProof/>
+                <w:webHidden/>
+              </w:rPr>
+            </w:r>
+            <w:r>
+              <w:rPr>
+                <w:noProof/>
+                <w:webHidden/>
+              </w:rPr>
+              <w:fldChar w:fldCharType="separate"/>
+            </w:r>
+            <w:r>
+              <w:rPr>
+                <w:noProof/>
+                <w:webHidden/>
+              </w:rPr>
+              <w:t>10</w:t>
+            </w:r>
+            <w:r>
+              <w:rPr>
+                <w:noProof/>
+                <w:webHidden/>
+              </w:rPr>
+              <w:fldChar w:fldCharType="end"/>
+            </w:r>
+          </w:hyperlink>
+        </w:p>
+        <w:p>
+          <w:pPr>
+            <w:pStyle w:val="TOC3"/>
+            <w:tabs>
+              <w:tab w:val="left" w:pos="1200"/>
+              <w:tab w:val="right" w:leader="dot" w:pos="10790"/>
+            </w:tabs>
+            <w:rPr>
+              <w:rFonts w:eastAsiaTheme="minorEastAsia"/>
+              <w:noProof/>
+              <w:sz w:val="24"/>
+              <w:szCs w:val="24"/>
+              <w:lang w:eastAsia="zh-CN"/>
+            </w:rPr>
+          </w:pPr>
+          <w:hyperlink w:anchor="_Toc242110905" w:history="1">
+            <w:r>
+              <w:rPr>
+                <w:rStyle w:val="Hyperlink"/>
+                <w:noProof/>
+              </w:rPr>
+              <w:t>4.1.1</w:t>
+            </w:r>
+            <w:r>
+              <w:rPr>
+                <w:rFonts w:eastAsiaTheme="minorEastAsia"/>
+                <w:noProof/>
+                <w:sz w:val="24"/>
+                <w:szCs w:val="24"/>
+                <w:lang w:eastAsia="zh-CN"/>
+              </w:rPr>
+              <w:tab/>
+            </w:r>
+            <w:r>
+              <w:rPr>
+                <w:rStyle w:val="Hyperlink"/>
+                <w:noProof/>
+              </w:rPr>
+              <w:t>Set the ASTERIX Data Source Identifier</w:t>
+            </w:r>
+            <w:r>
+              <w:rPr>
+                <w:noProof/>
+                <w:webHidden/>
+              </w:rPr>
+              <w:tab/>
+            </w:r>
+            <w:r>
+              <w:rPr>
+                <w:noProof/>
+                <w:webHidden/>
+              </w:rPr>
+              <w:fldChar w:fldCharType="begin"/>
+            </w:r>
+            <w:r>
+              <w:rPr>
+                <w:noProof/>
+                <w:webHidden/>
+              </w:rPr>
+              <w:instrText xml:space="preserve"> PAGEREF _Toc242110905 \h </w:instrText>
+            </w:r>
+            <w:r>
+              <w:rPr>
+                <w:noProof/>
+                <w:webHidden/>
+              </w:rPr>
+            </w:r>
+            <w:r>
+              <w:rPr>
+                <w:noProof/>
+                <w:webHidden/>
+              </w:rPr>
+              <w:fldChar w:fldCharType="separate"/>
+            </w:r>
+            <w:r>
+              <w:rPr>
+                <w:noProof/>
+                <w:webHidden/>
+              </w:rPr>
+              <w:t>10</w:t>
+            </w:r>
+            <w:r>
+              <w:rPr>
+                <w:noProof/>
+                <w:webHidden/>
+              </w:rPr>
+              <w:fldChar w:fldCharType="end"/>
+            </w:r>
+          </w:hyperlink>
+        </w:p>
+        <w:p>
+          <w:pPr>
+            <w:pStyle w:val="TOC3"/>
+            <w:tabs>
+              <w:tab w:val="left" w:pos="1200"/>
+              <w:tab w:val="right" w:leader="dot" w:pos="10790"/>
+            </w:tabs>
+            <w:rPr>
+              <w:rFonts w:eastAsiaTheme="minorEastAsia"/>
+              <w:noProof/>
+              <w:sz w:val="24"/>
+              <w:szCs w:val="24"/>
+              <w:lang w:eastAsia="zh-CN"/>
+            </w:rPr>
+          </w:pPr>
+          <w:hyperlink w:anchor="_Toc242110906" w:history="1">
+            <w:r>
+              <w:rPr>
+                <w:rStyle w:val="Hyperlink"/>
+                <w:noProof/>
+              </w:rPr>
+              <w:t>4.1.2</w:t>
+            </w:r>
+            <w:r>
+              <w:rPr>
+                <w:rFonts w:eastAsiaTheme="minorEastAsia"/>
+                <w:noProof/>
+                <w:sz w:val="24"/>
+                <w:szCs w:val="24"/>
+                <w:lang w:eastAsia="zh-CN"/>
+              </w:rPr>
+              <w:tab/>
+            </w:r>
+            <w:r>
+              <w:rPr>
+                <w:rStyle w:val="Hyperlink"/>
+                <w:noProof/>
+              </w:rPr>
+              <w:t>Query the ASTERIX Data Source Identifier</w:t>
+            </w:r>
+            <w:r>
+              <w:rPr>
+                <w:noProof/>
+                <w:webHidden/>
+              </w:rPr>
+              <w:tab/>
+            </w:r>
+            <w:r>
+              <w:rPr>
+                <w:noProof/>
+                <w:webHidden/>
+              </w:rPr>
+              <w:fldChar w:fldCharType="begin"/>
+            </w:r>
+            <w:r>
+              <w:rPr>
+                <w:noProof/>
+                <w:webHidden/>
+              </w:rPr>
+              <w:instrText xml:space="preserve"> PAGEREF _Toc242110906 \h </w:instrText>
+            </w:r>
+            <w:r>
+              <w:rPr>
+                <w:noProof/>
+                <w:webHidden/>
+              </w:rPr>
+            </w:r>
+            <w:r>
+              <w:rPr>
+                <w:noProof/>
+                <w:webHidden/>
+              </w:rPr>
+              <w:fldChar w:fldCharType="separate"/>
+            </w:r>
+            <w:r>
+              <w:rPr>
+                <w:noProof/>
+                <w:webHidden/>
+              </w:rPr>
+              <w:t>10</w:t>
+            </w:r>
+            <w:r>
+              <w:rPr>
+                <w:noProof/>
+                <w:webHidden/>
+              </w:rPr>
+              <w:fldChar w:fldCharType="end"/>
+            </w:r>
+          </w:hyperlink>
+        </w:p>
+        <w:p>
+          <w:pPr>
+            <w:pStyle w:val="TOC2"/>
+            <w:tabs>
+              <w:tab w:val="left" w:pos="960"/>
+              <w:tab w:val="right" w:leader="dot" w:pos="10790"/>
+            </w:tabs>
+            <w:rPr>
+              <w:rFonts w:eastAsiaTheme="minorEastAsia"/>
+              <w:noProof/>
+              <w:sz w:val="24"/>
+              <w:szCs w:val="24"/>
+              <w:lang w:eastAsia="zh-CN"/>
+            </w:rPr>
+          </w:pPr>
+          <w:hyperlink w:anchor="_Toc242110522" w:history="1">
+            <w:r>
+              <w:rPr>
+                <w:rStyle w:val="Hyperlink"/>
+                <w:noProof/>
+              </w:rPr>
+              <w:t>4.2</w:t>
+            </w:r>
+            <w:r>
+              <w:rPr>
+                <w:rFonts w:eastAsiaTheme="minorEastAsia"/>
+                <w:noProof/>
+                <w:sz w:val="24"/>
+                <w:szCs w:val="24"/>
+                <w:lang w:eastAsia="zh-CN"/>
+              </w:rPr>
+              <w:tab/>
+            </w:r>
+            <w:r>
+              <w:rPr>
+                <w:rStyle w:val="Hyperlink"/>
+                <w:noProof/>
+              </w:rPr>
               <w:t>AT+BAUD_RATE</w:t>
             </w:r>
             <w:r>
@@ -1978,7 +2248,7 @@
                 <w:noProof/>
                 <w:webHidden/>
               </w:rPr>
-              <w:t>10</w:t>
+              <w:t>11</w:t>
             </w:r>
             <w:r>
               <w:rPr>
@@ -2010,7 +2280,7 @@
                 <w:rStyle w:val="Hyperlink"/>
                 <w:noProof/>
               </w:rPr>
-              <w:t>4.1.1</w:t>
+              <w:t>4.2.1</w:t>
             </w:r>
             <w:r>
               <w:rPr>
@@ -2068,7 +2338,7 @@
                 <w:noProof/>
                 <w:webHidden/>
               </w:rPr>
-              <w:t>10</w:t>
+              <w:t>11</w:t>
             </w:r>
             <w:r>
               <w:rPr>
@@ -2100,7 +2370,7 @@
                 <w:rStyle w:val="Hyperlink"/>
                 <w:noProof/>
               </w:rPr>
-              <w:t>4.1.2</w:t>
+              <w:t>4.2.2</w:t>
             </w:r>
             <w:r>
               <w:rPr>
@@ -2158,7 +2428,7 @@
                 <w:noProof/>
                 <w:webHidden/>
               </w:rPr>
-              <w:t>10</w:t>
+              <w:t>11</w:t>
             </w:r>
             <w:r>
               <w:rPr>
@@ -2190,7 +2460,7 @@
                 <w:rStyle w:val="Hyperlink"/>
                 <w:noProof/>
               </w:rPr>
-              <w:t>4.2</w:t>
+              <w:t>4.3</w:t>
             </w:r>
             <w:r>
               <w:rPr>
@@ -2280,7 +2550,7 @@
                 <w:rStyle w:val="Hyperlink"/>
                 <w:noProof/>
               </w:rPr>
-              <w:t>4.2.1</w:t>
+              <w:t>4.3.1</w:t>
             </w:r>
             <w:r>
               <w:rPr>
@@ -2370,7 +2640,7 @@
                 <w:rStyle w:val="Hyperlink"/>
                 <w:noProof/>
               </w:rPr>
-              <w:t>4.2.2</w:t>
+              <w:t>4.3.2</w:t>
             </w:r>
             <w:r>
               <w:rPr>
@@ -2460,7 +2730,7 @@
                 <w:rStyle w:val="Hyperlink"/>
                 <w:noProof/>
               </w:rPr>
-              <w:t>4.3</w:t>
+              <w:t>4.4</w:t>
             </w:r>
             <w:r>
               <w:rPr>
@@ -2518,7 +2788,7 @@
                 <w:noProof/>
                 <w:webHidden/>
               </w:rPr>
-              <w:t>11</w:t>
+              <w:t>12</w:t>
             </w:r>
             <w:r>
               <w:rPr>
@@ -2550,7 +2820,7 @@
                 <w:rStyle w:val="Hyperlink"/>
                 <w:noProof/>
               </w:rPr>
-              <w:t>4.4</w:t>
+              <w:t>4.5</w:t>
             </w:r>
             <w:r>
               <w:rPr>
@@ -2608,7 +2878,7 @@
                 <w:noProof/>
                 <w:webHidden/>
               </w:rPr>
-              <w:t>12</w:t>
+              <w:t>13</w:t>
             </w:r>
             <w:r>
               <w:rPr>
@@ -2640,7 +2910,7 @@
                 <w:rStyle w:val="Hyperlink"/>
                 <w:noProof/>
               </w:rPr>
-              <w:t>4.5</w:t>
+              <w:t>4.6</w:t>
             </w:r>
             <w:r>
               <w:rPr>
@@ -2698,7 +2968,7 @@
                 <w:noProof/>
                 <w:webHidden/>
               </w:rPr>
-              <w:t>12</w:t>
+              <w:t>13</w:t>
             </w:r>
             <w:r>
               <w:rPr>
@@ -2730,7 +3000,7 @@
                 <w:rStyle w:val="Hyperlink"/>
                 <w:noProof/>
               </w:rPr>
-              <w:t>4.6</w:t>
+              <w:t>4.7</w:t>
             </w:r>
             <w:r>
               <w:rPr>
@@ -2788,7 +3058,7 @@
                 <w:noProof/>
                 <w:webHidden/>
               </w:rPr>
-              <w:t>13</w:t>
+              <w:t>14</w:t>
             </w:r>
             <w:r>
               <w:rPr>
@@ -2820,7 +3090,7 @@
                 <w:rStyle w:val="Hyperlink"/>
                 <w:noProof/>
               </w:rPr>
-              <w:t>4.6.1</w:t>
+              <w:t>4.7.1</w:t>
             </w:r>
             <w:r>
               <w:rPr>
@@ -2878,7 +3148,7 @@
                 <w:noProof/>
                 <w:webHidden/>
               </w:rPr>
-              <w:t>13</w:t>
+              <w:t>14</w:t>
             </w:r>
             <w:r>
               <w:rPr>
@@ -2910,7 +3180,7 @@
                 <w:rStyle w:val="Hyperlink"/>
                 <w:noProof/>
               </w:rPr>
-              <w:t>4.6.2</w:t>
+              <w:t>4.7.2</w:t>
             </w:r>
             <w:r>
               <w:rPr>
@@ -2968,7 +3238,7 @@
                 <w:noProof/>
                 <w:webHidden/>
               </w:rPr>
-              <w:t>13</w:t>
+              <w:t>14</w:t>
             </w:r>
             <w:r>
               <w:rPr>
@@ -3000,7 +3270,7 @@
                 <w:rStyle w:val="Hyperlink"/>
                 <w:noProof/>
               </w:rPr>
-              <w:t>4.7</w:t>
+              <w:t>4.8</w:t>
             </w:r>
             <w:r>
               <w:rPr>
@@ -3058,7 +3328,7 @@
                 <w:noProof/>
                 <w:webHidden/>
               </w:rPr>
-              <w:t>13</w:t>
+              <w:t>14</w:t>
             </w:r>
             <w:r>
               <w:rPr>
@@ -3090,7 +3360,7 @@
                 <w:rStyle w:val="Hyperlink"/>
                 <w:noProof/>
               </w:rPr>
-              <w:t>4.8</w:t>
+              <w:t>4.9</w:t>
             </w:r>
             <w:r>
               <w:rPr>
@@ -3148,7 +3418,7 @@
                 <w:noProof/>
                 <w:webHidden/>
               </w:rPr>
-              <w:t>13</w:t>
+              <w:t>14</w:t>
             </w:r>
             <w:r>
               <w:rPr>
@@ -3180,7 +3450,7 @@
                 <w:rStyle w:val="Hyperlink"/>
                 <w:noProof/>
               </w:rPr>
-              <w:t>4.8.1</w:t>
+              <w:t>4.9.1</w:t>
             </w:r>
             <w:r>
               <w:rPr>
@@ -3238,7 +3508,7 @@
                 <w:noProof/>
                 <w:webHidden/>
               </w:rPr>
-              <w:t>13</w:t>
+              <w:t>14</w:t>
             </w:r>
             <w:r>
               <w:rPr>
@@ -3270,7 +3540,7 @@
                 <w:rStyle w:val="Hyperlink"/>
                 <w:noProof/>
               </w:rPr>
-              <w:t>4.8.2</w:t>
+              <w:t>4.9.2</w:t>
             </w:r>
             <w:r>
               <w:rPr>
@@ -3328,7 +3598,7 @@
                 <w:noProof/>
                 <w:webHidden/>
               </w:rPr>
-              <w:t>14</w:t>
+              <w:t>15</w:t>
             </w:r>
             <w:r>
               <w:rPr>
@@ -3360,7 +3630,7 @@
                 <w:rStyle w:val="Hyperlink"/>
                 <w:noProof/>
               </w:rPr>
-              <w:t>4.9</w:t>
+              <w:t>4.10</w:t>
             </w:r>
             <w:r>
               <w:rPr>
@@ -3418,7 +3688,7 @@
                 <w:noProof/>
                 <w:webHidden/>
               </w:rPr>
-              <w:t>14</w:t>
+              <w:t>15</w:t>
             </w:r>
             <w:r>
               <w:rPr>
@@ -3450,7 +3720,7 @@
                 <w:rStyle w:val="Hyperlink"/>
                 <w:noProof/>
               </w:rPr>
-              <w:t>4.9.1</w:t>
+              <w:t>4.10.1</w:t>
             </w:r>
             <w:r>
               <w:rPr>
@@ -3508,7 +3778,7 @@
                 <w:noProof/>
                 <w:webHidden/>
               </w:rPr>
-              <w:t>14</w:t>
+              <w:t>15</w:t>
             </w:r>
             <w:r>
               <w:rPr>
@@ -3540,7 +3810,7 @@
                 <w:rStyle w:val="Hyperlink"/>
                 <w:noProof/>
               </w:rPr>
-              <w:t>4.9.2</w:t>
+              <w:t>4.10.2</w:t>
             </w:r>
             <w:r>
               <w:rPr>
@@ -3598,7 +3868,7 @@
                 <w:noProof/>
                 <w:webHidden/>
               </w:rPr>
-              <w:t>15</w:t>
+              <w:t>16</w:t>
             </w:r>
             <w:r>
               <w:rPr>
@@ -3630,7 +3900,7 @@
                 <w:rStyle w:val="Hyperlink"/>
                 <w:noProof/>
               </w:rPr>
-              <w:t>4.9.3</w:t>
+              <w:t>4.10.3</w:t>
             </w:r>
             <w:r>
               <w:rPr>
@@ -3688,7 +3958,7 @@
                 <w:noProof/>
                 <w:webHidden/>
               </w:rPr>
-              <w:t>15</w:t>
+              <w:t>16</w:t>
             </w:r>
             <w:r>
               <w:rPr>
@@ -3720,7 +3990,7 @@
                 <w:rStyle w:val="Hyperlink"/>
                 <w:noProof/>
               </w:rPr>
-              <w:t>4.10</w:t>
+              <w:t>4.11</w:t>
             </w:r>
             <w:r>
               <w:rPr>
@@ -3778,7 +4048,7 @@
                 <w:noProof/>
                 <w:webHidden/>
               </w:rPr>
-              <w:t>15</w:t>
+              <w:t>16</w:t>
             </w:r>
             <w:r>
               <w:rPr>
@@ -3810,7 +4080,7 @@
                 <w:rStyle w:val="Hyperlink"/>
                 <w:noProof/>
               </w:rPr>
-              <w:t>4.10.1</w:t>
+              <w:t>4.11.1</w:t>
             </w:r>
             <w:r>
               <w:rPr>
@@ -3868,7 +4138,7 @@
                 <w:noProof/>
                 <w:webHidden/>
               </w:rPr>
-              <w:t>15</w:t>
+              <w:t>16</w:t>
             </w:r>
             <w:r>
               <w:rPr>
@@ -3900,7 +4170,7 @@
                 <w:rStyle w:val="Hyperlink"/>
                 <w:noProof/>
               </w:rPr>
-              <w:t>4.10.2</w:t>
+              <w:t>4.11.2</w:t>
             </w:r>
             <w:r>
               <w:rPr>
@@ -3958,7 +4228,7 @@
                 <w:noProof/>
                 <w:webHidden/>
               </w:rPr>
-              <w:t>15</w:t>
+              <w:t>16</w:t>
             </w:r>
             <w:r>
               <w:rPr>
@@ -3990,7 +4260,7 @@
                 <w:rStyle w:val="Hyperlink"/>
                 <w:noProof/>
               </w:rPr>
-              <w:t>4.11</w:t>
+              <w:t>4.12</w:t>
             </w:r>
             <w:r>
               <w:rPr>
@@ -4048,7 +4318,7 @@
                 <w:noProof/>
                 <w:webHidden/>
               </w:rPr>
-              <w:t>16</w:t>
+              <w:t>17</w:t>
             </w:r>
             <w:r>
               <w:rPr>
@@ -4080,7 +4350,7 @@
                 <w:rStyle w:val="Hyperlink"/>
                 <w:noProof/>
               </w:rPr>
-              <w:t>4.11.1</w:t>
+              <w:t>4.12.1</w:t>
             </w:r>
             <w:r>
               <w:rPr>
@@ -4138,7 +4408,7 @@
                 <w:noProof/>
                 <w:webHidden/>
               </w:rPr>
-              <w:t>16</w:t>
+              <w:t>17</w:t>
             </w:r>
             <w:r>
               <w:rPr>
@@ -4170,7 +4440,7 @@
                 <w:rStyle w:val="Hyperlink"/>
                 <w:noProof/>
               </w:rPr>
-              <w:t>4.11.2</w:t>
+              <w:t>4.12.2</w:t>
             </w:r>
             <w:r>
               <w:rPr>
@@ -4228,7 +4498,7 @@
                 <w:noProof/>
                 <w:webHidden/>
               </w:rPr>
-              <w:t>16</w:t>
+              <w:t>17</w:t>
             </w:r>
             <w:r>
               <w:rPr>
@@ -4260,7 +4530,7 @@
                 <w:rStyle w:val="Hyperlink"/>
                 <w:noProof/>
               </w:rPr>
-              <w:t>4.12</w:t>
+              <w:t>4.13</w:t>
             </w:r>
             <w:r>
               <w:rPr>
@@ -4318,7 +4588,7 @@
                 <w:noProof/>
                 <w:webHidden/>
               </w:rPr>
-              <w:t>16</w:t>
+              <w:t>17</w:t>
             </w:r>
             <w:r>
               <w:rPr>
@@ -4350,7 +4620,7 @@
                 <w:rStyle w:val="Hyperlink"/>
                 <w:noProof/>
               </w:rPr>
-              <w:t>4.12.1</w:t>
+              <w:t>4.13.1</w:t>
             </w:r>
             <w:r>
               <w:rPr>
@@ -4408,7 +4678,7 @@
                 <w:noProof/>
                 <w:webHidden/>
               </w:rPr>
-              <w:t>16</w:t>
+              <w:t>17</w:t>
             </w:r>
             <w:r>
               <w:rPr>
@@ -4440,7 +4710,7 @@
                 <w:rStyle w:val="Hyperlink"/>
                 <w:noProof/>
               </w:rPr>
-              <w:t>4.12.2</w:t>
+              <w:t>4.13.2</w:t>
             </w:r>
             <w:r>
               <w:rPr>
@@ -4498,7 +4768,7 @@
                 <w:noProof/>
                 <w:webHidden/>
               </w:rPr>
-              <w:t>17</w:t>
+              <w:t>18</w:t>
             </w:r>
             <w:r>
               <w:rPr>
@@ -4530,7 +4800,7 @@
                 <w:rStyle w:val="Hyperlink"/>
                 <w:noProof/>
               </w:rPr>
-              <w:t>4.13</w:t>
+              <w:t>4.14</w:t>
             </w:r>
             <w:r>
               <w:rPr>
@@ -4588,7 +4858,7 @@
                 <w:noProof/>
                 <w:webHidden/>
               </w:rPr>
-              <w:t>17</w:t>
+              <w:t>18</w:t>
             </w:r>
             <w:r>
               <w:rPr>
@@ -4620,7 +4890,7 @@
                 <w:rStyle w:val="Hyperlink"/>
                 <w:noProof/>
               </w:rPr>
-              <w:t>4.13.1</w:t>
+              <w:t>4.14.1</w:t>
             </w:r>
             <w:r>
               <w:rPr>
@@ -4678,7 +4948,7 @@
                 <w:noProof/>
                 <w:webHidden/>
               </w:rPr>
-              <w:t>17</w:t>
+              <w:t>18</w:t>
             </w:r>
             <w:r>
               <w:rPr>
@@ -4710,7 +4980,7 @@
                 <w:rStyle w:val="Hyperlink"/>
                 <w:noProof/>
               </w:rPr>
-              <w:t>4.13.2</w:t>
+              <w:t>4.14.2</w:t>
             </w:r>
             <w:r>
               <w:rPr>
@@ -4768,7 +5038,7 @@
                 <w:noProof/>
                 <w:webHidden/>
               </w:rPr>
-              <w:t>17</w:t>
+              <w:t>18</w:t>
             </w:r>
             <w:r>
               <w:rPr>
@@ -4800,7 +5070,7 @@
                 <w:rStyle w:val="Hyperlink"/>
                 <w:noProof/>
               </w:rPr>
-              <w:t>4.14</w:t>
+              <w:t>4.15</w:t>
             </w:r>
             <w:r>
               <w:rPr>
@@ -4858,7 +5128,7 @@
                 <w:noProof/>
                 <w:webHidden/>
               </w:rPr>
-              <w:t>18</w:t>
+              <w:t>19</w:t>
             </w:r>
             <w:r>
               <w:rPr>
@@ -4890,7 +5160,7 @@
                 <w:rStyle w:val="Hyperlink"/>
                 <w:noProof/>
               </w:rPr>
-              <w:t>4.15</w:t>
+              <w:t>4.16</w:t>
             </w:r>
             <w:r>
               <w:rPr>
@@ -4948,7 +5218,7 @@
                 <w:noProof/>
                 <w:webHidden/>
               </w:rPr>
-              <w:t>18</w:t>
+              <w:t>19</w:t>
             </w:r>
             <w:r>
               <w:rPr>
@@ -4980,7 +5250,7 @@
                 <w:rStyle w:val="Hyperlink"/>
                 <w:noProof/>
               </w:rPr>
-              <w:t>4.15.1</w:t>
+              <w:t>4.16.1</w:t>
             </w:r>
             <w:r>
               <w:rPr>
@@ -5038,7 +5308,7 @@
                 <w:noProof/>
                 <w:webHidden/>
               </w:rPr>
-              <w:t>18</w:t>
+              <w:t>19</w:t>
             </w:r>
             <w:r>
               <w:rPr>
@@ -5070,7 +5340,7 @@
                 <w:rStyle w:val="Hyperlink"/>
                 <w:noProof/>
               </w:rPr>
-              <w:t>4.15.2</w:t>
+              <w:t>4.16.2</w:t>
             </w:r>
             <w:r>
               <w:rPr>
@@ -5128,7 +5398,7 @@
                 <w:noProof/>
                 <w:webHidden/>
               </w:rPr>
-              <w:t>18</w:t>
+              <w:t>19</w:t>
             </w:r>
             <w:r>
               <w:rPr>
@@ -5160,7 +5430,7 @@
                 <w:rStyle w:val="Hyperlink"/>
                 <w:noProof/>
               </w:rPr>
-              <w:t>4.16</w:t>
+              <w:t>4.17</w:t>
             </w:r>
             <w:r>
               <w:rPr>
@@ -5218,7 +5488,7 @@
                 <w:noProof/>
                 <w:webHidden/>
               </w:rPr>
-              <w:t>19</w:t>
+              <w:t>20</w:t>
             </w:r>
             <w:r>
               <w:rPr>
@@ -5250,7 +5520,7 @@
                 <w:rStyle w:val="Hyperlink"/>
                 <w:noProof/>
               </w:rPr>
-              <w:t>4.17</w:t>
+              <w:t>4.18</w:t>
             </w:r>
             <w:r>
               <w:rPr>
@@ -5308,7 +5578,7 @@
                 <w:noProof/>
                 <w:webHidden/>
               </w:rPr>
-              <w:t>20</w:t>
+              <w:t>21</w:t>
             </w:r>
             <w:r>
               <w:rPr>
@@ -5340,7 +5610,7 @@
                 <w:rStyle w:val="Hyperlink"/>
                 <w:noProof/>
               </w:rPr>
-              <w:t>4.17.1</w:t>
+              <w:t>4.18.1</w:t>
             </w:r>
             <w:r>
               <w:rPr>
@@ -5398,7 +5668,7 @@
                 <w:noProof/>
                 <w:webHidden/>
               </w:rPr>
-              <w:t>20</w:t>
+              <w:t>21</w:t>
             </w:r>
             <w:r>
               <w:rPr>
@@ -5430,7 +5700,7 @@
                 <w:rStyle w:val="Hyperlink"/>
                 <w:noProof/>
               </w:rPr>
-              <w:t>4.17.2</w:t>
+              <w:t>4.18.2</w:t>
             </w:r>
             <w:r>
               <w:rPr>
@@ -5488,7 +5758,7 @@
                 <w:noProof/>
                 <w:webHidden/>
               </w:rPr>
-              <w:t>20</w:t>
+              <w:t>21</w:t>
             </w:r>
             <w:r>
               <w:rPr>
@@ -5520,7 +5790,7 @@
                 <w:rStyle w:val="Hyperlink"/>
                 <w:noProof/>
               </w:rPr>
-              <w:t>4.18</w:t>
+              <w:t>4.19</w:t>
             </w:r>
             <w:r>
               <w:rPr>
@@ -5578,7 +5848,7 @@
                 <w:noProof/>
                 <w:webHidden/>
               </w:rPr>
-              <w:t>21</w:t>
+              <w:t>22</w:t>
             </w:r>
             <w:r>
               <w:rPr>
@@ -5610,7 +5880,7 @@
                 <w:rStyle w:val="Hyperlink"/>
                 <w:noProof/>
               </w:rPr>
-              <w:t>4.18.1</w:t>
+              <w:t>4.19.1</w:t>
             </w:r>
             <w:r>
               <w:rPr>
@@ -5668,7 +5938,7 @@
                 <w:noProof/>
                 <w:webHidden/>
               </w:rPr>
-              <w:t>21</w:t>
+              <w:t>22</w:t>
             </w:r>
             <w:r>
               <w:rPr>
@@ -5700,7 +5970,7 @@
                 <w:rStyle w:val="Hyperlink"/>
                 <w:noProof/>
               </w:rPr>
-              <w:t>4.18.2</w:t>
+              <w:t>4.19.2</w:t>
             </w:r>
             <w:r>
               <w:rPr>
@@ -5758,7 +6028,7 @@
                 <w:noProof/>
                 <w:webHidden/>
               </w:rPr>
-              <w:t>21</w:t>
+              <w:t>22</w:t>
             </w:r>
             <w:r>
               <w:rPr>
@@ -5790,7 +6060,7 @@
                 <w:rStyle w:val="Hyperlink"/>
                 <w:noProof/>
               </w:rPr>
-              <w:t>4.19</w:t>
+              <w:t>4.20</w:t>
             </w:r>
             <w:r>
               <w:rPr>
@@ -5848,7 +6118,277 @@
                 <w:noProof/>
                 <w:webHidden/>
               </w:rPr>
-              <w:t>21</w:t>
+              <w:t>22</w:t>
+            </w:r>
+            <w:r>
+              <w:rPr>
+                <w:noProof/>
+                <w:webHidden/>
+              </w:rPr>
+              <w:fldChar w:fldCharType="end"/>
+            </w:r>
+          </w:hyperlink>
+        </w:p>
+        <w:p>
+          <w:pPr>
+            <w:pStyle w:val="TOC2"/>
+            <w:tabs>
+              <w:tab w:val="left" w:pos="960"/>
+              <w:tab w:val="right" w:leader="dot" w:pos="10790"/>
+            </w:tabs>
+            <w:rPr>
+              <w:rFonts w:eastAsiaTheme="minorEastAsia"/>
+              <w:noProof/>
+              <w:sz w:val="24"/>
+              <w:szCs w:val="24"/>
+              <w:lang w:eastAsia="zh-CN"/>
+            </w:rPr>
+          </w:pPr>
+          <w:hyperlink w:anchor="_Toc242110907" w:history="1">
+            <w:r>
+              <w:rPr>
+                <w:rStyle w:val="Hyperlink"/>
+                <w:noProof/>
+              </w:rPr>
+              <w:t>4.21</w:t>
+            </w:r>
+            <w:r>
+              <w:rPr>
+                <w:rFonts w:eastAsiaTheme="minorEastAsia"/>
+                <w:noProof/>
+                <w:sz w:val="24"/>
+                <w:szCs w:val="24"/>
+                <w:lang w:eastAsia="zh-CN"/>
+              </w:rPr>
+              <w:tab/>
+            </w:r>
+            <w:r>
+              <w:rPr>
+                <w:rStyle w:val="Hyperlink"/>
+                <w:noProof/>
+              </w:rPr>
+              <w:t>AT+NTP_SERVER</w:t>
+            </w:r>
+            <w:r>
+              <w:rPr>
+                <w:noProof/>
+                <w:webHidden/>
+              </w:rPr>
+              <w:tab/>
+            </w:r>
+            <w:r>
+              <w:rPr>
+                <w:noProof/>
+                <w:webHidden/>
+              </w:rPr>
+              <w:fldChar w:fldCharType="begin"/>
+            </w:r>
+            <w:r>
+              <w:rPr>
+                <w:noProof/>
+                <w:webHidden/>
+              </w:rPr>
+              <w:instrText xml:space="preserve"> PAGEREF _Toc242110907 \h </w:instrText>
+            </w:r>
+            <w:r>
+              <w:rPr>
+                <w:noProof/>
+                <w:webHidden/>
+              </w:rPr>
+            </w:r>
+            <w:r>
+              <w:rPr>
+                <w:noProof/>
+                <w:webHidden/>
+              </w:rPr>
+              <w:fldChar w:fldCharType="separate"/>
+            </w:r>
+            <w:r>
+              <w:rPr>
+                <w:noProof/>
+                <w:webHidden/>
+              </w:rPr>
+              <w:t>23</w:t>
+            </w:r>
+            <w:r>
+              <w:rPr>
+                <w:noProof/>
+                <w:webHidden/>
+              </w:rPr>
+              <w:fldChar w:fldCharType="end"/>
+            </w:r>
+          </w:hyperlink>
+        </w:p>
+        <w:p>
+          <w:pPr>
+            <w:pStyle w:val="TOC3"/>
+            <w:tabs>
+              <w:tab w:val="left" w:pos="1200"/>
+              <w:tab w:val="right" w:leader="dot" w:pos="10790"/>
+            </w:tabs>
+            <w:rPr>
+              <w:rFonts w:eastAsiaTheme="minorEastAsia"/>
+              <w:noProof/>
+              <w:sz w:val="24"/>
+              <w:szCs w:val="24"/>
+              <w:lang w:eastAsia="zh-CN"/>
+            </w:rPr>
+          </w:pPr>
+          <w:hyperlink w:anchor="_Toc242110908" w:history="1">
+            <w:r>
+              <w:rPr>
+                <w:rStyle w:val="Hyperlink"/>
+                <w:noProof/>
+              </w:rPr>
+              <w:t>4.21.1</w:t>
+            </w:r>
+            <w:r>
+              <w:rPr>
+                <w:rFonts w:eastAsiaTheme="minorEastAsia"/>
+                <w:noProof/>
+                <w:sz w:val="24"/>
+                <w:szCs w:val="24"/>
+                <w:lang w:eastAsia="zh-CN"/>
+              </w:rPr>
+              <w:tab/>
+            </w:r>
+            <w:r>
+              <w:rPr>
+                <w:rStyle w:val="Hyperlink"/>
+                <w:noProof/>
+              </w:rPr>
+              <w:t>Set the NTP Server</w:t>
+            </w:r>
+            <w:r>
+              <w:rPr>
+                <w:noProof/>
+                <w:webHidden/>
+              </w:rPr>
+              <w:tab/>
+            </w:r>
+            <w:r>
+              <w:rPr>
+                <w:noProof/>
+                <w:webHidden/>
+              </w:rPr>
+              <w:fldChar w:fldCharType="begin"/>
+            </w:r>
+            <w:r>
+              <w:rPr>
+                <w:noProof/>
+                <w:webHidden/>
+              </w:rPr>
+              <w:instrText xml:space="preserve"> PAGEREF _Toc242110908 \h </w:instrText>
+            </w:r>
+            <w:r>
+              <w:rPr>
+                <w:noProof/>
+                <w:webHidden/>
+              </w:rPr>
+            </w:r>
+            <w:r>
+              <w:rPr>
+                <w:noProof/>
+                <w:webHidden/>
+              </w:rPr>
+              <w:fldChar w:fldCharType="separate"/>
+            </w:r>
+            <w:r>
+              <w:rPr>
+                <w:noProof/>
+                <w:webHidden/>
+              </w:rPr>
+              <w:t>23</w:t>
+            </w:r>
+            <w:r>
+              <w:rPr>
+                <w:noProof/>
+                <w:webHidden/>
+              </w:rPr>
+              <w:fldChar w:fldCharType="end"/>
+            </w:r>
+          </w:hyperlink>
+        </w:p>
+        <w:p>
+          <w:pPr>
+            <w:pStyle w:val="TOC3"/>
+            <w:tabs>
+              <w:tab w:val="left" w:pos="1200"/>
+              <w:tab w:val="right" w:leader="dot" w:pos="10790"/>
+            </w:tabs>
+            <w:rPr>
+              <w:rFonts w:eastAsiaTheme="minorEastAsia"/>
+              <w:noProof/>
+              <w:sz w:val="24"/>
+              <w:szCs w:val="24"/>
+              <w:lang w:eastAsia="zh-CN"/>
+            </w:rPr>
+          </w:pPr>
+          <w:hyperlink w:anchor="_Toc242110909" w:history="1">
+            <w:r>
+              <w:rPr>
+                <w:rStyle w:val="Hyperlink"/>
+                <w:noProof/>
+              </w:rPr>
+              <w:t>4.21.2</w:t>
+            </w:r>
+            <w:r>
+              <w:rPr>
+                <w:rFonts w:eastAsiaTheme="minorEastAsia"/>
+                <w:noProof/>
+                <w:sz w:val="24"/>
+                <w:szCs w:val="24"/>
+                <w:lang w:eastAsia="zh-CN"/>
+              </w:rPr>
+              <w:tab/>
+            </w:r>
+            <w:r>
+              <w:rPr>
+                <w:rStyle w:val="Hyperlink"/>
+                <w:noProof/>
+              </w:rPr>
+              <w:t>Query the NTP Server</w:t>
+            </w:r>
+            <w:r>
+              <w:rPr>
+                <w:noProof/>
+                <w:webHidden/>
+              </w:rPr>
+              <w:tab/>
+            </w:r>
+            <w:r>
+              <w:rPr>
+                <w:noProof/>
+                <w:webHidden/>
+              </w:rPr>
+              <w:fldChar w:fldCharType="begin"/>
+            </w:r>
+            <w:r>
+              <w:rPr>
+                <w:noProof/>
+                <w:webHidden/>
+              </w:rPr>
+              <w:instrText xml:space="preserve"> PAGEREF _Toc242110909 \h </w:instrText>
+            </w:r>
+            <w:r>
+              <w:rPr>
+                <w:noProof/>
+                <w:webHidden/>
+              </w:rPr>
+            </w:r>
+            <w:r>
+              <w:rPr>
+                <w:noProof/>
+                <w:webHidden/>
+              </w:rPr>
+              <w:fldChar w:fldCharType="separate"/>
+            </w:r>
+            <w:r>
+              <w:rPr>
+                <w:noProof/>
+                <w:webHidden/>
+              </w:rPr>
+              <w:t>23</w:t>
             </w:r>
             <w:r>
               <w:rPr>
@@ -5880,7 +6420,7 @@
                 <w:rStyle w:val="Hyperlink"/>
                 <w:noProof/>
               </w:rPr>
-              <w:t>4.20</w:t>
+              <w:t>4.22</w:t>
             </w:r>
             <w:r>
               <w:rPr>
@@ -5938,7 +6478,7 @@
                 <w:noProof/>
                 <w:webHidden/>
               </w:rPr>
-              <w:t>22</w:t>
+              <w:t>23</w:t>
             </w:r>
             <w:r>
               <w:rPr>
@@ -5970,7 +6510,7 @@
                 <w:rStyle w:val="Hyperlink"/>
                 <w:noProof/>
               </w:rPr>
-              <w:t>4.20.1</w:t>
+              <w:t>4.22.1</w:t>
             </w:r>
             <w:r>
               <w:rPr>
@@ -6028,7 +6568,7 @@
                 <w:noProof/>
                 <w:webHidden/>
               </w:rPr>
-              <w:t>22</w:t>
+              <w:t>23</w:t>
             </w:r>
             <w:r>
               <w:rPr>
@@ -6060,7 +6600,7 @@
                 <w:rStyle w:val="Hyperlink"/>
                 <w:noProof/>
               </w:rPr>
-              <w:t>4.20.2</w:t>
+              <w:t>4.22.2</w:t>
             </w:r>
             <w:r>
               <w:rPr>
@@ -6118,7 +6658,7 @@
                 <w:noProof/>
                 <w:webHidden/>
               </w:rPr>
-              <w:t>22</w:t>
+              <w:t>24</w:t>
             </w:r>
             <w:r>
               <w:rPr>
@@ -6150,7 +6690,7 @@
                 <w:rStyle w:val="Hyperlink"/>
                 <w:noProof/>
               </w:rPr>
-              <w:t>4.21</w:t>
+              <w:t>4.23</w:t>
             </w:r>
             <w:r>
               <w:rPr>
@@ -6208,7 +6748,7 @@
                 <w:noProof/>
                 <w:webHidden/>
               </w:rPr>
-              <w:t>22</w:t>
+              <w:t>24</w:t>
             </w:r>
             <w:r>
               <w:rPr>
@@ -6240,7 +6780,7 @@
                 <w:rStyle w:val="Hyperlink"/>
                 <w:noProof/>
               </w:rPr>
-              <w:t>4.22</w:t>
+              <w:t>4.24</w:t>
             </w:r>
             <w:r>
               <w:rPr>
@@ -6298,7 +6838,7 @@
                 <w:noProof/>
                 <w:webHidden/>
               </w:rPr>
-              <w:t>23</w:t>
+              <w:t>25</w:t>
             </w:r>
             <w:r>
               <w:rPr>
@@ -6330,7 +6870,7 @@
                 <w:rStyle w:val="Hyperlink"/>
                 <w:noProof/>
               </w:rPr>
-              <w:t>4.22.1</w:t>
+              <w:t>4.24.1</w:t>
             </w:r>
             <w:r>
               <w:rPr>
@@ -6388,7 +6928,7 @@
                 <w:noProof/>
                 <w:webHidden/>
               </w:rPr>
-              <w:t>23</w:t>
+              <w:t>25</w:t>
             </w:r>
             <w:r>
               <w:rPr>
@@ -6420,7 +6960,7 @@
                 <w:rStyle w:val="Hyperlink"/>
                 <w:noProof/>
               </w:rPr>
-              <w:t>4.22.2</w:t>
+              <w:t>4.24.2</w:t>
             </w:r>
             <w:r>
               <w:rPr>
@@ -6478,7 +7018,7 @@
                 <w:noProof/>
                 <w:webHidden/>
               </w:rPr>
-              <w:t>23</w:t>
+              <w:t>25</w:t>
             </w:r>
             <w:r>
               <w:rPr>
@@ -6510,7 +7050,7 @@
                 <w:rStyle w:val="Hyperlink"/>
                 <w:noProof/>
               </w:rPr>
-              <w:t>4.23</w:t>
+              <w:t>4.25</w:t>
             </w:r>
             <w:r>
               <w:rPr>
@@ -6568,7 +7108,7 @@
                 <w:noProof/>
                 <w:webHidden/>
               </w:rPr>
-              <w:t>24</w:t>
+              <w:t>26</w:t>
             </w:r>
             <w:r>
               <w:rPr>
@@ -6600,7 +7140,7 @@
                 <w:rStyle w:val="Hyperlink"/>
                 <w:noProof/>
               </w:rPr>
-              <w:t>4.23.1</w:t>
+              <w:t>4.25.1</w:t>
             </w:r>
             <w:r>
               <w:rPr>
@@ -6658,7 +7198,7 @@
                 <w:noProof/>
                 <w:webHidden/>
               </w:rPr>
-              <w:t>24</w:t>
+              <w:t>26</w:t>
             </w:r>
             <w:r>
               <w:rPr>
@@ -6690,7 +7230,7 @@
                 <w:rStyle w:val="Hyperlink"/>
                 <w:noProof/>
               </w:rPr>
-              <w:t>4.23.2</w:t>
+              <w:t>4.25.2</w:t>
             </w:r>
             <w:r>
               <w:rPr>
@@ -6748,7 +7288,7 @@
                 <w:noProof/>
                 <w:webHidden/>
               </w:rPr>
-              <w:t>25</w:t>
+              <w:t>27</w:t>
             </w:r>
             <w:r>
               <w:rPr>
@@ -6780,7 +7320,7 @@
                 <w:rStyle w:val="Hyperlink"/>
                 <w:noProof/>
               </w:rPr>
-              <w:t>4.24</w:t>
+              <w:t>4.26</w:t>
             </w:r>
             <w:r>
               <w:rPr>
@@ -6838,7 +7378,7 @@
                 <w:noProof/>
                 <w:webHidden/>
               </w:rPr>
-              <w:t>26</w:t>
+              <w:t>28</w:t>
             </w:r>
             <w:r>
               <w:rPr>
@@ -6870,7 +7410,7 @@
                 <w:rStyle w:val="Hyperlink"/>
                 <w:noProof/>
               </w:rPr>
-              <w:t>4.24.1</w:t>
+              <w:t>4.26.1</w:t>
             </w:r>
             <w:r>
               <w:rPr>
@@ -6928,7 +7468,7 @@
                 <w:noProof/>
                 <w:webHidden/>
               </w:rPr>
-              <w:t>26</w:t>
+              <w:t>28</w:t>
             </w:r>
             <w:r>
               <w:rPr>
@@ -6960,7 +7500,7 @@
                 <w:rStyle w:val="Hyperlink"/>
                 <w:noProof/>
               </w:rPr>
-              <w:t>4.24.2</w:t>
+              <w:t>4.26.2</w:t>
             </w:r>
             <w:r>
               <w:rPr>
@@ -7018,7 +7558,7 @@
                 <w:noProof/>
                 <w:webHidden/>
               </w:rPr>
-              <w:t>27</w:t>
+              <w:t>29</w:t>
             </w:r>
             <w:r>
               <w:rPr>
@@ -7050,7 +7590,7 @@
                 <w:rStyle w:val="Hyperlink"/>
                 <w:noProof/>
               </w:rPr>
-              <w:t>4.24.3</w:t>
+              <w:t>4.26.3</w:t>
             </w:r>
             <w:r>
               <w:rPr>
@@ -7108,7 +7648,7 @@
                 <w:noProof/>
                 <w:webHidden/>
               </w:rPr>
-              <w:t>27</w:t>
+              <w:t>29</w:t>
             </w:r>
             <w:r>
               <w:rPr>
@@ -7140,7 +7680,7 @@
                 <w:rStyle w:val="Hyperlink"/>
                 <w:noProof/>
               </w:rPr>
-              <w:t>4.24.4</w:t>
+              <w:t>4.26.4</w:t>
             </w:r>
             <w:r>
               <w:rPr>
@@ -7198,7 +7738,7 @@
                 <w:noProof/>
                 <w:webHidden/>
               </w:rPr>
-              <w:t>27</w:t>
+              <w:t>29</w:t>
             </w:r>
             <w:r>
               <w:rPr>
@@ -7230,7 +7770,7 @@
                 <w:rStyle w:val="Hyperlink"/>
                 <w:noProof/>
               </w:rPr>
-              <w:t>4.24.5</w:t>
+              <w:t>4.26.5</w:t>
             </w:r>
             <w:r>
               <w:rPr>
@@ -7288,7 +7828,7 @@
                 <w:noProof/>
                 <w:webHidden/>
               </w:rPr>
-              <w:t>27</w:t>
+              <w:t>29</w:t>
             </w:r>
             <w:r>
               <w:rPr>
@@ -7320,7 +7860,7 @@
                 <w:rStyle w:val="Hyperlink"/>
                 <w:noProof/>
               </w:rPr>
-              <w:t>4.25</w:t>
+              <w:t>4.27</w:t>
             </w:r>
             <w:r>
               <w:rPr>
@@ -7378,7 +7918,7 @@
                 <w:noProof/>
                 <w:webHidden/>
               </w:rPr>
-              <w:t>28</w:t>
+              <w:t>30</w:t>
             </w:r>
             <w:r>
               <w:rPr>
@@ -7412,7 +7952,7 @@
                 <w:bCs/>
                 <w:noProof/>
               </w:rPr>
-              <w:t>4.25.1</w:t>
+              <w:t>4.27.1</w:t>
             </w:r>
             <w:r>
               <w:rPr>
@@ -7472,7 +8012,7 @@
                 <w:noProof/>
                 <w:webHidden/>
               </w:rPr>
-              <w:t>28</w:t>
+              <w:t>30</w:t>
             </w:r>
             <w:r>
               <w:rPr>
@@ -7504,7 +8044,7 @@
                 <w:rStyle w:val="Hyperlink"/>
                 <w:noProof/>
               </w:rPr>
-              <w:t>4.25.2</w:t>
+              <w:t>4.27.2</w:t>
             </w:r>
             <w:r>
               <w:rPr>
@@ -7562,7 +8102,7 @@
                 <w:noProof/>
                 <w:webHidden/>
               </w:rPr>
-              <w:t>28</w:t>
+              <w:t>30</w:t>
             </w:r>
             <w:r>
               <w:rPr>
@@ -7594,7 +8134,7 @@
                 <w:rStyle w:val="Hyperlink"/>
                 <w:noProof/>
               </w:rPr>
-              <w:t>4.26</w:t>
+              <w:t>4.28</w:t>
             </w:r>
             <w:r>
               <w:rPr>
@@ -7652,7 +8192,7 @@
                 <w:noProof/>
                 <w:webHidden/>
               </w:rPr>
-              <w:t>28</w:t>
+              <w:t>30</w:t>
             </w:r>
             <w:r>
               <w:rPr>
@@ -7684,7 +8224,7 @@
                 <w:rStyle w:val="Hyperlink"/>
                 <w:noProof/>
               </w:rPr>
-              <w:t>4.27</w:t>
+              <w:t>4.29</w:t>
             </w:r>
             <w:r>
               <w:rPr>
@@ -7742,7 +8282,7 @@
                 <w:noProof/>
                 <w:webHidden/>
               </w:rPr>
-              <w:t>29</w:t>
+              <w:t>31</w:t>
             </w:r>
             <w:r>
               <w:rPr>
@@ -7774,7 +8314,7 @@
                 <w:rStyle w:val="Hyperlink"/>
                 <w:noProof/>
               </w:rPr>
-              <w:t>4.28</w:t>
+              <w:t>4.30</w:t>
             </w:r>
             <w:r>
               <w:rPr>
@@ -7832,7 +8372,7 @@
                 <w:noProof/>
                 <w:webHidden/>
               </w:rPr>
-              <w:t>29</w:t>
+              <w:t>31</w:t>
             </w:r>
             <w:r>
               <w:rPr>
@@ -7864,7 +8404,7 @@
                 <w:rStyle w:val="Hyperlink"/>
                 <w:noProof/>
               </w:rPr>
-              <w:t>4.28.1</w:t>
+              <w:t>4.30.1</w:t>
             </w:r>
             <w:r>
               <w:rPr>
@@ -7922,7 +8462,7 @@
                 <w:noProof/>
                 <w:webHidden/>
               </w:rPr>
-              <w:t>29</w:t>
+              <w:t>31</w:t>
             </w:r>
             <w:r>
               <w:rPr>
@@ -7954,7 +8494,7 @@
                 <w:rStyle w:val="Hyperlink"/>
                 <w:noProof/>
               </w:rPr>
-              <w:t>4.28.2</w:t>
+              <w:t>4.30.2</w:t>
             </w:r>
             <w:r>
               <w:rPr>
@@ -8012,7 +8552,7 @@
                 <w:noProof/>
                 <w:webHidden/>
               </w:rPr>
-              <w:t>29</w:t>
+              <w:t>31</w:t>
             </w:r>
             <w:r>
               <w:rPr>
@@ -8044,7 +8584,7 @@
                 <w:rStyle w:val="Hyperlink"/>
                 <w:noProof/>
               </w:rPr>
-              <w:t>4.29</w:t>
+              <w:t>4.31</w:t>
             </w:r>
             <w:r>
               <w:rPr>
@@ -8102,7 +8642,7 @@
                 <w:noProof/>
                 <w:webHidden/>
               </w:rPr>
-              <w:t>30</w:t>
+              <w:t>32</w:t>
             </w:r>
             <w:r>
               <w:rPr>
@@ -8134,7 +8674,7 @@
                 <w:rStyle w:val="Hyperlink"/>
                 <w:noProof/>
               </w:rPr>
-              <w:t>4.30</w:t>
+              <w:t>4.32</w:t>
             </w:r>
             <w:r>
               <w:rPr>
@@ -8192,7 +8732,7 @@
                 <w:noProof/>
                 <w:webHidden/>
               </w:rPr>
-              <w:t>30</w:t>
+              <w:t>32</w:t>
             </w:r>
             <w:r>
               <w:rPr>
@@ -8224,7 +8764,7 @@
                 <w:rStyle w:val="Hyperlink"/>
                 <w:noProof/>
               </w:rPr>
-              <w:t>4.30.1</w:t>
+              <w:t>4.32.1</w:t>
             </w:r>
             <w:r>
               <w:rPr>
@@ -8282,7 +8822,7 @@
                 <w:noProof/>
                 <w:webHidden/>
               </w:rPr>
-              <w:t>30</w:t>
+              <w:t>32</w:t>
             </w:r>
             <w:r>
               <w:rPr>
@@ -8314,7 +8854,7 @@
                 <w:rStyle w:val="Hyperlink"/>
                 <w:noProof/>
               </w:rPr>
-              <w:t>4.30.2</w:t>
+              <w:t>4.32.2</w:t>
             </w:r>
             <w:r>
               <w:rPr>
@@ -8372,7 +8912,7 @@
                 <w:noProof/>
                 <w:webHidden/>
               </w:rPr>
-              <w:t>30</w:t>
+              <w:t>32</w:t>
             </w:r>
             <w:r>
               <w:rPr>
@@ -8404,7 +8944,7 @@
                 <w:rStyle w:val="Hyperlink"/>
                 <w:noProof/>
               </w:rPr>
-              <w:t>4.30.3</w:t>
+              <w:t>4.32.3</w:t>
             </w:r>
             <w:r>
               <w:rPr>
@@ -8462,7 +9002,7 @@
                 <w:noProof/>
                 <w:webHidden/>
               </w:rPr>
-              <w:t>30</w:t>
+              <w:t>32</w:t>
             </w:r>
             <w:r>
               <w:rPr>
@@ -8494,7 +9034,7 @@
                 <w:rStyle w:val="Hyperlink"/>
                 <w:noProof/>
               </w:rPr>
-              <w:t>4.31</w:t>
+              <w:t>4.33</w:t>
             </w:r>
             <w:r>
               <w:rPr>
@@ -8552,7 +9092,7 @@
                 <w:noProof/>
                 <w:webHidden/>
               </w:rPr>
-              <w:t>31</w:t>
+              <w:t>33</w:t>
             </w:r>
             <w:r>
               <w:rPr>
@@ -8584,7 +9124,7 @@
                 <w:rStyle w:val="Hyperlink"/>
                 <w:noProof/>
               </w:rPr>
-              <w:t>4.31.1</w:t>
+              <w:t>4.33.1</w:t>
             </w:r>
             <w:r>
               <w:rPr>
@@ -8642,7 +9182,7 @@
                 <w:noProof/>
                 <w:webHidden/>
               </w:rPr>
-              <w:t>31</w:t>
+              <w:t>33</w:t>
             </w:r>
             <w:r>
               <w:rPr>
@@ -8674,7 +9214,7 @@
                 <w:rStyle w:val="Hyperlink"/>
                 <w:noProof/>
               </w:rPr>
-              <w:t>4.31.2</w:t>
+              <w:t>4.33.2</w:t>
             </w:r>
             <w:r>
               <w:rPr>
@@ -8732,7 +9272,7 @@
                 <w:noProof/>
                 <w:webHidden/>
               </w:rPr>
-              <w:t>31</w:t>
+              <w:t>33</w:t>
             </w:r>
             <w:r>
               <w:rPr>
@@ -8764,7 +9304,7 @@
                 <w:rStyle w:val="Hyperlink"/>
                 <w:noProof/>
               </w:rPr>
-              <w:t>4.32</w:t>
+              <w:t>4.34</w:t>
             </w:r>
             <w:r>
               <w:rPr>
@@ -8822,7 +9362,7 @@
                 <w:noProof/>
                 <w:webHidden/>
               </w:rPr>
-              <w:t>32</w:t>
+              <w:t>34</w:t>
             </w:r>
             <w:r>
               <w:rPr>
@@ -8854,7 +9394,7 @@
                 <w:rStyle w:val="Hyperlink"/>
                 <w:noProof/>
               </w:rPr>
-              <w:t>4.32.1</w:t>
+              <w:t>4.34.1</w:t>
             </w:r>
             <w:r>
               <w:rPr>
@@ -8912,7 +9452,7 @@
                 <w:noProof/>
                 <w:webHidden/>
               </w:rPr>
-              <w:t>32</w:t>
+              <w:t>34</w:t>
             </w:r>
             <w:r>
               <w:rPr>
@@ -8944,7 +9484,7 @@
                 <w:rStyle w:val="Hyperlink"/>
                 <w:noProof/>
               </w:rPr>
-              <w:t>4.32.2</w:t>
+              <w:t>4.34.2</w:t>
             </w:r>
             <w:r>
               <w:rPr>
@@ -9002,7 +9542,7 @@
                 <w:noProof/>
                 <w:webHidden/>
               </w:rPr>
-              <w:t>32</w:t>
+              <w:t>34</w:t>
             </w:r>
             <w:r>
               <w:rPr>
@@ -9091,7 +9631,277 @@
                 <w:noProof/>
                 <w:webHidden/>
               </w:rPr>
-              <w:t>33</w:t>
+              <w:t>35</w:t>
+            </w:r>
+            <w:r>
+              <w:rPr>
+                <w:noProof/>
+                <w:webHidden/>
+              </w:rPr>
+              <w:fldChar w:fldCharType="end"/>
+            </w:r>
+          </w:hyperlink>
+        </w:p>
+        <w:p>
+          <w:pPr>
+            <w:pStyle w:val="TOC2"/>
+            <w:tabs>
+              <w:tab w:val="left" w:pos="960"/>
+              <w:tab w:val="right" w:leader="dot" w:pos="10790"/>
+            </w:tabs>
+            <w:rPr>
+              <w:rFonts w:eastAsiaTheme="minorEastAsia"/>
+              <w:noProof/>
+              <w:sz w:val="24"/>
+              <w:szCs w:val="24"/>
+              <w:lang w:eastAsia="zh-CN"/>
+            </w:rPr>
+          </w:pPr>
+          <w:hyperlink w:anchor="_Toc242110910" w:history="1">
+            <w:r>
+              <w:rPr>
+                <w:rStyle w:val="Hyperlink"/>
+                <w:noProof/>
+              </w:rPr>
+              <w:t>5.1</w:t>
+            </w:r>
+            <w:r>
+              <w:rPr>
+                <w:rFonts w:eastAsiaTheme="minorEastAsia"/>
+                <w:noProof/>
+                <w:sz w:val="24"/>
+                <w:szCs w:val="24"/>
+                <w:lang w:eastAsia="zh-CN"/>
+              </w:rPr>
+              <w:tab/>
+            </w:r>
+            <w:r>
+              <w:rPr>
+                <w:rStyle w:val="Hyperlink"/>
+                <w:noProof/>
+              </w:rPr>
+              <w:t>ASTERIX</w:t>
+            </w:r>
+            <w:r>
+              <w:rPr>
+                <w:noProof/>
+                <w:webHidden/>
+              </w:rPr>
+              <w:tab/>
+            </w:r>
+            <w:r>
+              <w:rPr>
+                <w:noProof/>
+                <w:webHidden/>
+              </w:rPr>
+              <w:fldChar w:fldCharType="begin"/>
+            </w:r>
+            <w:r>
+              <w:rPr>
+                <w:noProof/>
+                <w:webHidden/>
+              </w:rPr>
+              <w:instrText xml:space="preserve"> PAGEREF _Toc242110910 \h </w:instrText>
+            </w:r>
+            <w:r>
+              <w:rPr>
+                <w:noProof/>
+                <w:webHidden/>
+              </w:rPr>
+            </w:r>
+            <w:r>
+              <w:rPr>
+                <w:noProof/>
+                <w:webHidden/>
+              </w:rPr>
+              <w:fldChar w:fldCharType="separate"/>
+            </w:r>
+            <w:r>
+              <w:rPr>
+                <w:noProof/>
+                <w:webHidden/>
+              </w:rPr>
+              <w:t>36</w:t>
+            </w:r>
+            <w:r>
+              <w:rPr>
+                <w:noProof/>
+                <w:webHidden/>
+              </w:rPr>
+              <w:fldChar w:fldCharType="end"/>
+            </w:r>
+          </w:hyperlink>
+        </w:p>
+        <w:p>
+          <w:pPr>
+            <w:pStyle w:val="TOC3"/>
+            <w:tabs>
+              <w:tab w:val="left" w:pos="1200"/>
+              <w:tab w:val="right" w:leader="dot" w:pos="10790"/>
+            </w:tabs>
+            <w:rPr>
+              <w:rFonts w:eastAsiaTheme="minorEastAsia"/>
+              <w:noProof/>
+              <w:sz w:val="24"/>
+              <w:szCs w:val="24"/>
+              <w:lang w:eastAsia="zh-CN"/>
+            </w:rPr>
+          </w:pPr>
+          <w:hyperlink w:anchor="_Toc242110911" w:history="1">
+            <w:r>
+              <w:rPr>
+                <w:rStyle w:val="Hyperlink"/>
+                <w:noProof/>
+              </w:rPr>
+              <w:t>5.1.1</w:t>
+            </w:r>
+            <w:r>
+              <w:rPr>
+                <w:rFonts w:eastAsiaTheme="minorEastAsia"/>
+                <w:noProof/>
+                <w:sz w:val="24"/>
+                <w:szCs w:val="24"/>
+                <w:lang w:eastAsia="zh-CN"/>
+              </w:rPr>
+              <w:tab/>
+            </w:r>
+            <w:r>
+              <w:rPr>
+                <w:rStyle w:val="Hyperlink"/>
+                <w:noProof/>
+              </w:rPr>
+              <w:t>ASTERIX: Data Blocks</w:t>
+            </w:r>
+            <w:r>
+              <w:rPr>
+                <w:noProof/>
+                <w:webHidden/>
+              </w:rPr>
+              <w:tab/>
+            </w:r>
+            <w:r>
+              <w:rPr>
+                <w:noProof/>
+                <w:webHidden/>
+              </w:rPr>
+              <w:fldChar w:fldCharType="begin"/>
+            </w:r>
+            <w:r>
+              <w:rPr>
+                <w:noProof/>
+                <w:webHidden/>
+              </w:rPr>
+              <w:instrText xml:space="preserve"> PAGEREF _Toc242110911 \h </w:instrText>
+            </w:r>
+            <w:r>
+              <w:rPr>
+                <w:noProof/>
+                <w:webHidden/>
+              </w:rPr>
+            </w:r>
+            <w:r>
+              <w:rPr>
+                <w:noProof/>
+                <w:webHidden/>
+              </w:rPr>
+              <w:fldChar w:fldCharType="separate"/>
+            </w:r>
+            <w:r>
+              <w:rPr>
+                <w:noProof/>
+                <w:webHidden/>
+              </w:rPr>
+              <w:t>36</w:t>
+            </w:r>
+            <w:r>
+              <w:rPr>
+                <w:noProof/>
+                <w:webHidden/>
+              </w:rPr>
+              <w:fldChar w:fldCharType="end"/>
+            </w:r>
+          </w:hyperlink>
+        </w:p>
+        <w:p>
+          <w:pPr>
+            <w:pStyle w:val="TOC3"/>
+            <w:tabs>
+              <w:tab w:val="left" w:pos="1200"/>
+              <w:tab w:val="right" w:leader="dot" w:pos="10790"/>
+            </w:tabs>
+            <w:rPr>
+              <w:rFonts w:eastAsiaTheme="minorEastAsia"/>
+              <w:noProof/>
+              <w:sz w:val="24"/>
+              <w:szCs w:val="24"/>
+              <w:lang w:eastAsia="zh-CN"/>
+            </w:rPr>
+          </w:pPr>
+          <w:hyperlink w:anchor="_Toc242110912" w:history="1">
+            <w:r>
+              <w:rPr>
+                <w:rStyle w:val="Hyperlink"/>
+                <w:noProof/>
+              </w:rPr>
+              <w:t>5.1.2</w:t>
+            </w:r>
+            <w:r>
+              <w:rPr>
+                <w:rFonts w:eastAsiaTheme="minorEastAsia"/>
+                <w:noProof/>
+                <w:sz w:val="24"/>
+                <w:szCs w:val="24"/>
+                <w:lang w:eastAsia="zh-CN"/>
+              </w:rPr>
+              <w:tab/>
+            </w:r>
+            <w:r>
+              <w:rPr>
+                <w:rStyle w:val="Hyperlink"/>
+                <w:noProof/>
+              </w:rPr>
+              <w:t>ASTERIX: Time Source</w:t>
+            </w:r>
+            <w:r>
+              <w:rPr>
+                <w:noProof/>
+                <w:webHidden/>
+              </w:rPr>
+              <w:tab/>
+            </w:r>
+            <w:r>
+              <w:rPr>
+                <w:noProof/>
+                <w:webHidden/>
+              </w:rPr>
+              <w:fldChar w:fldCharType="begin"/>
+            </w:r>
+            <w:r>
+              <w:rPr>
+                <w:noProof/>
+                <w:webHidden/>
+              </w:rPr>
+              <w:instrText xml:space="preserve"> PAGEREF _Toc242110912 \h </w:instrText>
+            </w:r>
+            <w:r>
+              <w:rPr>
+                <w:noProof/>
+                <w:webHidden/>
+              </w:rPr>
+            </w:r>
+            <w:r>
+              <w:rPr>
+                <w:noProof/>
+                <w:webHidden/>
+              </w:rPr>
+              <w:fldChar w:fldCharType="separate"/>
+            </w:r>
+            <w:r>
+              <w:rPr>
+                <w:noProof/>
+                <w:webHidden/>
+              </w:rPr>
+              <w:t>36</w:t>
             </w:r>
             <w:r>
               <w:rPr>
@@ -9123,7 +9933,7 @@
                 <w:rStyle w:val="Hyperlink"/>
                 <w:noProof/>
               </w:rPr>
-              <w:t>5.1</w:t>
+              <w:t>5.2</w:t>
             </w:r>
             <w:r>
               <w:rPr>
@@ -9181,7 +9991,7 @@
                 <w:noProof/>
                 <w:webHidden/>
               </w:rPr>
-              <w:t>34</w:t>
+              <w:t>37</w:t>
             </w:r>
             <w:r>
               <w:rPr>
@@ -9213,7 +10023,7 @@
                 <w:rStyle w:val="Hyperlink"/>
                 <w:noProof/>
               </w:rPr>
-              <w:t>5.1.1</w:t>
+              <w:t>5.2.1</w:t>
             </w:r>
             <w:r>
               <w:rPr>
@@ -9271,7 +10081,7 @@
                 <w:noProof/>
                 <w:webHidden/>
               </w:rPr>
-              <w:t>34</w:t>
+              <w:t>37</w:t>
             </w:r>
             <w:r>
               <w:rPr>
@@ -9303,7 +10113,7 @@
                 <w:rStyle w:val="Hyperlink"/>
                 <w:noProof/>
               </w:rPr>
-              <w:t>5.1.2</w:t>
+              <w:t>5.2.2</w:t>
             </w:r>
             <w:r>
               <w:rPr>
@@ -9361,7 +10171,7 @@
                 <w:noProof/>
                 <w:webHidden/>
               </w:rPr>
-              <w:t>35</w:t>
+              <w:t>38</w:t>
             </w:r>
             <w:r>
               <w:rPr>
@@ -9393,7 +10203,7 @@
                 <w:rStyle w:val="Hyperlink"/>
                 <w:noProof/>
               </w:rPr>
-              <w:t>5.1.3</w:t>
+              <w:t>5.2.3</w:t>
             </w:r>
             <w:r>
               <w:rPr>
@@ -9451,7 +10261,7 @@
                 <w:noProof/>
                 <w:webHidden/>
               </w:rPr>
-              <w:t>42</w:t>
+              <w:t>45</w:t>
             </w:r>
             <w:r>
               <w:rPr>
@@ -9483,7 +10293,7 @@
                 <w:rStyle w:val="Hyperlink"/>
                 <w:noProof/>
               </w:rPr>
-              <w:t>5.1.4</w:t>
+              <w:t>5.2.4</w:t>
             </w:r>
             <w:r>
               <w:rPr>
@@ -9541,7 +10351,7 @@
                 <w:noProof/>
                 <w:webHidden/>
               </w:rPr>
-              <w:t>46</w:t>
+              <w:t>49</w:t>
             </w:r>
             <w:r>
               <w:rPr>
@@ -9573,7 +10383,7 @@
                 <w:rStyle w:val="Hyperlink"/>
                 <w:noProof/>
               </w:rPr>
-              <w:t>5.2</w:t>
+              <w:t>5.3</w:t>
             </w:r>
             <w:r>
               <w:rPr>
@@ -9631,7 +10441,7 @@
                 <w:noProof/>
                 <w:webHidden/>
               </w:rPr>
-              <w:t>47</w:t>
+              <w:t>50</w:t>
             </w:r>
             <w:r>
               <w:rPr>
@@ -9663,7 +10473,7 @@
                 <w:rStyle w:val="Hyperlink"/>
                 <w:noProof/>
               </w:rPr>
-              <w:t>5.3</w:t>
+              <w:t>5.4</w:t>
             </w:r>
             <w:r>
               <w:rPr>
@@ -9721,7 +10531,7 @@
                 <w:noProof/>
                 <w:webHidden/>
               </w:rPr>
-              <w:t>48</w:t>
+              <w:t>51</w:t>
             </w:r>
             <w:r>
               <w:rPr>
@@ -9754,7 +10564,7 @@
                 <w:noProof/>
                 <w:lang w:eastAsia="zh-CN"/>
               </w:rPr>
-              <w:t>5.3.1</w:t>
+              <w:t>5.4.1</w:t>
             </w:r>
             <w:r>
               <w:rPr>
@@ -9844,7 +10654,7 @@
                 <w:noProof/>
                 <w:webHidden/>
               </w:rPr>
-              <w:t>48</w:t>
+              <w:t>51</w:t>
             </w:r>
             <w:r>
               <w:rPr>
@@ -9876,7 +10686,7 @@
                 <w:rStyle w:val="Hyperlink"/>
                 <w:noProof/>
               </w:rPr>
-              <w:t>5.3.2</w:t>
+              <w:t>5.4.2</w:t>
             </w:r>
             <w:r>
               <w:rPr>
@@ -9934,7 +10744,7 @@
                 <w:noProof/>
                 <w:webHidden/>
               </w:rPr>
-              <w:t>48</w:t>
+              <w:t>51</w:t>
             </w:r>
             <w:r>
               <w:rPr>
@@ -9966,7 +10776,7 @@
                 <w:rStyle w:val="Hyperlink"/>
                 <w:noProof/>
               </w:rPr>
-              <w:t>5.3.3</w:t>
+              <w:t>5.4.3</w:t>
             </w:r>
             <w:r>
               <w:rPr>
@@ -10024,7 +10834,7 @@
                 <w:noProof/>
                 <w:webHidden/>
               </w:rPr>
-              <w:t>49</w:t>
+              <w:t>52</w:t>
             </w:r>
             <w:r>
               <w:rPr>
@@ -10056,7 +10866,7 @@
                 <w:rStyle w:val="Hyperlink"/>
                 <w:noProof/>
               </w:rPr>
-              <w:t>5.3.4</w:t>
+              <w:t>5.4.4</w:t>
             </w:r>
             <w:r>
               <w:rPr>
@@ -10114,7 +10924,7 @@
                 <w:noProof/>
                 <w:webHidden/>
               </w:rPr>
-              <w:t>49</w:t>
+              <w:t>52</w:t>
             </w:r>
             <w:r>
               <w:rPr>
@@ -10146,7 +10956,7 @@
                 <w:rStyle w:val="Hyperlink"/>
                 <w:noProof/>
               </w:rPr>
-              <w:t>5.4</w:t>
+              <w:t>5.5</w:t>
             </w:r>
             <w:r>
               <w:rPr>
@@ -10204,7 +11014,7 @@
                 <w:noProof/>
                 <w:webHidden/>
               </w:rPr>
-              <w:t>50</w:t>
+              <w:t>53</w:t>
             </w:r>
             <w:r>
               <w:rPr>
@@ -10236,7 +11046,7 @@
                 <w:rStyle w:val="Hyperlink"/>
                 <w:noProof/>
               </w:rPr>
-              <w:t>5.4.1</w:t>
+              <w:t>5.5.1</w:t>
             </w:r>
             <w:r>
               <w:rPr>
@@ -10294,7 +11104,7 @@
                 <w:noProof/>
                 <w:webHidden/>
               </w:rPr>
-              <w:t>50</w:t>
+              <w:t>53</w:t>
             </w:r>
             <w:r>
               <w:rPr>
@@ -10326,7 +11136,7 @@
                 <w:rStyle w:val="Hyperlink"/>
                 <w:noProof/>
               </w:rPr>
-              <w:t>5.4.2</w:t>
+              <w:t>5.5.2</w:t>
             </w:r>
             <w:r>
               <w:rPr>
@@ -10384,7 +11194,7 @@
                 <w:noProof/>
                 <w:webHidden/>
               </w:rPr>
-              <w:t>50</w:t>
+              <w:t>53</w:t>
             </w:r>
             <w:r>
               <w:rPr>
@@ -10416,7 +11226,7 @@
                 <w:rStyle w:val="Hyperlink"/>
                 <w:noProof/>
               </w:rPr>
-              <w:t>5.5</w:t>
+              <w:t>5.6</w:t>
             </w:r>
             <w:r>
               <w:rPr>
@@ -10474,7 +11284,7 @@
                 <w:noProof/>
                 <w:webHidden/>
               </w:rPr>
-              <w:t>51</w:t>
+              <w:t>54</w:t>
             </w:r>
             <w:r>
               <w:rPr>
@@ -10506,7 +11316,7 @@
                 <w:rStyle w:val="Hyperlink"/>
                 <w:noProof/>
               </w:rPr>
-              <w:t>5.5.1</w:t>
+              <w:t>5.6.1</w:t>
             </w:r>
             <w:r>
               <w:rPr>
@@ -10564,7 +11374,7 @@
                 <w:noProof/>
                 <w:webHidden/>
               </w:rPr>
-              <w:t>51</w:t>
+              <w:t>54</w:t>
             </w:r>
             <w:r>
               <w:rPr>
@@ -10596,7 +11406,7 @@
                 <w:rStyle w:val="Hyperlink"/>
                 <w:noProof/>
               </w:rPr>
-              <w:t>5.5.2</w:t>
+              <w:t>5.6.2</w:t>
             </w:r>
             <w:r>
               <w:rPr>
@@ -10654,7 +11464,7 @@
                 <w:noProof/>
                 <w:webHidden/>
               </w:rPr>
-              <w:t>51</w:t>
+              <w:t>54</w:t>
             </w:r>
             <w:r>
               <w:rPr>
@@ -10686,7 +11496,7 @@
                 <w:rStyle w:val="Hyperlink"/>
                 <w:noProof/>
               </w:rPr>
-              <w:t>5.5.3</w:t>
+              <w:t>5.6.3</w:t>
             </w:r>
             <w:r>
               <w:rPr>
@@ -10744,7 +11554,7 @@
                 <w:noProof/>
                 <w:webHidden/>
               </w:rPr>
-              <w:t>52</w:t>
+              <w:t>55</w:t>
             </w:r>
             <w:r>
               <w:rPr>
@@ -10776,7 +11586,7 @@
                 <w:rStyle w:val="Hyperlink"/>
                 <w:noProof/>
               </w:rPr>
-              <w:t>5.6</w:t>
+              <w:t>5.7</w:t>
             </w:r>
             <w:r>
               <w:rPr>
@@ -10834,7 +11644,7 @@
                 <w:noProof/>
                 <w:webHidden/>
               </w:rPr>
-              <w:t>53</w:t>
+              <w:t>56</w:t>
             </w:r>
             <w:r>
               <w:rPr>
@@ -10866,7 +11676,7 @@
                 <w:rStyle w:val="Hyperlink"/>
                 <w:noProof/>
               </w:rPr>
-              <w:t>5.6.1</w:t>
+              <w:t>5.7.1</w:t>
             </w:r>
             <w:r>
               <w:rPr>
@@ -10924,7 +11734,7 @@
                 <w:noProof/>
                 <w:webHidden/>
               </w:rPr>
-              <w:t>53</w:t>
+              <w:t>56</w:t>
             </w:r>
             <w:r>
               <w:rPr>
@@ -10956,7 +11766,7 @@
                 <w:rStyle w:val="Hyperlink"/>
                 <w:noProof/>
               </w:rPr>
-              <w:t>5.6.2</w:t>
+              <w:t>5.7.2</w:t>
             </w:r>
             <w:r>
               <w:rPr>
@@ -11014,7 +11824,7 @@
                 <w:noProof/>
                 <w:webHidden/>
               </w:rPr>
-              <w:t>54</w:t>
+              <w:t>57</w:t>
             </w:r>
             <w:r>
               <w:rPr>
@@ -11209,7 +12019,7 @@
     </w:p>
     <w:p>
       <w:r>
-        <w:t>20261016</w:t>
+        <w:t>20261017</w:t>
       </w:r>
     </w:p>
     <w:p>
@@ -11354,6 +12164,18 @@
       </w:pPr>
       <w:r>
         <w:t>Sensitivity is -90dBm to 0dBm for Mode S on all models and for UAT on the 1090U. The m1090 has no first-stage LNA: about -70dBm, or -90dBm to 0dBm with an external LNA.</w:t>
+      </w:r>
+    </w:p>
+    <w:p>
+      <w:pPr>
+        <w:pStyle w:val="ListParagraph"/>
+        <w:numPr>
+          <w:ilvl w:val="0"/>
+          <w:numId w:val="10"/>
+        </w:numPr>
+      </w:pPr>
+      <w:r>
+        <w:t>Added the ASTERIX reporting protocol and the AT+ASTERIX_SAC_SIC and AT+NTP_SERVER commands.</w:t>
       </w:r>
     </w:p>
     <w:p>
@@ -12422,20 +13244,11 @@
           <w:numId w:val="4"/>
         </w:numPr>
       </w:pPr>
-      <w:bookmarkStart w:id="14" w:name="_Toc242110522"/>
-      <w:r>
-        <w:t>AT+BAUD</w:t>
-      </w:r>
-      <w:r>
-        <w:t>_</w:t>
-      </w:r>
-      <w:r>
-        <w:t>R</w:t>
-      </w:r>
-      <w:r>
-        <w:t>ATE</w:t>
-      </w:r>
-      <w:bookmarkEnd w:id="14"/>
+      <w:bookmarkStart w:id="304" w:name="_Toc242110904"/>
+      <w:r>
+        <w:t>AT+ASTERIX_SAC_SIC</w:t>
+      </w:r>
+      <w:bookmarkEnd w:id="304"/>
     </w:p>
     <w:p>
       <w:pPr>
@@ -12445,60 +13258,32 @@
           <w:numId w:val="4"/>
         </w:numPr>
       </w:pPr>
-      <w:bookmarkStart w:id="15" w:name="_Ref177744376"/>
-      <w:bookmarkStart w:id="16" w:name="_Toc242110523"/>
-      <w:r>
-        <w:t>Set Baud</w:t>
-      </w:r>
-      <w:r>
-        <w:t xml:space="preserve"> R</w:t>
-      </w:r>
-      <w:r>
-        <w:t>ate</w:t>
-      </w:r>
-      <w:bookmarkEnd w:id="15"/>
-      <w:bookmarkEnd w:id="16"/>
+      <w:bookmarkStart w:id="305" w:name="_Toc242110905"/>
+      <w:r>
+        <w:t>Set the ASTERIX Data Source Identifier</w:t>
+      </w:r>
+      <w:bookmarkEnd w:id="305"/>
     </w:p>
     <w:p>
       <w:pPr>
         <w:pStyle w:val="code"/>
       </w:pPr>
       <w:r>
-        <w:t>AT+BAUD</w:t>
-      </w:r>
-      <w:r>
-        <w:t>_</w:t>
-      </w:r>
-      <w:r>
-        <w:t>RATE=&lt;iface&gt;,&lt;baud</w:t>
-      </w:r>
-      <w:r>
-        <w:t>_</w:t>
-      </w:r>
-      <w:r>
-        <w:t>rate&gt;</w:t>
+        <w:t>AT+ASTERIX_SAC_SIC=&lt;sac&gt;,&lt;sic&gt;</w:t>
       </w:r>
     </w:p>
     <w:p>
       <w:pPr>
         <w:pStyle w:val="code"/>
       </w:pPr>
-    </w:p>
-    <w:p>
-      <w:r>
-        <w:t>Set the baud</w:t>
-      </w:r>
-      <w:r>
-        <w:t xml:space="preserve"> </w:t>
-      </w:r>
-      <w:r>
-        <w:t>rate for a particular serial interface. Note that the USB C port (CONSOLE interface) is a virtual COM port and does not have a baud</w:t>
-      </w:r>
-      <w:r>
-        <w:t xml:space="preserve"> </w:t>
-      </w:r>
-      <w:r>
-        <w:t>rate that can be changed.</w:t>
+      <w:r>
+        <w:t>OK</w:t>
+      </w:r>
+    </w:p>
+    <w:p/>
+    <w:p>
+      <w:r>
+        <w:t>Sets the System Area Code (SAC) and System Identification Code (SIC) carried by every ASTERIX record (I021/010 and I023/010). Use the codes the ASTERIX consumer assigned to this receiver: SACs are allocated per country by EUROCONTROL, and each receiver feeding the same consumer needs its own SAC/SIC pair. Both arguments are required.</w:t>
       </w:r>
     </w:p>
     <w:tbl>
@@ -12569,6 +13354,269 @@
                 <w:b/>
                 <w:bCs/>
               </w:rPr>
+              <w:t>Acceptable Values</w:t>
+            </w:r>
+          </w:p>
+        </w:tc>
+      </w:tr>
+      <w:tr>
+        <w:tc>
+          <w:tcPr>
+            <w:tcW w:w="1548" w:type="dxa"/>
+          </w:tcPr>
+          <w:p>
+            <w:r>
+              <w:t>sac</w:t>
+            </w:r>
+          </w:p>
+        </w:tc>
+        <w:tc>
+          <w:tcPr>
+            <w:tcW w:w="5796" w:type="dxa"/>
+          </w:tcPr>
+          <w:p>
+            <w:r>
+              <w:t>System Area Code.</w:t>
+            </w:r>
+          </w:p>
+        </w:tc>
+        <w:tc>
+          <w:tcPr>
+            <w:tcW w:w="3672" w:type="dxa"/>
+          </w:tcPr>
+          <w:p>
+            <w:r>
+              <w:t>0-255 (default 0)</w:t>
+            </w:r>
+          </w:p>
+        </w:tc>
+      </w:tr>
+      <w:tr>
+        <w:tc>
+          <w:tcPr>
+            <w:tcW w:w="1548" w:type="dxa"/>
+          </w:tcPr>
+          <w:p>
+            <w:r>
+              <w:t>sic</w:t>
+            </w:r>
+          </w:p>
+        </w:tc>
+        <w:tc>
+          <w:tcPr>
+            <w:tcW w:w="5796" w:type="dxa"/>
+          </w:tcPr>
+          <w:p>
+            <w:r>
+              <w:t>System Identification Code.</w:t>
+            </w:r>
+          </w:p>
+        </w:tc>
+        <w:tc>
+          <w:tcPr>
+            <w:tcW w:w="3672" w:type="dxa"/>
+          </w:tcPr>
+          <w:p>
+            <w:r>
+              <w:t>0-255 (default 0)</w:t>
+            </w:r>
+          </w:p>
+        </w:tc>
+      </w:tr>
+    </w:tbl>
+    <w:p/>
+    <w:p>
+      <w:pPr>
+        <w:pStyle w:val="Heading3"/>
+        <w:numPr>
+          <w:ilvl w:val="2"/>
+          <w:numId w:val="4"/>
+        </w:numPr>
+      </w:pPr>
+      <w:bookmarkStart w:id="306" w:name="_Toc242110906"/>
+      <w:r>
+        <w:t>Query the ASTERIX Data Source Identifier</w:t>
+      </w:r>
+      <w:bookmarkEnd w:id="306"/>
+    </w:p>
+    <w:p>
+      <w:pPr>
+        <w:pStyle w:val="code"/>
+      </w:pPr>
+      <w:r>
+        <w:t>AT+ASTERIX_SAC_SIC?</w:t>
+      </w:r>
+    </w:p>
+    <w:p>
+      <w:pPr>
+        <w:pStyle w:val="code"/>
+      </w:pPr>
+      <w:r>
+        <w:t>ASTERIX_SAC_SIC=&lt;sac&gt;,&lt;sic&gt;</w:t>
+      </w:r>
+    </w:p>
+    <w:p/>
+    <w:p>
+      <w:r>
+        <w:t>This setting does not persist across a power cycle unless AT+SETTINGS=SAVE is run to write it to non-volatile storage.</w:t>
+      </w:r>
+    </w:p>
+    <w:p/>
+    <w:p>
+      <w:pPr>
+        <w:pStyle w:val="Heading2"/>
+        <w:numPr>
+          <w:ilvl w:val="1"/>
+          <w:numId w:val="4"/>
+        </w:numPr>
+      </w:pPr>
+      <w:bookmarkStart w:id="14" w:name="_Toc242110522"/>
+      <w:r>
+        <w:t>AT+BAUD</w:t>
+      </w:r>
+      <w:r>
+        <w:t>_</w:t>
+      </w:r>
+      <w:r>
+        <w:t>R</w:t>
+      </w:r>
+      <w:r>
+        <w:t>ATE</w:t>
+      </w:r>
+      <w:bookmarkEnd w:id="14"/>
+    </w:p>
+    <w:p>
+      <w:pPr>
+        <w:pStyle w:val="Heading3"/>
+        <w:numPr>
+          <w:ilvl w:val="2"/>
+          <w:numId w:val="4"/>
+        </w:numPr>
+      </w:pPr>
+      <w:bookmarkStart w:id="15" w:name="_Ref177744376"/>
+      <w:bookmarkStart w:id="16" w:name="_Toc242110523"/>
+      <w:r>
+        <w:t>Set Baud</w:t>
+      </w:r>
+      <w:r>
+        <w:t xml:space="preserve"> R</w:t>
+      </w:r>
+      <w:r>
+        <w:t>ate</w:t>
+      </w:r>
+      <w:bookmarkEnd w:id="15"/>
+      <w:bookmarkEnd w:id="16"/>
+    </w:p>
+    <w:p>
+      <w:pPr>
+        <w:pStyle w:val="code"/>
+      </w:pPr>
+      <w:r>
+        <w:t>AT+BAUD</w:t>
+      </w:r>
+      <w:r>
+        <w:t>_</w:t>
+      </w:r>
+      <w:r>
+        <w:t>RATE=&lt;iface&gt;,&lt;baud</w:t>
+      </w:r>
+      <w:r>
+        <w:t>_</w:t>
+      </w:r>
+      <w:r>
+        <w:t>rate&gt;</w:t>
+      </w:r>
+    </w:p>
+    <w:p>
+      <w:pPr>
+        <w:pStyle w:val="code"/>
+      </w:pPr>
+    </w:p>
+    <w:p>
+      <w:r>
+        <w:t>Set the baud</w:t>
+      </w:r>
+      <w:r>
+        <w:t xml:space="preserve"> </w:t>
+      </w:r>
+      <w:r>
+        <w:t>rate for a particular serial interface. Note that the USB C port (CONSOLE interface) is a virtual COM port and does not have a baud</w:t>
+      </w:r>
+      <w:r>
+        <w:t xml:space="preserve"> </w:t>
+      </w:r>
+      <w:r>
+        <w:t>rate that can be changed.</w:t>
+      </w:r>
+    </w:p>
+    <w:tbl>
+      <w:tblPr>
+        <w:tblStyle w:val="TableGrid"/>
+        <w:tblW w:w="0" w:type="auto"/>
+        <w:tblLook w:val="04A0" w:firstRow="1" w:lastRow="0" w:firstColumn="1" w:lastColumn="0" w:noHBand="0" w:noVBand="1"/>
+      </w:tblPr>
+      <w:tblGrid>
+        <w:gridCol w:w="1548"/>
+        <w:gridCol w:w="5796"/>
+        <w:gridCol w:w="3672"/>
+      </w:tblGrid>
+      <w:tr>
+        <w:tc>
+          <w:tcPr>
+            <w:tcW w:w="1548" w:type="dxa"/>
+          </w:tcPr>
+          <w:p>
+            <w:pPr>
+              <w:rPr>
+                <w:b/>
+                <w:bCs/>
+              </w:rPr>
+            </w:pPr>
+            <w:r>
+              <w:rPr>
+                <w:b/>
+                <w:bCs/>
+              </w:rPr>
+              <w:t>Parameter</w:t>
+            </w:r>
+          </w:p>
+        </w:tc>
+        <w:tc>
+          <w:tcPr>
+            <w:tcW w:w="5796" w:type="dxa"/>
+          </w:tcPr>
+          <w:p>
+            <w:pPr>
+              <w:rPr>
+                <w:b/>
+                <w:bCs/>
+              </w:rPr>
+            </w:pPr>
+            <w:r>
+              <w:rPr>
+                <w:b/>
+                <w:bCs/>
+              </w:rPr>
+              <w:t>Description</w:t>
+            </w:r>
+          </w:p>
+        </w:tc>
+        <w:tc>
+          <w:tcPr>
+            <w:tcW w:w="3672" w:type="dxa"/>
+          </w:tcPr>
+          <w:p>
+            <w:pPr>
+              <w:rPr>
+                <w:b/>
+                <w:bCs/>
+              </w:rPr>
+            </w:pPr>
+            <w:r>
+              <w:rPr>
+                <w:b/>
+                <w:bCs/>
+              </w:rPr>
               <w:t>Values</w:t>
             </w:r>
           </w:p>
@@ -13274,7 +14322,7 @@
         <w:fldChar w:fldCharType="separate"/>
       </w:r>
       <w:r>
-        <w:t xml:space="preserve">4.1.1  </w:t>
+        <w:t xml:space="preserve">4.2.1  </w:t>
       </w:r>
       <w:r>
         <w:fldChar w:fldCharType="end"/>
@@ -14212,7 +15260,7 @@
         <w:fldChar w:fldCharType="separate"/>
       </w:r>
       <w:r>
-        <w:t xml:space="preserve">4.6.1  </w:t>
+        <w:t xml:space="preserve">4.7.1  </w:t>
       </w:r>
       <w:r>
         <w:fldChar w:fldCharType="end"/>
@@ -14739,6 +15787,11 @@
               <w:t>BEAST_RAW – Send both validated and invalid (bad checksum) packets in Mode S Beast format.</w:t>
             </w:r>
           </w:p>
+          <w:p>
+            <w:r>
+              <w:t>ASTERIX – Send EUROCONTROL ASTERIX CAT021 and CAT023 data blocks.</w:t>
+            </w:r>
+          </w:p>
         </w:tc>
       </w:tr>
     </w:tbl>
@@ -17227,6 +18280,199 @@
           <w:numId w:val="4"/>
         </w:numPr>
       </w:pPr>
+      <w:bookmarkStart w:id="307" w:name="_Toc242110907"/>
+      <w:r>
+        <w:t>AT+NTP_SERVER</w:t>
+      </w:r>
+      <w:bookmarkEnd w:id="307"/>
+    </w:p>
+    <w:p>
+      <w:pPr>
+        <w:pStyle w:val="Heading3"/>
+        <w:numPr>
+          <w:ilvl w:val="2"/>
+          <w:numId w:val="4"/>
+        </w:numPr>
+      </w:pPr>
+      <w:bookmarkStart w:id="308" w:name="_Toc242110908"/>
+      <w:r>
+        <w:t>Set the NTP Server</w:t>
+      </w:r>
+      <w:bookmarkEnd w:id="308"/>
+    </w:p>
+    <w:p>
+      <w:pPr>
+        <w:pStyle w:val="code"/>
+      </w:pPr>
+      <w:r>
+        <w:t>AT+NTP_SERVER=&lt;host&gt;</w:t>
+      </w:r>
+    </w:p>
+    <w:p>
+      <w:pPr>
+        <w:pStyle w:val="code"/>
+      </w:pPr>
+      <w:r>
+        <w:t>OK</w:t>
+      </w:r>
+    </w:p>
+    <w:p/>
+    <w:p>
+      <w:r>
+        <w:t>Sets the Network Time Protocol server that the ESP32 takes UTC from for ASTERIX times when no GNSS receiver has a valid time. The ESP32 polls it once an hour while the CONSOLE, the COMMS_UART or an active feed uses ASTERIX, over the WiFi station or Ethernet connection.</w:t>
+      </w:r>
+    </w:p>
+    <w:tbl>
+      <w:tblPr>
+        <w:tblStyle w:val="TableGrid"/>
+        <w:tblW w:w="0" w:type="auto"/>
+        <w:tblLook w:val="04A0" w:firstRow="1" w:lastRow="0" w:firstColumn="1" w:lastColumn="0" w:noHBand="0" w:noVBand="1"/>
+      </w:tblPr>
+      <w:tblGrid>
+        <w:gridCol w:w="1548"/>
+        <w:gridCol w:w="5796"/>
+        <w:gridCol w:w="3672"/>
+      </w:tblGrid>
+      <w:tr>
+        <w:tc>
+          <w:tcPr>
+            <w:tcW w:w="1548" w:type="dxa"/>
+          </w:tcPr>
+          <w:p>
+            <w:pPr>
+              <w:rPr>
+                <w:b/>
+                <w:bCs/>
+              </w:rPr>
+            </w:pPr>
+            <w:r>
+              <w:rPr>
+                <w:b/>
+                <w:bCs/>
+              </w:rPr>
+              <w:t>Parameter</w:t>
+            </w:r>
+          </w:p>
+        </w:tc>
+        <w:tc>
+          <w:tcPr>
+            <w:tcW w:w="5796" w:type="dxa"/>
+          </w:tcPr>
+          <w:p>
+            <w:pPr>
+              <w:rPr>
+                <w:b/>
+                <w:bCs/>
+              </w:rPr>
+            </w:pPr>
+            <w:r>
+              <w:rPr>
+                <w:b/>
+                <w:bCs/>
+              </w:rPr>
+              <w:t>Description</w:t>
+            </w:r>
+          </w:p>
+        </w:tc>
+        <w:tc>
+          <w:tcPr>
+            <w:tcW w:w="3672" w:type="dxa"/>
+          </w:tcPr>
+          <w:p>
+            <w:pPr>
+              <w:rPr>
+                <w:b/>
+                <w:bCs/>
+              </w:rPr>
+            </w:pPr>
+            <w:r>
+              <w:rPr>
+                <w:b/>
+                <w:bCs/>
+              </w:rPr>
+              <w:t>Acceptable Values</w:t>
+            </w:r>
+          </w:p>
+        </w:tc>
+      </w:tr>
+      <w:tr>
+        <w:tc>
+          <w:tcPr>
+            <w:tcW w:w="1548" w:type="dxa"/>
+          </w:tcPr>
+          <w:p>
+            <w:r>
+              <w:t>host</w:t>
+            </w:r>
+          </w:p>
+        </w:tc>
+        <w:tc>
+          <w:tcPr>
+            <w:tcW w:w="5796" w:type="dxa"/>
+          </w:tcPr>
+          <w:p>
+            <w:r>
+              <w:t>Hostname or IP address of the NTP server.</w:t>
+            </w:r>
+          </w:p>
+        </w:tc>
+        <w:tc>
+          <w:tcPr>
+            <w:tcW w:w="3672" w:type="dxa"/>
+          </w:tcPr>
+          <w:p>
+            <w:r>
+              <w:t>Up to 63 characters: letters, digits, “.”, “-” and “:”.</w:t>
+            </w:r>
+          </w:p>
+          <w:p>
+            <w:r>
+              <w:t>pool.ntp.org (default).</w:t>
+            </w:r>
+          </w:p>
+        </w:tc>
+      </w:tr>
+    </w:tbl>
+    <w:p/>
+    <w:p>
+      <w:pPr>
+        <w:pStyle w:val="Heading3"/>
+        <w:numPr>
+          <w:ilvl w:val="2"/>
+          <w:numId w:val="4"/>
+        </w:numPr>
+      </w:pPr>
+      <w:bookmarkStart w:id="309" w:name="_Toc242110909"/>
+      <w:r>
+        <w:t>Query the NTP Server</w:t>
+      </w:r>
+      <w:bookmarkEnd w:id="309"/>
+    </w:p>
+    <w:p>
+      <w:pPr>
+        <w:pStyle w:val="code"/>
+      </w:pPr>
+      <w:r>
+        <w:t>AT+NTP_SERVER?</w:t>
+      </w:r>
+    </w:p>
+    <w:p>
+      <w:pPr>
+        <w:pStyle w:val="code"/>
+      </w:pPr>
+      <w:r>
+        <w:t>NTP_SERVER=pool.ntp.org</w:t>
+      </w:r>
+    </w:p>
+    <w:p/>
+    <w:p>
+      <w:pPr>
+        <w:pStyle w:val="Heading2"/>
+        <w:numPr>
+          <w:ilvl w:val="1"/>
+          <w:numId w:val="4"/>
+        </w:numPr>
+      </w:pPr>
       <w:bookmarkStart w:id="63" w:name="_Toc242110562"/>
       <w:r>
         <w:lastRenderedPageBreak/>
@@ -17438,6 +18684,11 @@
               <w:t>GDL90 – Garmin GDL90 binary reporting protocol.</w:t>
             </w:r>
           </w:p>
+          <w:p>
+            <w:r>
+              <w:t>ASTERIX – EUROCONTROL ASTERIX CAT021 and CAT023 binary reporting protocol.</w:t>
+            </w:r>
+          </w:p>
         </w:tc>
       </w:tr>
     </w:tbl>
@@ -17521,7 +18772,7 @@
         <w:fldChar w:fldCharType="separate"/>
       </w:r>
       <w:r>
-        <w:t xml:space="preserve">4.19.1  </w:t>
+        <w:t xml:space="preserve">4.22.1  </w:t>
       </w:r>
       <w:r>
         <w:fldChar w:fldCharType="end"/>
@@ -21045,7 +22296,7 @@
         </w:numPr>
       </w:pPr>
       <w:r>
-        <w:t>CSBee</w:t>
+        <w:t>ASTERIX</w:t>
       </w:r>
     </w:p>
     <w:p>
@@ -21057,7 +22308,7 @@
         </w:numPr>
       </w:pPr>
       <w:r>
-        <w:t>GDL90</w:t>
+        <w:t>CSBee</w:t>
       </w:r>
     </w:p>
     <w:p>
@@ -21069,7 +22320,7 @@
         </w:numPr>
       </w:pPr>
       <w:r>
-        <w:t>MAVLINK 1</w:t>
+        <w:t>GDL90</w:t>
       </w:r>
     </w:p>
     <w:p>
@@ -21081,7 +22332,7 @@
         </w:numPr>
       </w:pPr>
       <w:r>
-        <w:t>MAVLINK 2</w:t>
+        <w:t>MAVLINK 1</w:t>
       </w:r>
     </w:p>
     <w:p>
@@ -21093,7 +22344,7 @@
         </w:numPr>
       </w:pPr>
       <w:r>
-        <w:t>Mode S Beast</w:t>
+        <w:t>MAVLINK 2</w:t>
       </w:r>
     </w:p>
     <w:p>
@@ -21105,12 +22356,109 @@
         </w:numPr>
       </w:pPr>
       <w:r>
+        <w:t>Mode S Beast</w:t>
+      </w:r>
+    </w:p>
+    <w:p>
+      <w:pPr>
+        <w:pStyle w:val="ListParagraph"/>
+        <w:numPr>
+          <w:ilvl w:val="0"/>
+          <w:numId w:val="3"/>
+        </w:numPr>
+      </w:pPr>
+      <w:r>
         <w:t>Raw Packets</w:t>
       </w:r>
     </w:p>
     <w:p>
       <w:r>
         <w:t>The CONSOLE interface reports debug messages and AT command responses in addition to the selected reporting protocol. If the CONSOLE interface is being used as a reporting interface, it is recommended to send AT+LOG_LEVEL=SILENT to silence any debug logs that might corrupt the reported data, and to avoid sending additional AT commands while reading reported data in order to avoid the reported data being interspersed with OK and other AT command responses from the ADSBee 1090.</w:t>
+      </w:r>
+    </w:p>
+    <w:p>
+      <w:pPr>
+        <w:rPr>
+          <w:rFonts w:ascii="Poppins" w:eastAsiaTheme="majorEastAsia" w:hAnsi="Poppins" w:cstheme="majorBidi"/>
+          <w:color w:val="008139" w:themeColor="accent1" w:themeShade="BF"/>
+          <w:sz w:val="26"/>
+          <w:szCs w:val="26"/>
+        </w:rPr>
+      </w:pPr>
+      <w:r>
+        <w:br w:type="page"/>
+      </w:r>
+    </w:p>
+    <w:p>
+      <w:pPr>
+        <w:pStyle w:val="Heading2"/>
+        <w:numPr>
+          <w:ilvl w:val="1"/>
+          <w:numId w:val="4"/>
+        </w:numPr>
+      </w:pPr>
+      <w:bookmarkStart w:id="310" w:name="_Toc242110910"/>
+      <w:r>
+        <w:t>ASTERIX</w:t>
+      </w:r>
+      <w:bookmarkEnd w:id="310"/>
+    </w:p>
+    <w:p>
+      <w:r>
+        <w:t>ASTERIX is the EUROCONTROL surveillance data format used by air navigation service providers. ADSBee 1090 reports CAT021 (ADS-B target reports, Edition 2.6, also valid as Edition 2.7) and CAT023 (ground station and service status, Edition 1.3).</w:t>
+      </w:r>
+    </w:p>
+    <w:p>
+      <w:r>
+        <w:t>Select it with AT+PROTOCOL_OUT on CONSOLE or COMMS_UART, or as the protocol of a network feed with AT+FEED. Set the data source identifier with AT+ASTERIX_SAC_SIC.</w:t>
+      </w:r>
+    </w:p>
+    <w:p>
+      <w:pPr>
+        <w:pStyle w:val="Heading3"/>
+        <w:numPr>
+          <w:ilvl w:val="2"/>
+          <w:numId w:val="4"/>
+        </w:numPr>
+      </w:pPr>
+      <w:bookmarkStart w:id="311" w:name="_Toc242110911"/>
+      <w:r>
+        <w:t>ASTERIX: Data Blocks</w:t>
+      </w:r>
+      <w:bookmarkEnd w:id="311"/>
+    </w:p>
+    <w:p>
+      <w:r>
+        <w:t>Once per second, ADSBee 1090 sends one CAT023 data block followed by CAT021 data blocks. The CAT023 block holds a ground station status report and a service status report for the 1090 MHz receiver (service ID 1) and for the UAT receiver (service ID 2). Each CAT021 record reports one aircraft. Data blocks are at most 1024 bytes, so each fits in one UDP datagram, and follow each other with no extra framing.</w:t>
+      </w:r>
+    </w:p>
+    <w:p>
+      <w:r>
+        <w:t>Aircraft without a position, 1090 MHz DF18 targets, UAT TIS-B and ADS-R targets, Mode S aircraft that don’t send ADS-B, and Remote ID drones are not reported. A track number stays with an aircraft while it is reported and is reused 60 s after the aircraft was last reported.</w:t>
+      </w:r>
+    </w:p>
+    <w:p>
+      <w:r>
+        <w:t>The data items of each record are listed in firmware/common/comms/asterix/README.md in the ADSBee repository. Wireshark decodes ASTERIX on UDP and TCP port 8600.</w:t>
+      </w:r>
+    </w:p>
+    <w:p>
+      <w:pPr>
+        <w:pStyle w:val="Heading3"/>
+        <w:numPr>
+          <w:ilvl w:val="2"/>
+          <w:numId w:val="4"/>
+        </w:numPr>
+      </w:pPr>
+      <w:bookmarkStart w:id="312" w:name="_Toc242110912"/>
+      <w:r>
+        <w:t>ASTERIX: Time Source</w:t>
+      </w:r>
+      <w:bookmarkEnd w:id="312"/>
+    </w:p>
+    <w:p>
+      <w:r>
+        <w:t>ASTERIX times are seconds since midnight UTC. ADSBee 1090 takes UTC from a GNSS receiver with a valid time (see AT+GNSS), or else from the NTP server set with AT+NTP_SERVER. Without either, times count from boot, CAT023 reports TSV (time source invalid) and NOGO, and every CAT021 record sets the NOGO bit.</w:t>
       </w:r>
     </w:p>
     <w:p>
@@ -22033,7 +23381,7 @@
               <w:fldChar w:fldCharType="separate"/>
             </w:r>
             <w:r>
-              <w:t>5.1.2.1</w:t>
+              <w:t>5.2.2.1</w:t>
             </w:r>
             <w:r>
               <w:fldChar w:fldCharType="end"/>
@@ -22316,7 +23664,7 @@
               <w:fldChar w:fldCharType="separate"/>
             </w:r>
             <w:r>
-              <w:t>5.1.2.2</w:t>
+              <w:t>5.2.2.2</w:t>
             </w:r>
             <w:r>
               <w:fldChar w:fldCharType="end"/>
@@ -23114,7 +24462,7 @@
               <w:fldChar w:fldCharType="separate"/>
             </w:r>
             <w:r>
-              <w:t>5.1.2.3</w:t>
+              <w:t>5.2.2.3</w:t>
             </w:r>
             <w:r>
               <w:fldChar w:fldCharType="end"/>
@@ -23207,7 +24555,7 @@
               <w:fldChar w:fldCharType="separate"/>
             </w:r>
             <w:r>
-              <w:t>5.1.2.4</w:t>
+              <w:t>5.2.2.4</w:t>
             </w:r>
             <w:r>
               <w:fldChar w:fldCharType="end"/>
@@ -23728,7 +25076,7 @@
               <w:fldChar w:fldCharType="separate"/>
             </w:r>
             <w:r>
-              <w:t>5.1.2.5</w:t>
+              <w:t>5.2.2.5</w:t>
             </w:r>
             <w:r>
               <w:fldChar w:fldCharType="end"/>
@@ -29597,7 +30945,7 @@
               <w:fldChar w:fldCharType="separate"/>
             </w:r>
             <w:r>
-              <w:t>5.1.3.1</w:t>
+              <w:t>5.2.3.1</w:t>
             </w:r>
             <w:r>
               <w:fldChar w:fldCharType="end"/>
@@ -29742,7 +31090,7 @@
               <w:fldChar w:fldCharType="separate"/>
             </w:r>
             <w:r>
-              <w:t>5.1.3.2</w:t>
+              <w:t>5.2.3.2</w:t>
             </w:r>
             <w:r>
               <w:fldChar w:fldCharType="end"/>
@@ -30025,7 +31373,7 @@
               <w:fldChar w:fldCharType="separate"/>
             </w:r>
             <w:r>
-              <w:t>5.1.2.2</w:t>
+              <w:t>5.2.2.2</w:t>
             </w:r>
             <w:r>
               <w:fldChar w:fldCharType="end"/>
@@ -30904,7 +32252,7 @@
               <w:fldChar w:fldCharType="separate"/>
             </w:r>
             <w:r>
-              <w:t>5.1.2.3</w:t>
+              <w:t>5.2.2.3</w:t>
             </w:r>
             <w:r>
               <w:fldChar w:fldCharType="end"/>
@@ -31000,7 +32348,7 @@
               <w:fldChar w:fldCharType="separate"/>
             </w:r>
             <w:r>
-              <w:t>5.1.2.4</w:t>
+              <w:t>5.2.2.4</w:t>
             </w:r>
             <w:r>
               <w:fldChar w:fldCharType="end"/>
@@ -31434,7 +32782,7 @@
               <w:fldChar w:fldCharType="separate"/>
             </w:r>
             <w:r>
-              <w:t>5.1.2.5</w:t>
+              <w:t>5.2.2.5</w:t>
             </w:r>
             <w:r>
               <w:fldChar w:fldCharType="end"/>
@@ -34250,7 +35598,7 @@
               <w:fldChar w:fldCharType="separate"/>
             </w:r>
             <w:r>
-              <w:t>5.1.4.1</w:t>
+              <w:t>5.2.4.1</w:t>
             </w:r>
             <w:r>
               <w:fldChar w:fldCharType="end"/>
@@ -34348,7 +35696,7 @@
         <w:fldChar w:fldCharType="separate"/>
       </w:r>
       <w:r>
-        <w:t>5.1.2.5</w:t>
+        <w:t>5.2.2.5</w:t>
       </w:r>
       <w:r>
         <w:fldChar w:fldCharType="end"/>
@@ -44921,13 +46269,13 @@
       <w:rPr>
         <w:color w:val="FFFFFF" w:themeColor="background1"/>
       </w:rPr>
-      <w:t>20261016</w:t>
+      <w:t>20261017</w:t>
     </w:r>
     <w:r>
       <w:rPr>
         <w:color w:val="FFFFFF" w:themeColor="background1"/>
       </w:rPr>
-      <w:t>1016</w:t>
+      <w:t/>
     </w:r>
     <w:r>
       <w:rPr>

</xml_diff>

<commit_message>
Datasheets: table of contents page numbers match the export (1090, m1421)
After #349 added the AT+FILTER_ALTITUDE_FT section, every heading from it on moved one page down in the CI-exported PDFs.
</commit_message>
<xml_diff>
--- a/word/datasheet_adsbee_1090.docx
+++ b/word/datasheet_adsbee_1090.docx
@@ -4318,7 +4318,7 @@
                 <w:noProof/>
                 <w:webHidden/>
               </w:rPr>
-              <w:t>16</w:t>
+              <w:t>17</w:t>
             </w:r>
             <w:r>
               <w:rPr>
@@ -4408,7 +4408,7 @@
                 <w:noProof/>
                 <w:webHidden/>
               </w:rPr>
-              <w:t>16</w:t>
+              <w:t>17</w:t>
             </w:r>
             <w:r>
               <w:rPr>
@@ -4498,7 +4498,7 @@
                 <w:noProof/>
                 <w:webHidden/>
               </w:rPr>
-              <w:t>16</w:t>
+              <w:t>17</w:t>
             </w:r>
             <w:r>
               <w:rPr>
@@ -4588,7 +4588,7 @@
                 <w:noProof/>
                 <w:webHidden/>
               </w:rPr>
-              <w:t>17</w:t>
+              <w:t>18</w:t>
             </w:r>
             <w:r>
               <w:rPr>
@@ -4678,7 +4678,7 @@
                 <w:noProof/>
                 <w:webHidden/>
               </w:rPr>
-              <w:t>17</w:t>
+              <w:t>18</w:t>
             </w:r>
             <w:r>
               <w:rPr>
@@ -4768,7 +4768,7 @@
                 <w:noProof/>
                 <w:webHidden/>
               </w:rPr>
-              <w:t>17</w:t>
+              <w:t>18</w:t>
             </w:r>
             <w:r>
               <w:rPr>
@@ -4858,7 +4858,7 @@
                 <w:noProof/>
                 <w:webHidden/>
               </w:rPr>
-              <w:t>17</w:t>
+              <w:t>18</w:t>
             </w:r>
             <w:r>
               <w:rPr>
@@ -4948,7 +4948,7 @@
                 <w:noProof/>
                 <w:webHidden/>
               </w:rPr>
-              <w:t>17</w:t>
+              <w:t>18</w:t>
             </w:r>
             <w:r>
               <w:rPr>
@@ -5038,7 +5038,7 @@
                 <w:noProof/>
                 <w:webHidden/>
               </w:rPr>
-              <w:t>18</w:t>
+              <w:t>19</w:t>
             </w:r>
             <w:r>
               <w:rPr>
@@ -5128,7 +5128,7 @@
                 <w:noProof/>
                 <w:webHidden/>
               </w:rPr>
-              <w:t>18</w:t>
+              <w:t>19</w:t>
             </w:r>
             <w:r>
               <w:rPr>
@@ -5218,7 +5218,7 @@
                 <w:noProof/>
                 <w:webHidden/>
               </w:rPr>
-              <w:t>18</w:t>
+              <w:t>19</w:t>
             </w:r>
             <w:r>
               <w:rPr>
@@ -5308,7 +5308,7 @@
                 <w:noProof/>
                 <w:webHidden/>
               </w:rPr>
-              <w:t>18</w:t>
+              <w:t>19</w:t>
             </w:r>
             <w:r>
               <w:rPr>
@@ -5398,7 +5398,7 @@
                 <w:noProof/>
                 <w:webHidden/>
               </w:rPr>
-              <w:t>19</w:t>
+              <w:t>20</w:t>
             </w:r>
             <w:r>
               <w:rPr>
@@ -5488,7 +5488,7 @@
                 <w:noProof/>
                 <w:webHidden/>
               </w:rPr>
-              <w:t>19</w:t>
+              <w:t>20</w:t>
             </w:r>
             <w:r>
               <w:rPr>
@@ -5578,7 +5578,7 @@
                 <w:noProof/>
                 <w:webHidden/>
               </w:rPr>
-              <w:t>19</w:t>
+              <w:t>20</w:t>
             </w:r>
             <w:r>
               <w:rPr>
@@ -5668,7 +5668,7 @@
                 <w:noProof/>
                 <w:webHidden/>
               </w:rPr>
-              <w:t>19</w:t>
+              <w:t>20</w:t>
             </w:r>
             <w:r>
               <w:rPr>
@@ -5758,7 +5758,7 @@
                 <w:noProof/>
                 <w:webHidden/>
               </w:rPr>
-              <w:t>20</w:t>
+              <w:t>21</w:t>
             </w:r>
             <w:r>
               <w:rPr>
@@ -5848,7 +5848,7 @@
                 <w:noProof/>
                 <w:webHidden/>
               </w:rPr>
-              <w:t>21</w:t>
+              <w:t>22</w:t>
             </w:r>
             <w:r>
               <w:rPr>
@@ -5938,7 +5938,7 @@
                 <w:noProof/>
                 <w:webHidden/>
               </w:rPr>
-              <w:t>21</w:t>
+              <w:t>22</w:t>
             </w:r>
             <w:r>
               <w:rPr>
@@ -6028,7 +6028,7 @@
                 <w:noProof/>
                 <w:webHidden/>
               </w:rPr>
-              <w:t>21</w:t>
+              <w:t>22</w:t>
             </w:r>
             <w:r>
               <w:rPr>
@@ -6118,7 +6118,7 @@
                 <w:noProof/>
                 <w:webHidden/>
               </w:rPr>
-              <w:t>22</w:t>
+              <w:t>23</w:t>
             </w:r>
             <w:r>
               <w:rPr>
@@ -6208,7 +6208,7 @@
                 <w:noProof/>
                 <w:webHidden/>
               </w:rPr>
-              <w:t>22</w:t>
+              <w:t>23</w:t>
             </w:r>
             <w:r>
               <w:rPr>
@@ -6298,7 +6298,7 @@
                 <w:noProof/>
                 <w:webHidden/>
               </w:rPr>
-              <w:t>22</w:t>
+              <w:t>23</w:t>
             </w:r>
             <w:r>
               <w:rPr>
@@ -6388,7 +6388,7 @@
                 <w:noProof/>
                 <w:webHidden/>
               </w:rPr>
-              <w:t>22</w:t>
+              <w:t>23</w:t>
             </w:r>
             <w:r>
               <w:rPr>
@@ -6478,7 +6478,7 @@
                 <w:noProof/>
                 <w:webHidden/>
               </w:rPr>
-              <w:t>23</w:t>
+              <w:t>24</w:t>
             </w:r>
             <w:r>
               <w:rPr>
@@ -6568,7 +6568,7 @@
                 <w:noProof/>
                 <w:webHidden/>
               </w:rPr>
-              <w:t>23</w:t>
+              <w:t>24</w:t>
             </w:r>
             <w:r>
               <w:rPr>
@@ -6658,7 +6658,7 @@
                 <w:noProof/>
                 <w:webHidden/>
               </w:rPr>
-              <w:t>23</w:t>
+              <w:t>24</w:t>
             </w:r>
             <w:r>
               <w:rPr>
@@ -6748,7 +6748,7 @@
                 <w:noProof/>
                 <w:webHidden/>
               </w:rPr>
-              <w:t>23</w:t>
+              <w:t>24</w:t>
             </w:r>
             <w:r>
               <w:rPr>
@@ -6838,7 +6838,7 @@
                 <w:noProof/>
                 <w:webHidden/>
               </w:rPr>
-              <w:t>23</w:t>
+              <w:t>24</w:t>
             </w:r>
             <w:r>
               <w:rPr>
@@ -6928,7 +6928,7 @@
                 <w:noProof/>
                 <w:webHidden/>
               </w:rPr>
-              <w:t>24</w:t>
+              <w:t>25</w:t>
             </w:r>
             <w:r>
               <w:rPr>
@@ -7018,7 +7018,7 @@
                 <w:noProof/>
                 <w:webHidden/>
               </w:rPr>
-              <w:t>24</w:t>
+              <w:t>25</w:t>
             </w:r>
             <w:r>
               <w:rPr>
@@ -7108,7 +7108,7 @@
                 <w:noProof/>
                 <w:webHidden/>
               </w:rPr>
-              <w:t>25</w:t>
+              <w:t>26</w:t>
             </w:r>
             <w:r>
               <w:rPr>
@@ -7198,7 +7198,7 @@
                 <w:noProof/>
                 <w:webHidden/>
               </w:rPr>
-              <w:t>25</w:t>
+              <w:t>26</w:t>
             </w:r>
             <w:r>
               <w:rPr>
@@ -7288,7 +7288,7 @@
                 <w:noProof/>
                 <w:webHidden/>
               </w:rPr>
-              <w:t>25</w:t>
+              <w:t>26</w:t>
             </w:r>
             <w:r>
               <w:rPr>
@@ -7378,7 +7378,7 @@
                 <w:noProof/>
                 <w:webHidden/>
               </w:rPr>
-              <w:t>26</w:t>
+              <w:t>27</w:t>
             </w:r>
             <w:r>
               <w:rPr>
@@ -7468,7 +7468,7 @@
                 <w:noProof/>
                 <w:webHidden/>
               </w:rPr>
-              <w:t>26</w:t>
+              <w:t>27</w:t>
             </w:r>
             <w:r>
               <w:rPr>
@@ -7558,7 +7558,7 @@
                 <w:noProof/>
                 <w:webHidden/>
               </w:rPr>
-              <w:t>27</w:t>
+              <w:t>28</w:t>
             </w:r>
             <w:r>
               <w:rPr>
@@ -7648,7 +7648,7 @@
                 <w:noProof/>
                 <w:webHidden/>
               </w:rPr>
-              <w:t>28</w:t>
+              <w:t>29</w:t>
             </w:r>
             <w:r>
               <w:rPr>
@@ -7738,7 +7738,7 @@
                 <w:noProof/>
                 <w:webHidden/>
               </w:rPr>
-              <w:t>28</w:t>
+              <w:t>29</w:t>
             </w:r>
             <w:r>
               <w:rPr>
@@ -7828,7 +7828,7 @@
                 <w:noProof/>
                 <w:webHidden/>
               </w:rPr>
-              <w:t>29</w:t>
+              <w:t>30</w:t>
             </w:r>
             <w:r>
               <w:rPr>
@@ -7918,7 +7918,7 @@
                 <w:noProof/>
                 <w:webHidden/>
               </w:rPr>
-              <w:t>29</w:t>
+              <w:t>30</w:t>
             </w:r>
             <w:r>
               <w:rPr>
@@ -8008,7 +8008,7 @@
                 <w:noProof/>
                 <w:webHidden/>
               </w:rPr>
-              <w:t>29</w:t>
+              <w:t>30</w:t>
             </w:r>
             <w:r>
               <w:rPr>
@@ -8098,7 +8098,7 @@
                 <w:noProof/>
                 <w:webHidden/>
               </w:rPr>
-              <w:t>29</w:t>
+              <w:t>30</w:t>
             </w:r>
             <w:r>
               <w:rPr>
@@ -8188,7 +8188,7 @@
                 <w:noProof/>
                 <w:webHidden/>
               </w:rPr>
-              <w:t>30</w:t>
+              <w:t>31</w:t>
             </w:r>
             <w:r>
               <w:rPr>
@@ -8282,7 +8282,7 @@
                 <w:noProof/>
                 <w:webHidden/>
               </w:rPr>
-              <w:t>30</w:t>
+              <w:t>31</w:t>
             </w:r>
             <w:r>
               <w:rPr>
@@ -8372,7 +8372,7 @@
                 <w:noProof/>
                 <w:webHidden/>
               </w:rPr>
-              <w:t>30</w:t>
+              <w:t>31</w:t>
             </w:r>
             <w:r>
               <w:rPr>
@@ -8462,7 +8462,7 @@
                 <w:noProof/>
                 <w:webHidden/>
               </w:rPr>
-              <w:t>30</w:t>
+              <w:t>31</w:t>
             </w:r>
             <w:r>
               <w:rPr>
@@ -8552,7 +8552,7 @@
                 <w:noProof/>
                 <w:webHidden/>
               </w:rPr>
-              <w:t>31</w:t>
+              <w:t>32</w:t>
             </w:r>
             <w:r>
               <w:rPr>
@@ -8642,7 +8642,7 @@
                 <w:noProof/>
                 <w:webHidden/>
               </w:rPr>
-              <w:t>31</w:t>
+              <w:t>32</w:t>
             </w:r>
             <w:r>
               <w:rPr>
@@ -8732,7 +8732,7 @@
                 <w:noProof/>
                 <w:webHidden/>
               </w:rPr>
-              <w:t>31</w:t>
+              <w:t>32</w:t>
             </w:r>
             <w:r>
               <w:rPr>
@@ -8822,7 +8822,7 @@
                 <w:noProof/>
                 <w:webHidden/>
               </w:rPr>
-              <w:t>31</w:t>
+              <w:t>32</w:t>
             </w:r>
             <w:r>
               <w:rPr>
@@ -8912,7 +8912,7 @@
                 <w:noProof/>
                 <w:webHidden/>
               </w:rPr>
-              <w:t>32</w:t>
+              <w:t>33</w:t>
             </w:r>
             <w:r>
               <w:rPr>
@@ -9002,7 +9002,7 @@
                 <w:noProof/>
                 <w:webHidden/>
               </w:rPr>
-              <w:t>32</w:t>
+              <w:t>33</w:t>
             </w:r>
             <w:r>
               <w:rPr>
@@ -9092,7 +9092,7 @@
                 <w:noProof/>
                 <w:webHidden/>
               </w:rPr>
-              <w:t>32</w:t>
+              <w:t>33</w:t>
             </w:r>
             <w:r>
               <w:rPr>
@@ -9182,7 +9182,7 @@
                 <w:noProof/>
                 <w:webHidden/>
               </w:rPr>
-              <w:t>32</w:t>
+              <w:t>33</w:t>
             </w:r>
             <w:r>
               <w:rPr>
@@ -9272,7 +9272,7 @@
                 <w:noProof/>
                 <w:webHidden/>
               </w:rPr>
-              <w:t>32</w:t>
+              <w:t>33</w:t>
             </w:r>
             <w:r>
               <w:rPr>
@@ -9362,7 +9362,7 @@
                 <w:noProof/>
                 <w:webHidden/>
               </w:rPr>
-              <w:t>33</w:t>
+              <w:t>34</w:t>
             </w:r>
             <w:r>
               <w:rPr>
@@ -9452,7 +9452,7 @@
                 <w:noProof/>
                 <w:webHidden/>
               </w:rPr>
-              <w:t>33</w:t>
+              <w:t>34</w:t>
             </w:r>
             <w:r>
               <w:rPr>
@@ -9542,7 +9542,7 @@
                 <w:noProof/>
                 <w:webHidden/>
               </w:rPr>
-              <w:t>33</w:t>
+              <w:t>34</w:t>
             </w:r>
             <w:r>
               <w:rPr>
@@ -9632,7 +9632,7 @@
                 <w:noProof/>
                 <w:webHidden/>
               </w:rPr>
-              <w:t>34</w:t>
+              <w:t>35</w:t>
             </w:r>
             <w:r>
               <w:rPr>
@@ -9722,7 +9722,7 @@
                 <w:noProof/>
                 <w:webHidden/>
               </w:rPr>
-              <w:t>34</w:t>
+              <w:t>35</w:t>
             </w:r>
             <w:r>
               <w:rPr>
@@ -9812,7 +9812,7 @@
                 <w:noProof/>
                 <w:webHidden/>
               </w:rPr>
-              <w:t>34</w:t>
+              <w:t>35</w:t>
             </w:r>
             <w:r>
               <w:rPr>
@@ -9901,7 +9901,7 @@
                 <w:noProof/>
                 <w:webHidden/>
               </w:rPr>
-              <w:t>35</w:t>
+              <w:t>36</w:t>
             </w:r>
             <w:r>
               <w:rPr>
@@ -9991,7 +9991,7 @@
                 <w:noProof/>
                 <w:webHidden/>
               </w:rPr>
-              <w:t>36</w:t>
+              <w:t>37</w:t>
             </w:r>
             <w:r>
               <w:rPr>
@@ -10081,7 +10081,7 @@
                 <w:noProof/>
                 <w:webHidden/>
               </w:rPr>
-              <w:t>36</w:t>
+              <w:t>37</w:t>
             </w:r>
             <w:r>
               <w:rPr>
@@ -10171,7 +10171,7 @@
                 <w:noProof/>
                 <w:webHidden/>
               </w:rPr>
-              <w:t>36</w:t>
+              <w:t>37</w:t>
             </w:r>
             <w:r>
               <w:rPr>
@@ -10261,7 +10261,7 @@
                 <w:noProof/>
                 <w:webHidden/>
               </w:rPr>
-              <w:t>37</w:t>
+              <w:t>38</w:t>
             </w:r>
             <w:r>
               <w:rPr>
@@ -10351,7 +10351,7 @@
                 <w:noProof/>
                 <w:webHidden/>
               </w:rPr>
-              <w:t>37</w:t>
+              <w:t>38</w:t>
             </w:r>
             <w:r>
               <w:rPr>
@@ -10441,7 +10441,7 @@
                 <w:noProof/>
                 <w:webHidden/>
               </w:rPr>
-              <w:t>38</w:t>
+              <w:t>39</w:t>
             </w:r>
             <w:r>
               <w:rPr>
@@ -10531,7 +10531,7 @@
                 <w:noProof/>
                 <w:webHidden/>
               </w:rPr>
-              <w:t>45</w:t>
+              <w:t>46</w:t>
             </w:r>
             <w:r>
               <w:rPr>
@@ -10621,7 +10621,7 @@
                 <w:noProof/>
                 <w:webHidden/>
               </w:rPr>
-              <w:t>49</w:t>
+              <w:t>50</w:t>
             </w:r>
             <w:r>
               <w:rPr>
@@ -10711,7 +10711,7 @@
                 <w:noProof/>
                 <w:webHidden/>
               </w:rPr>
-              <w:t>50</w:t>
+              <w:t>51</w:t>
             </w:r>
             <w:r>
               <w:rPr>
@@ -10801,7 +10801,7 @@
                 <w:noProof/>
                 <w:webHidden/>
               </w:rPr>
-              <w:t>51</w:t>
+              <w:t>52</w:t>
             </w:r>
             <w:r>
               <w:rPr>
@@ -10924,7 +10924,7 @@
                 <w:noProof/>
                 <w:webHidden/>
               </w:rPr>
-              <w:t>51</w:t>
+              <w:t>52</w:t>
             </w:r>
             <w:r>
               <w:rPr>
@@ -11014,7 +11014,7 @@
                 <w:noProof/>
                 <w:webHidden/>
               </w:rPr>
-              <w:t>51</w:t>
+              <w:t>52</w:t>
             </w:r>
             <w:r>
               <w:rPr>
@@ -11104,7 +11104,7 @@
                 <w:noProof/>
                 <w:webHidden/>
               </w:rPr>
-              <w:t>52</w:t>
+              <w:t>53</w:t>
             </w:r>
             <w:r>
               <w:rPr>
@@ -11194,7 +11194,7 @@
                 <w:noProof/>
                 <w:webHidden/>
               </w:rPr>
-              <w:t>52</w:t>
+              <w:t>53</w:t>
             </w:r>
             <w:r>
               <w:rPr>
@@ -11284,7 +11284,7 @@
                 <w:noProof/>
                 <w:webHidden/>
               </w:rPr>
-              <w:t>53</w:t>
+              <w:t>54</w:t>
             </w:r>
             <w:r>
               <w:rPr>
@@ -11374,7 +11374,7 @@
                 <w:noProof/>
                 <w:webHidden/>
               </w:rPr>
-              <w:t>53</w:t>
+              <w:t>54</w:t>
             </w:r>
             <w:r>
               <w:rPr>
@@ -11464,7 +11464,7 @@
                 <w:noProof/>
                 <w:webHidden/>
               </w:rPr>
-              <w:t>53</w:t>
+              <w:t>54</w:t>
             </w:r>
             <w:r>
               <w:rPr>
@@ -11554,7 +11554,7 @@
                 <w:noProof/>
                 <w:webHidden/>
               </w:rPr>
-              <w:t>54</w:t>
+              <w:t>55</w:t>
             </w:r>
             <w:r>
               <w:rPr>
@@ -11644,7 +11644,7 @@
                 <w:noProof/>
                 <w:webHidden/>
               </w:rPr>
-              <w:t>54</w:t>
+              <w:t>55</w:t>
             </w:r>
             <w:r>
               <w:rPr>
@@ -11734,7 +11734,7 @@
                 <w:noProof/>
                 <w:webHidden/>
               </w:rPr>
-              <w:t>54</w:t>
+              <w:t>55</w:t>
             </w:r>
             <w:r>
               <w:rPr>
@@ -11824,7 +11824,7 @@
                 <w:noProof/>
                 <w:webHidden/>
               </w:rPr>
-              <w:t>55</w:t>
+              <w:t>56</w:t>
             </w:r>
             <w:r>
               <w:rPr>
@@ -11914,7 +11914,7 @@
                 <w:noProof/>
                 <w:webHidden/>
               </w:rPr>
-              <w:t>56</w:t>
+              <w:t>57</w:t>
             </w:r>
             <w:r>
               <w:rPr>
@@ -12004,7 +12004,7 @@
                 <w:noProof/>
                 <w:webHidden/>
               </w:rPr>
-              <w:t>56</w:t>
+              <w:t>57</w:t>
             </w:r>
             <w:r>
               <w:rPr>
@@ -12094,7 +12094,7 @@
                 <w:noProof/>
                 <w:webHidden/>
               </w:rPr>
-              <w:t>57</w:t>
+              <w:t>58</w:t>
             </w:r>
             <w:r>
               <w:rPr>

</xml_diff>

<commit_message>
Datasheets: TOC page numbers after the altitude filter section (#354)
* Datasheets: table of contents page numbers match the export (1090, m1421)

After #349 added the AT+FILTER_ALTITUDE_FT section, every heading from it on moved one page down in the CI-exported PDFs.

* word: export PDFs

word/exports/datasheet_adsbee_1090.pdf
word/exports/datasheet_adsbee_m1421.pdf

---------

Co-authored-by: github-actions[bot] <41898282+github-actions[bot]@users.noreply.github.com>
</commit_message>
<xml_diff>
--- a/word/datasheet_adsbee_1090.docx
+++ b/word/datasheet_adsbee_1090.docx
@@ -4318,7 +4318,7 @@
                 <w:noProof/>
                 <w:webHidden/>
               </w:rPr>
-              <w:t>16</w:t>
+              <w:t>17</w:t>
             </w:r>
             <w:r>
               <w:rPr>
@@ -4408,7 +4408,7 @@
                 <w:noProof/>
                 <w:webHidden/>
               </w:rPr>
-              <w:t>16</w:t>
+              <w:t>17</w:t>
             </w:r>
             <w:r>
               <w:rPr>
@@ -4498,7 +4498,7 @@
                 <w:noProof/>
                 <w:webHidden/>
               </w:rPr>
-              <w:t>16</w:t>
+              <w:t>17</w:t>
             </w:r>
             <w:r>
               <w:rPr>
@@ -4588,7 +4588,7 @@
                 <w:noProof/>
                 <w:webHidden/>
               </w:rPr>
-              <w:t>17</w:t>
+              <w:t>18</w:t>
             </w:r>
             <w:r>
               <w:rPr>
@@ -4678,7 +4678,7 @@
                 <w:noProof/>
                 <w:webHidden/>
               </w:rPr>
-              <w:t>17</w:t>
+              <w:t>18</w:t>
             </w:r>
             <w:r>
               <w:rPr>
@@ -4768,7 +4768,7 @@
                 <w:noProof/>
                 <w:webHidden/>
               </w:rPr>
-              <w:t>17</w:t>
+              <w:t>18</w:t>
             </w:r>
             <w:r>
               <w:rPr>
@@ -4858,7 +4858,7 @@
                 <w:noProof/>
                 <w:webHidden/>
               </w:rPr>
-              <w:t>17</w:t>
+              <w:t>18</w:t>
             </w:r>
             <w:r>
               <w:rPr>
@@ -4948,7 +4948,7 @@
                 <w:noProof/>
                 <w:webHidden/>
               </w:rPr>
-              <w:t>17</w:t>
+              <w:t>18</w:t>
             </w:r>
             <w:r>
               <w:rPr>
@@ -5038,7 +5038,7 @@
                 <w:noProof/>
                 <w:webHidden/>
               </w:rPr>
-              <w:t>18</w:t>
+              <w:t>19</w:t>
             </w:r>
             <w:r>
               <w:rPr>
@@ -5128,7 +5128,7 @@
                 <w:noProof/>
                 <w:webHidden/>
               </w:rPr>
-              <w:t>18</w:t>
+              <w:t>19</w:t>
             </w:r>
             <w:r>
               <w:rPr>
@@ -5218,7 +5218,7 @@
                 <w:noProof/>
                 <w:webHidden/>
               </w:rPr>
-              <w:t>18</w:t>
+              <w:t>19</w:t>
             </w:r>
             <w:r>
               <w:rPr>
@@ -5308,7 +5308,7 @@
                 <w:noProof/>
                 <w:webHidden/>
               </w:rPr>
-              <w:t>18</w:t>
+              <w:t>19</w:t>
             </w:r>
             <w:r>
               <w:rPr>
@@ -5398,7 +5398,7 @@
                 <w:noProof/>
                 <w:webHidden/>
               </w:rPr>
-              <w:t>19</w:t>
+              <w:t>20</w:t>
             </w:r>
             <w:r>
               <w:rPr>
@@ -5488,7 +5488,7 @@
                 <w:noProof/>
                 <w:webHidden/>
               </w:rPr>
-              <w:t>19</w:t>
+              <w:t>20</w:t>
             </w:r>
             <w:r>
               <w:rPr>
@@ -5578,7 +5578,7 @@
                 <w:noProof/>
                 <w:webHidden/>
               </w:rPr>
-              <w:t>19</w:t>
+              <w:t>20</w:t>
             </w:r>
             <w:r>
               <w:rPr>
@@ -5668,7 +5668,7 @@
                 <w:noProof/>
                 <w:webHidden/>
               </w:rPr>
-              <w:t>19</w:t>
+              <w:t>20</w:t>
             </w:r>
             <w:r>
               <w:rPr>
@@ -5758,7 +5758,7 @@
                 <w:noProof/>
                 <w:webHidden/>
               </w:rPr>
-              <w:t>20</w:t>
+              <w:t>21</w:t>
             </w:r>
             <w:r>
               <w:rPr>
@@ -5848,7 +5848,7 @@
                 <w:noProof/>
                 <w:webHidden/>
               </w:rPr>
-              <w:t>21</w:t>
+              <w:t>22</w:t>
             </w:r>
             <w:r>
               <w:rPr>
@@ -5938,7 +5938,7 @@
                 <w:noProof/>
                 <w:webHidden/>
               </w:rPr>
-              <w:t>21</w:t>
+              <w:t>22</w:t>
             </w:r>
             <w:r>
               <w:rPr>
@@ -6028,7 +6028,7 @@
                 <w:noProof/>
                 <w:webHidden/>
               </w:rPr>
-              <w:t>21</w:t>
+              <w:t>22</w:t>
             </w:r>
             <w:r>
               <w:rPr>
@@ -6118,7 +6118,7 @@
                 <w:noProof/>
                 <w:webHidden/>
               </w:rPr>
-              <w:t>22</w:t>
+              <w:t>23</w:t>
             </w:r>
             <w:r>
               <w:rPr>
@@ -6208,7 +6208,7 @@
                 <w:noProof/>
                 <w:webHidden/>
               </w:rPr>
-              <w:t>22</w:t>
+              <w:t>23</w:t>
             </w:r>
             <w:r>
               <w:rPr>
@@ -6298,7 +6298,7 @@
                 <w:noProof/>
                 <w:webHidden/>
               </w:rPr>
-              <w:t>22</w:t>
+              <w:t>23</w:t>
             </w:r>
             <w:r>
               <w:rPr>
@@ -6388,7 +6388,7 @@
                 <w:noProof/>
                 <w:webHidden/>
               </w:rPr>
-              <w:t>22</w:t>
+              <w:t>23</w:t>
             </w:r>
             <w:r>
               <w:rPr>
@@ -6478,7 +6478,7 @@
                 <w:noProof/>
                 <w:webHidden/>
               </w:rPr>
-              <w:t>23</w:t>
+              <w:t>24</w:t>
             </w:r>
             <w:r>
               <w:rPr>
@@ -6568,7 +6568,7 @@
                 <w:noProof/>
                 <w:webHidden/>
               </w:rPr>
-              <w:t>23</w:t>
+              <w:t>24</w:t>
             </w:r>
             <w:r>
               <w:rPr>
@@ -6658,7 +6658,7 @@
                 <w:noProof/>
                 <w:webHidden/>
               </w:rPr>
-              <w:t>23</w:t>
+              <w:t>24</w:t>
             </w:r>
             <w:r>
               <w:rPr>
@@ -6748,7 +6748,7 @@
                 <w:noProof/>
                 <w:webHidden/>
               </w:rPr>
-              <w:t>23</w:t>
+              <w:t>24</w:t>
             </w:r>
             <w:r>
               <w:rPr>
@@ -6838,7 +6838,7 @@
                 <w:noProof/>
                 <w:webHidden/>
               </w:rPr>
-              <w:t>23</w:t>
+              <w:t>24</w:t>
             </w:r>
             <w:r>
               <w:rPr>
@@ -6928,7 +6928,7 @@
                 <w:noProof/>
                 <w:webHidden/>
               </w:rPr>
-              <w:t>24</w:t>
+              <w:t>25</w:t>
             </w:r>
             <w:r>
               <w:rPr>
@@ -7018,7 +7018,7 @@
                 <w:noProof/>
                 <w:webHidden/>
               </w:rPr>
-              <w:t>24</w:t>
+              <w:t>25</w:t>
             </w:r>
             <w:r>
               <w:rPr>
@@ -7108,7 +7108,7 @@
                 <w:noProof/>
                 <w:webHidden/>
               </w:rPr>
-              <w:t>25</w:t>
+              <w:t>26</w:t>
             </w:r>
             <w:r>
               <w:rPr>
@@ -7198,7 +7198,7 @@
                 <w:noProof/>
                 <w:webHidden/>
               </w:rPr>
-              <w:t>25</w:t>
+              <w:t>26</w:t>
             </w:r>
             <w:r>
               <w:rPr>
@@ -7288,7 +7288,7 @@
                 <w:noProof/>
                 <w:webHidden/>
               </w:rPr>
-              <w:t>25</w:t>
+              <w:t>26</w:t>
             </w:r>
             <w:r>
               <w:rPr>
@@ -7378,7 +7378,7 @@
                 <w:noProof/>
                 <w:webHidden/>
               </w:rPr>
-              <w:t>26</w:t>
+              <w:t>27</w:t>
             </w:r>
             <w:r>
               <w:rPr>
@@ -7468,7 +7468,7 @@
                 <w:noProof/>
                 <w:webHidden/>
               </w:rPr>
-              <w:t>26</w:t>
+              <w:t>27</w:t>
             </w:r>
             <w:r>
               <w:rPr>
@@ -7558,7 +7558,7 @@
                 <w:noProof/>
                 <w:webHidden/>
               </w:rPr>
-              <w:t>27</w:t>
+              <w:t>28</w:t>
             </w:r>
             <w:r>
               <w:rPr>
@@ -7648,7 +7648,7 @@
                 <w:noProof/>
                 <w:webHidden/>
               </w:rPr>
-              <w:t>28</w:t>
+              <w:t>29</w:t>
             </w:r>
             <w:r>
               <w:rPr>
@@ -7738,7 +7738,7 @@
                 <w:noProof/>
                 <w:webHidden/>
               </w:rPr>
-              <w:t>28</w:t>
+              <w:t>29</w:t>
             </w:r>
             <w:r>
               <w:rPr>
@@ -7828,7 +7828,7 @@
                 <w:noProof/>
                 <w:webHidden/>
               </w:rPr>
-              <w:t>29</w:t>
+              <w:t>30</w:t>
             </w:r>
             <w:r>
               <w:rPr>
@@ -7918,7 +7918,7 @@
                 <w:noProof/>
                 <w:webHidden/>
               </w:rPr>
-              <w:t>29</w:t>
+              <w:t>30</w:t>
             </w:r>
             <w:r>
               <w:rPr>
@@ -8008,7 +8008,7 @@
                 <w:noProof/>
                 <w:webHidden/>
               </w:rPr>
-              <w:t>29</w:t>
+              <w:t>30</w:t>
             </w:r>
             <w:r>
               <w:rPr>
@@ -8098,7 +8098,7 @@
                 <w:noProof/>
                 <w:webHidden/>
               </w:rPr>
-              <w:t>29</w:t>
+              <w:t>30</w:t>
             </w:r>
             <w:r>
               <w:rPr>
@@ -8188,7 +8188,7 @@
                 <w:noProof/>
                 <w:webHidden/>
               </w:rPr>
-              <w:t>30</w:t>
+              <w:t>31</w:t>
             </w:r>
             <w:r>
               <w:rPr>
@@ -8282,7 +8282,7 @@
                 <w:noProof/>
                 <w:webHidden/>
               </w:rPr>
-              <w:t>30</w:t>
+              <w:t>31</w:t>
             </w:r>
             <w:r>
               <w:rPr>
@@ -8372,7 +8372,7 @@
                 <w:noProof/>
                 <w:webHidden/>
               </w:rPr>
-              <w:t>30</w:t>
+              <w:t>31</w:t>
             </w:r>
             <w:r>
               <w:rPr>
@@ -8462,7 +8462,7 @@
                 <w:noProof/>
                 <w:webHidden/>
               </w:rPr>
-              <w:t>30</w:t>
+              <w:t>31</w:t>
             </w:r>
             <w:r>
               <w:rPr>
@@ -8552,7 +8552,7 @@
                 <w:noProof/>
                 <w:webHidden/>
               </w:rPr>
-              <w:t>31</w:t>
+              <w:t>32</w:t>
             </w:r>
             <w:r>
               <w:rPr>
@@ -8642,7 +8642,7 @@
                 <w:noProof/>
                 <w:webHidden/>
               </w:rPr>
-              <w:t>31</w:t>
+              <w:t>32</w:t>
             </w:r>
             <w:r>
               <w:rPr>
@@ -8732,7 +8732,7 @@
                 <w:noProof/>
                 <w:webHidden/>
               </w:rPr>
-              <w:t>31</w:t>
+              <w:t>32</w:t>
             </w:r>
             <w:r>
               <w:rPr>
@@ -8822,7 +8822,7 @@
                 <w:noProof/>
                 <w:webHidden/>
               </w:rPr>
-              <w:t>31</w:t>
+              <w:t>32</w:t>
             </w:r>
             <w:r>
               <w:rPr>
@@ -8912,7 +8912,7 @@
                 <w:noProof/>
                 <w:webHidden/>
               </w:rPr>
-              <w:t>32</w:t>
+              <w:t>33</w:t>
             </w:r>
             <w:r>
               <w:rPr>
@@ -9002,7 +9002,7 @@
                 <w:noProof/>
                 <w:webHidden/>
               </w:rPr>
-              <w:t>32</w:t>
+              <w:t>33</w:t>
             </w:r>
             <w:r>
               <w:rPr>
@@ -9092,7 +9092,7 @@
                 <w:noProof/>
                 <w:webHidden/>
               </w:rPr>
-              <w:t>32</w:t>
+              <w:t>33</w:t>
             </w:r>
             <w:r>
               <w:rPr>
@@ -9182,7 +9182,7 @@
                 <w:noProof/>
                 <w:webHidden/>
               </w:rPr>
-              <w:t>32</w:t>
+              <w:t>33</w:t>
             </w:r>
             <w:r>
               <w:rPr>
@@ -9272,7 +9272,7 @@
                 <w:noProof/>
                 <w:webHidden/>
               </w:rPr>
-              <w:t>32</w:t>
+              <w:t>33</w:t>
             </w:r>
             <w:r>
               <w:rPr>
@@ -9362,7 +9362,7 @@
                 <w:noProof/>
                 <w:webHidden/>
               </w:rPr>
-              <w:t>33</w:t>
+              <w:t>34</w:t>
             </w:r>
             <w:r>
               <w:rPr>
@@ -9452,7 +9452,7 @@
                 <w:noProof/>
                 <w:webHidden/>
               </w:rPr>
-              <w:t>33</w:t>
+              <w:t>34</w:t>
             </w:r>
             <w:r>
               <w:rPr>
@@ -9542,7 +9542,7 @@
                 <w:noProof/>
                 <w:webHidden/>
               </w:rPr>
-              <w:t>33</w:t>
+              <w:t>34</w:t>
             </w:r>
             <w:r>
               <w:rPr>
@@ -9632,7 +9632,7 @@
                 <w:noProof/>
                 <w:webHidden/>
               </w:rPr>
-              <w:t>34</w:t>
+              <w:t>35</w:t>
             </w:r>
             <w:r>
               <w:rPr>
@@ -9722,7 +9722,7 @@
                 <w:noProof/>
                 <w:webHidden/>
               </w:rPr>
-              <w:t>34</w:t>
+              <w:t>35</w:t>
             </w:r>
             <w:r>
               <w:rPr>
@@ -9812,7 +9812,7 @@
                 <w:noProof/>
                 <w:webHidden/>
               </w:rPr>
-              <w:t>34</w:t>
+              <w:t>35</w:t>
             </w:r>
             <w:r>
               <w:rPr>
@@ -9901,7 +9901,7 @@
                 <w:noProof/>
                 <w:webHidden/>
               </w:rPr>
-              <w:t>35</w:t>
+              <w:t>36</w:t>
             </w:r>
             <w:r>
               <w:rPr>
@@ -9991,7 +9991,7 @@
                 <w:noProof/>
                 <w:webHidden/>
               </w:rPr>
-              <w:t>36</w:t>
+              <w:t>37</w:t>
             </w:r>
             <w:r>
               <w:rPr>
@@ -10081,7 +10081,7 @@
                 <w:noProof/>
                 <w:webHidden/>
               </w:rPr>
-              <w:t>36</w:t>
+              <w:t>37</w:t>
             </w:r>
             <w:r>
               <w:rPr>
@@ -10171,7 +10171,7 @@
                 <w:noProof/>
                 <w:webHidden/>
               </w:rPr>
-              <w:t>36</w:t>
+              <w:t>37</w:t>
             </w:r>
             <w:r>
               <w:rPr>
@@ -10261,7 +10261,7 @@
                 <w:noProof/>
                 <w:webHidden/>
               </w:rPr>
-              <w:t>37</w:t>
+              <w:t>38</w:t>
             </w:r>
             <w:r>
               <w:rPr>
@@ -10351,7 +10351,7 @@
                 <w:noProof/>
                 <w:webHidden/>
               </w:rPr>
-              <w:t>37</w:t>
+              <w:t>38</w:t>
             </w:r>
             <w:r>
               <w:rPr>
@@ -10441,7 +10441,7 @@
                 <w:noProof/>
                 <w:webHidden/>
               </w:rPr>
-              <w:t>38</w:t>
+              <w:t>39</w:t>
             </w:r>
             <w:r>
               <w:rPr>
@@ -10531,7 +10531,7 @@
                 <w:noProof/>
                 <w:webHidden/>
               </w:rPr>
-              <w:t>45</w:t>
+              <w:t>46</w:t>
             </w:r>
             <w:r>
               <w:rPr>
@@ -10621,7 +10621,7 @@
                 <w:noProof/>
                 <w:webHidden/>
               </w:rPr>
-              <w:t>49</w:t>
+              <w:t>50</w:t>
             </w:r>
             <w:r>
               <w:rPr>
@@ -10711,7 +10711,7 @@
                 <w:noProof/>
                 <w:webHidden/>
               </w:rPr>
-              <w:t>50</w:t>
+              <w:t>51</w:t>
             </w:r>
             <w:r>
               <w:rPr>
@@ -10801,7 +10801,7 @@
                 <w:noProof/>
                 <w:webHidden/>
               </w:rPr>
-              <w:t>51</w:t>
+              <w:t>52</w:t>
             </w:r>
             <w:r>
               <w:rPr>
@@ -10924,7 +10924,7 @@
                 <w:noProof/>
                 <w:webHidden/>
               </w:rPr>
-              <w:t>51</w:t>
+              <w:t>52</w:t>
             </w:r>
             <w:r>
               <w:rPr>
@@ -11014,7 +11014,7 @@
                 <w:noProof/>
                 <w:webHidden/>
               </w:rPr>
-              <w:t>51</w:t>
+              <w:t>52</w:t>
             </w:r>
             <w:r>
               <w:rPr>
@@ -11104,7 +11104,7 @@
                 <w:noProof/>
                 <w:webHidden/>
               </w:rPr>
-              <w:t>52</w:t>
+              <w:t>53</w:t>
             </w:r>
             <w:r>
               <w:rPr>
@@ -11194,7 +11194,7 @@
                 <w:noProof/>
                 <w:webHidden/>
               </w:rPr>
-              <w:t>52</w:t>
+              <w:t>53</w:t>
             </w:r>
             <w:r>
               <w:rPr>
@@ -11284,7 +11284,7 @@
                 <w:noProof/>
                 <w:webHidden/>
               </w:rPr>
-              <w:t>53</w:t>
+              <w:t>54</w:t>
             </w:r>
             <w:r>
               <w:rPr>
@@ -11374,7 +11374,7 @@
                 <w:noProof/>
                 <w:webHidden/>
               </w:rPr>
-              <w:t>53</w:t>
+              <w:t>54</w:t>
             </w:r>
             <w:r>
               <w:rPr>
@@ -11464,7 +11464,7 @@
                 <w:noProof/>
                 <w:webHidden/>
               </w:rPr>
-              <w:t>53</w:t>
+              <w:t>54</w:t>
             </w:r>
             <w:r>
               <w:rPr>
@@ -11554,7 +11554,7 @@
                 <w:noProof/>
                 <w:webHidden/>
               </w:rPr>
-              <w:t>54</w:t>
+              <w:t>55</w:t>
             </w:r>
             <w:r>
               <w:rPr>
@@ -11644,7 +11644,7 @@
                 <w:noProof/>
                 <w:webHidden/>
               </w:rPr>
-              <w:t>54</w:t>
+              <w:t>55</w:t>
             </w:r>
             <w:r>
               <w:rPr>
@@ -11734,7 +11734,7 @@
                 <w:noProof/>
                 <w:webHidden/>
               </w:rPr>
-              <w:t>54</w:t>
+              <w:t>55</w:t>
             </w:r>
             <w:r>
               <w:rPr>
@@ -11824,7 +11824,7 @@
                 <w:noProof/>
                 <w:webHidden/>
               </w:rPr>
-              <w:t>55</w:t>
+              <w:t>56</w:t>
             </w:r>
             <w:r>
               <w:rPr>
@@ -11914,7 +11914,7 @@
                 <w:noProof/>
                 <w:webHidden/>
               </w:rPr>
-              <w:t>56</w:t>
+              <w:t>57</w:t>
             </w:r>
             <w:r>
               <w:rPr>
@@ -12004,7 +12004,7 @@
                 <w:noProof/>
                 <w:webHidden/>
               </w:rPr>
-              <w:t>56</w:t>
+              <w:t>57</w:t>
             </w:r>
             <w:r>
               <w:rPr>
@@ -12094,7 +12094,7 @@
                 <w:noProof/>
                 <w:webHidden/>
               </w:rPr>
-              <w:t>57</w:t>
+              <w:t>58</w:t>
             </w:r>
             <w:r>
               <w:rPr>

</xml_diff>

<commit_message>
Datasheet: TOC page numbers after the AT+TL_OFFSET section grew
</commit_message>
<xml_diff>
--- a/word/datasheet_adsbee_1090.docx
+++ b/word/datasheet_adsbee_1090.docx
@@ -8912,7 +8912,7 @@
                 <w:noProof/>
                 <w:webHidden/>
               </w:rPr>
-              <w:t>33</w:t>
+              <w:t>34</w:t>
             </w:r>
             <w:r>
               <w:rPr>
@@ -9002,7 +9002,7 @@
                 <w:noProof/>
                 <w:webHidden/>
               </w:rPr>
-              <w:t>33</w:t>
+              <w:t>34</w:t>
             </w:r>
             <w:r>
               <w:rPr>
@@ -9092,7 +9092,7 @@
                 <w:noProof/>
                 <w:webHidden/>
               </w:rPr>
-              <w:t>33</w:t>
+              <w:t>34</w:t>
             </w:r>
             <w:r>
               <w:rPr>
@@ -9182,7 +9182,7 @@
                 <w:noProof/>
                 <w:webHidden/>
               </w:rPr>
-              <w:t>33</w:t>
+              <w:t>34</w:t>
             </w:r>
             <w:r>
               <w:rPr>
@@ -9272,7 +9272,7 @@
                 <w:noProof/>
                 <w:webHidden/>
               </w:rPr>
-              <w:t>33</w:t>
+              <w:t>34</w:t>
             </w:r>
             <w:r>
               <w:rPr>
@@ -9362,7 +9362,7 @@
                 <w:noProof/>
                 <w:webHidden/>
               </w:rPr>
-              <w:t>34</w:t>
+              <w:t>35</w:t>
             </w:r>
             <w:r>
               <w:rPr>
@@ -9452,7 +9452,7 @@
                 <w:noProof/>
                 <w:webHidden/>
               </w:rPr>
-              <w:t>34</w:t>
+              <w:t>35</w:t>
             </w:r>
             <w:r>
               <w:rPr>
@@ -9542,7 +9542,7 @@
                 <w:noProof/>
                 <w:webHidden/>
               </w:rPr>
-              <w:t>34</w:t>
+              <w:t>35</w:t>
             </w:r>
             <w:r>
               <w:rPr>
@@ -9632,7 +9632,7 @@
                 <w:noProof/>
                 <w:webHidden/>
               </w:rPr>
-              <w:t>35</w:t>
+              <w:t>36</w:t>
             </w:r>
             <w:r>
               <w:rPr>
@@ -9722,7 +9722,7 @@
                 <w:noProof/>
                 <w:webHidden/>
               </w:rPr>
-              <w:t>35</w:t>
+              <w:t>36</w:t>
             </w:r>
             <w:r>
               <w:rPr>
@@ -9812,7 +9812,7 @@
                 <w:noProof/>
                 <w:webHidden/>
               </w:rPr>
-              <w:t>35</w:t>
+              <w:t>36</w:t>
             </w:r>
             <w:r>
               <w:rPr>
@@ -9901,7 +9901,7 @@
                 <w:noProof/>
                 <w:webHidden/>
               </w:rPr>
-              <w:t>36</w:t>
+              <w:t>37</w:t>
             </w:r>
             <w:r>
               <w:rPr>
@@ -9991,7 +9991,7 @@
                 <w:noProof/>
                 <w:webHidden/>
               </w:rPr>
-              <w:t>37</w:t>
+              <w:t>38</w:t>
             </w:r>
             <w:r>
               <w:rPr>
@@ -10081,7 +10081,7 @@
                 <w:noProof/>
                 <w:webHidden/>
               </w:rPr>
-              <w:t>37</w:t>
+              <w:t>38</w:t>
             </w:r>
             <w:r>
               <w:rPr>
@@ -10171,7 +10171,7 @@
                 <w:noProof/>
                 <w:webHidden/>
               </w:rPr>
-              <w:t>37</w:t>
+              <w:t>38</w:t>
             </w:r>
             <w:r>
               <w:rPr>
@@ -10261,7 +10261,7 @@
                 <w:noProof/>
                 <w:webHidden/>
               </w:rPr>
-              <w:t>38</w:t>
+              <w:t>39</w:t>
             </w:r>
             <w:r>
               <w:rPr>
@@ -10351,7 +10351,7 @@
                 <w:noProof/>
                 <w:webHidden/>
               </w:rPr>
-              <w:t>38</w:t>
+              <w:t>39</w:t>
             </w:r>
             <w:r>
               <w:rPr>
@@ -10441,7 +10441,7 @@
                 <w:noProof/>
                 <w:webHidden/>
               </w:rPr>
-              <w:t>39</w:t>
+              <w:t>40</w:t>
             </w:r>
             <w:r>
               <w:rPr>
@@ -10531,7 +10531,7 @@
                 <w:noProof/>
                 <w:webHidden/>
               </w:rPr>
-              <w:t>46</w:t>
+              <w:t>47</w:t>
             </w:r>
             <w:r>
               <w:rPr>
@@ -10621,7 +10621,7 @@
                 <w:noProof/>
                 <w:webHidden/>
               </w:rPr>
-              <w:t>50</w:t>
+              <w:t>51</w:t>
             </w:r>
             <w:r>
               <w:rPr>
@@ -10711,7 +10711,7 @@
                 <w:noProof/>
                 <w:webHidden/>
               </w:rPr>
-              <w:t>51</w:t>
+              <w:t>52</w:t>
             </w:r>
             <w:r>
               <w:rPr>
@@ -10801,7 +10801,7 @@
                 <w:noProof/>
                 <w:webHidden/>
               </w:rPr>
-              <w:t>52</w:t>
+              <w:t>53</w:t>
             </w:r>
             <w:r>
               <w:rPr>
@@ -10924,7 +10924,7 @@
                 <w:noProof/>
                 <w:webHidden/>
               </w:rPr>
-              <w:t>52</w:t>
+              <w:t>53</w:t>
             </w:r>
             <w:r>
               <w:rPr>
@@ -11014,7 +11014,7 @@
                 <w:noProof/>
                 <w:webHidden/>
               </w:rPr>
-              <w:t>52</w:t>
+              <w:t>53</w:t>
             </w:r>
             <w:r>
               <w:rPr>
@@ -11104,7 +11104,7 @@
                 <w:noProof/>
                 <w:webHidden/>
               </w:rPr>
-              <w:t>53</w:t>
+              <w:t>54</w:t>
             </w:r>
             <w:r>
               <w:rPr>
@@ -11194,7 +11194,7 @@
                 <w:noProof/>
                 <w:webHidden/>
               </w:rPr>
-              <w:t>53</w:t>
+              <w:t>54</w:t>
             </w:r>
             <w:r>
               <w:rPr>
@@ -11284,7 +11284,7 @@
                 <w:noProof/>
                 <w:webHidden/>
               </w:rPr>
-              <w:t>54</w:t>
+              <w:t>55</w:t>
             </w:r>
             <w:r>
               <w:rPr>
@@ -11374,7 +11374,7 @@
                 <w:noProof/>
                 <w:webHidden/>
               </w:rPr>
-              <w:t>54</w:t>
+              <w:t>55</w:t>
             </w:r>
             <w:r>
               <w:rPr>
@@ -11464,7 +11464,7 @@
                 <w:noProof/>
                 <w:webHidden/>
               </w:rPr>
-              <w:t>54</w:t>
+              <w:t>55</w:t>
             </w:r>
             <w:r>
               <w:rPr>
@@ -11554,7 +11554,7 @@
                 <w:noProof/>
                 <w:webHidden/>
               </w:rPr>
-              <w:t>55</w:t>
+              <w:t>56</w:t>
             </w:r>
             <w:r>
               <w:rPr>
@@ -11644,7 +11644,7 @@
                 <w:noProof/>
                 <w:webHidden/>
               </w:rPr>
-              <w:t>55</w:t>
+              <w:t>56</w:t>
             </w:r>
             <w:r>
               <w:rPr>
@@ -11734,7 +11734,7 @@
                 <w:noProof/>
                 <w:webHidden/>
               </w:rPr>
-              <w:t>55</w:t>
+              <w:t>56</w:t>
             </w:r>
             <w:r>
               <w:rPr>
@@ -11824,7 +11824,7 @@
                 <w:noProof/>
                 <w:webHidden/>
               </w:rPr>
-              <w:t>56</w:t>
+              <w:t>57</w:t>
             </w:r>
             <w:r>
               <w:rPr>
@@ -11914,7 +11914,7 @@
                 <w:noProof/>
                 <w:webHidden/>
               </w:rPr>
-              <w:t>57</w:t>
+              <w:t>58</w:t>
             </w:r>
             <w:r>
               <w:rPr>
@@ -12004,7 +12004,7 @@
                 <w:noProof/>
                 <w:webHidden/>
               </w:rPr>
-              <w:t>57</w:t>
+              <w:t>58</w:t>
             </w:r>
             <w:r>
               <w:rPr>
@@ -12094,7 +12094,7 @@
                 <w:noProof/>
                 <w:webHidden/>
               </w:rPr>
-              <w:t>58</w:t>
+              <w:t>59</w:t>
             </w:r>
             <w:r>
               <w:rPr>

</xml_diff>

<commit_message>
Datasheets: Aircraft JSON type and hex rows after #345 (m1421, 1090)
The type row listed the 0.3.11-rc6 Mode S types (adsr_icao as non-transponder,
adsb_icao_nt as Class B ground vehicle). Since #345 DF18 targets report
adsb_icao_nt, adsb_other, tisb_icao, tisb_trackfile, tisb_other, adsr_icao and
adsr_other, Mode S aircraft without ADS-B report mode_s, and UAT ADS-R reports
adsr_other. The hex row now says every non-ICAO address (adsb_other,
tisb_trackfile, tisb_other, adsr_other) gets the ~ prefix, not only UAT ones.

Revision history: the newest revisions (m1421 20261017, 1090 20261019) are not
in the latest stable tags (adsbee_1421-0.3.10, adsbee_1090-0.9.0), so they are
renamed to 20261022 with one added entry; footers updated. A local microslop
export (LibreOffice 26.8.1.1, same as CI) puts every TOC heading on the same
page as before; the 1090 grows by one page at its last section.
</commit_message>
<xml_diff>
--- a/word/datasheet_adsbee_1090.docx
+++ b/word/datasheet_adsbee_1090.docx
@@ -12289,7 +12289,7 @@
     </w:p>
     <w:p>
       <w:r>
-        <w:t>20261019</w:t>
+        <w:t>20261022</w:t>
       </w:r>
     </w:p>
     <w:p>
@@ -12470,6 +12470,18 @@
       </w:pPr>
       <w:r>
         <w:t>Fixed AT+TL_OFFSET=LEARN: it compares each candidate offset side by side with the best one, and AT+TL_OFFSET? shows its progress. Corrected the default trigger level offset (600 mV) and its range (0-2000 mV).</w:t>
+      </w:r>
+    </w:p>
+    <w:p>
+      <w:pPr>
+        <w:pStyle w:val="ListParagraph"/>
+        <w:numPr>
+          <w:ilvl w:val="0"/>
+          <w:numId w:val="10"/>
+        </w:numPr>
+      </w:pPr>
+      <w:r>
+        <w:t>Corrected the Aircraft JSON type and hex fields for DF18 (TIS-B, ADS-R) and non-ICAO targets.</w:t>
       </w:r>
     </w:p>
     <w:p>
@@ -42927,7 +42939,7 @@
           </w:tcPr>
           <w:p>
             <w:r>
-              <w:t>6-digit ICAO 24-bit address in lowercase hex. UAT non-ICAO addresses (self-assigned or TIS-B track file) are prefixed with ~.</w:t>
+              <w:t>6-digit ICAO 24-bit address in lowercase hex. Non-ICAO addresses (adsb_other, tisb_trackfile, tisb_other, adsr_other) are prefixed with ~.</w:t>
             </w:r>
           </w:p>
         </w:tc>
@@ -43050,7 +43062,7 @@
           </w:tcPr>
           <w:p>
             <w:r>
-              <w:t>Aircraft type. Mode S: adsb_icao, adsr_icao (non-transponder), adsb_icao_nt (Class B ground vehicle). UAT: adsb_icao, adsb_other, tisb_icao, tisb_trackfile.</w:t>
+              <w:t>Aircraft type. Mode S: adsb_icao (DF17), adsb_icao_nt (DF18 non-transponder), adsb_other (DF18 anonymous address), tisb_icao, tisb_trackfile, tisb_other (TIS-B), adsr_icao, adsr_other (ADS-R), mode_s (no ADS-B). UAT: adsb_icao, adsb_other, tisb_icao, tisb_trackfile, adsr_other.</w:t>
             </w:r>
           </w:p>
         </w:tc>
@@ -46856,7 +46868,7 @@
       <w:rPr>
         <w:color w:val="FFFFFF" w:themeColor="background1"/>
       </w:rPr>
-      <w:t>20261019</w:t>
+      <w:t>20261022</w:t>
     </w:r>
     <w:r>
       <w:rPr>

</xml_diff>

<commit_message>
Datasheets (1090, m1421): on_ground follows ADS-B; Mode S replies only when ADS-B is quiet (20261023)
</commit_message>
<xml_diff>
--- a/word/datasheet_adsbee_1090.docx
+++ b/word/datasheet_adsbee_1090.docx
@@ -12289,7 +12289,7 @@
     </w:p>
     <w:p>
       <w:r>
-        <w:t>20261022</w:t>
+        <w:t>20261023</w:t>
       </w:r>
     </w:p>
     <w:p>
@@ -12482,6 +12482,18 @@
       </w:pPr>
       <w:r>
         <w:t>Corrected the Aircraft JSON type and hex fields for DF18 (TIS-B, ADS-R) and non-ICAO targets.</w:t>
+      </w:r>
+    </w:p>
+    <w:p>
+      <w:pPr>
+        <w:pStyle w:val="ListParagraph"/>
+        <w:numPr>
+          <w:ilvl w:val="0"/>
+          <w:numId w:val="10"/>
+        </w:numPr>
+      </w:pPr>
+      <w:r>
+        <w:t>Aircraft JSON on_ground, ASTERIX ground bit and GDL90 airborne flag: ADS-B position and velocity messages decide; Mode S replies only when no ADS-B one has arrived for 30 s, and never on the ground above 18,000 ft.</w:t>
       </w:r>
     </w:p>
     <w:p>
@@ -46639,7 +46651,7 @@
           </w:tcPr>
           <w:p>
             <w:r>
-              <w:t>Present (value 1) when aircraft is on the ground. For UAT, also set for surface vehicles.</w:t>
+              <w:t>Present (value 1) when aircraft is on the ground. For UAT, also set for surface vehicles. For 1090 MHz, ADS-B position and velocity messages decide; a Mode S reply (flight status, vertical status or all-call capability) decides only when no ADS-B one has arrived for 30 s, and never reports on the ground above 18,000 ft.</w:t>
             </w:r>
           </w:p>
         </w:tc>
@@ -46868,7 +46880,7 @@
       <w:rPr>
         <w:color w:val="FFFFFF" w:themeColor="background1"/>
       </w:rPr>
-      <w:t>20261022</w:t>
+      <w:t>20261023</w:t>
     </w:r>
     <w:r>
       <w:rPr>

</xml_diff>

<commit_message>
Datasheets: sensitivity at the measured 90 % decode points
Bench measurement t-0802 (uncalibrated, about ±2.5 dB absolute), quoted as the 90 % point:
- ADSBee 1090U (and GS3M PoE, the 1090U in an enclosure): Mode S -83dBm to 0dBm, UAT -94dBm to 0dBm.
- m1090 with an external LNA: the 1090U's -83dBm to 0dBm (about -70dBm without an LNA, unchanged).
- ADSBee m1421: Mode S -89dBm to 0dBm, UAT -94dBm to 0dBm (datasheet and docs/adsbee-1421/m1421.md).

Each Sensitivity row says '90% of messages decoded'. The unreleased sensitivity revision entry (PR #344)
is rewritten in place under 20261023, and every footer's Document Version is 20261023 (the GS3M and m1090
eval board default footers still said 20250901).
</commit_message>
<xml_diff>
--- a/word/datasheet_adsbee_1090.docx
+++ b/word/datasheet_adsbee_1090.docx
@@ -460,7 +460,7 @@
           </w:tcPr>
           <w:p>
             <w:r>
-              <w:t>Sensitivity</w:t>
+              <w:t xml:space="preserve">Sensitivity (90% of messages decoded)</w:t>
             </w:r>
           </w:p>
         </w:tc>
@@ -470,17 +470,17 @@
           </w:tcPr>
           <w:p>
             <w:r>
-              <w:t>Mode S: -90dBm to 0dBm</w:t>
-            </w:r>
-          </w:p>
-          <w:p>
-            <w:r>
-              <w:t>UAT (1090U): -90dBm to 0dBm</w:t>
-            </w:r>
-          </w:p>
-          <w:p>
-            <w:r>
-              <w:t>m1090 Mode S: about -70dBm (no LNA), -90dBm to 0dBm with an external LNA</w:t>
+              <w:t xml:space="preserve">Mode S: -83dBm to 0dBm</w:t>
+            </w:r>
+          </w:p>
+          <w:p>
+            <w:r>
+              <w:t xml:space="preserve">UAT (1090U): -94dBm to 0dBm</w:t>
+            </w:r>
+          </w:p>
+          <w:p>
+            <w:r>
+              <w:t xml:space="preserve">m1090 Mode S: about -70dBm (no LNA), -83dBm to 0dBm with an external LNA</w:t>
             </w:r>
           </w:p>
         </w:tc>
@@ -12289,7 +12289,7 @@
     </w:p>
     <w:p>
       <w:r>
-        <w:t>20261022</w:t>
+        <w:t xml:space="preserve">20261023</w:t>
       </w:r>
     </w:p>
     <w:p>
@@ -12445,7 +12445,7 @@
         </w:numPr>
       </w:pPr>
       <w:r>
-        <w:t>Sensitivity is -90dBm to 0dBm for Mode S on all models and for UAT on the 1090U. The m1090 has no first-stage LNA: about -70dBm, or -90dBm to 0dBm with an external LNA.</w:t>
+        <w:t xml:space="preserve">Sensitivity (90% of messages decoded) is -83dBm to 0dBm for Mode S and -94dBm to 0dBm for UAT on the 1090U. The m1090 has no first-stage LNA: about -70dBm, or -83dBm to 0dBm with an external LNA.</w:t>
       </w:r>
     </w:p>
     <w:p>
@@ -46868,7 +46868,7 @@
       <w:rPr>
         <w:color w:val="FFFFFF" w:themeColor="background1"/>
       </w:rPr>
-      <w:t>20261022</w:t>
+      <w:t>20261023</w:t>
     </w:r>
     <w:r>
       <w:rPr>

</xml_diff>

<commit_message>
On ground: unknown until a message says so; web UI clears on_ground once a report leaves it out
A new aircraft started with the airborne flag cleared, so its first JSON report said on_ground:1 until an
airborne ADS-B message arrived. The web UI merged each report into the previous one, and the firmware sends
on_ground only while true, so that first 1 stayed on screen for an aircraft in cruise.

- ModeSAircraft::IsOnGround(): false until an ADS-B message or Mode S reply gives air/ground. JSON on_ground,
  ASTERIX GBS and the GDL90 airborne flag use it.
- Web UI and adsbee_1090_console: on_ground, alert, spi and emergency are cleared when a report leaves them out.
- Host test for a new aircraft in every output; web test for the store; datasheets.
</commit_message>
<xml_diff>
--- a/word/datasheet_adsbee_1090.docx
+++ b/word/datasheet_adsbee_1090.docx
@@ -12493,7 +12493,7 @@
         </w:numPr>
       </w:pPr>
       <w:r>
-        <w:t>Aircraft JSON on_ground, ASTERIX ground bit and GDL90 airborne flag: ADS-B position and velocity messages decide; Mode S replies only when no ADS-B one has arrived for 30 s, and never on the ground above 18,000 ft.</w:t>
+        <w:t>Aircraft JSON on_ground, ASTERIX ground bit and GDL90 airborne flag: ADS-B position and velocity messages decide; Mode S replies only when no ADS-B one has arrived for 30 s, and never on the ground above 18,000 ft. A new aircraft is not reported on the ground before a message gives air/ground.</w:t>
       </w:r>
     </w:p>
     <w:p>
@@ -46651,7 +46651,7 @@
           </w:tcPr>
           <w:p>
             <w:r>
-              <w:t>Present (value 1) when aircraft is on the ground. For UAT, also set for surface vehicles. 1090 MHz: from ADS-B; from Mode S replies only after 30 s without ADS-B, and never above 18,000 ft.</w:t>
+              <w:t>Present (value 1) when aircraft is on the ground. For UAT, also set for surface vehicles. 1090 MHz: from ADS-B; from Mode S replies only after 30 s without ADS-B, never above 18,000 ft; absent until known.</w:t>
             </w:r>
           </w:p>
         </w:tc>

</xml_diff>

<commit_message>
Datasheets: on_ground row kept on one page, condition 'If on ground'
</commit_message>
<xml_diff>
--- a/word/datasheet_adsbee_1090.docx
+++ b/word/datasheet_adsbee_1090.docx
@@ -46534,6 +46534,9 @@
         </w:tc>
       </w:tr>
       <w:tr>
+        <w:trPr>
+          <w:cantSplit/>
+        </w:trPr>
         <w:tc>
           <w:tcPr>
             <w:tcW w:w="1458" w:type="dxa"/>
@@ -46578,7 +46581,7 @@
           </w:tcPr>
           <w:p>
             <w:r>
-              <w:t>If NOT airborne</w:t>
+              <w:t>If on ground</w:t>
             </w:r>
           </w:p>
         </w:tc>

</xml_diff>

<commit_message>
1090 and GS3M datasheets: Mode S -84dBm with AT+TL_OFFSET=500 (reduced trigger level), default -83dBm unchanged
</commit_message>
<xml_diff>
--- a/word/datasheet_adsbee_1090.docx
+++ b/word/datasheet_adsbee_1090.docx
@@ -470,7 +470,7 @@
           </w:tcPr>
           <w:p>
             <w:r>
-              <w:t xml:space="preserve">Mode S: -83dBm to 0dBm</w:t>
+              <w:t xml:space="preserve">Mode S: -83dBm to 0dBm (-84dBm with AT+TL_OFFSET=500)</w:t>
             </w:r>
           </w:p>
           <w:p>
@@ -12445,7 +12445,7 @@
         </w:numPr>
       </w:pPr>
       <w:r>
-        <w:t xml:space="preserve">Sensitivity (90% of messages decoded) is -83dBm to 0dBm for Mode S and -94dBm to 0dBm for UAT on the 1090U. The m1090 has no first-stage LNA: about -70dBm, or -83dBm to 0dBm with an external LNA.</w:t>
+        <w:t xml:space="preserve">Sensitivity (90% of messages decoded) is -83dBm to 0dBm for Mode S and -94dBm to 0dBm for UAT on the 1090U, and -84dBm for Mode S with AT+TL_OFFSET=500. The m1090 has no first-stage LNA: about -70dBm, or -83dBm to 0dBm with an external LNA.</w:t>
       </w:r>
     </w:p>
     <w:p>
@@ -21881,7 +21881,7 @@
     </w:p>
     <w:p>
       <w:r>
-        <w:t>A higher trigger level makes the receiver less sensitive, while a lower trigger level makes the receiver more sensitive (and thus more likely to be triggered by unwanted noise).</w:t>
+        <w:t>A higher trigger level makes the receiver less sensitive, while a lower trigger level makes the receiver more sensitive (and thus more likely to be triggered by unwanted noise). On the 1090U, Mode S sensitivity (90% of messages decoded) is -83dBm at the default 600 mV and -84dBm at 500 mV.</w:t>
       </w:r>
     </w:p>
     <w:p>

</xml_diff>

<commit_message>
1090U Mode S sensitivity -84dBm to 0dBm (admin decision): 1090, GS3M PoE and m1090 eval board (external LNA) datasheets
</commit_message>
<xml_diff>
--- a/word/datasheet_adsbee_1090.docx
+++ b/word/datasheet_adsbee_1090.docx
@@ -470,7 +470,7 @@
           </w:tcPr>
           <w:p>
             <w:r>
-              <w:t xml:space="preserve">Mode S: -83dBm to 0dBm (-84dBm with AT+TL_OFFSET=500)</w:t>
+              <w:t xml:space="preserve">Mode S: -84dBm to 0dBm</w:t>
             </w:r>
           </w:p>
           <w:p>
@@ -480,7 +480,7 @@
           </w:p>
           <w:p>
             <w:r>
-              <w:t xml:space="preserve">m1090 Mode S: about -70dBm (no LNA), -83dBm to 0dBm with an external LNA</w:t>
+              <w:t xml:space="preserve">m1090 Mode S: about -70dBm (no LNA), -84dBm to 0dBm with an external LNA</w:t>
             </w:r>
           </w:p>
         </w:tc>
@@ -12445,7 +12445,7 @@
         </w:numPr>
       </w:pPr>
       <w:r>
-        <w:t xml:space="preserve">Sensitivity (90% of messages decoded) is -83dBm to 0dBm for Mode S and -94dBm to 0dBm for UAT on the 1090U, and -84dBm for Mode S with AT+TL_OFFSET=500. The m1090 has no first-stage LNA: about -70dBm, or -83dBm to 0dBm with an external LNA.</w:t>
+        <w:t xml:space="preserve">Sensitivity (90% of messages decoded) is -84dBm to 0dBm for Mode S and -94dBm to 0dBm for UAT on the 1090U. The m1090 has no first-stage LNA: about -70dBm, or -84dBm to 0dBm with an external LNA.</w:t>
       </w:r>
     </w:p>
     <w:p>
@@ -21881,7 +21881,7 @@
     </w:p>
     <w:p>
       <w:r>
-        <w:t>A higher trigger level makes the receiver less sensitive, while a lower trigger level makes the receiver more sensitive (and thus more likely to be triggered by unwanted noise). On the 1090U, Mode S sensitivity (90% of messages decoded) is -83dBm at the default 600 mV and -84dBm at 500 mV.</w:t>
+        <w:t>A higher trigger level makes the receiver less sensitive, while a lower trigger level makes the receiver more sensitive (and thus more likely to be triggered by unwanted noise).</w:t>
       </w:r>
     </w:p>
     <w:p>

</xml_diff>

<commit_message>
Datasheets, docs: 400 aircraft over USB/UART, 200 over WiFi/Ethernet (20261024); release test for a full dictionary
- 1090 datasheet: Quick Specs row per output path, AT+DEVICE_INFO RAM and dictionary lines; revision 20261023 renamed 20261024.
- GS3M PoE: its outputs go over Ethernet, so 200.
- RELEASE_TESTING item 18: fill to 400 with bench ICAOs, evictions, warning limit, RAM margin.
</commit_message>
<xml_diff>
--- a/word/datasheet_adsbee_1090.docx
+++ b/word/datasheet_adsbee_1090.docx
@@ -505,13 +505,15 @@
               <w:rPr>
                 <w:rFonts w:cstheme="minorHAnsi"/>
               </w:rPr>
-              <w:t>≤</w:t>
-            </w:r>
+              <w:t>USB, UART: ≤400</w:t>
+            </w:r>
+          </w:p>
+          <w:p>
             <w:r>
               <w:rPr>
                 <w:rFonts w:cstheme="minorHAnsi"/>
               </w:rPr>
-              <w:t>200</w:t>
+              <w:t xml:space="preserve">WiFi, Ethernet: ≤200</w:t>
             </w:r>
           </w:p>
         </w:tc>
@@ -12289,7 +12291,7 @@
     </w:p>
     <w:p>
       <w:r>
-        <w:t>20261023</w:t>
+        <w:t>20261024</w:t>
       </w:r>
     </w:p>
     <w:p>
@@ -12494,6 +12496,18 @@
       </w:pPr>
       <w:r>
         <w:t>Aircraft JSON on_ground, ASTERIX ground bit and GDL90 airborne flag: ADS-B position and velocity messages decide; Mode S replies only when no ADS-B one has arrived for 30 s, and never on the ground above 18,000 ft. A new aircraft is not reported on the ground before a message gives air/ground.</w:t>
+      </w:r>
+    </w:p>
+    <w:p>
+      <w:pPr>
+        <w:pStyle w:val="ListParagraph"/>
+        <w:numPr>
+          <w:ilvl w:val="0"/>
+          <w:numId w:val="10"/>
+        </w:numPr>
+      </w:pPr>
+      <w:r>
+        <w:t xml:space="preserve">Simultaneous aircraft tracks: up to 400 on the USB and UART outputs, 200 over WiFi and Ethernet (web UI, feeds, MQTT). AT+DEVICE_INFO shows RP2040 RAM use and the dictionary size.</w:t>
       </w:r>
     </w:p>
     <w:p>
@@ -15273,6 +15287,32 @@
               <w:rPr>
                 <w:rFonts w:ascii="Courier New" w:hAnsi="Courier New" w:cs="Courier New"/>
               </w:rPr>
+              <w:t xml:space="preserve">RP2040 RAM: 6156 B heap, 12100 B free, stack peak 5872 B core 0, 936 B core 1</w:t>
+            </w:r>
+          </w:p>
+          <w:p>
+            <w:pPr>
+              <w:rPr>
+                <w:rFonts w:ascii="Courier New" w:hAnsi="Courier New" w:cs="Courier New"/>
+              </w:rPr>
+            </w:pPr>
+            <w:r>
+              <w:rPr>
+                <w:rFonts w:ascii="Courier New" w:hAnsi="Courier New" w:cs="Courier New"/>
+              </w:rPr>
+              <w:t xml:space="preserve">RP2040 Aircraft Dictionary: 400 aircraft max</w:t>
+            </w:r>
+          </w:p>
+          <w:p>
+            <w:pPr>
+              <w:rPr>
+                <w:rFonts w:ascii="Courier New" w:hAnsi="Courier New" w:cs="Courier New"/>
+              </w:rPr>
+            </w:pPr>
+            <w:r>
+              <w:rPr>
+                <w:rFonts w:ascii="Courier New" w:hAnsi="Courier New" w:cs="Courier New"/>
+              </w:rPr>
               <w:t>OTA Key 0: cf737c4fce892fab44c6ec0d5d0f66dccf06c5630ac5b531f4067599df014d5ef213bb73205a9ce378318f259e3d01e3b99c089a75ac0735b204256b9371fbce</w:t>
             </w:r>
           </w:p>
@@ -15370,6 +15410,11 @@
           <w:p>
             <w:r>
               <w:t>The RP2040 Firmware Build line reads Debug or Release (firmware 0.9.1-rc7 and later). Published releases are Release builds; build.sh -d in firmware/adsbee_1090 makes a Debug build.</w:t>
+            </w:r>
+          </w:p>
+          <w:p>
+            <w:r>
+              <w:t xml:space="preserve">The RP2040 RAM line (firmware 0.9.1-rc11 and later) shows the heap in use, the free RAM between the heap and core 0’s stack, and each core’s deepest stack use since boot. RP2040 Aircraft Dictionary is how many aircraft the USB and UART outputs track; WiFi and Ethernet outputs track 200.</w:t>
             </w:r>
           </w:p>
           <w:p/>
@@ -46883,7 +46928,7 @@
       <w:rPr>
         <w:color w:val="FFFFFF" w:themeColor="background1"/>
       </w:rPr>
-      <w:t>20261023</w:t>
+      <w:t>20261024</w:t>
     </w:r>
     <w:r>
       <w:rPr>

</xml_diff>